<commit_message>
doc: add `Class Identified`
</commit_message>
<xml_diff>
--- a/document/hw3.docx
+++ b/document/hw3.docx
@@ -1,6 +1,6 @@
 
 <file path=word/document.xml><?xml version="1.0" encoding="utf-8"?>
-<w:document xmlns:wpc="http://schemas.microsoft.com/office/word/2010/wordprocessingCanvas" xmlns:cx="http://schemas.microsoft.com/office/drawing/2014/chartex" xmlns:cx1="http://schemas.microsoft.com/office/drawing/2015/9/8/chartex" xmlns:cx2="http://schemas.microsoft.com/office/drawing/2015/10/21/chartex" xmlns:cx3="http://schemas.microsoft.com/office/drawing/2016/5/9/chartex" xmlns:cx4="http://schemas.microsoft.com/office/drawing/2016/5/10/chartex" xmlns:cx5="http://schemas.microsoft.com/office/drawing/2016/5/11/chartex" xmlns:cx6="http://schemas.microsoft.com/office/drawing/2016/5/12/chartex" xmlns:cx7="http://schemas.microsoft.com/office/drawing/2016/5/13/chartex" xmlns:cx8="http://schemas.microsoft.com/office/drawing/2016/5/14/chartex" xmlns:mc="http://schemas.openxmlformats.org/markup-compatibility/2006" xmlns:aink="http://schemas.microsoft.com/office/drawing/2016/ink" xmlns:am3d="http://schemas.microsoft.com/office/drawing/2017/model3d" xmlns:o="urn:schemas-microsoft-com:office:office" xmlns:oel="http://schemas.microsoft.com/office/2019/extlst" xmlns:r="http://schemas.openxmlformats.org/officeDocument/2006/relationships" xmlns:m="http://schemas.openxmlformats.org/officeDocument/2006/math" xmlns:v="urn:schemas-microsoft-com:vml" xmlns:wp14="http://schemas.microsoft.com/office/word/2010/wordprocessingDrawing" xmlns:wp="http://schemas.openxmlformats.org/drawingml/2006/wordprocessingDrawing" xmlns:w10="urn:schemas-microsoft-com:office:word" xmlns:w="http://schemas.openxmlformats.org/wordprocessingml/2006/main" xmlns:w14="http://schemas.microsoft.com/office/word/2010/wordml" xmlns:w15="http://schemas.microsoft.com/office/word/2012/wordml" xmlns:w16cex="http://schemas.microsoft.com/office/word/2018/wordml/cex" xmlns:w16cid="http://schemas.microsoft.com/office/word/2016/wordml/cid" xmlns:w16="http://schemas.microsoft.com/office/word/2018/wordml" xmlns:w16sdtdh="http://schemas.microsoft.com/office/word/2020/wordml/sdtdatahash" xmlns:w16se="http://schemas.microsoft.com/office/word/2015/wordml/symex" xmlns:wpg="http://schemas.microsoft.com/office/word/2010/wordprocessingGroup" xmlns:wpi="http://schemas.microsoft.com/office/word/2010/wordprocessingInk" xmlns:wne="http://schemas.microsoft.com/office/word/2006/wordml" xmlns:wps="http://schemas.microsoft.com/office/word/2010/wordprocessingShape" mc:Ignorable="w14 w15 w16se w16cid w16 w16cex w16sdtdh wp14">
+<w:document xmlns:wpc="http://schemas.microsoft.com/office/word/2010/wordprocessingCanvas" xmlns:cx="http://schemas.microsoft.com/office/drawing/2014/chartex" xmlns:cx1="http://schemas.microsoft.com/office/drawing/2015/9/8/chartex" xmlns:cx2="http://schemas.microsoft.com/office/drawing/2015/10/21/chartex" xmlns:cx3="http://schemas.microsoft.com/office/drawing/2016/5/9/chartex" xmlns:cx4="http://schemas.microsoft.com/office/drawing/2016/5/10/chartex" xmlns:cx5="http://schemas.microsoft.com/office/drawing/2016/5/11/chartex" xmlns:cx6="http://schemas.microsoft.com/office/drawing/2016/5/12/chartex" xmlns:cx7="http://schemas.microsoft.com/office/drawing/2016/5/13/chartex" xmlns:cx8="http://schemas.microsoft.com/office/drawing/2016/5/14/chartex" xmlns:mc="http://schemas.openxmlformats.org/markup-compatibility/2006" xmlns:aink="http://schemas.microsoft.com/office/drawing/2016/ink" xmlns:am3d="http://schemas.microsoft.com/office/drawing/2017/model3d" xmlns:o="urn:schemas-microsoft-com:office:office" xmlns:oel="http://schemas.microsoft.com/office/2019/extlst" xmlns:r="http://schemas.openxmlformats.org/officeDocument/2006/relationships" xmlns:m="http://schemas.openxmlformats.org/officeDocument/2006/math" xmlns:v="urn:schemas-microsoft-com:vml" xmlns:wp14="http://schemas.microsoft.com/office/word/2010/wordprocessingDrawing" xmlns:wp="http://schemas.openxmlformats.org/drawingml/2006/wordprocessingDrawing" xmlns:w10="urn:schemas-microsoft-com:office:word" xmlns:w="http://schemas.openxmlformats.org/wordprocessingml/2006/main" xmlns:w14="http://schemas.microsoft.com/office/word/2010/wordml" xmlns:w15="http://schemas.microsoft.com/office/word/2012/wordml" xmlns:w16cex="http://schemas.microsoft.com/office/word/2018/wordml/cex" xmlns:w16cid="http://schemas.microsoft.com/office/word/2016/wordml/cid" xmlns:w16="http://schemas.microsoft.com/office/word/2018/wordml" xmlns:w16du="http://schemas.microsoft.com/office/word/2023/wordml/word16du" xmlns:w16sdtdh="http://schemas.microsoft.com/office/word/2020/wordml/sdtdatahash" xmlns:w16sdtfl="http://schemas.microsoft.com/office/word/2024/wordml/sdtformatlock" xmlns:w16se="http://schemas.microsoft.com/office/word/2015/wordml/symex" xmlns:wpg="http://schemas.microsoft.com/office/word/2010/wordprocessingGroup" xmlns:wpi="http://schemas.microsoft.com/office/word/2010/wordprocessingInk" xmlns:wne="http://schemas.microsoft.com/office/word/2006/wordml" xmlns:wps="http://schemas.microsoft.com/office/word/2010/wordprocessingShape" mc:Ignorable="w14 w15 w16se w16cid w16 w16cex w16sdtdh w16sdtfl w16du wp14">
   <w:body>
     <w:p>
       <w:pPr>
@@ -1132,7 +1132,7 @@
                     <pic:cNvPicPr/>
                   </pic:nvPicPr>
                   <pic:blipFill>
-                    <a:blip r:embed="rId7" cstate="print">
+                    <a:blip r:embed="rId8" cstate="print">
                       <a:extLst>
                         <a:ext uri="{28A0092B-C50C-407E-A947-70E740481C1C}">
                           <a14:useLocalDpi xmlns:a14="http://schemas.microsoft.com/office/drawing/2010/main" val="0"/>
@@ -8137,7 +8137,7 @@
     <w:p>
       <w:pPr>
         <w:rPr>
-          <w:rFonts w:ascii="Times New Roman" w:eastAsia="標楷體" w:hAnsi="Times New Roman" w:cs="Times New Roman" w:hint="eastAsia"/>
+          <w:rFonts w:ascii="Times New Roman" w:eastAsia="標楷體" w:hAnsi="Times New Roman" w:cs="Times New Roman"/>
         </w:rPr>
       </w:pPr>
     </w:p>
@@ -8160,35 +8160,1373 @@
     </w:p>
     <w:p>
       <w:pPr>
-        <w:rPr>
-          <w:rFonts w:ascii="Times New Roman" w:eastAsia="標楷體" w:hAnsi="Times New Roman" w:cs="Times New Roman" w:hint="eastAsia"/>
-        </w:rPr>
-      </w:pPr>
+        <w:pStyle w:val="3"/>
+      </w:pPr>
+      <w:r>
+        <w:rPr>
+          <w:rFonts w:hint="eastAsia"/>
+        </w:rPr>
+        <w:t>2.2.1 Class Identified</w:t>
+      </w:r>
     </w:p>
     <w:p>
       <w:pPr>
-        <w:pStyle w:val="2"/>
-      </w:pPr>
-      <w:r>
-        <w:rPr>
-          <w:rFonts w:hint="eastAsia"/>
-        </w:rPr>
-        <w:t>2.2 Add associations</w:t>
-      </w:r>
+        <w:rPr>
+          <w:rFonts w:ascii="Times New Roman" w:eastAsia="標楷體" w:hAnsi="Times New Roman" w:cs="Times New Roman"/>
+        </w:rPr>
+      </w:pPr>
+      <w:r>
+        <w:rPr>
+          <w:rFonts w:ascii="Times New Roman" w:eastAsia="標楷體" w:hAnsi="Times New Roman" w:cs="Times New Roman" w:hint="eastAsia"/>
+        </w:rPr>
+        <w:t>在</w:t>
+      </w:r>
+      <w:r>
+        <w:rPr>
+          <w:rFonts w:ascii="Times New Roman" w:eastAsia="標楷體" w:hAnsi="Times New Roman" w:cs="Times New Roman" w:hint="eastAsia"/>
+        </w:rPr>
+        <w:t>Use Cases</w:t>
+      </w:r>
+      <w:r>
+        <w:rPr>
+          <w:rFonts w:ascii="Times New Roman" w:eastAsia="標楷體" w:hAnsi="Times New Roman" w:cs="Times New Roman" w:hint="eastAsia"/>
+        </w:rPr>
+        <w:t>所使用過的單詞：</w:t>
+      </w:r>
+    </w:p>
+    <w:tbl>
+      <w:tblPr>
+        <w:tblStyle w:val="af2"/>
+        <w:tblW w:w="0" w:type="auto"/>
+        <w:tblLook w:val="04A0" w:firstRow="1" w:lastRow="0" w:firstColumn="1" w:lastColumn="0" w:noHBand="0" w:noVBand="1"/>
+      </w:tblPr>
+      <w:tblGrid>
+        <w:gridCol w:w="1659"/>
+        <w:gridCol w:w="1659"/>
+        <w:gridCol w:w="1659"/>
+        <w:gridCol w:w="1659"/>
+        <w:gridCol w:w="1660"/>
+      </w:tblGrid>
+      <w:tr>
+        <w:tc>
+          <w:tcPr>
+            <w:tcW w:w="1659" w:type="dxa"/>
+          </w:tcPr>
+          <w:p>
+            <w:pPr>
+              <w:rPr>
+                <w:rFonts w:ascii="Times New Roman" w:eastAsia="標楷體" w:hAnsi="Times New Roman" w:cs="Times New Roman"/>
+              </w:rPr>
+            </w:pPr>
+            <w:r>
+              <w:rPr>
+                <w:rFonts w:ascii="Times New Roman" w:eastAsia="標楷體" w:hAnsi="Times New Roman" w:cs="Times New Roman" w:hint="eastAsia"/>
+                <w:highlight w:val="yellow"/>
+              </w:rPr>
+              <w:t>賣家</w:t>
+            </w:r>
+          </w:p>
+        </w:tc>
+        <w:tc>
+          <w:tcPr>
+            <w:tcW w:w="1659" w:type="dxa"/>
+          </w:tcPr>
+          <w:p>
+            <w:pPr>
+              <w:rPr>
+                <w:rFonts w:ascii="Times New Roman" w:eastAsia="標楷體" w:hAnsi="Times New Roman" w:cs="Times New Roman"/>
+              </w:rPr>
+            </w:pPr>
+            <w:r>
+              <w:rPr>
+                <w:rFonts w:ascii="Times New Roman" w:eastAsia="標楷體" w:hAnsi="Times New Roman" w:cs="Times New Roman" w:hint="eastAsia"/>
+                <w:highlight w:val="yellow"/>
+              </w:rPr>
+              <w:t>買家</w:t>
+            </w:r>
+          </w:p>
+        </w:tc>
+        <w:tc>
+          <w:tcPr>
+            <w:tcW w:w="1659" w:type="dxa"/>
+          </w:tcPr>
+          <w:p>
+            <w:pPr>
+              <w:rPr>
+                <w:rFonts w:ascii="Times New Roman" w:eastAsia="標楷體" w:hAnsi="Times New Roman" w:cs="Times New Roman"/>
+              </w:rPr>
+            </w:pPr>
+            <w:r>
+              <w:rPr>
+                <w:rFonts w:ascii="Times New Roman" w:eastAsia="標楷體" w:hAnsi="Times New Roman" w:cs="Times New Roman" w:hint="eastAsia"/>
+                <w:highlight w:val="yellow"/>
+              </w:rPr>
+              <w:t>書籍頁面</w:t>
+            </w:r>
+          </w:p>
+        </w:tc>
+        <w:tc>
+          <w:tcPr>
+            <w:tcW w:w="1659" w:type="dxa"/>
+          </w:tcPr>
+          <w:p>
+            <w:pPr>
+              <w:rPr>
+                <w:rFonts w:ascii="Times New Roman" w:eastAsia="標楷體" w:hAnsi="Times New Roman" w:cs="Times New Roman"/>
+                <w:highlight w:val="yellow"/>
+              </w:rPr>
+            </w:pPr>
+            <w:r>
+              <w:rPr>
+                <w:rFonts w:ascii="Times New Roman" w:eastAsia="標楷體" w:hAnsi="Times New Roman" w:cs="Times New Roman" w:hint="eastAsia"/>
+                <w:highlight w:val="yellow"/>
+              </w:rPr>
+              <w:t>書籍</w:t>
+            </w:r>
+          </w:p>
+        </w:tc>
+        <w:tc>
+          <w:tcPr>
+            <w:tcW w:w="1660" w:type="dxa"/>
+          </w:tcPr>
+          <w:p>
+            <w:pPr>
+              <w:rPr>
+                <w:rFonts w:ascii="Times New Roman" w:eastAsia="標楷體" w:hAnsi="Times New Roman" w:cs="Times New Roman"/>
+              </w:rPr>
+            </w:pPr>
+            <w:r>
+              <w:rPr>
+                <w:rFonts w:ascii="Times New Roman" w:eastAsia="標楷體" w:hAnsi="Times New Roman" w:cs="Times New Roman" w:hint="eastAsia"/>
+                <w:highlight w:val="yellow"/>
+              </w:rPr>
+              <w:t>書籍狀態</w:t>
+            </w:r>
+          </w:p>
+        </w:tc>
+      </w:tr>
+      <w:tr>
+        <w:tc>
+          <w:tcPr>
+            <w:tcW w:w="1659" w:type="dxa"/>
+          </w:tcPr>
+          <w:p>
+            <w:pPr>
+              <w:rPr>
+                <w:rFonts w:ascii="Times New Roman" w:eastAsia="標楷體" w:hAnsi="Times New Roman" w:cs="Times New Roman"/>
+              </w:rPr>
+            </w:pPr>
+            <w:r>
+              <w:rPr>
+                <w:rFonts w:ascii="Times New Roman" w:eastAsia="標楷體" w:hAnsi="Times New Roman" w:cs="Times New Roman" w:hint="eastAsia"/>
+                <w:highlight w:val="yellow"/>
+              </w:rPr>
+              <w:t>系統</w:t>
+            </w:r>
+          </w:p>
+        </w:tc>
+        <w:tc>
+          <w:tcPr>
+            <w:tcW w:w="1659" w:type="dxa"/>
+          </w:tcPr>
+          <w:p>
+            <w:pPr>
+              <w:rPr>
+                <w:rFonts w:ascii="Times New Roman" w:eastAsia="標楷體" w:hAnsi="Times New Roman" w:cs="Times New Roman"/>
+              </w:rPr>
+            </w:pPr>
+            <w:r>
+              <w:rPr>
+                <w:rFonts w:ascii="Times New Roman" w:eastAsia="標楷體" w:hAnsi="Times New Roman" w:cs="Times New Roman" w:hint="eastAsia"/>
+                <w:highlight w:val="yellow"/>
+              </w:rPr>
+              <w:t>訂單狀態</w:t>
+            </w:r>
+          </w:p>
+        </w:tc>
+        <w:tc>
+          <w:tcPr>
+            <w:tcW w:w="1659" w:type="dxa"/>
+          </w:tcPr>
+          <w:p>
+            <w:pPr>
+              <w:rPr>
+                <w:rFonts w:ascii="Times New Roman" w:eastAsia="標楷體" w:hAnsi="Times New Roman" w:cs="Times New Roman"/>
+              </w:rPr>
+            </w:pPr>
+            <w:r>
+              <w:rPr>
+                <w:rFonts w:ascii="Times New Roman" w:eastAsia="標楷體" w:hAnsi="Times New Roman" w:cs="Times New Roman" w:hint="eastAsia"/>
+                <w:highlight w:val="yellow"/>
+              </w:rPr>
+              <w:t>資料庫</w:t>
+            </w:r>
+          </w:p>
+        </w:tc>
+        <w:tc>
+          <w:tcPr>
+            <w:tcW w:w="1659" w:type="dxa"/>
+          </w:tcPr>
+          <w:p>
+            <w:pPr>
+              <w:rPr>
+                <w:rFonts w:ascii="Times New Roman" w:eastAsia="標楷體" w:hAnsi="Times New Roman" w:cs="Times New Roman"/>
+              </w:rPr>
+            </w:pPr>
+            <w:r>
+              <w:rPr>
+                <w:rFonts w:ascii="Times New Roman" w:eastAsia="標楷體" w:hAnsi="Times New Roman" w:cs="Times New Roman" w:hint="eastAsia"/>
+                <w:highlight w:val="yellow"/>
+              </w:rPr>
+              <w:t>ISBN</w:t>
+            </w:r>
+            <w:r>
+              <w:rPr>
+                <w:rFonts w:ascii="Times New Roman" w:eastAsia="標楷體" w:hAnsi="Times New Roman" w:cs="Times New Roman" w:hint="eastAsia"/>
+                <w:highlight w:val="yellow"/>
+              </w:rPr>
+              <w:t>格式</w:t>
+            </w:r>
+          </w:p>
+        </w:tc>
+        <w:tc>
+          <w:tcPr>
+            <w:tcW w:w="1660" w:type="dxa"/>
+          </w:tcPr>
+          <w:p>
+            <w:pPr>
+              <w:rPr>
+                <w:rFonts w:ascii="Times New Roman" w:eastAsia="標楷體" w:hAnsi="Times New Roman" w:cs="Times New Roman"/>
+              </w:rPr>
+            </w:pPr>
+            <w:proofErr w:type="gramStart"/>
+            <w:r>
+              <w:rPr>
+                <w:rFonts w:ascii="Times New Roman" w:eastAsia="標楷體" w:hAnsi="Times New Roman" w:cs="Times New Roman" w:hint="eastAsia"/>
+                <w:highlight w:val="yellow"/>
+              </w:rPr>
+              <w:t>必填欄位</w:t>
+            </w:r>
+            <w:proofErr w:type="gramEnd"/>
+          </w:p>
+        </w:tc>
+      </w:tr>
+      <w:tr>
+        <w:tc>
+          <w:tcPr>
+            <w:tcW w:w="1659" w:type="dxa"/>
+          </w:tcPr>
+          <w:p>
+            <w:pPr>
+              <w:rPr>
+                <w:rFonts w:ascii="Times New Roman" w:eastAsia="標楷體" w:hAnsi="Times New Roman" w:cs="Times New Roman"/>
+              </w:rPr>
+            </w:pPr>
+            <w:r>
+              <w:rPr>
+                <w:rFonts w:ascii="Times New Roman" w:eastAsia="標楷體" w:hAnsi="Times New Roman" w:cs="Times New Roman" w:hint="eastAsia"/>
+                <w:highlight w:val="yellow"/>
+              </w:rPr>
+              <w:t>所在地</w:t>
+            </w:r>
+          </w:p>
+        </w:tc>
+        <w:tc>
+          <w:tcPr>
+            <w:tcW w:w="1659" w:type="dxa"/>
+          </w:tcPr>
+          <w:p>
+            <w:pPr>
+              <w:rPr>
+                <w:rFonts w:ascii="Times New Roman" w:eastAsia="標楷體" w:hAnsi="Times New Roman" w:cs="Times New Roman"/>
+              </w:rPr>
+            </w:pPr>
+            <w:r>
+              <w:rPr>
+                <w:rFonts w:ascii="Times New Roman" w:eastAsia="標楷體" w:hAnsi="Times New Roman" w:cs="Times New Roman" w:hint="eastAsia"/>
+                <w:highlight w:val="yellow"/>
+              </w:rPr>
+              <w:t>書</w:t>
+            </w:r>
+            <w:proofErr w:type="gramStart"/>
+            <w:r>
+              <w:rPr>
+                <w:rFonts w:ascii="Times New Roman" w:eastAsia="標楷體" w:hAnsi="Times New Roman" w:cs="Times New Roman" w:hint="eastAsia"/>
+                <w:highlight w:val="yellow"/>
+              </w:rPr>
+              <w:t>況</w:t>
+            </w:r>
+            <w:proofErr w:type="gramEnd"/>
+          </w:p>
+        </w:tc>
+        <w:tc>
+          <w:tcPr>
+            <w:tcW w:w="1659" w:type="dxa"/>
+          </w:tcPr>
+          <w:p>
+            <w:pPr>
+              <w:rPr>
+                <w:rFonts w:ascii="Times New Roman" w:eastAsia="標楷體" w:hAnsi="Times New Roman" w:cs="Times New Roman"/>
+              </w:rPr>
+            </w:pPr>
+            <w:r>
+              <w:rPr>
+                <w:rFonts w:ascii="Times New Roman" w:eastAsia="標楷體" w:hAnsi="Times New Roman" w:cs="Times New Roman" w:hint="eastAsia"/>
+                <w:highlight w:val="yellow"/>
+              </w:rPr>
+              <w:t>訂單通知</w:t>
+            </w:r>
+          </w:p>
+        </w:tc>
+        <w:tc>
+          <w:tcPr>
+            <w:tcW w:w="1659" w:type="dxa"/>
+          </w:tcPr>
+          <w:p>
+            <w:pPr>
+              <w:rPr>
+                <w:rFonts w:ascii="Times New Roman" w:eastAsia="標楷體" w:hAnsi="Times New Roman" w:cs="Times New Roman"/>
+              </w:rPr>
+            </w:pPr>
+            <w:r>
+              <w:rPr>
+                <w:rFonts w:ascii="Times New Roman" w:eastAsia="標楷體" w:hAnsi="Times New Roman" w:cs="Times New Roman" w:hint="eastAsia"/>
+              </w:rPr>
+              <w:t>書名作者</w:t>
+            </w:r>
+          </w:p>
+        </w:tc>
+        <w:tc>
+          <w:tcPr>
+            <w:tcW w:w="1660" w:type="dxa"/>
+          </w:tcPr>
+          <w:p>
+            <w:pPr>
+              <w:rPr>
+                <w:rFonts w:ascii="Times New Roman" w:eastAsia="標楷體" w:hAnsi="Times New Roman" w:cs="Times New Roman"/>
+              </w:rPr>
+            </w:pPr>
+            <w:proofErr w:type="gramStart"/>
+            <w:r>
+              <w:rPr>
+                <w:rFonts w:ascii="Times New Roman" w:eastAsia="標楷體" w:hAnsi="Times New Roman" w:cs="Times New Roman" w:hint="eastAsia"/>
+                <w:highlight w:val="green"/>
+              </w:rPr>
+              <w:t>私訊</w:t>
+            </w:r>
+            <w:proofErr w:type="gramEnd"/>
+          </w:p>
+        </w:tc>
+      </w:tr>
+      <w:tr>
+        <w:tc>
+          <w:tcPr>
+            <w:tcW w:w="1659" w:type="dxa"/>
+          </w:tcPr>
+          <w:p>
+            <w:pPr>
+              <w:rPr>
+                <w:rFonts w:ascii="Times New Roman" w:eastAsia="標楷體" w:hAnsi="Times New Roman" w:cs="Times New Roman"/>
+              </w:rPr>
+            </w:pPr>
+            <w:r>
+              <w:rPr>
+                <w:rFonts w:ascii="Times New Roman" w:eastAsia="標楷體" w:hAnsi="Times New Roman" w:cs="Times New Roman" w:hint="eastAsia"/>
+                <w:highlight w:val="yellow"/>
+              </w:rPr>
+              <w:t>價格範圍</w:t>
+            </w:r>
+          </w:p>
+        </w:tc>
+        <w:tc>
+          <w:tcPr>
+            <w:tcW w:w="1659" w:type="dxa"/>
+          </w:tcPr>
+          <w:p>
+            <w:pPr>
+              <w:rPr>
+                <w:rFonts w:ascii="Times New Roman" w:eastAsia="標楷體" w:hAnsi="Times New Roman" w:cs="Times New Roman"/>
+              </w:rPr>
+            </w:pPr>
+            <w:r>
+              <w:rPr>
+                <w:rFonts w:ascii="Times New Roman" w:eastAsia="標楷體" w:hAnsi="Times New Roman" w:cs="Times New Roman" w:hint="eastAsia"/>
+                <w:highlight w:val="yellow"/>
+              </w:rPr>
+              <w:t>搜尋條件</w:t>
+            </w:r>
+          </w:p>
+        </w:tc>
+        <w:tc>
+          <w:tcPr>
+            <w:tcW w:w="1659" w:type="dxa"/>
+          </w:tcPr>
+          <w:p>
+            <w:pPr>
+              <w:rPr>
+                <w:rFonts w:ascii="Times New Roman" w:eastAsia="標楷體" w:hAnsi="Times New Roman" w:cs="Times New Roman"/>
+              </w:rPr>
+            </w:pPr>
+            <w:r>
+              <w:rPr>
+                <w:rFonts w:ascii="Times New Roman" w:eastAsia="標楷體" w:hAnsi="Times New Roman" w:cs="Times New Roman" w:hint="eastAsia"/>
+                <w:highlight w:val="yellow"/>
+              </w:rPr>
+              <w:t>購物車</w:t>
+            </w:r>
+          </w:p>
+        </w:tc>
+        <w:tc>
+          <w:tcPr>
+            <w:tcW w:w="1659" w:type="dxa"/>
+          </w:tcPr>
+          <w:p>
+            <w:pPr>
+              <w:rPr>
+                <w:rFonts w:ascii="Times New Roman" w:eastAsia="標楷體" w:hAnsi="Times New Roman" w:cs="Times New Roman"/>
+              </w:rPr>
+            </w:pPr>
+            <w:r>
+              <w:rPr>
+                <w:rFonts w:ascii="Times New Roman" w:eastAsia="標楷體" w:hAnsi="Times New Roman" w:cs="Times New Roman" w:hint="eastAsia"/>
+              </w:rPr>
+              <w:t>關鍵字</w:t>
+            </w:r>
+          </w:p>
+        </w:tc>
+        <w:tc>
+          <w:tcPr>
+            <w:tcW w:w="1660" w:type="dxa"/>
+          </w:tcPr>
+          <w:p>
+            <w:pPr>
+              <w:rPr>
+                <w:rFonts w:ascii="Times New Roman" w:eastAsia="標楷體" w:hAnsi="Times New Roman" w:cs="Times New Roman"/>
+              </w:rPr>
+            </w:pPr>
+            <w:r>
+              <w:rPr>
+                <w:rFonts w:ascii="Times New Roman" w:eastAsia="標楷體" w:hAnsi="Times New Roman" w:cs="Times New Roman" w:hint="eastAsia"/>
+                <w:highlight w:val="green"/>
+              </w:rPr>
+              <w:t>交易狀態</w:t>
+            </w:r>
+          </w:p>
+        </w:tc>
+      </w:tr>
+      <w:tr>
+        <w:tc>
+          <w:tcPr>
+            <w:tcW w:w="1659" w:type="dxa"/>
+          </w:tcPr>
+          <w:p>
+            <w:pPr>
+              <w:rPr>
+                <w:rFonts w:ascii="Times New Roman" w:eastAsia="標楷體" w:hAnsi="Times New Roman" w:cs="Times New Roman"/>
+              </w:rPr>
+            </w:pPr>
+            <w:r>
+              <w:rPr>
+                <w:rFonts w:ascii="Times New Roman" w:eastAsia="標楷體" w:hAnsi="Times New Roman" w:cs="Times New Roman" w:hint="eastAsia"/>
+                <w:highlight w:val="yellow"/>
+              </w:rPr>
+              <w:t>交易</w:t>
+            </w:r>
+          </w:p>
+        </w:tc>
+        <w:tc>
+          <w:tcPr>
+            <w:tcW w:w="1659" w:type="dxa"/>
+          </w:tcPr>
+          <w:p>
+            <w:pPr>
+              <w:rPr>
+                <w:rFonts w:ascii="Times New Roman" w:eastAsia="標楷體" w:hAnsi="Times New Roman" w:cs="Times New Roman"/>
+              </w:rPr>
+            </w:pPr>
+            <w:r>
+              <w:rPr>
+                <w:rFonts w:ascii="Times New Roman" w:eastAsia="標楷體" w:hAnsi="Times New Roman" w:cs="Times New Roman" w:hint="eastAsia"/>
+                <w:highlight w:val="yellow"/>
+              </w:rPr>
+              <w:t>搜尋結果列表</w:t>
+            </w:r>
+          </w:p>
+        </w:tc>
+        <w:tc>
+          <w:tcPr>
+            <w:tcW w:w="1659" w:type="dxa"/>
+          </w:tcPr>
+          <w:p>
+            <w:pPr>
+              <w:rPr>
+                <w:rFonts w:ascii="Times New Roman" w:eastAsia="標楷體" w:hAnsi="Times New Roman" w:cs="Times New Roman"/>
+              </w:rPr>
+            </w:pPr>
+            <w:r>
+              <w:rPr>
+                <w:rFonts w:ascii="Times New Roman" w:eastAsia="標楷體" w:hAnsi="Times New Roman" w:cs="Times New Roman" w:hint="eastAsia"/>
+                <w:highlight w:val="yellow"/>
+              </w:rPr>
+              <w:t>訂單</w:t>
+            </w:r>
+          </w:p>
+        </w:tc>
+        <w:tc>
+          <w:tcPr>
+            <w:tcW w:w="1659" w:type="dxa"/>
+          </w:tcPr>
+          <w:p>
+            <w:pPr>
+              <w:rPr>
+                <w:rFonts w:ascii="Times New Roman" w:eastAsia="標楷體" w:hAnsi="Times New Roman" w:cs="Times New Roman"/>
+              </w:rPr>
+            </w:pPr>
+            <w:r>
+              <w:rPr>
+                <w:rFonts w:ascii="Times New Roman" w:eastAsia="標楷體" w:hAnsi="Times New Roman" w:cs="Times New Roman" w:hint="eastAsia"/>
+              </w:rPr>
+              <w:t>類別</w:t>
+            </w:r>
+            <w:r>
+              <w:rPr>
+                <w:rFonts w:ascii="Times New Roman" w:eastAsia="標楷體" w:hAnsi="Times New Roman" w:cs="Times New Roman" w:hint="eastAsia"/>
+              </w:rPr>
+              <w:t>名稱</w:t>
+            </w:r>
+          </w:p>
+        </w:tc>
+        <w:tc>
+          <w:tcPr>
+            <w:tcW w:w="1660" w:type="dxa"/>
+          </w:tcPr>
+          <w:p>
+            <w:pPr>
+              <w:rPr>
+                <w:rFonts w:ascii="Times New Roman" w:eastAsia="標楷體" w:hAnsi="Times New Roman" w:cs="Times New Roman"/>
+              </w:rPr>
+            </w:pPr>
+            <w:r>
+              <w:rPr>
+                <w:rFonts w:ascii="Times New Roman" w:eastAsia="標楷體" w:hAnsi="Times New Roman" w:cs="Times New Roman" w:hint="eastAsia"/>
+                <w:highlight w:val="yellow"/>
+              </w:rPr>
+              <w:t>訂單資訊</w:t>
+            </w:r>
+          </w:p>
+        </w:tc>
+      </w:tr>
+      <w:tr>
+        <w:tc>
+          <w:tcPr>
+            <w:tcW w:w="1659" w:type="dxa"/>
+          </w:tcPr>
+          <w:p>
+            <w:pPr>
+              <w:rPr>
+                <w:rFonts w:ascii="Times New Roman" w:eastAsia="標楷體" w:hAnsi="Times New Roman" w:cs="Times New Roman"/>
+              </w:rPr>
+            </w:pPr>
+            <w:r>
+              <w:rPr>
+                <w:rFonts w:ascii="Times New Roman" w:eastAsia="標楷體" w:hAnsi="Times New Roman" w:cs="Times New Roman" w:hint="eastAsia"/>
+                <w:highlight w:val="yellow"/>
+              </w:rPr>
+              <w:t>個人賣場管理頁面</w:t>
+            </w:r>
+          </w:p>
+        </w:tc>
+        <w:tc>
+          <w:tcPr>
+            <w:tcW w:w="1659" w:type="dxa"/>
+          </w:tcPr>
+          <w:p>
+            <w:pPr>
+              <w:rPr>
+                <w:rFonts w:ascii="Times New Roman" w:eastAsia="標楷體" w:hAnsi="Times New Roman" w:cs="Times New Roman"/>
+              </w:rPr>
+            </w:pPr>
+            <w:r>
+              <w:rPr>
+                <w:rFonts w:ascii="Times New Roman" w:eastAsia="標楷體" w:hAnsi="Times New Roman" w:cs="Times New Roman" w:hint="eastAsia"/>
+                <w:highlight w:val="yellow"/>
+              </w:rPr>
+              <w:t>書籍清單</w:t>
+            </w:r>
+          </w:p>
+        </w:tc>
+        <w:tc>
+          <w:tcPr>
+            <w:tcW w:w="1659" w:type="dxa"/>
+          </w:tcPr>
+          <w:p>
+            <w:pPr>
+              <w:rPr>
+                <w:rFonts w:ascii="Times New Roman" w:eastAsia="標楷體" w:hAnsi="Times New Roman" w:cs="Times New Roman"/>
+                <w:highlight w:val="yellow"/>
+              </w:rPr>
+            </w:pPr>
+            <w:proofErr w:type="gramStart"/>
+            <w:r>
+              <w:rPr>
+                <w:rFonts w:ascii="Times New Roman" w:eastAsia="標楷體" w:hAnsi="Times New Roman" w:cs="Times New Roman" w:hint="eastAsia"/>
+                <w:highlight w:val="yellow"/>
+              </w:rPr>
+              <w:t>購物車頁面</w:t>
+            </w:r>
+            <w:proofErr w:type="gramEnd"/>
+          </w:p>
+        </w:tc>
+        <w:tc>
+          <w:tcPr>
+            <w:tcW w:w="1659" w:type="dxa"/>
+          </w:tcPr>
+          <w:p>
+            <w:pPr>
+              <w:rPr>
+                <w:rFonts w:ascii="Times New Roman" w:eastAsia="標楷體" w:hAnsi="Times New Roman" w:cs="Times New Roman"/>
+              </w:rPr>
+            </w:pPr>
+            <w:r>
+              <w:rPr>
+                <w:rFonts w:ascii="Times New Roman" w:eastAsia="標楷體" w:hAnsi="Times New Roman" w:cs="Times New Roman" w:hint="eastAsia"/>
+                <w:highlight w:val="yellow"/>
+              </w:rPr>
+              <w:t>搜尋列</w:t>
+            </w:r>
+          </w:p>
+        </w:tc>
+        <w:tc>
+          <w:tcPr>
+            <w:tcW w:w="1660" w:type="dxa"/>
+          </w:tcPr>
+          <w:p>
+            <w:pPr>
+              <w:rPr>
+                <w:rFonts w:ascii="Times New Roman" w:eastAsia="標楷體" w:hAnsi="Times New Roman" w:cs="Times New Roman"/>
+              </w:rPr>
+            </w:pPr>
+            <w:r>
+              <w:rPr>
+                <w:rFonts w:ascii="Times New Roman" w:eastAsia="標楷體" w:hAnsi="Times New Roman" w:cs="Times New Roman" w:hint="eastAsia"/>
+                <w:highlight w:val="yellow"/>
+              </w:rPr>
+              <w:t>書名</w:t>
+            </w:r>
+          </w:p>
+        </w:tc>
+      </w:tr>
+    </w:tbl>
+    <w:p>
+      <w:pPr>
+        <w:rPr>
+          <w:rFonts w:ascii="Times New Roman" w:eastAsia="標楷體" w:hAnsi="Times New Roman" w:cs="Times New Roman"/>
+        </w:rPr>
+      </w:pPr>
     </w:p>
     <w:p>
       <w:pPr>
-        <w:rPr>
-          <w:rFonts w:ascii="Times New Roman" w:eastAsia="標楷體" w:hAnsi="Times New Roman" w:cs="Times New Roman" w:hint="eastAsia"/>
-        </w:rPr>
-      </w:pPr>
+        <w:pStyle w:val="3"/>
+      </w:pPr>
+      <w:r>
+        <w:rPr>
+          <w:rFonts w:hint="eastAsia"/>
+        </w:rPr>
+        <w:t>2.2.2 Bad Classes</w:t>
+      </w:r>
     </w:p>
     <w:p>
       <w:pPr>
+        <w:rPr>
+          <w:rFonts w:ascii="Times New Roman" w:eastAsia="標楷體" w:hAnsi="Times New Roman" w:cs="Times New Roman"/>
+        </w:rPr>
+      </w:pPr>
+      <w:r>
+        <w:rPr>
+          <w:rFonts w:ascii="Times New Roman" w:eastAsia="標楷體" w:hAnsi="Times New Roman" w:cs="Times New Roman" w:hint="eastAsia"/>
+        </w:rPr>
+        <w:t>將不好的</w:t>
+      </w:r>
+      <w:r>
+        <w:rPr>
+          <w:rFonts w:ascii="Times New Roman" w:eastAsia="標楷體" w:hAnsi="Times New Roman" w:cs="Times New Roman" w:hint="eastAsia"/>
+        </w:rPr>
+        <w:t>Classes</w:t>
+      </w:r>
+      <w:r>
+        <w:rPr>
+          <w:rFonts w:ascii="Times New Roman" w:eastAsia="標楷體" w:hAnsi="Times New Roman" w:cs="Times New Roman" w:hint="eastAsia"/>
+        </w:rPr>
+        <w:t>分成主要三大類：</w:t>
+      </w:r>
+      <w:r>
+        <w:rPr>
+          <w:rFonts w:ascii="Times New Roman" w:eastAsia="標楷體" w:hAnsi="Times New Roman" w:cs="Times New Roman"/>
+        </w:rPr>
+        <w:br/>
+      </w:r>
+      <w:r>
+        <w:rPr>
+          <w:rFonts w:ascii="Times New Roman" w:eastAsia="標楷體" w:hAnsi="Times New Roman" w:cs="Times New Roman" w:hint="eastAsia"/>
+        </w:rPr>
+        <w:t>1.</w:t>
+      </w:r>
+      <w:r>
+        <w:rPr>
+          <w:rFonts w:ascii="Times New Roman" w:eastAsia="標楷體" w:hAnsi="Times New Roman" w:cs="Times New Roman" w:hint="eastAsia"/>
+        </w:rPr>
+        <w:t>屬於</w:t>
+      </w:r>
+      <w:r>
+        <w:rPr>
+          <w:rFonts w:ascii="Times New Roman" w:eastAsia="標楷體" w:hAnsi="Times New Roman" w:cs="Times New Roman" w:hint="eastAsia"/>
+        </w:rPr>
+        <w:t>「</w:t>
+      </w:r>
+      <w:r>
+        <w:rPr>
+          <w:rFonts w:ascii="Times New Roman" w:eastAsia="標楷體" w:hAnsi="Times New Roman" w:cs="Times New Roman"/>
+        </w:rPr>
+        <w:t>系統介面或實作細節</w:t>
+      </w:r>
+      <w:r>
+        <w:rPr>
+          <w:rFonts w:ascii="Times New Roman" w:eastAsia="標楷體" w:hAnsi="Times New Roman" w:cs="Times New Roman" w:hint="eastAsia"/>
+        </w:rPr>
+        <w:t>」</w:t>
+      </w:r>
+      <w:r>
+        <w:rPr>
+          <w:rFonts w:ascii="Times New Roman" w:eastAsia="標楷體" w:hAnsi="Times New Roman" w:cs="Times New Roman" w:hint="eastAsia"/>
+        </w:rPr>
+        <w:t>：</w:t>
+      </w:r>
+    </w:p>
+    <w:p>
+      <w:pPr>
+        <w:pStyle w:val="a9"/>
+        <w:numPr>
+          <w:ilvl w:val="0"/>
+          <w:numId w:val="12"/>
+        </w:numPr>
+        <w:rPr>
+          <w:rFonts w:ascii="Times New Roman" w:eastAsia="標楷體" w:hAnsi="Times New Roman" w:cs="Times New Roman" w:hint="eastAsia"/>
+        </w:rPr>
+      </w:pPr>
+      <w:r>
+        <w:rPr>
+          <w:rFonts w:ascii="Times New Roman" w:eastAsia="標楷體" w:hAnsi="Times New Roman" w:cs="Times New Roman" w:hint="eastAsia"/>
+        </w:rPr>
+        <w:t>書籍頁面、個人賣場管理頁面、</w:t>
+      </w:r>
+      <w:proofErr w:type="gramStart"/>
+      <w:r>
+        <w:rPr>
+          <w:rFonts w:ascii="Times New Roman" w:eastAsia="標楷體" w:hAnsi="Times New Roman" w:cs="Times New Roman" w:hint="eastAsia"/>
+        </w:rPr>
+        <w:t>購物車頁面</w:t>
+      </w:r>
+      <w:proofErr w:type="gramEnd"/>
+      <w:r>
+        <w:rPr>
+          <w:rFonts w:ascii="Times New Roman" w:eastAsia="標楷體" w:hAnsi="Times New Roman" w:cs="Times New Roman" w:hint="eastAsia"/>
+        </w:rPr>
+        <w:t>：皆為前端</w:t>
+      </w:r>
+      <w:r>
+        <w:rPr>
+          <w:rFonts w:ascii="Times New Roman" w:eastAsia="標楷體" w:hAnsi="Times New Roman" w:cs="Times New Roman" w:hint="eastAsia"/>
+        </w:rPr>
+        <w:t>UI</w:t>
+      </w:r>
+      <w:r>
+        <w:rPr>
+          <w:rFonts w:ascii="Times New Roman" w:eastAsia="標楷體" w:hAnsi="Times New Roman" w:cs="Times New Roman" w:hint="eastAsia"/>
+        </w:rPr>
+        <w:t>介面。</w:t>
+      </w:r>
+    </w:p>
+    <w:p>
+      <w:pPr>
+        <w:pStyle w:val="a9"/>
+        <w:numPr>
+          <w:ilvl w:val="0"/>
+          <w:numId w:val="12"/>
+        </w:numPr>
+        <w:rPr>
+          <w:rFonts w:ascii="Times New Roman" w:eastAsia="標楷體" w:hAnsi="Times New Roman" w:cs="Times New Roman"/>
+        </w:rPr>
+      </w:pPr>
+      <w:r>
+        <w:rPr>
+          <w:rFonts w:ascii="Times New Roman" w:eastAsia="標楷體" w:hAnsi="Times New Roman" w:cs="Times New Roman" w:hint="eastAsia"/>
+        </w:rPr>
+        <w:t>搜尋結果列表、搜尋列：皆為前端</w:t>
+      </w:r>
+      <w:r>
+        <w:rPr>
+          <w:rFonts w:ascii="Times New Roman" w:eastAsia="標楷體" w:hAnsi="Times New Roman" w:cs="Times New Roman" w:hint="eastAsia"/>
+        </w:rPr>
+        <w:t>UI</w:t>
+      </w:r>
+      <w:r>
+        <w:rPr>
+          <w:rFonts w:ascii="Times New Roman" w:eastAsia="標楷體" w:hAnsi="Times New Roman" w:cs="Times New Roman" w:hint="eastAsia"/>
+        </w:rPr>
+        <w:t>元件。</w:t>
+      </w:r>
+    </w:p>
+    <w:p>
+      <w:pPr>
+        <w:pStyle w:val="a9"/>
+        <w:numPr>
+          <w:ilvl w:val="0"/>
+          <w:numId w:val="12"/>
+        </w:numPr>
+        <w:rPr>
+          <w:rFonts w:ascii="Times New Roman" w:eastAsia="標楷體" w:hAnsi="Times New Roman" w:cs="Times New Roman"/>
+        </w:rPr>
+      </w:pPr>
+      <w:r>
+        <w:rPr>
+          <w:rFonts w:ascii="Times New Roman" w:eastAsia="標楷體" w:hAnsi="Times New Roman" w:cs="Times New Roman" w:hint="eastAsia"/>
+        </w:rPr>
+        <w:t>系統：系統本身，非內部類別。</w:t>
+      </w:r>
+    </w:p>
+    <w:p>
+      <w:pPr>
+        <w:pStyle w:val="a9"/>
+        <w:numPr>
+          <w:ilvl w:val="0"/>
+          <w:numId w:val="12"/>
+        </w:numPr>
+        <w:rPr>
+          <w:rFonts w:ascii="Times New Roman" w:eastAsia="標楷體" w:hAnsi="Times New Roman" w:cs="Times New Roman" w:hint="eastAsia"/>
+        </w:rPr>
+      </w:pPr>
+      <w:r>
+        <w:rPr>
+          <w:rFonts w:ascii="Times New Roman" w:eastAsia="標楷體" w:hAnsi="Times New Roman" w:cs="Times New Roman" w:hint="eastAsia"/>
+        </w:rPr>
+        <w:t>資料庫：底層儲存技術。</w:t>
+      </w:r>
+    </w:p>
+    <w:p>
+      <w:pPr>
+        <w:pStyle w:val="a9"/>
+        <w:numPr>
+          <w:ilvl w:val="0"/>
+          <w:numId w:val="12"/>
+        </w:numPr>
+        <w:rPr>
+          <w:rFonts w:ascii="Times New Roman" w:eastAsia="標楷體" w:hAnsi="Times New Roman" w:cs="Times New Roman"/>
+        </w:rPr>
+      </w:pPr>
+      <w:proofErr w:type="gramStart"/>
+      <w:r>
+        <w:rPr>
+          <w:rFonts w:ascii="Times New Roman" w:eastAsia="標楷體" w:hAnsi="Times New Roman" w:cs="Times New Roman" w:hint="eastAsia"/>
+        </w:rPr>
+        <w:t>必填欄位</w:t>
+      </w:r>
+      <w:proofErr w:type="gramEnd"/>
+      <w:r>
+        <w:rPr>
+          <w:rFonts w:ascii="Times New Roman" w:eastAsia="標楷體" w:hAnsi="Times New Roman" w:cs="Times New Roman" w:hint="eastAsia"/>
+        </w:rPr>
+        <w:t>：表單驗證規則，非實體物件。</w:t>
+      </w:r>
+    </w:p>
+    <w:p>
+      <w:pPr>
+        <w:rPr>
+          <w:rFonts w:ascii="Times New Roman" w:eastAsia="標楷體" w:hAnsi="Times New Roman" w:cs="Times New Roman"/>
+        </w:rPr>
+      </w:pPr>
+      <w:r>
+        <w:rPr>
+          <w:rFonts w:ascii="Times New Roman" w:eastAsia="標楷體" w:hAnsi="Times New Roman" w:cs="Times New Roman" w:hint="eastAsia"/>
+        </w:rPr>
+        <w:t>2.</w:t>
+      </w:r>
+      <w:r>
+        <w:rPr>
+          <w:rFonts w:ascii="Times New Roman" w:eastAsia="標楷體" w:hAnsi="Times New Roman" w:cs="Times New Roman" w:hint="eastAsia"/>
+        </w:rPr>
+        <w:t>屬於「</w:t>
+      </w:r>
+      <w:r>
+        <w:rPr>
+          <w:rFonts w:ascii="Times New Roman" w:eastAsia="標楷體" w:hAnsi="Times New Roman" w:cs="Times New Roman"/>
+        </w:rPr>
+        <w:t>屬</w:t>
+      </w:r>
+      <w:r>
+        <w:rPr>
+          <w:rFonts w:ascii="Times New Roman" w:eastAsia="標楷體" w:hAnsi="Times New Roman" w:cs="Times New Roman" w:hint="eastAsia"/>
+        </w:rPr>
+        <w:t>性</w:t>
+      </w:r>
+      <w:r>
+        <w:rPr>
+          <w:rFonts w:ascii="Times New Roman" w:eastAsia="標楷體" w:hAnsi="Times New Roman" w:cs="Times New Roman"/>
+        </w:rPr>
+        <w:t>或資料型態</w:t>
+      </w:r>
+      <w:r>
+        <w:rPr>
+          <w:rFonts w:ascii="Times New Roman" w:eastAsia="標楷體" w:hAnsi="Times New Roman" w:cs="Times New Roman" w:hint="eastAsia"/>
+        </w:rPr>
+        <w:t>」</w:t>
+      </w:r>
+    </w:p>
+    <w:p>
+      <w:pPr>
+        <w:pStyle w:val="a9"/>
+        <w:numPr>
+          <w:ilvl w:val="0"/>
+          <w:numId w:val="13"/>
+        </w:numPr>
+        <w:rPr>
+          <w:rFonts w:ascii="Times New Roman" w:eastAsia="標楷體" w:hAnsi="Times New Roman" w:cs="Times New Roman" w:hint="eastAsia"/>
+        </w:rPr>
+      </w:pPr>
+      <w:r>
+        <w:rPr>
+          <w:rFonts w:ascii="Times New Roman" w:eastAsia="標楷體" w:hAnsi="Times New Roman" w:cs="Times New Roman" w:hint="eastAsia"/>
+        </w:rPr>
+        <w:t>書籍狀態、書</w:t>
+      </w:r>
+      <w:proofErr w:type="gramStart"/>
+      <w:r>
+        <w:rPr>
+          <w:rFonts w:ascii="Times New Roman" w:eastAsia="標楷體" w:hAnsi="Times New Roman" w:cs="Times New Roman" w:hint="eastAsia"/>
+        </w:rPr>
+        <w:t>況</w:t>
+      </w:r>
+      <w:proofErr w:type="gramEnd"/>
+      <w:r>
+        <w:rPr>
+          <w:rFonts w:ascii="Times New Roman" w:eastAsia="標楷體" w:hAnsi="Times New Roman" w:cs="Times New Roman" w:hint="eastAsia"/>
+        </w:rPr>
+        <w:t>：應作為</w:t>
+      </w:r>
+      <w:r>
+        <w:rPr>
+          <w:rFonts w:ascii="Times New Roman" w:eastAsia="標楷體" w:hAnsi="Times New Roman" w:cs="Times New Roman" w:hint="eastAsia"/>
+        </w:rPr>
+        <w:t xml:space="preserve"> Book </w:t>
+      </w:r>
+      <w:r>
+        <w:rPr>
+          <w:rFonts w:ascii="Times New Roman" w:eastAsia="標楷體" w:hAnsi="Times New Roman" w:cs="Times New Roman" w:hint="eastAsia"/>
+        </w:rPr>
+        <w:t>類別的屬性</w:t>
+      </w:r>
+      <w:r>
+        <w:rPr>
+          <w:rFonts w:ascii="Times New Roman" w:eastAsia="標楷體" w:hAnsi="Times New Roman" w:cs="Times New Roman" w:hint="eastAsia"/>
+        </w:rPr>
+        <w:t xml:space="preserve"> (Enum)</w:t>
+      </w:r>
+      <w:r>
+        <w:rPr>
+          <w:rFonts w:ascii="Times New Roman" w:eastAsia="標楷體" w:hAnsi="Times New Roman" w:cs="Times New Roman" w:hint="eastAsia"/>
+        </w:rPr>
+        <w:t>。</w:t>
+      </w:r>
+    </w:p>
+    <w:p>
+      <w:pPr>
+        <w:pStyle w:val="a9"/>
+        <w:numPr>
+          <w:ilvl w:val="0"/>
+          <w:numId w:val="13"/>
+        </w:numPr>
+        <w:rPr>
+          <w:rFonts w:ascii="Times New Roman" w:eastAsia="標楷體" w:hAnsi="Times New Roman" w:cs="Times New Roman"/>
+        </w:rPr>
+      </w:pPr>
+      <w:r>
+        <w:rPr>
+          <w:rFonts w:ascii="Times New Roman" w:eastAsia="標楷體" w:hAnsi="Times New Roman" w:cs="Times New Roman" w:hint="eastAsia"/>
+        </w:rPr>
+        <w:t>訂單狀態、交易狀態：應作為</w:t>
+      </w:r>
+      <w:r>
+        <w:rPr>
+          <w:rFonts w:ascii="Times New Roman" w:eastAsia="標楷體" w:hAnsi="Times New Roman" w:cs="Times New Roman" w:hint="eastAsia"/>
+        </w:rPr>
+        <w:t xml:space="preserve"> Order </w:t>
+      </w:r>
+      <w:r>
+        <w:rPr>
+          <w:rFonts w:ascii="Times New Roman" w:eastAsia="標楷體" w:hAnsi="Times New Roman" w:cs="Times New Roman" w:hint="eastAsia"/>
+        </w:rPr>
+        <w:t>類別的屬性</w:t>
+      </w:r>
+      <w:r>
+        <w:rPr>
+          <w:rFonts w:ascii="Times New Roman" w:eastAsia="標楷體" w:hAnsi="Times New Roman" w:cs="Times New Roman" w:hint="eastAsia"/>
+        </w:rPr>
+        <w:t xml:space="preserve"> (Enum)</w:t>
+      </w:r>
+      <w:r>
+        <w:rPr>
+          <w:rFonts w:ascii="Times New Roman" w:eastAsia="標楷體" w:hAnsi="Times New Roman" w:cs="Times New Roman" w:hint="eastAsia"/>
+        </w:rPr>
+        <w:t>。</w:t>
+      </w:r>
+    </w:p>
+    <w:p>
+      <w:pPr>
+        <w:pStyle w:val="a9"/>
+        <w:numPr>
+          <w:ilvl w:val="0"/>
+          <w:numId w:val="13"/>
+        </w:numPr>
+        <w:rPr>
+          <w:rFonts w:ascii="Times New Roman" w:eastAsia="標楷體" w:hAnsi="Times New Roman" w:cs="Times New Roman" w:hint="eastAsia"/>
+        </w:rPr>
+      </w:pPr>
+      <w:r>
+        <w:rPr>
+          <w:rFonts w:ascii="Times New Roman" w:eastAsia="標楷體" w:hAnsi="Times New Roman" w:cs="Times New Roman" w:hint="eastAsia"/>
+        </w:rPr>
+        <w:t xml:space="preserve">ISBN </w:t>
+      </w:r>
+      <w:r>
+        <w:rPr>
+          <w:rFonts w:ascii="Times New Roman" w:eastAsia="標楷體" w:hAnsi="Times New Roman" w:cs="Times New Roman" w:hint="eastAsia"/>
+        </w:rPr>
+        <w:t>格式、書名作者、書名：應直接作為</w:t>
+      </w:r>
+      <w:r>
+        <w:rPr>
+          <w:rFonts w:ascii="Times New Roman" w:eastAsia="標楷體" w:hAnsi="Times New Roman" w:cs="Times New Roman" w:hint="eastAsia"/>
+        </w:rPr>
+        <w:t xml:space="preserve"> Book </w:t>
+      </w:r>
+      <w:r>
+        <w:rPr>
+          <w:rFonts w:ascii="Times New Roman" w:eastAsia="標楷體" w:hAnsi="Times New Roman" w:cs="Times New Roman" w:hint="eastAsia"/>
+        </w:rPr>
+        <w:t>類別的字串屬性</w:t>
+      </w:r>
+      <w:r>
+        <w:rPr>
+          <w:rFonts w:ascii="Times New Roman" w:eastAsia="標楷體" w:hAnsi="Times New Roman" w:cs="Times New Roman" w:hint="eastAsia"/>
+        </w:rPr>
+        <w:t xml:space="preserve"> (String)</w:t>
+      </w:r>
+      <w:r>
+        <w:rPr>
+          <w:rFonts w:ascii="Times New Roman" w:eastAsia="標楷體" w:hAnsi="Times New Roman" w:cs="Times New Roman" w:hint="eastAsia"/>
+        </w:rPr>
+        <w:t>。</w:t>
+      </w:r>
+    </w:p>
+    <w:p>
+      <w:pPr>
+        <w:pStyle w:val="a9"/>
+        <w:numPr>
+          <w:ilvl w:val="0"/>
+          <w:numId w:val="13"/>
+        </w:numPr>
+        <w:rPr>
+          <w:rFonts w:ascii="Times New Roman" w:eastAsia="標楷體" w:hAnsi="Times New Roman" w:cs="Times New Roman" w:hint="eastAsia"/>
+        </w:rPr>
+      </w:pPr>
+      <w:r>
+        <w:rPr>
+          <w:rFonts w:ascii="Times New Roman" w:eastAsia="標楷體" w:hAnsi="Times New Roman" w:cs="Times New Roman" w:hint="eastAsia"/>
+        </w:rPr>
+        <w:t>所在地：應作為</w:t>
+      </w:r>
+      <w:r>
+        <w:rPr>
+          <w:rFonts w:ascii="Times New Roman" w:eastAsia="標楷體" w:hAnsi="Times New Roman" w:cs="Times New Roman" w:hint="eastAsia"/>
+        </w:rPr>
+        <w:t xml:space="preserve"> User (</w:t>
+      </w:r>
+      <w:r>
+        <w:rPr>
+          <w:rFonts w:ascii="Times New Roman" w:eastAsia="標楷體" w:hAnsi="Times New Roman" w:cs="Times New Roman" w:hint="eastAsia"/>
+        </w:rPr>
+        <w:t>或</w:t>
+      </w:r>
+      <w:r>
+        <w:rPr>
+          <w:rFonts w:ascii="Times New Roman" w:eastAsia="標楷體" w:hAnsi="Times New Roman" w:cs="Times New Roman" w:hint="eastAsia"/>
+        </w:rPr>
+        <w:t xml:space="preserve"> Buyer/Seller) </w:t>
+      </w:r>
+      <w:r>
+        <w:rPr>
+          <w:rFonts w:ascii="Times New Roman" w:eastAsia="標楷體" w:hAnsi="Times New Roman" w:cs="Times New Roman" w:hint="eastAsia"/>
+        </w:rPr>
+        <w:t>的屬性。</w:t>
+      </w:r>
+    </w:p>
+    <w:p>
+      <w:pPr>
+        <w:pStyle w:val="a9"/>
+        <w:numPr>
+          <w:ilvl w:val="0"/>
+          <w:numId w:val="13"/>
+        </w:numPr>
+        <w:rPr>
+          <w:rFonts w:ascii="Times New Roman" w:eastAsia="標楷體" w:hAnsi="Times New Roman" w:cs="Times New Roman"/>
+        </w:rPr>
+      </w:pPr>
+      <w:r>
+        <w:rPr>
+          <w:rFonts w:ascii="Times New Roman" w:eastAsia="標楷體" w:hAnsi="Times New Roman" w:cs="Times New Roman" w:hint="eastAsia"/>
+        </w:rPr>
+        <w:t>類別名稱：應作為</w:t>
+      </w:r>
+      <w:r>
+        <w:rPr>
+          <w:rFonts w:ascii="Times New Roman" w:eastAsia="標楷體" w:hAnsi="Times New Roman" w:cs="Times New Roman" w:hint="eastAsia"/>
+        </w:rPr>
+        <w:t xml:space="preserve"> Category </w:t>
+      </w:r>
+      <w:r>
+        <w:rPr>
+          <w:rFonts w:ascii="Times New Roman" w:eastAsia="標楷體" w:hAnsi="Times New Roman" w:cs="Times New Roman" w:hint="eastAsia"/>
+        </w:rPr>
+        <w:t>類別的屬性。</w:t>
+      </w:r>
+    </w:p>
+    <w:p>
+      <w:pPr>
+        <w:pStyle w:val="a9"/>
+        <w:numPr>
+          <w:ilvl w:val="0"/>
+          <w:numId w:val="13"/>
+        </w:numPr>
+        <w:rPr>
+          <w:rFonts w:ascii="Times New Roman" w:eastAsia="標楷體" w:hAnsi="Times New Roman" w:cs="Times New Roman"/>
+        </w:rPr>
+      </w:pPr>
+      <w:r>
+        <w:rPr>
+          <w:rFonts w:ascii="Times New Roman" w:eastAsia="標楷體" w:hAnsi="Times New Roman" w:cs="Times New Roman" w:hint="eastAsia"/>
+        </w:rPr>
+        <w:t>訂單資訊：這只是一堆</w:t>
+      </w:r>
+      <w:r>
+        <w:rPr>
+          <w:rFonts w:ascii="Times New Roman" w:eastAsia="標楷體" w:hAnsi="Times New Roman" w:cs="Times New Roman" w:hint="eastAsia"/>
+        </w:rPr>
+        <w:t xml:space="preserve"> Order </w:t>
+      </w:r>
+      <w:r>
+        <w:rPr>
+          <w:rFonts w:ascii="Times New Roman" w:eastAsia="標楷體" w:hAnsi="Times New Roman" w:cs="Times New Roman" w:hint="eastAsia"/>
+        </w:rPr>
+        <w:t>屬性的集合代稱。</w:t>
+      </w:r>
+    </w:p>
+    <w:p>
+      <w:pPr>
+        <w:pStyle w:val="a9"/>
+        <w:numPr>
+          <w:ilvl w:val="0"/>
+          <w:numId w:val="13"/>
+        </w:numPr>
+        <w:rPr>
+          <w:rFonts w:ascii="Times New Roman" w:eastAsia="標楷體" w:hAnsi="Times New Roman" w:cs="Times New Roman" w:hint="eastAsia"/>
+        </w:rPr>
+      </w:pPr>
+      <w:r>
+        <w:rPr>
+          <w:rFonts w:ascii="Times New Roman" w:eastAsia="標楷體" w:hAnsi="Times New Roman" w:cs="Times New Roman" w:hint="eastAsia"/>
+        </w:rPr>
+        <w:lastRenderedPageBreak/>
+        <w:t>書籍清單：在程式碼中通常是資料結構（如</w:t>
+      </w:r>
+      <w:r>
+        <w:rPr>
+          <w:rFonts w:ascii="Times New Roman" w:eastAsia="標楷體" w:hAnsi="Times New Roman" w:cs="Times New Roman" w:hint="eastAsia"/>
+        </w:rPr>
+        <w:t xml:space="preserve"> List&lt;Book&gt;</w:t>
+      </w:r>
+      <w:r>
+        <w:rPr>
+          <w:rFonts w:ascii="Times New Roman" w:eastAsia="標楷體" w:hAnsi="Times New Roman" w:cs="Times New Roman" w:hint="eastAsia"/>
+        </w:rPr>
+        <w:t>），本身不需要獨立成一個領域類別。</w:t>
+      </w:r>
+    </w:p>
+    <w:p>
+      <w:pPr>
+        <w:rPr>
+          <w:rFonts w:ascii="Times New Roman" w:eastAsia="標楷體" w:hAnsi="Times New Roman" w:cs="Times New Roman"/>
+        </w:rPr>
+      </w:pPr>
+      <w:r>
+        <w:rPr>
+          <w:rFonts w:ascii="Times New Roman" w:eastAsia="標楷體" w:hAnsi="Times New Roman" w:cs="Times New Roman" w:hint="eastAsia"/>
+        </w:rPr>
+        <w:t>3.</w:t>
+      </w:r>
+      <w:r>
+        <w:rPr>
+          <w:rFonts w:ascii="Times New Roman" w:eastAsia="標楷體" w:hAnsi="Times New Roman" w:cs="Times New Roman" w:hint="eastAsia"/>
+        </w:rPr>
+        <w:t>屬於</w:t>
+      </w:r>
+      <w:r>
+        <w:rPr>
+          <w:rFonts w:ascii="Times New Roman" w:eastAsia="標楷體" w:hAnsi="Times New Roman" w:cs="Times New Roman" w:hint="eastAsia"/>
+        </w:rPr>
+        <w:t>「</w:t>
+      </w:r>
+      <w:r>
+        <w:rPr>
+          <w:rFonts w:ascii="Times New Roman" w:eastAsia="標楷體" w:hAnsi="Times New Roman" w:cs="Times New Roman" w:hint="eastAsia"/>
+        </w:rPr>
+        <w:t>事件</w:t>
+      </w:r>
+      <w:r>
+        <w:rPr>
+          <w:rFonts w:ascii="Times New Roman" w:eastAsia="標楷體" w:hAnsi="Times New Roman" w:cs="Times New Roman" w:hint="eastAsia"/>
+        </w:rPr>
+        <w:t>」</w:t>
+      </w:r>
+      <w:r>
+        <w:rPr>
+          <w:rFonts w:ascii="Times New Roman" w:eastAsia="標楷體" w:hAnsi="Times New Roman" w:cs="Times New Roman" w:hint="eastAsia"/>
+        </w:rPr>
+        <w:t>：</w:t>
+      </w:r>
+    </w:p>
+    <w:p>
+      <w:pPr>
+        <w:pStyle w:val="a9"/>
+        <w:numPr>
+          <w:ilvl w:val="0"/>
+          <w:numId w:val="14"/>
+        </w:numPr>
+        <w:rPr>
+          <w:rFonts w:ascii="Times New Roman" w:eastAsia="標楷體" w:hAnsi="Times New Roman" w:cs="Times New Roman" w:hint="eastAsia"/>
+        </w:rPr>
+      </w:pPr>
+      <w:r>
+        <w:rPr>
+          <w:rFonts w:ascii="Times New Roman" w:eastAsia="標楷體" w:hAnsi="Times New Roman" w:cs="Times New Roman" w:hint="eastAsia"/>
+        </w:rPr>
+        <w:t>交易：在此系統下，通常與「訂單</w:t>
+      </w:r>
+      <w:r>
+        <w:rPr>
+          <w:rFonts w:ascii="Times New Roman" w:eastAsia="標楷體" w:hAnsi="Times New Roman" w:cs="Times New Roman" w:hint="eastAsia"/>
+        </w:rPr>
+        <w:t xml:space="preserve"> (Order)</w:t>
+      </w:r>
+      <w:r>
+        <w:rPr>
+          <w:rFonts w:ascii="Times New Roman" w:eastAsia="標楷體" w:hAnsi="Times New Roman" w:cs="Times New Roman" w:hint="eastAsia"/>
+        </w:rPr>
+        <w:t>」完全是同義詞，保留「訂單」即可。</w:t>
+      </w:r>
+    </w:p>
+    <w:p>
+      <w:pPr>
+        <w:pStyle w:val="a9"/>
+        <w:numPr>
+          <w:ilvl w:val="0"/>
+          <w:numId w:val="14"/>
+        </w:numPr>
+        <w:rPr>
+          <w:rFonts w:ascii="Times New Roman" w:eastAsia="標楷體" w:hAnsi="Times New Roman" w:cs="Times New Roman" w:hint="eastAsia"/>
+        </w:rPr>
+      </w:pPr>
+      <w:r>
+        <w:rPr>
+          <w:rFonts w:ascii="Times New Roman" w:eastAsia="標楷體" w:hAnsi="Times New Roman" w:cs="Times New Roman" w:hint="eastAsia"/>
+        </w:rPr>
+        <w:t>訂單通知：這是一個系統觸發的事件，而不是靜態實體。</w:t>
+      </w:r>
+    </w:p>
+    <w:p>
+      <w:pPr>
+        <w:pStyle w:val="a9"/>
+        <w:numPr>
+          <w:ilvl w:val="0"/>
+          <w:numId w:val="14"/>
+        </w:numPr>
+        <w:rPr>
+          <w:rFonts w:ascii="Times New Roman" w:eastAsia="標楷體" w:hAnsi="Times New Roman" w:cs="Times New Roman" w:hint="eastAsia"/>
+        </w:rPr>
+      </w:pPr>
+      <w:r>
+        <w:rPr>
+          <w:rFonts w:ascii="Times New Roman" w:eastAsia="標楷體" w:hAnsi="Times New Roman" w:cs="Times New Roman" w:hint="eastAsia"/>
+        </w:rPr>
+        <w:t>關鍵字、價格範圍、搜尋條件：這些是執行「搜尋」這個方法時傳入的「參數</w:t>
+      </w:r>
+      <w:r>
+        <w:rPr>
+          <w:rFonts w:ascii="Times New Roman" w:eastAsia="標楷體" w:hAnsi="Times New Roman" w:cs="Times New Roman" w:hint="eastAsia"/>
+        </w:rPr>
+        <w:t xml:space="preserve"> (Parameters)</w:t>
+      </w:r>
+      <w:r>
+        <w:rPr>
+          <w:rFonts w:ascii="Times New Roman" w:eastAsia="標楷體" w:hAnsi="Times New Roman" w:cs="Times New Roman" w:hint="eastAsia"/>
+        </w:rPr>
+        <w:t>」，不具備實體物件的特性。</w:t>
+      </w:r>
+    </w:p>
+    <w:p>
+      <w:pPr>
+        <w:rPr>
+          <w:rFonts w:ascii="Times New Roman" w:eastAsia="標楷體" w:hAnsi="Times New Roman" w:cs="Times New Roman" w:hint="eastAsia"/>
+        </w:rPr>
+      </w:pPr>
+    </w:p>
+    <w:p>
+      <w:pPr>
+        <w:pStyle w:val="3"/>
+      </w:pPr>
+      <w:r>
+        <w:rPr>
+          <w:rFonts w:hint="eastAsia"/>
+        </w:rPr>
+        <w:t>2.2.3 Good Classes</w:t>
+      </w:r>
+    </w:p>
+    <w:p>
+      <w:pPr>
+        <w:rPr>
+          <w:rFonts w:ascii="Times New Roman" w:eastAsia="標楷體" w:hAnsi="Times New Roman" w:cs="Times New Roman"/>
+        </w:rPr>
+      </w:pPr>
+    </w:p>
+    <w:p>
+      <w:pPr>
         <w:pStyle w:val="2"/>
+      </w:pPr>
+      <w:r>
         <w:rPr>
           <w:rFonts w:hint="eastAsia"/>
         </w:rPr>
+        <w:t>2.2 Add associations</w:t>
+      </w:r>
+    </w:p>
+    <w:p>
+      <w:pPr>
+        <w:rPr>
+          <w:rFonts w:ascii="Times New Roman" w:eastAsia="標楷體" w:hAnsi="Times New Roman" w:cs="Times New Roman"/>
+        </w:rPr>
+      </w:pPr>
+    </w:p>
+    <w:p>
+      <w:pPr>
+        <w:pStyle w:val="2"/>
       </w:pPr>
       <w:r>
         <w:rPr>
@@ -8197,6 +9535,7 @@
         <w:t>2.3 Add attributes</w:t>
       </w:r>
     </w:p>
+    <w:p/>
     <w:p>
       <w:pPr>
         <w:pStyle w:val="1"/>
@@ -8209,36 +9548,257 @@
         <w:t>Measurement</w:t>
       </w:r>
     </w:p>
+    <w:tbl>
+      <w:tblPr>
+        <w:tblStyle w:val="af2"/>
+        <w:tblW w:w="0" w:type="auto"/>
+        <w:tblLook w:val="04A0" w:firstRow="1" w:lastRow="0" w:firstColumn="1" w:lastColumn="0" w:noHBand="0" w:noVBand="1"/>
+      </w:tblPr>
+      <w:tblGrid>
+        <w:gridCol w:w="4148"/>
+        <w:gridCol w:w="4148"/>
+      </w:tblGrid>
+      <w:tr>
+        <w:tc>
+          <w:tcPr>
+            <w:tcW w:w="4148" w:type="dxa"/>
+          </w:tcPr>
+          <w:p>
+            <w:pPr>
+              <w:rPr>
+                <w:rFonts w:ascii="Times New Roman" w:eastAsia="標楷體" w:hAnsi="Times New Roman" w:cs="Times New Roman"/>
+              </w:rPr>
+            </w:pPr>
+            <w:r>
+              <w:rPr>
+                <w:rFonts w:ascii="Times New Roman" w:eastAsia="標楷體" w:hAnsi="Times New Roman" w:cs="Times New Roman" w:hint="eastAsia"/>
+              </w:rPr>
+              <w:t>Homework</w:t>
+            </w:r>
+          </w:p>
+        </w:tc>
+        <w:tc>
+          <w:tcPr>
+            <w:tcW w:w="4148" w:type="dxa"/>
+          </w:tcPr>
+          <w:p>
+            <w:pPr>
+              <w:rPr>
+                <w:rFonts w:ascii="Times New Roman" w:eastAsia="標楷體" w:hAnsi="Times New Roman" w:cs="Times New Roman"/>
+              </w:rPr>
+            </w:pPr>
+            <w:r>
+              <w:rPr>
+                <w:rFonts w:ascii="Times New Roman" w:eastAsia="標楷體" w:hAnsi="Times New Roman" w:cs="Times New Roman" w:hint="eastAsia"/>
+              </w:rPr>
+              <w:t>Time</w:t>
+            </w:r>
+          </w:p>
+        </w:tc>
+      </w:tr>
+      <w:tr>
+        <w:tc>
+          <w:tcPr>
+            <w:tcW w:w="4148" w:type="dxa"/>
+            <w:vMerge w:val="restart"/>
+          </w:tcPr>
+          <w:p>
+            <w:pPr>
+              <w:rPr>
+                <w:rFonts w:ascii="Times New Roman" w:eastAsia="標楷體" w:hAnsi="Times New Roman" w:cs="Times New Roman"/>
+              </w:rPr>
+            </w:pPr>
+            <w:r>
+              <w:rPr>
+                <w:rFonts w:ascii="Times New Roman" w:eastAsia="標楷體" w:hAnsi="Times New Roman" w:cs="Times New Roman" w:hint="eastAsia"/>
+              </w:rPr>
+              <w:t>HW #1</w:t>
+            </w:r>
+          </w:p>
+        </w:tc>
+        <w:tc>
+          <w:tcPr>
+            <w:tcW w:w="4148" w:type="dxa"/>
+          </w:tcPr>
+          <w:p>
+            <w:pPr>
+              <w:rPr>
+                <w:rFonts w:ascii="Times New Roman" w:eastAsia="標楷體" w:hAnsi="Times New Roman" w:cs="Times New Roman"/>
+              </w:rPr>
+            </w:pPr>
+            <w:r>
+              <w:rPr>
+                <w:rFonts w:ascii="Times New Roman" w:eastAsia="標楷體" w:hAnsi="Times New Roman" w:cs="Times New Roman" w:hint="eastAsia"/>
+              </w:rPr>
+              <w:t>26/02/28 20:17~22:07</w:t>
+            </w:r>
+          </w:p>
+        </w:tc>
+      </w:tr>
+      <w:tr>
+        <w:tc>
+          <w:tcPr>
+            <w:tcW w:w="4148" w:type="dxa"/>
+            <w:vMerge/>
+          </w:tcPr>
+          <w:p>
+            <w:pPr>
+              <w:rPr>
+                <w:rFonts w:ascii="Times New Roman" w:eastAsia="標楷體" w:hAnsi="Times New Roman" w:cs="Times New Roman"/>
+              </w:rPr>
+            </w:pPr>
+          </w:p>
+        </w:tc>
+        <w:tc>
+          <w:tcPr>
+            <w:tcW w:w="4148" w:type="dxa"/>
+          </w:tcPr>
+          <w:p>
+            <w:pPr>
+              <w:rPr>
+                <w:rFonts w:ascii="Times New Roman" w:eastAsia="標楷體" w:hAnsi="Times New Roman" w:cs="Times New Roman"/>
+              </w:rPr>
+            </w:pPr>
+            <w:r>
+              <w:rPr>
+                <w:rFonts w:ascii="Times New Roman" w:eastAsia="標楷體" w:hAnsi="Times New Roman" w:cs="Times New Roman" w:hint="eastAsia"/>
+              </w:rPr>
+              <w:t>26/03/02 17:15~18:19</w:t>
+            </w:r>
+          </w:p>
+        </w:tc>
+      </w:tr>
+      <w:tr>
+        <w:tc>
+          <w:tcPr>
+            <w:tcW w:w="4148" w:type="dxa"/>
+            <w:vMerge w:val="restart"/>
+          </w:tcPr>
+          <w:p>
+            <w:pPr>
+              <w:rPr>
+                <w:rFonts w:ascii="Times New Roman" w:eastAsia="標楷體" w:hAnsi="Times New Roman" w:cs="Times New Roman"/>
+              </w:rPr>
+            </w:pPr>
+          </w:p>
+        </w:tc>
+        <w:tc>
+          <w:tcPr>
+            <w:tcW w:w="4148" w:type="dxa"/>
+          </w:tcPr>
+          <w:p>
+            <w:pPr>
+              <w:rPr>
+                <w:rFonts w:ascii="Times New Roman" w:eastAsia="標楷體" w:hAnsi="Times New Roman" w:cs="Times New Roman"/>
+              </w:rPr>
+            </w:pPr>
+            <w:r>
+              <w:rPr>
+                <w:rFonts w:ascii="Times New Roman" w:eastAsia="標楷體" w:hAnsi="Times New Roman" w:cs="Times New Roman" w:hint="eastAsia"/>
+              </w:rPr>
+              <w:t>26/03/09 14:30~16:00</w:t>
+            </w:r>
+          </w:p>
+        </w:tc>
+      </w:tr>
+      <w:tr>
+        <w:tc>
+          <w:tcPr>
+            <w:tcW w:w="4148" w:type="dxa"/>
+            <w:vMerge/>
+          </w:tcPr>
+          <w:p>
+            <w:pPr>
+              <w:rPr>
+                <w:rFonts w:ascii="Times New Roman" w:eastAsia="標楷體" w:hAnsi="Times New Roman" w:cs="Times New Roman"/>
+              </w:rPr>
+            </w:pPr>
+          </w:p>
+        </w:tc>
+        <w:tc>
+          <w:tcPr>
+            <w:tcW w:w="4148" w:type="dxa"/>
+          </w:tcPr>
+          <w:p>
+            <w:pPr>
+              <w:rPr>
+                <w:rFonts w:ascii="Times New Roman" w:eastAsia="標楷體" w:hAnsi="Times New Roman" w:cs="Times New Roman"/>
+              </w:rPr>
+            </w:pPr>
+            <w:r>
+              <w:rPr>
+                <w:rFonts w:ascii="Times New Roman" w:eastAsia="標楷體" w:hAnsi="Times New Roman" w:cs="Times New Roman" w:hint="eastAsia"/>
+              </w:rPr>
+              <w:t>26/03/13 13:00~16:00</w:t>
+            </w:r>
+          </w:p>
+        </w:tc>
+      </w:tr>
+      <w:tr>
+        <w:tc>
+          <w:tcPr>
+            <w:tcW w:w="4148" w:type="dxa"/>
+          </w:tcPr>
+          <w:p>
+            <w:pPr>
+              <w:rPr>
+                <w:rFonts w:ascii="Times New Roman" w:eastAsia="標楷體" w:hAnsi="Times New Roman" w:cs="Times New Roman"/>
+              </w:rPr>
+            </w:pPr>
+          </w:p>
+        </w:tc>
+        <w:tc>
+          <w:tcPr>
+            <w:tcW w:w="4148" w:type="dxa"/>
+          </w:tcPr>
+          <w:p>
+            <w:pPr>
+              <w:rPr>
+                <w:rFonts w:ascii="Times New Roman" w:eastAsia="標楷體" w:hAnsi="Times New Roman" w:cs="Times New Roman"/>
+              </w:rPr>
+            </w:pPr>
+          </w:p>
+        </w:tc>
+      </w:tr>
+      <w:tr>
+        <w:tc>
+          <w:tcPr>
+            <w:tcW w:w="4148" w:type="dxa"/>
+          </w:tcPr>
+          <w:p>
+            <w:pPr>
+              <w:rPr>
+                <w:rFonts w:ascii="Times New Roman" w:eastAsia="標楷體" w:hAnsi="Times New Roman" w:cs="Times New Roman"/>
+              </w:rPr>
+            </w:pPr>
+          </w:p>
+        </w:tc>
+        <w:tc>
+          <w:tcPr>
+            <w:tcW w:w="4148" w:type="dxa"/>
+          </w:tcPr>
+          <w:p>
+            <w:pPr>
+              <w:rPr>
+                <w:rFonts w:ascii="Times New Roman" w:eastAsia="標楷體" w:hAnsi="Times New Roman" w:cs="Times New Roman" w:hint="eastAsia"/>
+              </w:rPr>
+            </w:pPr>
+            <w:r>
+              <w:rPr>
+                <w:rFonts w:ascii="Times New Roman" w:eastAsia="標楷體" w:hAnsi="Times New Roman" w:cs="Times New Roman" w:hint="eastAsia"/>
+              </w:rPr>
+              <w:t xml:space="preserve">26/03/27 </w:t>
+            </w:r>
+          </w:p>
+        </w:tc>
+      </w:tr>
+    </w:tbl>
     <w:p>
       <w:pPr>
         <w:rPr>
           <w:rFonts w:ascii="Times New Roman" w:eastAsia="標楷體" w:hAnsi="Times New Roman" w:cs="Times New Roman"/>
         </w:rPr>
       </w:pPr>
-      <w:r>
-        <w:rPr>
-          <w:rFonts w:ascii="Times New Roman" w:eastAsia="標楷體" w:hAnsi="Times New Roman" w:cs="Times New Roman" w:hint="eastAsia"/>
-        </w:rPr>
-        <w:t>26/</w:t>
-      </w:r>
-      <w:r>
-        <w:rPr>
-          <w:rFonts w:ascii="Times New Roman" w:eastAsia="標楷體" w:hAnsi="Times New Roman" w:cs="Times New Roman" w:hint="eastAsia"/>
-        </w:rPr>
-        <w:t xml:space="preserve">02/28 </w:t>
-      </w:r>
-      <w:r>
-        <w:rPr>
-          <w:rFonts w:ascii="Times New Roman" w:eastAsia="標楷體" w:hAnsi="Times New Roman" w:cs="Times New Roman" w:hint="eastAsia"/>
-        </w:rPr>
-        <w:t>20:17~</w:t>
-      </w:r>
-      <w:r>
-        <w:rPr>
-          <w:rFonts w:ascii="Times New Roman" w:eastAsia="標楷體" w:hAnsi="Times New Roman" w:cs="Times New Roman" w:hint="eastAsia"/>
-        </w:rPr>
-        <w:t>22:07</w:t>
-      </w:r>
     </w:p>
     <w:p>
       <w:pPr>
@@ -8246,50 +9806,6 @@
           <w:rFonts w:ascii="Times New Roman" w:eastAsia="標楷體" w:hAnsi="Times New Roman" w:cs="Times New Roman"/>
         </w:rPr>
       </w:pPr>
-      <w:r>
-        <w:rPr>
-          <w:rFonts w:ascii="Times New Roman" w:eastAsia="標楷體" w:hAnsi="Times New Roman" w:cs="Times New Roman" w:hint="eastAsia"/>
-        </w:rPr>
-        <w:t xml:space="preserve">26/03/02 </w:t>
-      </w:r>
-      <w:r>
-        <w:rPr>
-          <w:rFonts w:ascii="Times New Roman" w:eastAsia="標楷體" w:hAnsi="Times New Roman" w:cs="Times New Roman" w:hint="eastAsia"/>
-        </w:rPr>
-        <w:t>17:15~</w:t>
-      </w:r>
-      <w:r>
-        <w:rPr>
-          <w:rFonts w:ascii="Times New Roman" w:eastAsia="標楷體" w:hAnsi="Times New Roman" w:cs="Times New Roman" w:hint="eastAsia"/>
-        </w:rPr>
-        <w:t>18:19</w:t>
-      </w:r>
-    </w:p>
-    <w:p>
-      <w:pPr>
-        <w:rPr>
-          <w:rFonts w:ascii="Times New Roman" w:eastAsia="標楷體" w:hAnsi="Times New Roman" w:cs="Times New Roman"/>
-        </w:rPr>
-      </w:pPr>
-      <w:r>
-        <w:rPr>
-          <w:rFonts w:ascii="Times New Roman" w:eastAsia="標楷體" w:hAnsi="Times New Roman" w:cs="Times New Roman" w:hint="eastAsia"/>
-        </w:rPr>
-        <w:t>26/03/09 14:30~16:00</w:t>
-      </w:r>
-    </w:p>
-    <w:p>
-      <w:pPr>
-        <w:rPr>
-          <w:rFonts w:ascii="Times New Roman" w:eastAsia="標楷體" w:hAnsi="Times New Roman" w:cs="Times New Roman"/>
-        </w:rPr>
-      </w:pPr>
-      <w:r>
-        <w:rPr>
-          <w:rFonts w:ascii="Times New Roman" w:eastAsia="標楷體" w:hAnsi="Times New Roman" w:cs="Times New Roman" w:hint="eastAsia"/>
-        </w:rPr>
-        <w:t>26/03/13 13:00~16:00</w:t>
-      </w:r>
     </w:p>
     <w:sectPr>
       <w:pgSz w:w="11906" w:h="16838"/>
@@ -8302,7 +9818,7 @@
 </file>
 
 <file path=word/endnotes.xml><?xml version="1.0" encoding="utf-8"?>
-<w:endnotes xmlns:wpc="http://schemas.microsoft.com/office/word/2010/wordprocessingCanvas" xmlns:cx="http://schemas.microsoft.com/office/drawing/2014/chartex" xmlns:cx1="http://schemas.microsoft.com/office/drawing/2015/9/8/chartex" xmlns:cx2="http://schemas.microsoft.com/office/drawing/2015/10/21/chartex" xmlns:cx3="http://schemas.microsoft.com/office/drawing/2016/5/9/chartex" xmlns:cx4="http://schemas.microsoft.com/office/drawing/2016/5/10/chartex" xmlns:cx5="http://schemas.microsoft.com/office/drawing/2016/5/11/chartex" xmlns:cx6="http://schemas.microsoft.com/office/drawing/2016/5/12/chartex" xmlns:cx7="http://schemas.microsoft.com/office/drawing/2016/5/13/chartex" xmlns:cx8="http://schemas.microsoft.com/office/drawing/2016/5/14/chartex" xmlns:mc="http://schemas.openxmlformats.org/markup-compatibility/2006" xmlns:aink="http://schemas.microsoft.com/office/drawing/2016/ink" xmlns:am3d="http://schemas.microsoft.com/office/drawing/2017/model3d" xmlns:o="urn:schemas-microsoft-com:office:office" xmlns:oel="http://schemas.microsoft.com/office/2019/extlst" xmlns:r="http://schemas.openxmlformats.org/officeDocument/2006/relationships" xmlns:m="http://schemas.openxmlformats.org/officeDocument/2006/math" xmlns:v="urn:schemas-microsoft-com:vml" xmlns:wp14="http://schemas.microsoft.com/office/word/2010/wordprocessingDrawing" xmlns:wp="http://schemas.openxmlformats.org/drawingml/2006/wordprocessingDrawing" xmlns:w10="urn:schemas-microsoft-com:office:word" xmlns:w="http://schemas.openxmlformats.org/wordprocessingml/2006/main" xmlns:w14="http://schemas.microsoft.com/office/word/2010/wordml" xmlns:w15="http://schemas.microsoft.com/office/word/2012/wordml" xmlns:w16cex="http://schemas.microsoft.com/office/word/2018/wordml/cex" xmlns:w16cid="http://schemas.microsoft.com/office/word/2016/wordml/cid" xmlns:w16="http://schemas.microsoft.com/office/word/2018/wordml" xmlns:w16sdtdh="http://schemas.microsoft.com/office/word/2020/wordml/sdtdatahash" xmlns:w16se="http://schemas.microsoft.com/office/word/2015/wordml/symex" xmlns:wpg="http://schemas.microsoft.com/office/word/2010/wordprocessingGroup" xmlns:wpi="http://schemas.microsoft.com/office/word/2010/wordprocessingInk" xmlns:wne="http://schemas.microsoft.com/office/word/2006/wordml" xmlns:wps="http://schemas.microsoft.com/office/word/2010/wordprocessingShape" mc:Ignorable="w14 w15 w16se w16cid w16 w16cex w16sdtdh wp14">
+<w:endnotes xmlns:wpc="http://schemas.microsoft.com/office/word/2010/wordprocessingCanvas" xmlns:cx="http://schemas.microsoft.com/office/drawing/2014/chartex" xmlns:cx1="http://schemas.microsoft.com/office/drawing/2015/9/8/chartex" xmlns:cx2="http://schemas.microsoft.com/office/drawing/2015/10/21/chartex" xmlns:cx3="http://schemas.microsoft.com/office/drawing/2016/5/9/chartex" xmlns:cx4="http://schemas.microsoft.com/office/drawing/2016/5/10/chartex" xmlns:cx5="http://schemas.microsoft.com/office/drawing/2016/5/11/chartex" xmlns:cx6="http://schemas.microsoft.com/office/drawing/2016/5/12/chartex" xmlns:cx7="http://schemas.microsoft.com/office/drawing/2016/5/13/chartex" xmlns:cx8="http://schemas.microsoft.com/office/drawing/2016/5/14/chartex" xmlns:mc="http://schemas.openxmlformats.org/markup-compatibility/2006" xmlns:aink="http://schemas.microsoft.com/office/drawing/2016/ink" xmlns:am3d="http://schemas.microsoft.com/office/drawing/2017/model3d" xmlns:o="urn:schemas-microsoft-com:office:office" xmlns:oel="http://schemas.microsoft.com/office/2019/extlst" xmlns:r="http://schemas.openxmlformats.org/officeDocument/2006/relationships" xmlns:m="http://schemas.openxmlformats.org/officeDocument/2006/math" xmlns:v="urn:schemas-microsoft-com:vml" xmlns:wp14="http://schemas.microsoft.com/office/word/2010/wordprocessingDrawing" xmlns:wp="http://schemas.openxmlformats.org/drawingml/2006/wordprocessingDrawing" xmlns:w10="urn:schemas-microsoft-com:office:word" xmlns:w="http://schemas.openxmlformats.org/wordprocessingml/2006/main" xmlns:w14="http://schemas.microsoft.com/office/word/2010/wordml" xmlns:w15="http://schemas.microsoft.com/office/word/2012/wordml" xmlns:w16cex="http://schemas.microsoft.com/office/word/2018/wordml/cex" xmlns:w16cid="http://schemas.microsoft.com/office/word/2016/wordml/cid" xmlns:w16="http://schemas.microsoft.com/office/word/2018/wordml" xmlns:w16du="http://schemas.microsoft.com/office/word/2023/wordml/word16du" xmlns:w16sdtdh="http://schemas.microsoft.com/office/word/2020/wordml/sdtdatahash" xmlns:w16sdtfl="http://schemas.microsoft.com/office/word/2024/wordml/sdtformatlock" xmlns:w16se="http://schemas.microsoft.com/office/word/2015/wordml/symex" xmlns:wpg="http://schemas.microsoft.com/office/word/2010/wordprocessingGroup" xmlns:wpi="http://schemas.microsoft.com/office/word/2010/wordprocessingInk" xmlns:wne="http://schemas.microsoft.com/office/word/2006/wordml" xmlns:wps="http://schemas.microsoft.com/office/word/2010/wordprocessingShape" mc:Ignorable="w14 w15 w16se w16cid w16 w16cex w16sdtdh w16sdtfl w16du wp14">
   <w:endnote w:type="separator" w:id="-1">
     <w:p>
       <w:pPr>
@@ -8327,7 +9843,7 @@
 </file>
 
 <file path=word/footnotes.xml><?xml version="1.0" encoding="utf-8"?>
-<w:footnotes xmlns:wpc="http://schemas.microsoft.com/office/word/2010/wordprocessingCanvas" xmlns:cx="http://schemas.microsoft.com/office/drawing/2014/chartex" xmlns:cx1="http://schemas.microsoft.com/office/drawing/2015/9/8/chartex" xmlns:cx2="http://schemas.microsoft.com/office/drawing/2015/10/21/chartex" xmlns:cx3="http://schemas.microsoft.com/office/drawing/2016/5/9/chartex" xmlns:cx4="http://schemas.microsoft.com/office/drawing/2016/5/10/chartex" xmlns:cx5="http://schemas.microsoft.com/office/drawing/2016/5/11/chartex" xmlns:cx6="http://schemas.microsoft.com/office/drawing/2016/5/12/chartex" xmlns:cx7="http://schemas.microsoft.com/office/drawing/2016/5/13/chartex" xmlns:cx8="http://schemas.microsoft.com/office/drawing/2016/5/14/chartex" xmlns:mc="http://schemas.openxmlformats.org/markup-compatibility/2006" xmlns:aink="http://schemas.microsoft.com/office/drawing/2016/ink" xmlns:am3d="http://schemas.microsoft.com/office/drawing/2017/model3d" xmlns:o="urn:schemas-microsoft-com:office:office" xmlns:oel="http://schemas.microsoft.com/office/2019/extlst" xmlns:r="http://schemas.openxmlformats.org/officeDocument/2006/relationships" xmlns:m="http://schemas.openxmlformats.org/officeDocument/2006/math" xmlns:v="urn:schemas-microsoft-com:vml" xmlns:wp14="http://schemas.microsoft.com/office/word/2010/wordprocessingDrawing" xmlns:wp="http://schemas.openxmlformats.org/drawingml/2006/wordprocessingDrawing" xmlns:w10="urn:schemas-microsoft-com:office:word" xmlns:w="http://schemas.openxmlformats.org/wordprocessingml/2006/main" xmlns:w14="http://schemas.microsoft.com/office/word/2010/wordml" xmlns:w15="http://schemas.microsoft.com/office/word/2012/wordml" xmlns:w16cex="http://schemas.microsoft.com/office/word/2018/wordml/cex" xmlns:w16cid="http://schemas.microsoft.com/office/word/2016/wordml/cid" xmlns:w16="http://schemas.microsoft.com/office/word/2018/wordml" xmlns:w16sdtdh="http://schemas.microsoft.com/office/word/2020/wordml/sdtdatahash" xmlns:w16se="http://schemas.microsoft.com/office/word/2015/wordml/symex" xmlns:wpg="http://schemas.microsoft.com/office/word/2010/wordprocessingGroup" xmlns:wpi="http://schemas.microsoft.com/office/word/2010/wordprocessingInk" xmlns:wne="http://schemas.microsoft.com/office/word/2006/wordml" xmlns:wps="http://schemas.microsoft.com/office/word/2010/wordprocessingShape" mc:Ignorable="w14 w15 w16se w16cid w16 w16cex w16sdtdh wp14">
+<w:footnotes xmlns:wpc="http://schemas.microsoft.com/office/word/2010/wordprocessingCanvas" xmlns:cx="http://schemas.microsoft.com/office/drawing/2014/chartex" xmlns:cx1="http://schemas.microsoft.com/office/drawing/2015/9/8/chartex" xmlns:cx2="http://schemas.microsoft.com/office/drawing/2015/10/21/chartex" xmlns:cx3="http://schemas.microsoft.com/office/drawing/2016/5/9/chartex" xmlns:cx4="http://schemas.microsoft.com/office/drawing/2016/5/10/chartex" xmlns:cx5="http://schemas.microsoft.com/office/drawing/2016/5/11/chartex" xmlns:cx6="http://schemas.microsoft.com/office/drawing/2016/5/12/chartex" xmlns:cx7="http://schemas.microsoft.com/office/drawing/2016/5/13/chartex" xmlns:cx8="http://schemas.microsoft.com/office/drawing/2016/5/14/chartex" xmlns:mc="http://schemas.openxmlformats.org/markup-compatibility/2006" xmlns:aink="http://schemas.microsoft.com/office/drawing/2016/ink" xmlns:am3d="http://schemas.microsoft.com/office/drawing/2017/model3d" xmlns:o="urn:schemas-microsoft-com:office:office" xmlns:oel="http://schemas.microsoft.com/office/2019/extlst" xmlns:r="http://schemas.openxmlformats.org/officeDocument/2006/relationships" xmlns:m="http://schemas.openxmlformats.org/officeDocument/2006/math" xmlns:v="urn:schemas-microsoft-com:vml" xmlns:wp14="http://schemas.microsoft.com/office/word/2010/wordprocessingDrawing" xmlns:wp="http://schemas.openxmlformats.org/drawingml/2006/wordprocessingDrawing" xmlns:w10="urn:schemas-microsoft-com:office:word" xmlns:w="http://schemas.openxmlformats.org/wordprocessingml/2006/main" xmlns:w14="http://schemas.microsoft.com/office/word/2010/wordml" xmlns:w15="http://schemas.microsoft.com/office/word/2012/wordml" xmlns:w16cex="http://schemas.microsoft.com/office/word/2018/wordml/cex" xmlns:w16cid="http://schemas.microsoft.com/office/word/2016/wordml/cid" xmlns:w16="http://schemas.microsoft.com/office/word/2018/wordml" xmlns:w16du="http://schemas.microsoft.com/office/word/2023/wordml/word16du" xmlns:w16sdtdh="http://schemas.microsoft.com/office/word/2020/wordml/sdtdatahash" xmlns:w16sdtfl="http://schemas.microsoft.com/office/word/2024/wordml/sdtformatlock" xmlns:w16se="http://schemas.microsoft.com/office/word/2015/wordml/symex" xmlns:wpg="http://schemas.microsoft.com/office/word/2010/wordprocessingGroup" xmlns:wpi="http://schemas.microsoft.com/office/word/2010/wordprocessingInk" xmlns:wne="http://schemas.microsoft.com/office/word/2006/wordml" xmlns:wps="http://schemas.microsoft.com/office/word/2010/wordprocessingShape" mc:Ignorable="w14 w15 w16se w16cid w16 w16cex w16sdtdh w16sdtfl w16du wp14">
   <w:footnote w:type="separator" w:id="-1">
     <w:p>
       <w:pPr>
@@ -8352,8 +9868,121 @@
 </file>
 
 <file path=word/numbering.xml><?xml version="1.0" encoding="utf-8"?>
-<w:numbering xmlns:wpc="http://schemas.microsoft.com/office/word/2010/wordprocessingCanvas" xmlns:cx="http://schemas.microsoft.com/office/drawing/2014/chartex" xmlns:cx1="http://schemas.microsoft.com/office/drawing/2015/9/8/chartex" xmlns:cx2="http://schemas.microsoft.com/office/drawing/2015/10/21/chartex" xmlns:cx3="http://schemas.microsoft.com/office/drawing/2016/5/9/chartex" xmlns:cx4="http://schemas.microsoft.com/office/drawing/2016/5/10/chartex" xmlns:cx5="http://schemas.microsoft.com/office/drawing/2016/5/11/chartex" xmlns:cx6="http://schemas.microsoft.com/office/drawing/2016/5/12/chartex" xmlns:cx7="http://schemas.microsoft.com/office/drawing/2016/5/13/chartex" xmlns:cx8="http://schemas.microsoft.com/office/drawing/2016/5/14/chartex" xmlns:mc="http://schemas.openxmlformats.org/markup-compatibility/2006" xmlns:aink="http://schemas.microsoft.com/office/drawing/2016/ink" xmlns:am3d="http://schemas.microsoft.com/office/drawing/2017/model3d" xmlns:o="urn:schemas-microsoft-com:office:office" xmlns:oel="http://schemas.microsoft.com/office/2019/extlst" xmlns:r="http://schemas.openxmlformats.org/officeDocument/2006/relationships" xmlns:m="http://schemas.openxmlformats.org/officeDocument/2006/math" xmlns:v="urn:schemas-microsoft-com:vml" xmlns:wp14="http://schemas.microsoft.com/office/word/2010/wordprocessingDrawing" xmlns:wp="http://schemas.openxmlformats.org/drawingml/2006/wordprocessingDrawing" xmlns:w10="urn:schemas-microsoft-com:office:word" xmlns:w="http://schemas.openxmlformats.org/wordprocessingml/2006/main" xmlns:w14="http://schemas.microsoft.com/office/word/2010/wordml" xmlns:w15="http://schemas.microsoft.com/office/word/2012/wordml" xmlns:w16cex="http://schemas.microsoft.com/office/word/2018/wordml/cex" xmlns:w16cid="http://schemas.microsoft.com/office/word/2016/wordml/cid" xmlns:w16="http://schemas.microsoft.com/office/word/2018/wordml" xmlns:w16sdtdh="http://schemas.microsoft.com/office/word/2020/wordml/sdtdatahash" xmlns:w16se="http://schemas.microsoft.com/office/word/2015/wordml/symex" xmlns:wpg="http://schemas.microsoft.com/office/word/2010/wordprocessingGroup" xmlns:wpi="http://schemas.microsoft.com/office/word/2010/wordprocessingInk" xmlns:wne="http://schemas.microsoft.com/office/word/2006/wordml" xmlns:wps="http://schemas.microsoft.com/office/word/2010/wordprocessingShape" mc:Ignorable="w14 w15 w16se w16cid w16 w16cex w16sdtdh wp14">
+<w:numbering xmlns:wpc="http://schemas.microsoft.com/office/word/2010/wordprocessingCanvas" xmlns:cx="http://schemas.microsoft.com/office/drawing/2014/chartex" xmlns:cx1="http://schemas.microsoft.com/office/drawing/2015/9/8/chartex" xmlns:cx2="http://schemas.microsoft.com/office/drawing/2015/10/21/chartex" xmlns:cx3="http://schemas.microsoft.com/office/drawing/2016/5/9/chartex" xmlns:cx4="http://schemas.microsoft.com/office/drawing/2016/5/10/chartex" xmlns:cx5="http://schemas.microsoft.com/office/drawing/2016/5/11/chartex" xmlns:cx6="http://schemas.microsoft.com/office/drawing/2016/5/12/chartex" xmlns:cx7="http://schemas.microsoft.com/office/drawing/2016/5/13/chartex" xmlns:cx8="http://schemas.microsoft.com/office/drawing/2016/5/14/chartex" xmlns:mc="http://schemas.openxmlformats.org/markup-compatibility/2006" xmlns:aink="http://schemas.microsoft.com/office/drawing/2016/ink" xmlns:am3d="http://schemas.microsoft.com/office/drawing/2017/model3d" xmlns:o="urn:schemas-microsoft-com:office:office" xmlns:oel="http://schemas.microsoft.com/office/2019/extlst" xmlns:r="http://schemas.openxmlformats.org/officeDocument/2006/relationships" xmlns:m="http://schemas.openxmlformats.org/officeDocument/2006/math" xmlns:v="urn:schemas-microsoft-com:vml" xmlns:wp14="http://schemas.microsoft.com/office/word/2010/wordprocessingDrawing" xmlns:wp="http://schemas.openxmlformats.org/drawingml/2006/wordprocessingDrawing" xmlns:w10="urn:schemas-microsoft-com:office:word" xmlns:w="http://schemas.openxmlformats.org/wordprocessingml/2006/main" xmlns:w14="http://schemas.microsoft.com/office/word/2010/wordml" xmlns:w15="http://schemas.microsoft.com/office/word/2012/wordml" xmlns:w16cex="http://schemas.microsoft.com/office/word/2018/wordml/cex" xmlns:w16cid="http://schemas.microsoft.com/office/word/2016/wordml/cid" xmlns:w16="http://schemas.microsoft.com/office/word/2018/wordml" xmlns:w16du="http://schemas.microsoft.com/office/word/2023/wordml/word16du" xmlns:w16sdtdh="http://schemas.microsoft.com/office/word/2020/wordml/sdtdatahash" xmlns:w16sdtfl="http://schemas.microsoft.com/office/word/2024/wordml/sdtformatlock" xmlns:w16se="http://schemas.microsoft.com/office/word/2015/wordml/symex" xmlns:wpg="http://schemas.microsoft.com/office/word/2010/wordprocessingGroup" xmlns:wpi="http://schemas.microsoft.com/office/word/2010/wordprocessingInk" xmlns:wne="http://schemas.microsoft.com/office/word/2006/wordml" xmlns:wps="http://schemas.microsoft.com/office/word/2010/wordprocessingShape" mc:Ignorable="w14 w15 w16se w16cid w16 w16cex w16sdtdh w16sdtfl w16du wp14">
   <w:abstractNum w:abstractNumId="0" w15:restartNumberingAfterBreak="0">
+    <w:nsid w:val="0BA862C0"/>
+    <w:multiLevelType w:val="hybridMultilevel"/>
+    <w:tmpl w:val="6770B2D6"/>
+    <w:lvl w:ilvl="0" w:tplc="FB7AFAA2">
+      <w:start w:val="1"/>
+      <w:numFmt w:val="bullet"/>
+      <w:lvlText w:val=""/>
+      <w:lvlJc w:val="left"/>
+      <w:pPr>
+        <w:ind w:left="960" w:hanging="480"/>
+      </w:pPr>
+      <w:rPr>
+        <w:rFonts w:ascii="Wingdings" w:hAnsi="Wingdings" w:hint="default"/>
+      </w:rPr>
+    </w:lvl>
+    <w:lvl w:ilvl="1" w:tplc="04090003" w:tentative="1">
+      <w:start w:val="1"/>
+      <w:numFmt w:val="bullet"/>
+      <w:lvlText w:val=""/>
+      <w:lvlJc w:val="left"/>
+      <w:pPr>
+        <w:ind w:left="1440" w:hanging="480"/>
+      </w:pPr>
+      <w:rPr>
+        <w:rFonts w:ascii="Wingdings" w:hAnsi="Wingdings" w:hint="default"/>
+      </w:rPr>
+    </w:lvl>
+    <w:lvl w:ilvl="2" w:tplc="04090005" w:tentative="1">
+      <w:start w:val="1"/>
+      <w:numFmt w:val="bullet"/>
+      <w:lvlText w:val=""/>
+      <w:lvlJc w:val="left"/>
+      <w:pPr>
+        <w:ind w:left="1920" w:hanging="480"/>
+      </w:pPr>
+      <w:rPr>
+        <w:rFonts w:ascii="Wingdings" w:hAnsi="Wingdings" w:hint="default"/>
+      </w:rPr>
+    </w:lvl>
+    <w:lvl w:ilvl="3" w:tplc="04090001" w:tentative="1">
+      <w:start w:val="1"/>
+      <w:numFmt w:val="bullet"/>
+      <w:lvlText w:val=""/>
+      <w:lvlJc w:val="left"/>
+      <w:pPr>
+        <w:ind w:left="2400" w:hanging="480"/>
+      </w:pPr>
+      <w:rPr>
+        <w:rFonts w:ascii="Wingdings" w:hAnsi="Wingdings" w:hint="default"/>
+      </w:rPr>
+    </w:lvl>
+    <w:lvl w:ilvl="4" w:tplc="04090003" w:tentative="1">
+      <w:start w:val="1"/>
+      <w:numFmt w:val="bullet"/>
+      <w:lvlText w:val=""/>
+      <w:lvlJc w:val="left"/>
+      <w:pPr>
+        <w:ind w:left="2880" w:hanging="480"/>
+      </w:pPr>
+      <w:rPr>
+        <w:rFonts w:ascii="Wingdings" w:hAnsi="Wingdings" w:hint="default"/>
+      </w:rPr>
+    </w:lvl>
+    <w:lvl w:ilvl="5" w:tplc="04090005" w:tentative="1">
+      <w:start w:val="1"/>
+      <w:numFmt w:val="bullet"/>
+      <w:lvlText w:val=""/>
+      <w:lvlJc w:val="left"/>
+      <w:pPr>
+        <w:ind w:left="3360" w:hanging="480"/>
+      </w:pPr>
+      <w:rPr>
+        <w:rFonts w:ascii="Wingdings" w:hAnsi="Wingdings" w:hint="default"/>
+      </w:rPr>
+    </w:lvl>
+    <w:lvl w:ilvl="6" w:tplc="04090001" w:tentative="1">
+      <w:start w:val="1"/>
+      <w:numFmt w:val="bullet"/>
+      <w:lvlText w:val=""/>
+      <w:lvlJc w:val="left"/>
+      <w:pPr>
+        <w:ind w:left="3840" w:hanging="480"/>
+      </w:pPr>
+      <w:rPr>
+        <w:rFonts w:ascii="Wingdings" w:hAnsi="Wingdings" w:hint="default"/>
+      </w:rPr>
+    </w:lvl>
+    <w:lvl w:ilvl="7" w:tplc="04090003" w:tentative="1">
+      <w:start w:val="1"/>
+      <w:numFmt w:val="bullet"/>
+      <w:lvlText w:val=""/>
+      <w:lvlJc w:val="left"/>
+      <w:pPr>
+        <w:ind w:left="4320" w:hanging="480"/>
+      </w:pPr>
+      <w:rPr>
+        <w:rFonts w:ascii="Wingdings" w:hAnsi="Wingdings" w:hint="default"/>
+      </w:rPr>
+    </w:lvl>
+    <w:lvl w:ilvl="8" w:tplc="04090005" w:tentative="1">
+      <w:start w:val="1"/>
+      <w:numFmt w:val="bullet"/>
+      <w:lvlText w:val=""/>
+      <w:lvlJc w:val="left"/>
+      <w:pPr>
+        <w:ind w:left="4800" w:hanging="480"/>
+      </w:pPr>
+      <w:rPr>
+        <w:rFonts w:ascii="Wingdings" w:hAnsi="Wingdings" w:hint="default"/>
+      </w:rPr>
+    </w:lvl>
+  </w:abstractNum>
+  <w:abstractNum w:abstractNumId="1" w15:restartNumberingAfterBreak="0">
     <w:nsid w:val="0E237A54"/>
     <w:multiLevelType w:val="hybridMultilevel"/>
     <w:tmpl w:val="EE5AA63C"/>
@@ -8442,7 +10071,7 @@
       </w:pPr>
     </w:lvl>
   </w:abstractNum>
-  <w:abstractNum w:abstractNumId="1" w15:restartNumberingAfterBreak="0">
+  <w:abstractNum w:abstractNumId="2" w15:restartNumberingAfterBreak="0">
     <w:nsid w:val="10E4285D"/>
     <w:multiLevelType w:val="multilevel"/>
     <w:tmpl w:val="66BEF5D4"/>
@@ -8555,7 +10184,7 @@
       </w:pPr>
     </w:lvl>
   </w:abstractNum>
-  <w:abstractNum w:abstractNumId="2" w15:restartNumberingAfterBreak="0">
+  <w:abstractNum w:abstractNumId="3" w15:restartNumberingAfterBreak="0">
     <w:nsid w:val="1F397696"/>
     <w:multiLevelType w:val="hybridMultilevel"/>
     <w:tmpl w:val="24763604"/>
@@ -8644,7 +10273,7 @@
       </w:pPr>
     </w:lvl>
   </w:abstractNum>
-  <w:abstractNum w:abstractNumId="3" w15:restartNumberingAfterBreak="0">
+  <w:abstractNum w:abstractNumId="4" w15:restartNumberingAfterBreak="0">
     <w:nsid w:val="261C4754"/>
     <w:multiLevelType w:val="multilevel"/>
     <w:tmpl w:val="42008736"/>
@@ -8757,7 +10386,7 @@
       </w:rPr>
     </w:lvl>
   </w:abstractNum>
-  <w:abstractNum w:abstractNumId="4" w15:restartNumberingAfterBreak="0">
+  <w:abstractNum w:abstractNumId="5" w15:restartNumberingAfterBreak="0">
     <w:nsid w:val="2DC22962"/>
     <w:multiLevelType w:val="multilevel"/>
     <w:tmpl w:val="79D68678"/>
@@ -8870,7 +10499,120 @@
       </w:pPr>
     </w:lvl>
   </w:abstractNum>
-  <w:abstractNum w:abstractNumId="5" w15:restartNumberingAfterBreak="0">
+  <w:abstractNum w:abstractNumId="6" w15:restartNumberingAfterBreak="0">
+    <w:nsid w:val="30F90C66"/>
+    <w:multiLevelType w:val="hybridMultilevel"/>
+    <w:tmpl w:val="8C24E380"/>
+    <w:lvl w:ilvl="0" w:tplc="FB7AFAA2">
+      <w:start w:val="1"/>
+      <w:numFmt w:val="bullet"/>
+      <w:lvlText w:val=""/>
+      <w:lvlJc w:val="left"/>
+      <w:pPr>
+        <w:ind w:left="840" w:hanging="480"/>
+      </w:pPr>
+      <w:rPr>
+        <w:rFonts w:ascii="Wingdings" w:hAnsi="Wingdings" w:hint="default"/>
+      </w:rPr>
+    </w:lvl>
+    <w:lvl w:ilvl="1" w:tplc="04090003" w:tentative="1">
+      <w:start w:val="1"/>
+      <w:numFmt w:val="bullet"/>
+      <w:lvlText w:val=""/>
+      <w:lvlJc w:val="left"/>
+      <w:pPr>
+        <w:ind w:left="1320" w:hanging="480"/>
+      </w:pPr>
+      <w:rPr>
+        <w:rFonts w:ascii="Wingdings" w:hAnsi="Wingdings" w:hint="default"/>
+      </w:rPr>
+    </w:lvl>
+    <w:lvl w:ilvl="2" w:tplc="04090005" w:tentative="1">
+      <w:start w:val="1"/>
+      <w:numFmt w:val="bullet"/>
+      <w:lvlText w:val=""/>
+      <w:lvlJc w:val="left"/>
+      <w:pPr>
+        <w:ind w:left="1800" w:hanging="480"/>
+      </w:pPr>
+      <w:rPr>
+        <w:rFonts w:ascii="Wingdings" w:hAnsi="Wingdings" w:hint="default"/>
+      </w:rPr>
+    </w:lvl>
+    <w:lvl w:ilvl="3" w:tplc="04090001" w:tentative="1">
+      <w:start w:val="1"/>
+      <w:numFmt w:val="bullet"/>
+      <w:lvlText w:val=""/>
+      <w:lvlJc w:val="left"/>
+      <w:pPr>
+        <w:ind w:left="2280" w:hanging="480"/>
+      </w:pPr>
+      <w:rPr>
+        <w:rFonts w:ascii="Wingdings" w:hAnsi="Wingdings" w:hint="default"/>
+      </w:rPr>
+    </w:lvl>
+    <w:lvl w:ilvl="4" w:tplc="04090003" w:tentative="1">
+      <w:start w:val="1"/>
+      <w:numFmt w:val="bullet"/>
+      <w:lvlText w:val=""/>
+      <w:lvlJc w:val="left"/>
+      <w:pPr>
+        <w:ind w:left="2760" w:hanging="480"/>
+      </w:pPr>
+      <w:rPr>
+        <w:rFonts w:ascii="Wingdings" w:hAnsi="Wingdings" w:hint="default"/>
+      </w:rPr>
+    </w:lvl>
+    <w:lvl w:ilvl="5" w:tplc="04090005" w:tentative="1">
+      <w:start w:val="1"/>
+      <w:numFmt w:val="bullet"/>
+      <w:lvlText w:val=""/>
+      <w:lvlJc w:val="left"/>
+      <w:pPr>
+        <w:ind w:left="3240" w:hanging="480"/>
+      </w:pPr>
+      <w:rPr>
+        <w:rFonts w:ascii="Wingdings" w:hAnsi="Wingdings" w:hint="default"/>
+      </w:rPr>
+    </w:lvl>
+    <w:lvl w:ilvl="6" w:tplc="04090001" w:tentative="1">
+      <w:start w:val="1"/>
+      <w:numFmt w:val="bullet"/>
+      <w:lvlText w:val=""/>
+      <w:lvlJc w:val="left"/>
+      <w:pPr>
+        <w:ind w:left="3720" w:hanging="480"/>
+      </w:pPr>
+      <w:rPr>
+        <w:rFonts w:ascii="Wingdings" w:hAnsi="Wingdings" w:hint="default"/>
+      </w:rPr>
+    </w:lvl>
+    <w:lvl w:ilvl="7" w:tplc="04090003" w:tentative="1">
+      <w:start w:val="1"/>
+      <w:numFmt w:val="bullet"/>
+      <w:lvlText w:val=""/>
+      <w:lvlJc w:val="left"/>
+      <w:pPr>
+        <w:ind w:left="4200" w:hanging="480"/>
+      </w:pPr>
+      <w:rPr>
+        <w:rFonts w:ascii="Wingdings" w:hAnsi="Wingdings" w:hint="default"/>
+      </w:rPr>
+    </w:lvl>
+    <w:lvl w:ilvl="8" w:tplc="04090005" w:tentative="1">
+      <w:start w:val="1"/>
+      <w:numFmt w:val="bullet"/>
+      <w:lvlText w:val=""/>
+      <w:lvlJc w:val="left"/>
+      <w:pPr>
+        <w:ind w:left="4680" w:hanging="480"/>
+      </w:pPr>
+      <w:rPr>
+        <w:rFonts w:ascii="Wingdings" w:hAnsi="Wingdings" w:hint="default"/>
+      </w:rPr>
+    </w:lvl>
+  </w:abstractNum>
+  <w:abstractNum w:abstractNumId="7" w15:restartNumberingAfterBreak="0">
     <w:nsid w:val="310300D0"/>
     <w:multiLevelType w:val="hybridMultilevel"/>
     <w:tmpl w:val="B03EA8F6"/>
@@ -8959,7 +10701,7 @@
       </w:pPr>
     </w:lvl>
   </w:abstractNum>
-  <w:abstractNum w:abstractNumId="6" w15:restartNumberingAfterBreak="0">
+  <w:abstractNum w:abstractNumId="8" w15:restartNumberingAfterBreak="0">
     <w:nsid w:val="39EE2293"/>
     <w:multiLevelType w:val="multilevel"/>
     <w:tmpl w:val="445E386E"/>
@@ -9072,7 +10814,7 @@
       </w:pPr>
     </w:lvl>
   </w:abstractNum>
-  <w:abstractNum w:abstractNumId="7" w15:restartNumberingAfterBreak="0">
+  <w:abstractNum w:abstractNumId="9" w15:restartNumberingAfterBreak="0">
     <w:nsid w:val="49FA50B4"/>
     <w:multiLevelType w:val="multilevel"/>
     <w:tmpl w:val="C0D8CE2A"/>
@@ -9193,17 +10935,17 @@
       </w:rPr>
     </w:lvl>
   </w:abstractNum>
-  <w:abstractNum w:abstractNumId="8" w15:restartNumberingAfterBreak="0">
-    <w:nsid w:val="4B030739"/>
+  <w:abstractNum w:abstractNumId="10" w15:restartNumberingAfterBreak="0">
+    <w:nsid w:val="4A9A42A9"/>
     <w:multiLevelType w:val="hybridMultilevel"/>
-    <w:tmpl w:val="67E4FD68"/>
+    <w:tmpl w:val="10A4ACCC"/>
     <w:lvl w:ilvl="0" w:tplc="FB7AFAA2">
       <w:start w:val="1"/>
       <w:numFmt w:val="bullet"/>
       <w:lvlText w:val=""/>
       <w:lvlJc w:val="left"/>
       <w:pPr>
-        <w:ind w:left="480" w:hanging="480"/>
+        <w:ind w:left="840" w:hanging="480"/>
       </w:pPr>
       <w:rPr>
         <w:rFonts w:ascii="Wingdings" w:hAnsi="Wingdings" w:hint="default"/>
@@ -9215,7 +10957,7 @@
       <w:lvlText w:val=""/>
       <w:lvlJc w:val="left"/>
       <w:pPr>
-        <w:ind w:left="960" w:hanging="480"/>
+        <w:ind w:left="1320" w:hanging="480"/>
       </w:pPr>
       <w:rPr>
         <w:rFonts w:ascii="Wingdings" w:hAnsi="Wingdings" w:hint="default"/>
@@ -9227,7 +10969,7 @@
       <w:lvlText w:val=""/>
       <w:lvlJc w:val="left"/>
       <w:pPr>
-        <w:ind w:left="1440" w:hanging="480"/>
+        <w:ind w:left="1800" w:hanging="480"/>
       </w:pPr>
       <w:rPr>
         <w:rFonts w:ascii="Wingdings" w:hAnsi="Wingdings" w:hint="default"/>
@@ -9239,7 +10981,7 @@
       <w:lvlText w:val=""/>
       <w:lvlJc w:val="left"/>
       <w:pPr>
-        <w:ind w:left="1920" w:hanging="480"/>
+        <w:ind w:left="2280" w:hanging="480"/>
       </w:pPr>
       <w:rPr>
         <w:rFonts w:ascii="Wingdings" w:hAnsi="Wingdings" w:hint="default"/>
@@ -9251,7 +10993,7 @@
       <w:lvlText w:val=""/>
       <w:lvlJc w:val="left"/>
       <w:pPr>
-        <w:ind w:left="2400" w:hanging="480"/>
+        <w:ind w:left="2760" w:hanging="480"/>
       </w:pPr>
       <w:rPr>
         <w:rFonts w:ascii="Wingdings" w:hAnsi="Wingdings" w:hint="default"/>
@@ -9263,7 +11005,7 @@
       <w:lvlText w:val=""/>
       <w:lvlJc w:val="left"/>
       <w:pPr>
-        <w:ind w:left="2880" w:hanging="480"/>
+        <w:ind w:left="3240" w:hanging="480"/>
       </w:pPr>
       <w:rPr>
         <w:rFonts w:ascii="Wingdings" w:hAnsi="Wingdings" w:hint="default"/>
@@ -9275,7 +11017,7 @@
       <w:lvlText w:val=""/>
       <w:lvlJc w:val="left"/>
       <w:pPr>
-        <w:ind w:left="3360" w:hanging="480"/>
+        <w:ind w:left="3720" w:hanging="480"/>
       </w:pPr>
       <w:rPr>
         <w:rFonts w:ascii="Wingdings" w:hAnsi="Wingdings" w:hint="default"/>
@@ -9287,7 +11029,7 @@
       <w:lvlText w:val=""/>
       <w:lvlJc w:val="left"/>
       <w:pPr>
-        <w:ind w:left="3840" w:hanging="480"/>
+        <w:ind w:left="4200" w:hanging="480"/>
       </w:pPr>
       <w:rPr>
         <w:rFonts w:ascii="Wingdings" w:hAnsi="Wingdings" w:hint="default"/>
@@ -9299,14 +11041,127 @@
       <w:lvlText w:val=""/>
       <w:lvlJc w:val="left"/>
       <w:pPr>
-        <w:ind w:left="4320" w:hanging="480"/>
+        <w:ind w:left="4680" w:hanging="480"/>
       </w:pPr>
       <w:rPr>
         <w:rFonts w:ascii="Wingdings" w:hAnsi="Wingdings" w:hint="default"/>
       </w:rPr>
     </w:lvl>
   </w:abstractNum>
-  <w:abstractNum w:abstractNumId="9" w15:restartNumberingAfterBreak="0">
+  <w:abstractNum w:abstractNumId="11" w15:restartNumberingAfterBreak="0">
+    <w:nsid w:val="4B030739"/>
+    <w:multiLevelType w:val="hybridMultilevel"/>
+    <w:tmpl w:val="67E4FD68"/>
+    <w:lvl w:ilvl="0" w:tplc="FB7AFAA2">
+      <w:start w:val="1"/>
+      <w:numFmt w:val="bullet"/>
+      <w:lvlText w:val=""/>
+      <w:lvlJc w:val="left"/>
+      <w:pPr>
+        <w:ind w:left="480" w:hanging="480"/>
+      </w:pPr>
+      <w:rPr>
+        <w:rFonts w:ascii="Wingdings" w:hAnsi="Wingdings" w:hint="default"/>
+      </w:rPr>
+    </w:lvl>
+    <w:lvl w:ilvl="1" w:tplc="04090003" w:tentative="1">
+      <w:start w:val="1"/>
+      <w:numFmt w:val="bullet"/>
+      <w:lvlText w:val=""/>
+      <w:lvlJc w:val="left"/>
+      <w:pPr>
+        <w:ind w:left="960" w:hanging="480"/>
+      </w:pPr>
+      <w:rPr>
+        <w:rFonts w:ascii="Wingdings" w:hAnsi="Wingdings" w:hint="default"/>
+      </w:rPr>
+    </w:lvl>
+    <w:lvl w:ilvl="2" w:tplc="04090005" w:tentative="1">
+      <w:start w:val="1"/>
+      <w:numFmt w:val="bullet"/>
+      <w:lvlText w:val=""/>
+      <w:lvlJc w:val="left"/>
+      <w:pPr>
+        <w:ind w:left="1440" w:hanging="480"/>
+      </w:pPr>
+      <w:rPr>
+        <w:rFonts w:ascii="Wingdings" w:hAnsi="Wingdings" w:hint="default"/>
+      </w:rPr>
+    </w:lvl>
+    <w:lvl w:ilvl="3" w:tplc="04090001" w:tentative="1">
+      <w:start w:val="1"/>
+      <w:numFmt w:val="bullet"/>
+      <w:lvlText w:val=""/>
+      <w:lvlJc w:val="left"/>
+      <w:pPr>
+        <w:ind w:left="1920" w:hanging="480"/>
+      </w:pPr>
+      <w:rPr>
+        <w:rFonts w:ascii="Wingdings" w:hAnsi="Wingdings" w:hint="default"/>
+      </w:rPr>
+    </w:lvl>
+    <w:lvl w:ilvl="4" w:tplc="04090003" w:tentative="1">
+      <w:start w:val="1"/>
+      <w:numFmt w:val="bullet"/>
+      <w:lvlText w:val=""/>
+      <w:lvlJc w:val="left"/>
+      <w:pPr>
+        <w:ind w:left="2400" w:hanging="480"/>
+      </w:pPr>
+      <w:rPr>
+        <w:rFonts w:ascii="Wingdings" w:hAnsi="Wingdings" w:hint="default"/>
+      </w:rPr>
+    </w:lvl>
+    <w:lvl w:ilvl="5" w:tplc="04090005" w:tentative="1">
+      <w:start w:val="1"/>
+      <w:numFmt w:val="bullet"/>
+      <w:lvlText w:val=""/>
+      <w:lvlJc w:val="left"/>
+      <w:pPr>
+        <w:ind w:left="2880" w:hanging="480"/>
+      </w:pPr>
+      <w:rPr>
+        <w:rFonts w:ascii="Wingdings" w:hAnsi="Wingdings" w:hint="default"/>
+      </w:rPr>
+    </w:lvl>
+    <w:lvl w:ilvl="6" w:tplc="04090001" w:tentative="1">
+      <w:start w:val="1"/>
+      <w:numFmt w:val="bullet"/>
+      <w:lvlText w:val=""/>
+      <w:lvlJc w:val="left"/>
+      <w:pPr>
+        <w:ind w:left="3360" w:hanging="480"/>
+      </w:pPr>
+      <w:rPr>
+        <w:rFonts w:ascii="Wingdings" w:hAnsi="Wingdings" w:hint="default"/>
+      </w:rPr>
+    </w:lvl>
+    <w:lvl w:ilvl="7" w:tplc="04090003" w:tentative="1">
+      <w:start w:val="1"/>
+      <w:numFmt w:val="bullet"/>
+      <w:lvlText w:val=""/>
+      <w:lvlJc w:val="left"/>
+      <w:pPr>
+        <w:ind w:left="3840" w:hanging="480"/>
+      </w:pPr>
+      <w:rPr>
+        <w:rFonts w:ascii="Wingdings" w:hAnsi="Wingdings" w:hint="default"/>
+      </w:rPr>
+    </w:lvl>
+    <w:lvl w:ilvl="8" w:tplc="04090005" w:tentative="1">
+      <w:start w:val="1"/>
+      <w:numFmt w:val="bullet"/>
+      <w:lvlText w:val=""/>
+      <w:lvlJc w:val="left"/>
+      <w:pPr>
+        <w:ind w:left="4320" w:hanging="480"/>
+      </w:pPr>
+      <w:rPr>
+        <w:rFonts w:ascii="Wingdings" w:hAnsi="Wingdings" w:hint="default"/>
+      </w:rPr>
+    </w:lvl>
+  </w:abstractNum>
+  <w:abstractNum w:abstractNumId="12" w15:restartNumberingAfterBreak="0">
     <w:nsid w:val="6901172F"/>
     <w:multiLevelType w:val="hybridMultilevel"/>
     <w:tmpl w:val="41B8C0DA"/>
@@ -9396,25 +11251,25 @@
     </w:lvl>
   </w:abstractNum>
   <w:num w:numId="1" w16cid:durableId="1101150216">
-    <w:abstractNumId w:val="8"/>
+    <w:abstractNumId w:val="11"/>
   </w:num>
   <w:num w:numId="2" w16cid:durableId="1255750687">
+    <w:abstractNumId w:val="4"/>
+  </w:num>
+  <w:num w:numId="3" w16cid:durableId="2023389186">
     <w:abstractNumId w:val="3"/>
   </w:num>
-  <w:num w:numId="3" w16cid:durableId="2023389186">
-    <w:abstractNumId w:val="2"/>
-  </w:num>
   <w:num w:numId="4" w16cid:durableId="1786346422">
-    <w:abstractNumId w:val="0"/>
+    <w:abstractNumId w:val="1"/>
   </w:num>
   <w:num w:numId="5" w16cid:durableId="808938519">
-    <w:abstractNumId w:val="9"/>
+    <w:abstractNumId w:val="12"/>
   </w:num>
   <w:num w:numId="6" w16cid:durableId="2106612740">
-    <w:abstractNumId w:val="5"/>
+    <w:abstractNumId w:val="7"/>
   </w:num>
   <w:num w:numId="7" w16cid:durableId="1489900482">
-    <w:abstractNumId w:val="0"/>
+    <w:abstractNumId w:val="1"/>
     <w:lvlOverride w:ilvl="0">
       <w:startOverride w:val="1"/>
     </w:lvlOverride>
@@ -9444,22 +11299,31 @@
     </w:lvlOverride>
   </w:num>
   <w:num w:numId="8" w16cid:durableId="541483985">
+    <w:abstractNumId w:val="8"/>
+  </w:num>
+  <w:num w:numId="9" w16cid:durableId="705719654">
+    <w:abstractNumId w:val="2"/>
+  </w:num>
+  <w:num w:numId="10" w16cid:durableId="437872203">
+    <w:abstractNumId w:val="5"/>
+  </w:num>
+  <w:num w:numId="11" w16cid:durableId="205025338">
+    <w:abstractNumId w:val="9"/>
+  </w:num>
+  <w:num w:numId="12" w16cid:durableId="1324165709">
+    <w:abstractNumId w:val="0"/>
+  </w:num>
+  <w:num w:numId="13" w16cid:durableId="1915625224">
     <w:abstractNumId w:val="6"/>
   </w:num>
-  <w:num w:numId="9" w16cid:durableId="705719654">
-    <w:abstractNumId w:val="1"/>
-  </w:num>
-  <w:num w:numId="10" w16cid:durableId="437872203">
-    <w:abstractNumId w:val="4"/>
-  </w:num>
-  <w:num w:numId="11" w16cid:durableId="205025338">
-    <w:abstractNumId w:val="7"/>
+  <w:num w:numId="14" w16cid:durableId="771975603">
+    <w:abstractNumId w:val="10"/>
   </w:num>
 </w:numbering>
 </file>
 
 <file path=word/styles.xml><?xml version="1.0" encoding="utf-8"?>
-<w:styles xmlns:mc="http://schemas.openxmlformats.org/markup-compatibility/2006" xmlns:r="http://schemas.openxmlformats.org/officeDocument/2006/relationships" xmlns:w="http://schemas.openxmlformats.org/wordprocessingml/2006/main" xmlns:w14="http://schemas.microsoft.com/office/word/2010/wordml" xmlns:w15="http://schemas.microsoft.com/office/word/2012/wordml" xmlns:w16cex="http://schemas.microsoft.com/office/word/2018/wordml/cex" xmlns:w16cid="http://schemas.microsoft.com/office/word/2016/wordml/cid" xmlns:w16="http://schemas.microsoft.com/office/word/2018/wordml" xmlns:w16sdtdh="http://schemas.microsoft.com/office/word/2020/wordml/sdtdatahash" xmlns:w16se="http://schemas.microsoft.com/office/word/2015/wordml/symex" mc:Ignorable="w14 w15 w16se w16cid w16 w16cex w16sdtdh">
+<w:styles xmlns:mc="http://schemas.openxmlformats.org/markup-compatibility/2006" xmlns:r="http://schemas.openxmlformats.org/officeDocument/2006/relationships" xmlns:w="http://schemas.openxmlformats.org/wordprocessingml/2006/main" xmlns:w14="http://schemas.microsoft.com/office/word/2010/wordml" xmlns:w15="http://schemas.microsoft.com/office/word/2012/wordml" xmlns:w16cex="http://schemas.microsoft.com/office/word/2018/wordml/cex" xmlns:w16cid="http://schemas.microsoft.com/office/word/2016/wordml/cid" xmlns:w16="http://schemas.microsoft.com/office/word/2018/wordml" xmlns:w16du="http://schemas.microsoft.com/office/word/2023/wordml/word16du" xmlns:w16sdtdh="http://schemas.microsoft.com/office/word/2020/wordml/sdtdatahash" xmlns:w16sdtfl="http://schemas.microsoft.com/office/word/2024/wordml/sdtformatlock" xmlns:w16se="http://schemas.microsoft.com/office/word/2015/wordml/symex" mc:Ignorable="w14 w15 w16se w16cid w16 w16cex w16sdtdh w16sdtfl w16du">
   <w:docDefaults>
     <w:rPrDefault>
       <w:rPr>
@@ -9858,7 +11722,7 @@
   <w:style w:type="paragraph" w:default="1" w:styleId="a">
     <w:name w:val="Normal"/>
     <w:qFormat/>
-    <w:rsid w:val="007B0C51"/>
+    <w:rsid w:val="004F5365"/>
     <w:pPr>
       <w:widowControl w:val="0"/>
     </w:pPr>
@@ -10062,7 +11926,6 @@
   <w:style w:type="character" w:default="1" w:styleId="a0">
     <w:name w:val="Default Paragraph Font"/>
     <w:uiPriority w:val="1"/>
-    <w:semiHidden/>
     <w:unhideWhenUsed/>
   </w:style>
   <w:style w:type="table" w:default="1" w:styleId="a1">
@@ -10788,4 +12651,16 @@
     </a:ext>
   </a:extLst>
 </a:theme>
+</file>
+
+<file path=customXml/item1.xml><?xml version="1.0" encoding="utf-8"?>
+<b:Sources xmlns:b="http://schemas.openxmlformats.org/officeDocument/2006/bibliography" xmlns="http://schemas.openxmlformats.org/officeDocument/2006/bibliography" SelectedStyle="\APASixthEditionOfficeOnline.xsl" StyleName="APA" Version="6"/>
+</file>
+
+<file path=customXml/itemProps1.xml><?xml version="1.0" encoding="utf-8"?>
+<ds:datastoreItem xmlns:ds="http://schemas.openxmlformats.org/officeDocument/2006/customXml" ds:itemID="{442A49B5-D3ED-4F89-8D7E-C6F061573030}">
+  <ds:schemaRefs>
+    <ds:schemaRef ds:uri="http://schemas.openxmlformats.org/officeDocument/2006/bibliography"/>
+  </ds:schemaRefs>
+</ds:datastoreItem>
 </file>
</xml_diff>

<commit_message>
doc: revise use case description and modify `Good Classes` and `Bad Classes`
</commit_message>
<xml_diff>
--- a/document/hw3.docx
+++ b/document/hw3.docx
@@ -1823,7 +1823,19 @@
               <w:rPr>
                 <w:rFonts w:ascii="Times New Roman" w:eastAsia="標楷體" w:hAnsi="Times New Roman" w:cs="Times New Roman"/>
               </w:rPr>
-              <w:t>賣家選擇「刪除」書籍：</w:t>
+              <w:t>賣家選擇「</w:t>
+            </w:r>
+            <w:r>
+              <w:rPr>
+                <w:rFonts w:ascii="Times New Roman" w:eastAsia="標楷體" w:hAnsi="Times New Roman" w:cs="Times New Roman" w:hint="eastAsia"/>
+              </w:rPr>
+              <w:t>編輯</w:t>
+            </w:r>
+            <w:r>
+              <w:rPr>
+                <w:rFonts w:ascii="Times New Roman" w:eastAsia="標楷體" w:hAnsi="Times New Roman" w:cs="Times New Roman"/>
+              </w:rPr>
+              <w:t>」書籍：</w:t>
             </w:r>
           </w:p>
           <w:p>
@@ -1833,45 +1845,28 @@
                 <w:ilvl w:val="0"/>
                 <w:numId w:val="4"/>
               </w:numPr>
-              <w:rPr>
-                <w:rFonts w:ascii="Times New Roman" w:eastAsia="標楷體" w:hAnsi="Times New Roman" w:cs="Times New Roman"/>
-              </w:rPr>
-            </w:pPr>
-            <w:r>
-              <w:rPr>
-                <w:rFonts w:ascii="Times New Roman" w:eastAsia="標楷體" w:hAnsi="Times New Roman" w:cs="Times New Roman" w:hint="eastAsia"/>
-              </w:rPr>
-              <w:t>系統跳出</w:t>
-            </w:r>
-            <w:r>
-              <w:rPr>
-                <w:rFonts w:ascii="Times New Roman" w:eastAsia="標楷體" w:hAnsi="Times New Roman" w:cs="Times New Roman" w:hint="eastAsia"/>
-              </w:rPr>
-              <w:t>警告</w:t>
-            </w:r>
-            <w:r>
-              <w:rPr>
-                <w:rFonts w:ascii="Times New Roman" w:eastAsia="標楷體" w:hAnsi="Times New Roman" w:cs="Times New Roman" w:hint="eastAsia"/>
-              </w:rPr>
-              <w:t>以</w:t>
-            </w:r>
-            <w:r>
-              <w:rPr>
-                <w:rFonts w:ascii="Times New Roman" w:eastAsia="標楷體" w:hAnsi="Times New Roman" w:cs="Times New Roman" w:hint="eastAsia"/>
-              </w:rPr>
-              <w:t>確認</w:t>
-            </w:r>
-            <w:r>
-              <w:rPr>
-                <w:rFonts w:ascii="Times New Roman" w:eastAsia="標楷體" w:hAnsi="Times New Roman" w:cs="Times New Roman" w:hint="eastAsia"/>
-              </w:rPr>
-              <w:t>是否</w:t>
-            </w:r>
-            <w:r>
-              <w:rPr>
-                <w:rFonts w:ascii="Times New Roman" w:eastAsia="標楷體" w:hAnsi="Times New Roman" w:cs="Times New Roman" w:hint="eastAsia"/>
-              </w:rPr>
-              <w:t>刪除。</w:t>
+              <w:spacing w:after="160" w:line="278" w:lineRule="auto"/>
+              <w:rPr>
+                <w:rFonts w:ascii="Times New Roman" w:eastAsia="標楷體" w:hAnsi="Times New Roman" w:cs="Times New Roman"/>
+              </w:rPr>
+            </w:pPr>
+            <w:r>
+              <w:rPr>
+                <w:rFonts w:ascii="Times New Roman" w:eastAsia="標楷體" w:hAnsi="Times New Roman" w:cs="Times New Roman" w:hint="eastAsia"/>
+              </w:rPr>
+              <w:t>賣家修改</w:t>
+            </w:r>
+            <w:r>
+              <w:rPr>
+                <w:rFonts w:ascii="Times New Roman" w:eastAsia="標楷體" w:hAnsi="Times New Roman" w:cs="Times New Roman" w:hint="eastAsia"/>
+              </w:rPr>
+              <w:t>書籍資料</w:t>
+            </w:r>
+            <w:r>
+              <w:rPr>
+                <w:rFonts w:ascii="Times New Roman" w:eastAsia="標楷體" w:hAnsi="Times New Roman" w:cs="Times New Roman"/>
+              </w:rPr>
+              <w:t>。</w:t>
             </w:r>
           </w:p>
           <w:p>
@@ -1881,15 +1876,34 @@
                 <w:ilvl w:val="0"/>
                 <w:numId w:val="4"/>
               </w:numPr>
-              <w:rPr>
-                <w:rFonts w:ascii="Times New Roman" w:eastAsia="標楷體" w:hAnsi="Times New Roman" w:cs="Times New Roman"/>
-              </w:rPr>
-            </w:pPr>
-            <w:r>
-              <w:rPr>
-                <w:rFonts w:ascii="Times New Roman" w:eastAsia="標楷體" w:hAnsi="Times New Roman" w:cs="Times New Roman"/>
-              </w:rPr>
-              <w:t>賣家確認刪除。</w:t>
+              <w:spacing w:after="160" w:line="278" w:lineRule="auto"/>
+              <w:rPr>
+                <w:rFonts w:ascii="Times New Roman" w:eastAsia="標楷體" w:hAnsi="Times New Roman" w:cs="Times New Roman"/>
+              </w:rPr>
+            </w:pPr>
+            <w:r>
+              <w:rPr>
+                <w:rFonts w:ascii="Times New Roman" w:eastAsia="標楷體" w:hAnsi="Times New Roman" w:cs="Times New Roman"/>
+              </w:rPr>
+              <w:t>系統</w:t>
+            </w:r>
+            <w:r>
+              <w:rPr>
+                <w:rFonts w:ascii="Times New Roman" w:eastAsia="標楷體" w:hAnsi="Times New Roman" w:cs="Times New Roman" w:hint="eastAsia"/>
+              </w:rPr>
+              <w:t>更新</w:t>
+            </w:r>
+            <w:r>
+              <w:rPr>
+                <w:rFonts w:ascii="Times New Roman" w:eastAsia="標楷體" w:hAnsi="Times New Roman" w:cs="Times New Roman"/>
+              </w:rPr>
+              <w:t>資料庫</w:t>
+            </w:r>
+            <w:r>
+              <w:rPr>
+                <w:rFonts w:ascii="Times New Roman" w:eastAsia="標楷體" w:hAnsi="Times New Roman" w:cs="Times New Roman" w:hint="eastAsia"/>
+              </w:rPr>
+              <w:t>。</w:t>
             </w:r>
           </w:p>
           <w:p>
@@ -1899,51 +1913,35 @@
                 <w:ilvl w:val="0"/>
                 <w:numId w:val="4"/>
               </w:numPr>
-              <w:rPr>
-                <w:rFonts w:ascii="Times New Roman" w:eastAsia="標楷體" w:hAnsi="Times New Roman" w:cs="Times New Roman"/>
-              </w:rPr>
-            </w:pPr>
-            <w:r>
-              <w:rPr>
-                <w:rFonts w:ascii="Times New Roman" w:eastAsia="標楷體" w:hAnsi="Times New Roman" w:cs="Times New Roman"/>
-              </w:rPr>
-              <w:t>系統</w:t>
-            </w:r>
-            <w:r>
-              <w:rPr>
-                <w:rFonts w:ascii="Times New Roman" w:eastAsia="標楷體" w:hAnsi="Times New Roman" w:cs="Times New Roman" w:hint="eastAsia"/>
-              </w:rPr>
-              <w:t>從</w:t>
-            </w:r>
-            <w:r>
-              <w:rPr>
-                <w:rFonts w:ascii="Times New Roman" w:eastAsia="標楷體" w:hAnsi="Times New Roman" w:cs="Times New Roman"/>
-              </w:rPr>
-              <w:t>資料庫移除該</w:t>
-            </w:r>
-            <w:r>
-              <w:rPr>
-                <w:rFonts w:ascii="Times New Roman" w:eastAsia="標楷體" w:hAnsi="Times New Roman" w:cs="Times New Roman" w:hint="eastAsia"/>
-              </w:rPr>
-              <w:t>本</w:t>
-            </w:r>
-            <w:r>
-              <w:rPr>
-                <w:rFonts w:ascii="Times New Roman" w:eastAsia="標楷體" w:hAnsi="Times New Roman" w:cs="Times New Roman" w:hint="eastAsia"/>
-              </w:rPr>
-              <w:t>書籍</w:t>
-            </w:r>
-            <w:r>
-              <w:rPr>
-                <w:rFonts w:ascii="Times New Roman" w:eastAsia="標楷體" w:hAnsi="Times New Roman" w:cs="Times New Roman" w:hint="eastAsia"/>
-              </w:rPr>
-              <w:t>資料</w:t>
-            </w:r>
-            <w:r>
-              <w:rPr>
-                <w:rFonts w:ascii="Times New Roman" w:eastAsia="標楷體" w:hAnsi="Times New Roman" w:cs="Times New Roman"/>
-              </w:rPr>
-              <w:t>。</w:t>
+              <w:spacing w:after="160" w:line="278" w:lineRule="auto"/>
+              <w:rPr>
+                <w:rFonts w:ascii="Times New Roman" w:eastAsia="標楷體" w:hAnsi="Times New Roman" w:cs="Times New Roman"/>
+              </w:rPr>
+            </w:pPr>
+            <w:r>
+              <w:rPr>
+                <w:rFonts w:ascii="Times New Roman" w:eastAsia="標楷體" w:hAnsi="Times New Roman" w:cs="Times New Roman"/>
+              </w:rPr>
+              <w:t>重新載入清單，顯示最新狀態。</w:t>
+            </w:r>
+          </w:p>
+          <w:p>
+            <w:pPr>
+              <w:rPr>
+                <w:rFonts w:ascii="Times New Roman" w:eastAsia="標楷體" w:hAnsi="Times New Roman" w:cs="Times New Roman"/>
+              </w:rPr>
+            </w:pPr>
+            <w:r>
+              <w:rPr>
+                <w:rFonts w:ascii="Times New Roman" w:eastAsia="標楷體" w:hAnsi="Times New Roman" w:cs="Times New Roman" w:hint="eastAsia"/>
+              </w:rPr>
+              <w:t xml:space="preserve">3b. </w:t>
+            </w:r>
+            <w:r>
+              <w:rPr>
+                <w:rFonts w:ascii="Times New Roman" w:eastAsia="標楷體" w:hAnsi="Times New Roman" w:cs="Times New Roman"/>
+              </w:rPr>
+              <w:t>賣家選擇「刪除」書籍：</w:t>
             </w:r>
           </w:p>
           <w:p>
@@ -1959,6 +1957,114 @@
             </w:pPr>
             <w:r>
               <w:rPr>
+                <w:rFonts w:ascii="Times New Roman" w:eastAsia="標楷體" w:hAnsi="Times New Roman" w:cs="Times New Roman" w:hint="eastAsia"/>
+              </w:rPr>
+              <w:t>系統</w:t>
+            </w:r>
+            <w:r>
+              <w:rPr>
+                <w:rFonts w:ascii="Times New Roman" w:eastAsia="標楷體" w:hAnsi="Times New Roman" w:cs="Times New Roman" w:hint="eastAsia"/>
+              </w:rPr>
+              <w:t>詢問</w:t>
+            </w:r>
+            <w:r>
+              <w:rPr>
+                <w:rFonts w:ascii="Times New Roman" w:eastAsia="標楷體" w:hAnsi="Times New Roman" w:cs="Times New Roman" w:hint="eastAsia"/>
+              </w:rPr>
+              <w:t>是否</w:t>
+            </w:r>
+            <w:r>
+              <w:rPr>
+                <w:rFonts w:ascii="Times New Roman" w:eastAsia="標楷體" w:hAnsi="Times New Roman" w:cs="Times New Roman" w:hint="eastAsia"/>
+              </w:rPr>
+              <w:t>刪除。</w:t>
+            </w:r>
+          </w:p>
+          <w:p>
+            <w:pPr>
+              <w:pStyle w:val="a9"/>
+              <w:numPr>
+                <w:ilvl w:val="0"/>
+                <w:numId w:val="4"/>
+              </w:numPr>
+              <w:rPr>
+                <w:rFonts w:ascii="Times New Roman" w:eastAsia="標楷體" w:hAnsi="Times New Roman" w:cs="Times New Roman"/>
+              </w:rPr>
+            </w:pPr>
+            <w:r>
+              <w:rPr>
+                <w:rFonts w:ascii="Times New Roman" w:eastAsia="標楷體" w:hAnsi="Times New Roman" w:cs="Times New Roman"/>
+              </w:rPr>
+              <w:t>賣家確認刪除。</w:t>
+            </w:r>
+          </w:p>
+          <w:p>
+            <w:pPr>
+              <w:pStyle w:val="a9"/>
+              <w:numPr>
+                <w:ilvl w:val="0"/>
+                <w:numId w:val="4"/>
+              </w:numPr>
+              <w:rPr>
+                <w:rFonts w:ascii="Times New Roman" w:eastAsia="標楷體" w:hAnsi="Times New Roman" w:cs="Times New Roman"/>
+              </w:rPr>
+            </w:pPr>
+            <w:r>
+              <w:rPr>
+                <w:rFonts w:ascii="Times New Roman" w:eastAsia="標楷體" w:hAnsi="Times New Roman" w:cs="Times New Roman"/>
+              </w:rPr>
+              <w:t>系統</w:t>
+            </w:r>
+            <w:r>
+              <w:rPr>
+                <w:rFonts w:ascii="Times New Roman" w:eastAsia="標楷體" w:hAnsi="Times New Roman" w:cs="Times New Roman" w:hint="eastAsia"/>
+              </w:rPr>
+              <w:t>從</w:t>
+            </w:r>
+            <w:r>
+              <w:rPr>
+                <w:rFonts w:ascii="Times New Roman" w:eastAsia="標楷體" w:hAnsi="Times New Roman" w:cs="Times New Roman"/>
+              </w:rPr>
+              <w:t>資料庫移除該</w:t>
+            </w:r>
+            <w:r>
+              <w:rPr>
+                <w:rFonts w:ascii="Times New Roman" w:eastAsia="標楷體" w:hAnsi="Times New Roman" w:cs="Times New Roman" w:hint="eastAsia"/>
+              </w:rPr>
+              <w:t>本</w:t>
+            </w:r>
+            <w:r>
+              <w:rPr>
+                <w:rFonts w:ascii="Times New Roman" w:eastAsia="標楷體" w:hAnsi="Times New Roman" w:cs="Times New Roman" w:hint="eastAsia"/>
+              </w:rPr>
+              <w:t>書籍</w:t>
+            </w:r>
+            <w:r>
+              <w:rPr>
+                <w:rFonts w:ascii="Times New Roman" w:eastAsia="標楷體" w:hAnsi="Times New Roman" w:cs="Times New Roman" w:hint="eastAsia"/>
+              </w:rPr>
+              <w:t>資料</w:t>
+            </w:r>
+            <w:r>
+              <w:rPr>
+                <w:rFonts w:ascii="Times New Roman" w:eastAsia="標楷體" w:hAnsi="Times New Roman" w:cs="Times New Roman"/>
+              </w:rPr>
+              <w:t>。</w:t>
+            </w:r>
+          </w:p>
+          <w:p>
+            <w:pPr>
+              <w:pStyle w:val="a9"/>
+              <w:numPr>
+                <w:ilvl w:val="0"/>
+                <w:numId w:val="4"/>
+              </w:numPr>
+              <w:rPr>
+                <w:rFonts w:ascii="Times New Roman" w:eastAsia="標楷體" w:hAnsi="Times New Roman" w:cs="Times New Roman"/>
+              </w:rPr>
+            </w:pPr>
+            <w:r>
+              <w:rPr>
                 <w:rFonts w:ascii="Times New Roman" w:eastAsia="標楷體" w:hAnsi="Times New Roman" w:cs="Times New Roman"/>
               </w:rPr>
               <w:t>重新載入清單，顯示最新狀態</w:t>
@@ -2232,6 +2338,7 @@
         <w:rPr>
           <w:rFonts w:hint="eastAsia"/>
         </w:rPr>
+        <w:lastRenderedPageBreak/>
         <w:t xml:space="preserve">1.5.2 </w:t>
       </w:r>
       <w:r>
@@ -2390,7 +2497,6 @@
               <w:rPr>
                 <w:rFonts w:ascii="Times New Roman" w:eastAsia="標楷體" w:hAnsi="Times New Roman" w:cs="Times New Roman" w:hint="eastAsia"/>
               </w:rPr>
-              <w:lastRenderedPageBreak/>
               <w:t>Primary Actor</w:t>
             </w:r>
           </w:p>
@@ -2749,7 +2855,7 @@
           <w:p>
             <w:pPr>
               <w:rPr>
-                <w:rFonts w:ascii="Times New Roman" w:eastAsia="標楷體" w:hAnsi="Times New Roman" w:cs="Times New Roman"/>
+                <w:rFonts w:ascii="Times New Roman" w:eastAsia="標楷體" w:hAnsi="Times New Roman" w:cs="Times New Roman" w:hint="eastAsia"/>
               </w:rPr>
             </w:pPr>
             <w:r>
@@ -2762,13 +2868,13 @@
               <w:rPr>
                 <w:rFonts w:ascii="Times New Roman" w:eastAsia="標楷體" w:hAnsi="Times New Roman" w:cs="Times New Roman" w:hint="eastAsia"/>
               </w:rPr>
-              <w:t>買家點擊</w:t>
-            </w:r>
-            <w:r>
-              <w:rPr>
-                <w:rFonts w:ascii="Times New Roman" w:eastAsia="標楷體" w:hAnsi="Times New Roman" w:cs="Times New Roman" w:hint="eastAsia"/>
-              </w:rPr>
-              <w:t>書籍</w:t>
+              <w:t>買家</w:t>
+            </w:r>
+            <w:r>
+              <w:rPr>
+                <w:rFonts w:ascii="Times New Roman" w:eastAsia="標楷體" w:hAnsi="Times New Roman" w:cs="Times New Roman" w:hint="eastAsia"/>
+              </w:rPr>
+              <w:t>選擇書籍並</w:t>
             </w:r>
             <w:r>
               <w:rPr>
@@ -3192,6 +3298,7 @@
               <w:rPr>
                 <w:rFonts w:ascii="Times New Roman" w:eastAsia="標楷體" w:hAnsi="Times New Roman" w:cs="Times New Roman" w:hint="eastAsia"/>
               </w:rPr>
+              <w:lastRenderedPageBreak/>
               <w:t>Primary Actor</w:t>
             </w:r>
           </w:p>
@@ -3299,7 +3406,6 @@
               <w:rPr>
                 <w:rFonts w:ascii="Times New Roman" w:eastAsia="標楷體" w:hAnsi="Times New Roman" w:cs="Times New Roman" w:hint="eastAsia"/>
               </w:rPr>
-              <w:lastRenderedPageBreak/>
               <w:t>Preconditions</w:t>
             </w:r>
           </w:p>
@@ -3566,7 +3672,19 @@
               <w:rPr>
                 <w:rFonts w:ascii="Times New Roman" w:eastAsia="標楷體" w:hAnsi="Times New Roman" w:cs="Times New Roman" w:hint="eastAsia"/>
               </w:rPr>
-              <w:t>賣家在系統後台點擊「確認已完成交易」。</w:t>
+              <w:t>賣家</w:t>
+            </w:r>
+            <w:r>
+              <w:rPr>
+                <w:rFonts w:ascii="Times New Roman" w:eastAsia="標楷體" w:hAnsi="Times New Roman" w:cs="Times New Roman" w:hint="eastAsia"/>
+              </w:rPr>
+              <w:t>與買家皆於系統上</w:t>
+            </w:r>
+            <w:r>
+              <w:rPr>
+                <w:rFonts w:ascii="Times New Roman" w:eastAsia="標楷體" w:hAnsi="Times New Roman" w:cs="Times New Roman" w:hint="eastAsia"/>
+              </w:rPr>
+              <w:t>確認已完成交易。</w:t>
             </w:r>
           </w:p>
           <w:p>
@@ -3850,7 +3968,14 @@
               <w:rPr>
                 <w:rFonts w:ascii="Times New Roman" w:eastAsia="標楷體" w:hAnsi="Times New Roman" w:cs="Times New Roman"/>
               </w:rPr>
-              <w:t>例如：訂單成立後</w:t>
+              <w:t>例</w:t>
+            </w:r>
+            <w:r>
+              <w:rPr>
+                <w:rFonts w:ascii="Times New Roman" w:eastAsia="標楷體" w:hAnsi="Times New Roman" w:cs="Times New Roman"/>
+              </w:rPr>
+              <w:lastRenderedPageBreak/>
+              <w:t>如：訂單成立後</w:t>
             </w:r>
             <w:r>
               <w:rPr>
@@ -3897,7 +4022,6 @@
         <w:rPr>
           <w:rFonts w:hint="eastAsia"/>
         </w:rPr>
-        <w:lastRenderedPageBreak/>
         <w:t>1.5.</w:t>
       </w:r>
       <w:r>
@@ -4331,7 +4455,13 @@
               <w:rPr>
                 <w:rFonts w:ascii="Times New Roman" w:eastAsia="標楷體" w:hAnsi="Times New Roman" w:cs="Times New Roman" w:hint="eastAsia"/>
               </w:rPr>
-              <w:t>買家在</w:t>
+              <w:t>買家</w:t>
+            </w:r>
+            <w:r>
+              <w:rPr>
+                <w:rFonts w:ascii="Times New Roman" w:eastAsia="標楷體" w:hAnsi="Times New Roman" w:cs="Times New Roman" w:hint="eastAsia"/>
+              </w:rPr>
+              <w:t>透過</w:t>
             </w:r>
             <w:r>
               <w:rPr>
@@ -4343,120 +4473,105 @@
               <w:rPr>
                 <w:rFonts w:ascii="Times New Roman" w:eastAsia="標楷體" w:hAnsi="Times New Roman" w:cs="Times New Roman" w:hint="eastAsia"/>
               </w:rPr>
-              <w:t>詳情</w:t>
+              <w:t>詳情頁面</w:t>
+            </w:r>
+            <w:r>
+              <w:rPr>
+                <w:rFonts w:ascii="Times New Roman" w:eastAsia="標楷體" w:hAnsi="Times New Roman" w:cs="Times New Roman" w:hint="eastAsia"/>
+              </w:rPr>
+              <w:t>開啟與</w:t>
+            </w:r>
+            <w:r>
+              <w:rPr>
+                <w:rFonts w:ascii="Times New Roman" w:eastAsia="標楷體" w:hAnsi="Times New Roman" w:cs="Times New Roman" w:hint="eastAsia"/>
+              </w:rPr>
+              <w:t>賣家</w:t>
             </w:r>
             <w:proofErr w:type="gramStart"/>
             <w:r>
               <w:rPr>
                 <w:rFonts w:ascii="Times New Roman" w:eastAsia="標楷體" w:hAnsi="Times New Roman" w:cs="Times New Roman" w:hint="eastAsia"/>
               </w:rPr>
-              <w:t>頁面點擊</w:t>
+              <w:t>的私訊</w:t>
             </w:r>
             <w:proofErr w:type="gramEnd"/>
             <w:r>
               <w:rPr>
                 <w:rFonts w:ascii="Times New Roman" w:eastAsia="標楷體" w:hAnsi="Times New Roman" w:cs="Times New Roman" w:hint="eastAsia"/>
               </w:rPr>
-              <w:t>「聯繫賣家」按鈕。</w:t>
-            </w:r>
-          </w:p>
-          <w:p>
-            <w:pPr>
-              <w:rPr>
-                <w:rFonts w:ascii="Times New Roman" w:eastAsia="標楷體" w:hAnsi="Times New Roman" w:cs="Times New Roman"/>
-              </w:rPr>
-            </w:pPr>
-            <w:r>
-              <w:rPr>
-                <w:rFonts w:ascii="Times New Roman" w:eastAsia="標楷體" w:hAnsi="Times New Roman" w:cs="Times New Roman" w:hint="eastAsia"/>
-              </w:rPr>
-              <w:t xml:space="preserve">2. </w:t>
-            </w:r>
-            <w:r>
-              <w:rPr>
-                <w:rFonts w:ascii="Times New Roman" w:eastAsia="標楷體" w:hAnsi="Times New Roman" w:cs="Times New Roman" w:hint="eastAsia"/>
-              </w:rPr>
-              <w:t>系統</w:t>
+              <w:t>。</w:t>
+            </w:r>
+          </w:p>
+          <w:p>
+            <w:pPr>
+              <w:rPr>
+                <w:rFonts w:ascii="Times New Roman" w:eastAsia="標楷體" w:hAnsi="Times New Roman" w:cs="Times New Roman"/>
+              </w:rPr>
+            </w:pPr>
+            <w:r>
+              <w:rPr>
+                <w:rFonts w:ascii="Times New Roman" w:eastAsia="標楷體" w:hAnsi="Times New Roman" w:cs="Times New Roman" w:hint="eastAsia"/>
+              </w:rPr>
+              <w:t>2</w:t>
+            </w:r>
+            <w:r>
+              <w:rPr>
+                <w:rFonts w:ascii="Times New Roman" w:eastAsia="標楷體" w:hAnsi="Times New Roman" w:cs="Times New Roman" w:hint="eastAsia"/>
+              </w:rPr>
+              <w:t xml:space="preserve">. </w:t>
+            </w:r>
+            <w:r>
+              <w:rPr>
+                <w:rFonts w:ascii="Times New Roman" w:eastAsia="標楷體" w:hAnsi="Times New Roman" w:cs="Times New Roman" w:hint="eastAsia"/>
+              </w:rPr>
+              <w:t>買家輸入諮詢內容</w:t>
             </w:r>
             <w:proofErr w:type="gramStart"/>
             <w:r>
               <w:rPr>
                 <w:rFonts w:ascii="Times New Roman" w:eastAsia="標楷體" w:hAnsi="Times New Roman" w:cs="Times New Roman" w:hint="eastAsia"/>
               </w:rPr>
-              <w:t>開啟私訊對話</w:t>
+              <w:t>（</w:t>
             </w:r>
             <w:proofErr w:type="gramEnd"/>
             <w:r>
               <w:rPr>
                 <w:rFonts w:ascii="Times New Roman" w:eastAsia="標楷體" w:hAnsi="Times New Roman" w:cs="Times New Roman" w:hint="eastAsia"/>
               </w:rPr>
-              <w:t>視窗。</w:t>
-            </w:r>
-          </w:p>
-          <w:p>
-            <w:pPr>
-              <w:rPr>
-                <w:rFonts w:ascii="Times New Roman" w:eastAsia="標楷體" w:hAnsi="Times New Roman" w:cs="Times New Roman"/>
-              </w:rPr>
-            </w:pPr>
-            <w:r>
-              <w:rPr>
-                <w:rFonts w:ascii="Times New Roman" w:eastAsia="標楷體" w:hAnsi="Times New Roman" w:cs="Times New Roman" w:hint="eastAsia"/>
-              </w:rPr>
-              <w:t xml:space="preserve">3. </w:t>
-            </w:r>
-            <w:r>
-              <w:rPr>
-                <w:rFonts w:ascii="Times New Roman" w:eastAsia="標楷體" w:hAnsi="Times New Roman" w:cs="Times New Roman" w:hint="eastAsia"/>
-              </w:rPr>
-              <w:t>買家輸入諮詢內容</w:t>
+              <w:t>如：詢問</w:t>
+            </w:r>
+            <w:r>
+              <w:rPr>
+                <w:rFonts w:ascii="Times New Roman" w:eastAsia="標楷體" w:hAnsi="Times New Roman" w:cs="Times New Roman" w:hint="eastAsia"/>
+              </w:rPr>
+              <w:t>書</w:t>
             </w:r>
             <w:proofErr w:type="gramStart"/>
             <w:r>
               <w:rPr>
                 <w:rFonts w:ascii="Times New Roman" w:eastAsia="標楷體" w:hAnsi="Times New Roman" w:cs="Times New Roman" w:hint="eastAsia"/>
               </w:rPr>
-              <w:t>（</w:t>
+              <w:t>況</w:t>
             </w:r>
             <w:proofErr w:type="gramEnd"/>
             <w:r>
               <w:rPr>
                 <w:rFonts w:ascii="Times New Roman" w:eastAsia="標楷體" w:hAnsi="Times New Roman" w:cs="Times New Roman" w:hint="eastAsia"/>
               </w:rPr>
-              <w:t>如：詢問</w:t>
-            </w:r>
-            <w:r>
-              <w:rPr>
-                <w:rFonts w:ascii="Times New Roman" w:eastAsia="標楷體" w:hAnsi="Times New Roman" w:cs="Times New Roman" w:hint="eastAsia"/>
-              </w:rPr>
-              <w:t>書</w:t>
+              <w:t>、議價或約定地點</w:t>
             </w:r>
             <w:proofErr w:type="gramStart"/>
             <w:r>
               <w:rPr>
                 <w:rFonts w:ascii="Times New Roman" w:eastAsia="標楷體" w:hAnsi="Times New Roman" w:cs="Times New Roman" w:hint="eastAsia"/>
               </w:rPr>
-              <w:t>況</w:t>
+              <w:t>）</w:t>
             </w:r>
             <w:proofErr w:type="gramEnd"/>
             <w:r>
               <w:rPr>
                 <w:rFonts w:ascii="Times New Roman" w:eastAsia="標楷體" w:hAnsi="Times New Roman" w:cs="Times New Roman" w:hint="eastAsia"/>
               </w:rPr>
-              <w:t>、議價或約定地點</w:t>
-            </w:r>
-            <w:proofErr w:type="gramStart"/>
-            <w:r>
-              <w:rPr>
-                <w:rFonts w:ascii="Times New Roman" w:eastAsia="標楷體" w:hAnsi="Times New Roman" w:cs="Times New Roman" w:hint="eastAsia"/>
-              </w:rPr>
-              <w:t>）</w:t>
-            </w:r>
-            <w:proofErr w:type="gramEnd"/>
-            <w:r>
-              <w:rPr>
-                <w:rFonts w:ascii="Times New Roman" w:eastAsia="標楷體" w:hAnsi="Times New Roman" w:cs="Times New Roman" w:hint="eastAsia"/>
-              </w:rPr>
               <w:t>。</w:t>
             </w:r>
           </w:p>
@@ -4470,44 +4585,56 @@
               <w:rPr>
                 <w:rFonts w:ascii="Times New Roman" w:eastAsia="標楷體" w:hAnsi="Times New Roman" w:cs="Times New Roman" w:hint="eastAsia"/>
               </w:rPr>
-              <w:t xml:space="preserve">4. </w:t>
-            </w:r>
-            <w:r>
-              <w:rPr>
-                <w:rFonts w:ascii="Times New Roman" w:eastAsia="標楷體" w:hAnsi="Times New Roman" w:cs="Times New Roman" w:hint="eastAsia"/>
-              </w:rPr>
-              <w:t>買家點擊發送。</w:t>
-            </w:r>
-          </w:p>
-          <w:p>
-            <w:pPr>
-              <w:rPr>
-                <w:rFonts w:ascii="Times New Roman" w:eastAsia="標楷體" w:hAnsi="Times New Roman" w:cs="Times New Roman"/>
-              </w:rPr>
-            </w:pPr>
-            <w:r>
-              <w:rPr>
-                <w:rFonts w:ascii="Times New Roman" w:eastAsia="標楷體" w:hAnsi="Times New Roman" w:cs="Times New Roman" w:hint="eastAsia"/>
-              </w:rPr>
-              <w:t xml:space="preserve">5. </w:t>
-            </w:r>
-            <w:r>
-              <w:rPr>
-                <w:rFonts w:ascii="Times New Roman" w:eastAsia="標楷體" w:hAnsi="Times New Roman" w:cs="Times New Roman" w:hint="eastAsia"/>
-              </w:rPr>
-              <w:t>系統將訊息即時推播給賣家，並顯示於兩者的對話</w:t>
-            </w:r>
-            <w:r>
-              <w:rPr>
-                <w:rFonts w:ascii="Times New Roman" w:eastAsia="標楷體" w:hAnsi="Times New Roman" w:cs="Times New Roman" w:hint="eastAsia"/>
-              </w:rPr>
-              <w:t>視窗</w:t>
-            </w:r>
-            <w:r>
-              <w:rPr>
-                <w:rFonts w:ascii="Times New Roman" w:eastAsia="標楷體" w:hAnsi="Times New Roman" w:cs="Times New Roman" w:hint="eastAsia"/>
-              </w:rPr>
-              <w:t>中。</w:t>
+              <w:t>3</w:t>
+            </w:r>
+            <w:r>
+              <w:rPr>
+                <w:rFonts w:ascii="Times New Roman" w:eastAsia="標楷體" w:hAnsi="Times New Roman" w:cs="Times New Roman" w:hint="eastAsia"/>
+              </w:rPr>
+              <w:t xml:space="preserve">. </w:t>
+            </w:r>
+            <w:r>
+              <w:rPr>
+                <w:rFonts w:ascii="Times New Roman" w:eastAsia="標楷體" w:hAnsi="Times New Roman" w:cs="Times New Roman" w:hint="eastAsia"/>
+              </w:rPr>
+              <w:t>買家</w:t>
+            </w:r>
+            <w:r>
+              <w:rPr>
+                <w:rFonts w:ascii="Times New Roman" w:eastAsia="標楷體" w:hAnsi="Times New Roman" w:cs="Times New Roman" w:hint="eastAsia"/>
+              </w:rPr>
+              <w:t>確認</w:t>
+            </w:r>
+            <w:r>
+              <w:rPr>
+                <w:rFonts w:ascii="Times New Roman" w:eastAsia="標楷體" w:hAnsi="Times New Roman" w:cs="Times New Roman" w:hint="eastAsia"/>
+              </w:rPr>
+              <w:t>發送。</w:t>
+            </w:r>
+          </w:p>
+          <w:p>
+            <w:pPr>
+              <w:rPr>
+                <w:rFonts w:ascii="Times New Roman" w:eastAsia="標楷體" w:hAnsi="Times New Roman" w:cs="Times New Roman"/>
+              </w:rPr>
+            </w:pPr>
+            <w:r>
+              <w:rPr>
+                <w:rFonts w:ascii="Times New Roman" w:eastAsia="標楷體" w:hAnsi="Times New Roman" w:cs="Times New Roman" w:hint="eastAsia"/>
+              </w:rPr>
+              <w:t>4</w:t>
+            </w:r>
+            <w:r>
+              <w:rPr>
+                <w:rFonts w:ascii="Times New Roman" w:eastAsia="標楷體" w:hAnsi="Times New Roman" w:cs="Times New Roman" w:hint="eastAsia"/>
+              </w:rPr>
+              <w:t xml:space="preserve">. </w:t>
+            </w:r>
+            <w:r>
+              <w:rPr>
+                <w:rFonts w:ascii="Times New Roman" w:eastAsia="標楷體" w:hAnsi="Times New Roman" w:cs="Times New Roman" w:hint="eastAsia"/>
+              </w:rPr>
+              <w:t>系統將訊息即時推播給賣家。</w:t>
             </w:r>
           </w:p>
         </w:tc>
@@ -4545,7 +4672,13 @@
               <w:rPr>
                 <w:rFonts w:ascii="Times New Roman" w:eastAsia="標楷體" w:hAnsi="Times New Roman" w:cs="Times New Roman" w:hint="eastAsia"/>
               </w:rPr>
-              <w:t xml:space="preserve">4a. </w:t>
+              <w:t>3</w:t>
+            </w:r>
+            <w:r>
+              <w:rPr>
+                <w:rFonts w:ascii="Times New Roman" w:eastAsia="標楷體" w:hAnsi="Times New Roman" w:cs="Times New Roman" w:hint="eastAsia"/>
+              </w:rPr>
+              <w:t xml:space="preserve">a. </w:t>
             </w:r>
             <w:r>
               <w:rPr>
@@ -4564,7 +4697,13 @@
               <w:rPr>
                 <w:rFonts w:ascii="Times New Roman" w:eastAsia="標楷體" w:hAnsi="Times New Roman" w:cs="Times New Roman" w:hint="eastAsia"/>
               </w:rPr>
-              <w:t xml:space="preserve">4b. </w:t>
+              <w:t>3</w:t>
+            </w:r>
+            <w:r>
+              <w:rPr>
+                <w:rFonts w:ascii="Times New Roman" w:eastAsia="標楷體" w:hAnsi="Times New Roman" w:cs="Times New Roman" w:hint="eastAsia"/>
+              </w:rPr>
+              <w:t xml:space="preserve">b. </w:t>
             </w:r>
             <w:r>
               <w:rPr>
@@ -4775,6 +4914,7 @@
         <w:rPr>
           <w:rFonts w:hint="eastAsia"/>
         </w:rPr>
+        <w:lastRenderedPageBreak/>
         <w:t>1.5.</w:t>
       </w:r>
       <w:r>
@@ -4865,7 +5005,6 @@
               <w:rPr>
                 <w:rFonts w:ascii="Times New Roman" w:eastAsia="標楷體" w:hAnsi="Times New Roman" w:cs="Times New Roman" w:hint="eastAsia"/>
               </w:rPr>
-              <w:lastRenderedPageBreak/>
               <w:t>Scope</w:t>
             </w:r>
           </w:p>
@@ -5296,7 +5435,7 @@
               <w:rPr>
                 <w:rFonts w:ascii="Times New Roman" w:eastAsia="標楷體" w:hAnsi="Times New Roman" w:cs="Times New Roman" w:hint="eastAsia"/>
               </w:rPr>
-              <w:t>點選</w:t>
+              <w:t>選擇</w:t>
             </w:r>
             <w:r>
               <w:rPr>
@@ -5314,13 +5453,111 @@
               <w:rPr>
                 <w:rFonts w:ascii="Times New Roman" w:eastAsia="標楷體" w:hAnsi="Times New Roman" w:cs="Times New Roman" w:hint="eastAsia"/>
               </w:rPr>
-              <w:t>編輯分類」</w:t>
-            </w:r>
-            <w:r>
-              <w:rPr>
-                <w:rFonts w:ascii="Times New Roman" w:eastAsia="標楷體" w:hAnsi="Times New Roman" w:cs="Times New Roman" w:hint="eastAsia"/>
-              </w:rPr>
-              <w:t>按鈕</w:t>
+              <w:t>編輯分類」。</w:t>
+            </w:r>
+          </w:p>
+          <w:p>
+            <w:pPr>
+              <w:rPr>
+                <w:rFonts w:ascii="Times New Roman" w:eastAsia="標楷體" w:hAnsi="Times New Roman" w:cs="Times New Roman"/>
+              </w:rPr>
+            </w:pPr>
+            <w:r>
+              <w:rPr>
+                <w:rFonts w:ascii="Times New Roman" w:eastAsia="標楷體" w:hAnsi="Times New Roman" w:cs="Times New Roman" w:hint="eastAsia"/>
+              </w:rPr>
+              <w:t xml:space="preserve">3. </w:t>
+            </w:r>
+            <w:r>
+              <w:rPr>
+                <w:rFonts w:ascii="Times New Roman" w:eastAsia="標楷體" w:hAnsi="Times New Roman" w:cs="Times New Roman" w:hint="eastAsia"/>
+              </w:rPr>
+              <w:t>賣家自</w:t>
+            </w:r>
+            <w:r>
+              <w:rPr>
+                <w:rFonts w:ascii="Times New Roman" w:eastAsia="標楷體" w:hAnsi="Times New Roman" w:cs="Times New Roman" w:hint="eastAsia"/>
+              </w:rPr>
+              <w:t>行</w:t>
+            </w:r>
+            <w:r>
+              <w:rPr>
+                <w:rFonts w:ascii="Times New Roman" w:eastAsia="標楷體" w:hAnsi="Times New Roman" w:cs="Times New Roman" w:hint="eastAsia"/>
+              </w:rPr>
+              <w:t>定義類別</w:t>
+            </w:r>
+            <w:r>
+              <w:rPr>
+                <w:rFonts w:ascii="Times New Roman" w:eastAsia="標楷體" w:hAnsi="Times New Roman" w:cs="Times New Roman" w:hint="eastAsia"/>
+              </w:rPr>
+              <w:t>的</w:t>
+            </w:r>
+            <w:r>
+              <w:rPr>
+                <w:rFonts w:ascii="Times New Roman" w:eastAsia="標楷體" w:hAnsi="Times New Roman" w:cs="Times New Roman" w:hint="eastAsia"/>
+              </w:rPr>
+              <w:t>名稱。</w:t>
+            </w:r>
+          </w:p>
+          <w:p>
+            <w:pPr>
+              <w:rPr>
+                <w:rFonts w:ascii="Times New Roman" w:eastAsia="標楷體" w:hAnsi="Times New Roman" w:cs="Times New Roman"/>
+              </w:rPr>
+            </w:pPr>
+            <w:r>
+              <w:rPr>
+                <w:rFonts w:ascii="Times New Roman" w:eastAsia="標楷體" w:hAnsi="Times New Roman" w:cs="Times New Roman" w:hint="eastAsia"/>
+              </w:rPr>
+              <w:t>4</w:t>
+            </w:r>
+            <w:r>
+              <w:rPr>
+                <w:rFonts w:ascii="Times New Roman" w:eastAsia="標楷體" w:hAnsi="Times New Roman" w:cs="Times New Roman" w:hint="eastAsia"/>
+              </w:rPr>
+              <w:t xml:space="preserve">. </w:t>
+            </w:r>
+            <w:r>
+              <w:rPr>
+                <w:rFonts w:ascii="Times New Roman" w:eastAsia="標楷體" w:hAnsi="Times New Roman" w:cs="Times New Roman" w:hint="eastAsia"/>
+              </w:rPr>
+              <w:t>賣家從已上架的</w:t>
+            </w:r>
+            <w:r>
+              <w:rPr>
+                <w:rFonts w:ascii="Times New Roman" w:eastAsia="標楷體" w:hAnsi="Times New Roman" w:cs="Times New Roman" w:hint="eastAsia"/>
+              </w:rPr>
+              <w:t>書籍</w:t>
+            </w:r>
+            <w:r>
+              <w:rPr>
+                <w:rFonts w:ascii="Times New Roman" w:eastAsia="標楷體" w:hAnsi="Times New Roman" w:cs="Times New Roman" w:hint="eastAsia"/>
+              </w:rPr>
+              <w:t>清單中，選</w:t>
+            </w:r>
+            <w:r>
+              <w:rPr>
+                <w:rFonts w:ascii="Times New Roman" w:eastAsia="標楷體" w:hAnsi="Times New Roman" w:cs="Times New Roman" w:hint="eastAsia"/>
+              </w:rPr>
+              <w:t>擇</w:t>
+            </w:r>
+            <w:r>
+              <w:rPr>
+                <w:rFonts w:ascii="Times New Roman" w:eastAsia="標楷體" w:hAnsi="Times New Roman" w:cs="Times New Roman" w:hint="eastAsia"/>
+              </w:rPr>
+              <w:t>欲歸入該分類</w:t>
+            </w:r>
+            <w:r>
+              <w:rPr>
+                <w:rFonts w:ascii="Times New Roman" w:eastAsia="標楷體" w:hAnsi="Times New Roman" w:cs="Times New Roman" w:hint="eastAsia"/>
+              </w:rPr>
+              <w:t>的</w:t>
+            </w:r>
+            <w:r>
+              <w:rPr>
+                <w:rFonts w:ascii="Times New Roman" w:eastAsia="標楷體" w:hAnsi="Times New Roman" w:cs="Times New Roman" w:hint="eastAsia"/>
+              </w:rPr>
+              <w:t>書籍</w:t>
             </w:r>
             <w:r>
               <w:rPr>
@@ -5339,26 +5576,7 @@
               <w:rPr>
                 <w:rFonts w:ascii="Times New Roman" w:eastAsia="標楷體" w:hAnsi="Times New Roman" w:cs="Times New Roman" w:hint="eastAsia"/>
               </w:rPr>
-              <w:t xml:space="preserve">3. </w:t>
-            </w:r>
-            <w:r>
-              <w:rPr>
-                <w:rFonts w:ascii="Times New Roman" w:eastAsia="標楷體" w:hAnsi="Times New Roman" w:cs="Times New Roman" w:hint="eastAsia"/>
-              </w:rPr>
-              <w:t>賣家輸入自定義的類別名稱。</w:t>
-            </w:r>
-          </w:p>
-          <w:p>
-            <w:pPr>
-              <w:rPr>
-                <w:rFonts w:ascii="Times New Roman" w:eastAsia="標楷體" w:hAnsi="Times New Roman" w:cs="Times New Roman"/>
-              </w:rPr>
-            </w:pPr>
-            <w:r>
-              <w:rPr>
-                <w:rFonts w:ascii="Times New Roman" w:eastAsia="標楷體" w:hAnsi="Times New Roman" w:cs="Times New Roman" w:hint="eastAsia"/>
-              </w:rPr>
-              <w:t>4</w:t>
+              <w:t>5</w:t>
             </w:r>
             <w:r>
               <w:rPr>
@@ -5370,80 +5588,25 @@
               <w:rPr>
                 <w:rFonts w:ascii="Times New Roman" w:eastAsia="標楷體" w:hAnsi="Times New Roman" w:cs="Times New Roman" w:hint="eastAsia"/>
               </w:rPr>
-              <w:t>賣家從已上架的</w:t>
-            </w:r>
-            <w:r>
-              <w:rPr>
-                <w:rFonts w:ascii="Times New Roman" w:eastAsia="標楷體" w:hAnsi="Times New Roman" w:cs="Times New Roman" w:hint="eastAsia"/>
-              </w:rPr>
-              <w:t>書籍</w:t>
-            </w:r>
-            <w:r>
-              <w:rPr>
-                <w:rFonts w:ascii="Times New Roman" w:eastAsia="標楷體" w:hAnsi="Times New Roman" w:cs="Times New Roman" w:hint="eastAsia"/>
-              </w:rPr>
-              <w:t>清單中，勾選欲歸入該分類</w:t>
-            </w:r>
-            <w:r>
-              <w:rPr>
-                <w:rFonts w:ascii="Times New Roman" w:eastAsia="標楷體" w:hAnsi="Times New Roman" w:cs="Times New Roman" w:hint="eastAsia"/>
-              </w:rPr>
-              <w:t>的</w:t>
-            </w:r>
-            <w:r>
-              <w:rPr>
-                <w:rFonts w:ascii="Times New Roman" w:eastAsia="標楷體" w:hAnsi="Times New Roman" w:cs="Times New Roman" w:hint="eastAsia"/>
-              </w:rPr>
-              <w:t>書籍</w:t>
-            </w:r>
-            <w:r>
-              <w:rPr>
-                <w:rFonts w:ascii="Times New Roman" w:eastAsia="標楷體" w:hAnsi="Times New Roman" w:cs="Times New Roman" w:hint="eastAsia"/>
-              </w:rPr>
-              <w:t>。</w:t>
-            </w:r>
-          </w:p>
-          <w:p>
-            <w:pPr>
-              <w:rPr>
-                <w:rFonts w:ascii="Times New Roman" w:eastAsia="標楷體" w:hAnsi="Times New Roman" w:cs="Times New Roman"/>
-              </w:rPr>
-            </w:pPr>
-            <w:r>
-              <w:rPr>
-                <w:rFonts w:ascii="Times New Roman" w:eastAsia="標楷體" w:hAnsi="Times New Roman" w:cs="Times New Roman" w:hint="eastAsia"/>
-              </w:rPr>
-              <w:t>5</w:t>
-            </w:r>
-            <w:r>
-              <w:rPr>
-                <w:rFonts w:ascii="Times New Roman" w:eastAsia="標楷體" w:hAnsi="Times New Roman" w:cs="Times New Roman" w:hint="eastAsia"/>
-              </w:rPr>
-              <w:t xml:space="preserve">. </w:t>
-            </w:r>
-            <w:r>
-              <w:rPr>
-                <w:rFonts w:ascii="Times New Roman" w:eastAsia="標楷體" w:hAnsi="Times New Roman" w:cs="Times New Roman" w:hint="eastAsia"/>
-              </w:rPr>
-              <w:t>賣家點</w:t>
-            </w:r>
-            <w:r>
-              <w:rPr>
-                <w:rFonts w:ascii="Times New Roman" w:eastAsia="標楷體" w:hAnsi="Times New Roman" w:cs="Times New Roman" w:hint="eastAsia"/>
-              </w:rPr>
-              <w:t>選</w:t>
-            </w:r>
-            <w:r>
-              <w:rPr>
-                <w:rFonts w:ascii="Times New Roman" w:eastAsia="標楷體" w:hAnsi="Times New Roman" w:cs="Times New Roman" w:hint="eastAsia"/>
-              </w:rPr>
-              <w:t>「確認套用」</w:t>
-            </w:r>
-            <w:r>
-              <w:rPr>
-                <w:rFonts w:ascii="Times New Roman" w:eastAsia="標楷體" w:hAnsi="Times New Roman" w:cs="Times New Roman" w:hint="eastAsia"/>
-              </w:rPr>
-              <w:t>按鈕</w:t>
+              <w:t>賣家</w:t>
+            </w:r>
+            <w:r>
+              <w:rPr>
+                <w:rFonts w:ascii="Times New Roman" w:eastAsia="標楷體" w:hAnsi="Times New Roman" w:cs="Times New Roman" w:hint="eastAsia"/>
+              </w:rPr>
+              <w:t>確認</w:t>
+            </w:r>
+            <w:r>
+              <w:rPr>
+                <w:rFonts w:ascii="Times New Roman" w:eastAsia="標楷體" w:hAnsi="Times New Roman" w:cs="Times New Roman" w:hint="eastAsia"/>
+              </w:rPr>
+              <w:t>套用</w:t>
+            </w:r>
+            <w:r>
+              <w:rPr>
+                <w:rFonts w:ascii="Times New Roman" w:eastAsia="標楷體" w:hAnsi="Times New Roman" w:cs="Times New Roman" w:hint="eastAsia"/>
+              </w:rPr>
+              <w:t>類別</w:t>
             </w:r>
             <w:r>
               <w:rPr>
@@ -5753,43 +5916,7 @@
               <w:rPr>
                 <w:rFonts w:ascii="Times New Roman" w:eastAsia="標楷體" w:hAnsi="Times New Roman" w:cs="Times New Roman" w:hint="eastAsia"/>
               </w:rPr>
-              <w:t>支援「批次處理」功能，賣家</w:t>
-            </w:r>
-            <w:r>
-              <w:rPr>
-                <w:rFonts w:ascii="Times New Roman" w:eastAsia="標楷體" w:hAnsi="Times New Roman" w:cs="Times New Roman" w:hint="eastAsia"/>
-              </w:rPr>
-              <w:t>可以</w:t>
-            </w:r>
-            <w:r>
-              <w:rPr>
-                <w:rFonts w:ascii="Times New Roman" w:eastAsia="標楷體" w:hAnsi="Times New Roman" w:cs="Times New Roman" w:hint="eastAsia"/>
-              </w:rPr>
-              <w:t>一次</w:t>
-            </w:r>
-            <w:r>
-              <w:rPr>
-                <w:rFonts w:ascii="Times New Roman" w:eastAsia="標楷體" w:hAnsi="Times New Roman" w:cs="Times New Roman" w:hint="eastAsia"/>
-              </w:rPr>
-              <w:t>處理</w:t>
-            </w:r>
-            <w:r>
-              <w:rPr>
-                <w:rFonts w:ascii="Times New Roman" w:eastAsia="標楷體" w:hAnsi="Times New Roman" w:cs="Times New Roman" w:hint="eastAsia"/>
-              </w:rPr>
-              <w:t>多</w:t>
-            </w:r>
-            <w:r>
-              <w:rPr>
-                <w:rFonts w:ascii="Times New Roman" w:eastAsia="標楷體" w:hAnsi="Times New Roman" w:cs="Times New Roman" w:hint="eastAsia"/>
-              </w:rPr>
-              <w:t>本書籍</w:t>
-            </w:r>
-            <w:r>
-              <w:rPr>
-                <w:rFonts w:ascii="Times New Roman" w:eastAsia="標楷體" w:hAnsi="Times New Roman" w:cs="Times New Roman" w:hint="eastAsia"/>
-              </w:rPr>
-              <w:t>。</w:t>
+              <w:t>無</w:t>
             </w:r>
           </w:p>
         </w:tc>
@@ -5827,7 +5954,14 @@
               <w:rPr>
                 <w:rFonts w:ascii="Times New Roman" w:eastAsia="標楷體" w:hAnsi="Times New Roman" w:cs="Times New Roman" w:hint="eastAsia"/>
               </w:rPr>
-              <w:t>允許賣家自定義標籤進行彈性的管理。</w:t>
+              <w:t>允許賣家自定義標籤進行彈性的管</w:t>
+            </w:r>
+            <w:r>
+              <w:rPr>
+                <w:rFonts w:ascii="Times New Roman" w:eastAsia="標楷體" w:hAnsi="Times New Roman" w:cs="Times New Roman" w:hint="eastAsia"/>
+              </w:rPr>
+              <w:lastRenderedPageBreak/>
+              <w:t>理。</w:t>
             </w:r>
           </w:p>
         </w:tc>
@@ -6931,6 +7065,7 @@
         <w:rPr>
           <w:rFonts w:hint="eastAsia"/>
         </w:rPr>
+        <w:lastRenderedPageBreak/>
         <w:t xml:space="preserve">1.6 </w:t>
       </w:r>
       <w:r>
@@ -7019,7 +7154,6 @@
               <w:rPr>
                 <w:rFonts w:ascii="Times New Roman" w:eastAsia="標楷體" w:hAnsi="Times New Roman" w:cs="Times New Roman"/>
               </w:rPr>
-              <w:lastRenderedPageBreak/>
               <w:t>NFR-1</w:t>
             </w:r>
           </w:p>
@@ -8130,7 +8264,6 @@
         <w:rPr>
           <w:rFonts w:hint="eastAsia"/>
         </w:rPr>
-        <w:lastRenderedPageBreak/>
         <w:t>Domain model</w:t>
       </w:r>
     </w:p>
@@ -8492,7 +8625,7 @@
               <w:rPr>
                 <w:rFonts w:ascii="Times New Roman" w:eastAsia="標楷體" w:hAnsi="Times New Roman" w:cs="Times New Roman" w:hint="eastAsia"/>
               </w:rPr>
-              <w:t>書名作者</w:t>
+              <w:t>書名</w:t>
             </w:r>
           </w:p>
         </w:tc>
@@ -8607,9 +8740,8 @@
             <w:r>
               <w:rPr>
                 <w:rFonts w:ascii="Times New Roman" w:eastAsia="標楷體" w:hAnsi="Times New Roman" w:cs="Times New Roman" w:hint="eastAsia"/>
-                <w:highlight w:val="green"/>
-              </w:rPr>
-              <w:t>交易狀態</w:t>
+              </w:rPr>
+              <w:t>作者</w:t>
             </w:r>
           </w:p>
         </w:tc>
@@ -8687,12 +8819,6 @@
                 <w:rFonts w:ascii="Times New Roman" w:eastAsia="標楷體" w:hAnsi="Times New Roman" w:cs="Times New Roman" w:hint="eastAsia"/>
               </w:rPr>
               <w:t>類別</w:t>
-            </w:r>
-            <w:r>
-              <w:rPr>
-                <w:rFonts w:ascii="Times New Roman" w:eastAsia="標楷體" w:hAnsi="Times New Roman" w:cs="Times New Roman" w:hint="eastAsia"/>
-              </w:rPr>
-              <w:t>名稱</w:t>
             </w:r>
           </w:p>
         </w:tc>
@@ -8910,7 +9036,7 @@
           <w:numId w:val="12"/>
         </w:numPr>
         <w:rPr>
-          <w:rFonts w:ascii="Times New Roman" w:eastAsia="標楷體" w:hAnsi="Times New Roman" w:cs="Times New Roman" w:hint="eastAsia"/>
+          <w:rFonts w:ascii="Times New Roman" w:eastAsia="標楷體" w:hAnsi="Times New Roman" w:cs="Times New Roman"/>
         </w:rPr>
       </w:pPr>
       <w:r>
@@ -9002,7 +9128,7 @@
           <w:numId w:val="12"/>
         </w:numPr>
         <w:rPr>
-          <w:rFonts w:ascii="Times New Roman" w:eastAsia="標楷體" w:hAnsi="Times New Roman" w:cs="Times New Roman" w:hint="eastAsia"/>
+          <w:rFonts w:ascii="Times New Roman" w:eastAsia="標楷體" w:hAnsi="Times New Roman" w:cs="Times New Roman"/>
         </w:rPr>
       </w:pPr>
       <w:r>
@@ -9089,7 +9215,7 @@
           <w:numId w:val="13"/>
         </w:numPr>
         <w:rPr>
-          <w:rFonts w:ascii="Times New Roman" w:eastAsia="標楷體" w:hAnsi="Times New Roman" w:cs="Times New Roman" w:hint="eastAsia"/>
+          <w:rFonts w:ascii="Times New Roman" w:eastAsia="標楷體" w:hAnsi="Times New Roman" w:cs="Times New Roman"/>
         </w:rPr>
       </w:pPr>
       <w:r>
@@ -9187,20 +9313,32 @@
           <w:numId w:val="13"/>
         </w:numPr>
         <w:rPr>
+          <w:rFonts w:ascii="Times New Roman" w:eastAsia="標楷體" w:hAnsi="Times New Roman" w:cs="Times New Roman"/>
+        </w:rPr>
+      </w:pPr>
+      <w:r>
+        <w:rPr>
           <w:rFonts w:ascii="Times New Roman" w:eastAsia="標楷體" w:hAnsi="Times New Roman" w:cs="Times New Roman" w:hint="eastAsia"/>
         </w:rPr>
-      </w:pPr>
+        <w:t xml:space="preserve">ISBN </w:t>
+      </w:r>
       <w:r>
         <w:rPr>
           <w:rFonts w:ascii="Times New Roman" w:eastAsia="標楷體" w:hAnsi="Times New Roman" w:cs="Times New Roman" w:hint="eastAsia"/>
         </w:rPr>
-        <w:t xml:space="preserve">ISBN </w:t>
+        <w:t>格式、書名</w:t>
       </w:r>
       <w:r>
         <w:rPr>
           <w:rFonts w:ascii="Times New Roman" w:eastAsia="標楷體" w:hAnsi="Times New Roman" w:cs="Times New Roman" w:hint="eastAsia"/>
         </w:rPr>
-        <w:t>格式、書名作者、書名：應直接作為</w:t>
+        <w:t>、</w:t>
+      </w:r>
+      <w:r>
+        <w:rPr>
+          <w:rFonts w:ascii="Times New Roman" w:eastAsia="標楷體" w:hAnsi="Times New Roman" w:cs="Times New Roman" w:hint="eastAsia"/>
+        </w:rPr>
+        <w:t>作者：應直接作為</w:t>
       </w:r>
       <w:r>
         <w:rPr>
@@ -9235,32 +9373,20 @@
           <w:numId w:val="13"/>
         </w:numPr>
         <w:rPr>
+          <w:rFonts w:ascii="Times New Roman" w:eastAsia="標楷體" w:hAnsi="Times New Roman" w:cs="Times New Roman"/>
+        </w:rPr>
+      </w:pPr>
+      <w:r>
+        <w:rPr>
           <w:rFonts w:ascii="Times New Roman" w:eastAsia="標楷體" w:hAnsi="Times New Roman" w:cs="Times New Roman" w:hint="eastAsia"/>
         </w:rPr>
-      </w:pPr>
+        <w:t>所在地：應作為</w:t>
+      </w:r>
       <w:r>
         <w:rPr>
           <w:rFonts w:ascii="Times New Roman" w:eastAsia="標楷體" w:hAnsi="Times New Roman" w:cs="Times New Roman" w:hint="eastAsia"/>
         </w:rPr>
-        <w:t>所在地：應作為</w:t>
-      </w:r>
-      <w:r>
-        <w:rPr>
-          <w:rFonts w:ascii="Times New Roman" w:eastAsia="標楷體" w:hAnsi="Times New Roman" w:cs="Times New Roman" w:hint="eastAsia"/>
-        </w:rPr>
-        <w:t xml:space="preserve"> User (</w:t>
-      </w:r>
-      <w:r>
-        <w:rPr>
-          <w:rFonts w:ascii="Times New Roman" w:eastAsia="標楷體" w:hAnsi="Times New Roman" w:cs="Times New Roman" w:hint="eastAsia"/>
-        </w:rPr>
-        <w:t>或</w:t>
-      </w:r>
-      <w:r>
-        <w:rPr>
-          <w:rFonts w:ascii="Times New Roman" w:eastAsia="標楷體" w:hAnsi="Times New Roman" w:cs="Times New Roman" w:hint="eastAsia"/>
-        </w:rPr>
-        <w:t xml:space="preserve"> Buyer/Seller) </w:t>
+        <w:t>買家與賣家</w:t>
       </w:r>
       <w:r>
         <w:rPr>
@@ -9284,6 +9410,7 @@
         <w:rPr>
           <w:rFonts w:ascii="Times New Roman" w:eastAsia="標楷體" w:hAnsi="Times New Roman" w:cs="Times New Roman" w:hint="eastAsia"/>
         </w:rPr>
+        <w:lastRenderedPageBreak/>
         <w:t>類別名稱：應作為</w:t>
       </w:r>
       <w:r>
@@ -9337,14 +9464,13 @@
           <w:numId w:val="13"/>
         </w:numPr>
         <w:rPr>
+          <w:rFonts w:ascii="Times New Roman" w:eastAsia="標楷體" w:hAnsi="Times New Roman" w:cs="Times New Roman"/>
+        </w:rPr>
+      </w:pPr>
+      <w:r>
+        <w:rPr>
           <w:rFonts w:ascii="Times New Roman" w:eastAsia="標楷體" w:hAnsi="Times New Roman" w:cs="Times New Roman" w:hint="eastAsia"/>
         </w:rPr>
-      </w:pPr>
-      <w:r>
-        <w:rPr>
-          <w:rFonts w:ascii="Times New Roman" w:eastAsia="標楷體" w:hAnsi="Times New Roman" w:cs="Times New Roman" w:hint="eastAsia"/>
-        </w:rPr>
-        <w:lastRenderedPageBreak/>
         <w:t>書籍清單：在程式碼中通常是資料結構（如</w:t>
       </w:r>
       <w:r>
@@ -9376,25 +9502,7 @@
         <w:rPr>
           <w:rFonts w:ascii="Times New Roman" w:eastAsia="標楷體" w:hAnsi="Times New Roman" w:cs="Times New Roman" w:hint="eastAsia"/>
         </w:rPr>
-        <w:t>屬於</w:t>
-      </w:r>
-      <w:r>
-        <w:rPr>
-          <w:rFonts w:ascii="Times New Roman" w:eastAsia="標楷體" w:hAnsi="Times New Roman" w:cs="Times New Roman" w:hint="eastAsia"/>
-        </w:rPr>
-        <w:t>「</w:t>
-      </w:r>
-      <w:r>
-        <w:rPr>
-          <w:rFonts w:ascii="Times New Roman" w:eastAsia="標楷體" w:hAnsi="Times New Roman" w:cs="Times New Roman" w:hint="eastAsia"/>
-        </w:rPr>
-        <w:t>事件</w:t>
-      </w:r>
-      <w:r>
-        <w:rPr>
-          <w:rFonts w:ascii="Times New Roman" w:eastAsia="標楷體" w:hAnsi="Times New Roman" w:cs="Times New Roman" w:hint="eastAsia"/>
-        </w:rPr>
-        <w:t>」</w:t>
+        <w:t>屬於「事件」</w:t>
       </w:r>
       <w:r>
         <w:rPr>
@@ -9411,7 +9519,7 @@
           <w:numId w:val="14"/>
         </w:numPr>
         <w:rPr>
-          <w:rFonts w:ascii="Times New Roman" w:eastAsia="標楷體" w:hAnsi="Times New Roman" w:cs="Times New Roman" w:hint="eastAsia"/>
+          <w:rFonts w:ascii="Times New Roman" w:eastAsia="標楷體" w:hAnsi="Times New Roman" w:cs="Times New Roman"/>
         </w:rPr>
       </w:pPr>
       <w:r>
@@ -9441,7 +9549,7 @@
           <w:numId w:val="14"/>
         </w:numPr>
         <w:rPr>
-          <w:rFonts w:ascii="Times New Roman" w:eastAsia="標楷體" w:hAnsi="Times New Roman" w:cs="Times New Roman" w:hint="eastAsia"/>
+          <w:rFonts w:ascii="Times New Roman" w:eastAsia="標楷體" w:hAnsi="Times New Roman" w:cs="Times New Roman"/>
         </w:rPr>
       </w:pPr>
       <w:r>
@@ -9459,7 +9567,7 @@
           <w:numId w:val="14"/>
         </w:numPr>
         <w:rPr>
-          <w:rFonts w:ascii="Times New Roman" w:eastAsia="標楷體" w:hAnsi="Times New Roman" w:cs="Times New Roman" w:hint="eastAsia"/>
+          <w:rFonts w:ascii="Times New Roman" w:eastAsia="標楷體" w:hAnsi="Times New Roman" w:cs="Times New Roman"/>
         </w:rPr>
       </w:pPr>
       <w:r>
@@ -9484,7 +9592,7 @@
     <w:p>
       <w:pPr>
         <w:rPr>
-          <w:rFonts w:ascii="Times New Roman" w:eastAsia="標楷體" w:hAnsi="Times New Roman" w:cs="Times New Roman" w:hint="eastAsia"/>
+          <w:rFonts w:ascii="Times New Roman" w:eastAsia="標楷體" w:hAnsi="Times New Roman" w:cs="Times New Roman"/>
         </w:rPr>
       </w:pPr>
     </w:p>
@@ -9677,9 +9785,15 @@
           <w:p>
             <w:pPr>
               <w:rPr>
-                <w:rFonts w:ascii="Times New Roman" w:eastAsia="標楷體" w:hAnsi="Times New Roman" w:cs="Times New Roman"/>
-              </w:rPr>
-            </w:pPr>
+                <w:rFonts w:ascii="Times New Roman" w:eastAsia="標楷體" w:hAnsi="Times New Roman" w:cs="Times New Roman" w:hint="eastAsia"/>
+              </w:rPr>
+            </w:pPr>
+            <w:r>
+              <w:rPr>
+                <w:rFonts w:ascii="Times New Roman" w:eastAsia="標楷體" w:hAnsi="Times New Roman" w:cs="Times New Roman" w:hint="eastAsia"/>
+              </w:rPr>
+              <w:t>HW#2</w:t>
+            </w:r>
           </w:p>
         </w:tc>
         <w:tc>
@@ -9754,9 +9868,15 @@
           <w:p>
             <w:pPr>
               <w:rPr>
-                <w:rFonts w:ascii="Times New Roman" w:eastAsia="標楷體" w:hAnsi="Times New Roman" w:cs="Times New Roman"/>
-              </w:rPr>
-            </w:pPr>
+                <w:rFonts w:ascii="Times New Roman" w:eastAsia="標楷體" w:hAnsi="Times New Roman" w:cs="Times New Roman" w:hint="eastAsia"/>
+              </w:rPr>
+            </w:pPr>
+            <w:r>
+              <w:rPr>
+                <w:rFonts w:ascii="Times New Roman" w:eastAsia="標楷體" w:hAnsi="Times New Roman" w:cs="Times New Roman" w:hint="eastAsia"/>
+              </w:rPr>
+              <w:t>26/03/30 10:00~12:00</w:t>
+            </w:r>
           </w:p>
         </w:tc>
       </w:tr>
@@ -9780,7 +9900,7 @@
           <w:p>
             <w:pPr>
               <w:rPr>
-                <w:rFonts w:ascii="Times New Roman" w:eastAsia="標楷體" w:hAnsi="Times New Roman" w:cs="Times New Roman" w:hint="eastAsia"/>
+                <w:rFonts w:ascii="Times New Roman" w:eastAsia="標楷體" w:hAnsi="Times New Roman" w:cs="Times New Roman"/>
               </w:rPr>
             </w:pPr>
             <w:r>
@@ -11722,7 +11842,7 @@
   <w:style w:type="paragraph" w:default="1" w:styleId="a">
     <w:name w:val="Normal"/>
     <w:qFormat/>
-    <w:rsid w:val="004F5365"/>
+    <w:rsid w:val="008A4F2C"/>
     <w:pPr>
       <w:widowControl w:val="0"/>
     </w:pPr>
@@ -11926,6 +12046,7 @@
   <w:style w:type="character" w:default="1" w:styleId="a0">
     <w:name w:val="Default Paragraph Font"/>
     <w:uiPriority w:val="1"/>
+    <w:semiHidden/>
     <w:unhideWhenUsed/>
   </w:style>
   <w:style w:type="table" w:default="1" w:styleId="a1">

</xml_diff>

<commit_message>
doc: add domain model with associations and attributes
</commit_message>
<xml_diff>
--- a/document/hw3.docx
+++ b/document/hw3.docx
@@ -1,6 +1,6 @@
 
 <file path=word/document.xml><?xml version="1.0" encoding="utf-8"?>
-<w:document xmlns:wpc="http://schemas.microsoft.com/office/word/2010/wordprocessingCanvas" xmlns:cx="http://schemas.microsoft.com/office/drawing/2014/chartex" xmlns:cx1="http://schemas.microsoft.com/office/drawing/2015/9/8/chartex" xmlns:cx2="http://schemas.microsoft.com/office/drawing/2015/10/21/chartex" xmlns:cx3="http://schemas.microsoft.com/office/drawing/2016/5/9/chartex" xmlns:cx4="http://schemas.microsoft.com/office/drawing/2016/5/10/chartex" xmlns:cx5="http://schemas.microsoft.com/office/drawing/2016/5/11/chartex" xmlns:cx6="http://schemas.microsoft.com/office/drawing/2016/5/12/chartex" xmlns:cx7="http://schemas.microsoft.com/office/drawing/2016/5/13/chartex" xmlns:cx8="http://schemas.microsoft.com/office/drawing/2016/5/14/chartex" xmlns:mc="http://schemas.openxmlformats.org/markup-compatibility/2006" xmlns:aink="http://schemas.microsoft.com/office/drawing/2016/ink" xmlns:am3d="http://schemas.microsoft.com/office/drawing/2017/model3d" xmlns:o="urn:schemas-microsoft-com:office:office" xmlns:oel="http://schemas.microsoft.com/office/2019/extlst" xmlns:r="http://schemas.openxmlformats.org/officeDocument/2006/relationships" xmlns:m="http://schemas.openxmlformats.org/officeDocument/2006/math" xmlns:v="urn:schemas-microsoft-com:vml" xmlns:wp14="http://schemas.microsoft.com/office/word/2010/wordprocessingDrawing" xmlns:wp="http://schemas.openxmlformats.org/drawingml/2006/wordprocessingDrawing" xmlns:w10="urn:schemas-microsoft-com:office:word" xmlns:w="http://schemas.openxmlformats.org/wordprocessingml/2006/main" xmlns:w14="http://schemas.microsoft.com/office/word/2010/wordml" xmlns:w15="http://schemas.microsoft.com/office/word/2012/wordml" xmlns:w16cex="http://schemas.microsoft.com/office/word/2018/wordml/cex" xmlns:w16cid="http://schemas.microsoft.com/office/word/2016/wordml/cid" xmlns:w16="http://schemas.microsoft.com/office/word/2018/wordml" xmlns:w16du="http://schemas.microsoft.com/office/word/2023/wordml/word16du" xmlns:w16sdtdh="http://schemas.microsoft.com/office/word/2020/wordml/sdtdatahash" xmlns:w16sdtfl="http://schemas.microsoft.com/office/word/2024/wordml/sdtformatlock" xmlns:w16se="http://schemas.microsoft.com/office/word/2015/wordml/symex" xmlns:wpg="http://schemas.microsoft.com/office/word/2010/wordprocessingGroup" xmlns:wpi="http://schemas.microsoft.com/office/word/2010/wordprocessingInk" xmlns:wne="http://schemas.microsoft.com/office/word/2006/wordml" xmlns:wps="http://schemas.microsoft.com/office/word/2010/wordprocessingShape" mc:Ignorable="w14 w15 w16se w16cid w16 w16cex w16sdtdh w16sdtfl w16du wp14">
+<w:document xmlns:wpc="http://schemas.microsoft.com/office/word/2010/wordprocessingCanvas" xmlns:cx="http://schemas.microsoft.com/office/drawing/2014/chartex" xmlns:cx1="http://schemas.microsoft.com/office/drawing/2015/9/8/chartex" xmlns:cx2="http://schemas.microsoft.com/office/drawing/2015/10/21/chartex" xmlns:cx3="http://schemas.microsoft.com/office/drawing/2016/5/9/chartex" xmlns:cx4="http://schemas.microsoft.com/office/drawing/2016/5/10/chartex" xmlns:cx5="http://schemas.microsoft.com/office/drawing/2016/5/11/chartex" xmlns:cx6="http://schemas.microsoft.com/office/drawing/2016/5/12/chartex" xmlns:cx7="http://schemas.microsoft.com/office/drawing/2016/5/13/chartex" xmlns:cx8="http://schemas.microsoft.com/office/drawing/2016/5/14/chartex" xmlns:mc="http://schemas.openxmlformats.org/markup-compatibility/2006" xmlns:aink="http://schemas.microsoft.com/office/drawing/2016/ink" xmlns:am3d="http://schemas.microsoft.com/office/drawing/2017/model3d" xmlns:o="urn:schemas-microsoft-com:office:office" xmlns:oel="http://schemas.microsoft.com/office/2019/extlst" xmlns:r="http://schemas.openxmlformats.org/officeDocument/2006/relationships" xmlns:m="http://schemas.openxmlformats.org/officeDocument/2006/math" xmlns:v="urn:schemas-microsoft-com:vml" xmlns:wp14="http://schemas.microsoft.com/office/word/2010/wordprocessingDrawing" xmlns:wp="http://schemas.openxmlformats.org/drawingml/2006/wordprocessingDrawing" xmlns:w10="urn:schemas-microsoft-com:office:word" xmlns:w="http://schemas.openxmlformats.org/wordprocessingml/2006/main" xmlns:w14="http://schemas.microsoft.com/office/word/2010/wordml" xmlns:w15="http://schemas.microsoft.com/office/word/2012/wordml" xmlns:w16cex="http://schemas.microsoft.com/office/word/2018/wordml/cex" xmlns:w16cid="http://schemas.microsoft.com/office/word/2016/wordml/cid" xmlns:w16="http://schemas.microsoft.com/office/word/2018/wordml" xmlns:w16sdtdh="http://schemas.microsoft.com/office/word/2020/wordml/sdtdatahash" xmlns:w16se="http://schemas.microsoft.com/office/word/2015/wordml/symex" xmlns:wpg="http://schemas.microsoft.com/office/word/2010/wordprocessingGroup" xmlns:wpi="http://schemas.microsoft.com/office/word/2010/wordprocessingInk" xmlns:wne="http://schemas.microsoft.com/office/word/2006/wordml" xmlns:wps="http://schemas.microsoft.com/office/word/2010/wordprocessingShape" mc:Ignorable="w14 w15 w16se w16cid w16 w16cex w16sdtdh wp14">
   <w:body>
     <w:p>
       <w:pPr>
@@ -84,7 +84,6 @@
         </w:rPr>
       </w:pPr>
       <w:proofErr w:type="spellStart"/>
-      <w:proofErr w:type="gramStart"/>
       <w:r>
         <w:rPr>
           <w:rFonts w:ascii="Times New Roman" w:eastAsia="標楷體" w:hAnsi="Times New Roman" w:cs="Times New Roman" w:hint="eastAsia"/>
@@ -96,7 +95,6 @@
         <w:t>Re:Book</w:t>
       </w:r>
       <w:proofErr w:type="spellEnd"/>
-      <w:proofErr w:type="gramEnd"/>
     </w:p>
     <w:p>
       <w:pPr>
@@ -201,23 +199,21 @@
           <w:szCs w:val="40"/>
         </w:rPr>
       </w:pPr>
-      <w:proofErr w:type="gramStart"/>
       <w:r>
         <w:rPr>
           <w:rFonts w:ascii="Times New Roman" w:eastAsia="標楷體" w:hAnsi="Times New Roman" w:cs="Times New Roman"/>
           <w:sz w:val="40"/>
           <w:szCs w:val="40"/>
         </w:rPr>
-        <w:t>資工碩</w:t>
-      </w:r>
-      <w:proofErr w:type="gramEnd"/>
+        <w:t>資工碩二</w:t>
+      </w:r>
       <w:r>
         <w:rPr>
           <w:rFonts w:ascii="Times New Roman" w:eastAsia="標楷體" w:hAnsi="Times New Roman" w:cs="Times New Roman"/>
           <w:sz w:val="40"/>
           <w:szCs w:val="40"/>
         </w:rPr>
-        <w:t>二</w:t>
+        <w:t xml:space="preserve"> 113598037 </w:t>
       </w:r>
       <w:r>
         <w:rPr>
@@ -225,54 +221,26 @@
           <w:sz w:val="40"/>
           <w:szCs w:val="40"/>
         </w:rPr>
-        <w:t xml:space="preserve"> 113598037 </w:t>
-      </w:r>
-      <w:r>
+        <w:t>陳宥錡</w:t>
+      </w:r>
+    </w:p>
+    <w:p>
+      <w:pPr>
+        <w:jc w:val="center"/>
         <w:rPr>
           <w:rFonts w:ascii="Times New Roman" w:eastAsia="標楷體" w:hAnsi="Times New Roman" w:cs="Times New Roman"/>
           <w:sz w:val="40"/>
           <w:szCs w:val="40"/>
         </w:rPr>
-        <w:t>陳</w:t>
-      </w:r>
-      <w:proofErr w:type="gramStart"/>
+      </w:pPr>
       <w:r>
         <w:rPr>
           <w:rFonts w:ascii="Times New Roman" w:eastAsia="標楷體" w:hAnsi="Times New Roman" w:cs="Times New Roman"/>
           <w:sz w:val="40"/>
           <w:szCs w:val="40"/>
         </w:rPr>
-        <w:t>宥錡</w:t>
-      </w:r>
-      <w:proofErr w:type="gramEnd"/>
-    </w:p>
-    <w:p>
-      <w:pPr>
-        <w:jc w:val="center"/>
-        <w:rPr>
-          <w:rFonts w:ascii="Times New Roman" w:eastAsia="標楷體" w:hAnsi="Times New Roman" w:cs="Times New Roman"/>
-          <w:sz w:val="40"/>
-          <w:szCs w:val="40"/>
-        </w:rPr>
-      </w:pPr>
-      <w:r>
-        <w:rPr>
-          <w:rFonts w:ascii="Times New Roman" w:eastAsia="標楷體" w:hAnsi="Times New Roman" w:cs="Times New Roman"/>
-          <w:sz w:val="40"/>
-          <w:szCs w:val="40"/>
-        </w:rPr>
-        <w:t>資工碩</w:t>
-      </w:r>
-      <w:proofErr w:type="gramStart"/>
-      <w:r>
-        <w:rPr>
-          <w:rFonts w:ascii="Times New Roman" w:eastAsia="標楷體" w:hAnsi="Times New Roman" w:cs="Times New Roman"/>
-          <w:sz w:val="40"/>
-          <w:szCs w:val="40"/>
-        </w:rPr>
-        <w:t>一</w:t>
-      </w:r>
-      <w:proofErr w:type="gramEnd"/>
+        <w:t>資工碩一</w:t>
+      </w:r>
       <w:r>
         <w:rPr>
           <w:rFonts w:ascii="Times New Roman" w:eastAsia="標楷體" w:hAnsi="Times New Roman" w:cs="Times New Roman"/>
@@ -736,35 +704,7 @@
         <w:rPr>
           <w:rFonts w:ascii="Times New Roman" w:eastAsia="標楷體" w:hAnsi="Times New Roman" w:cs="Times New Roman" w:hint="eastAsia"/>
         </w:rPr>
-        <w:t>類。為體現對書本價值的尊重，賣家可設定期望售價，並上傳書</w:t>
-      </w:r>
-      <w:proofErr w:type="gramStart"/>
-      <w:r>
-        <w:rPr>
-          <w:rFonts w:ascii="Times New Roman" w:eastAsia="標楷體" w:hAnsi="Times New Roman" w:cs="Times New Roman" w:hint="eastAsia"/>
-        </w:rPr>
-        <w:t>況</w:t>
-      </w:r>
-      <w:proofErr w:type="gramEnd"/>
-      <w:r>
-        <w:rPr>
-          <w:rFonts w:ascii="Times New Roman" w:eastAsia="標楷體" w:hAnsi="Times New Roman" w:cs="Times New Roman" w:hint="eastAsia"/>
-        </w:rPr>
-        <w:t>照片或分享使用心得。潛在買家則可透過搜尋與篩選功能，快速找到所需書籍。平台同時</w:t>
-      </w:r>
-      <w:proofErr w:type="gramStart"/>
-      <w:r>
-        <w:rPr>
-          <w:rFonts w:ascii="Times New Roman" w:eastAsia="標楷體" w:hAnsi="Times New Roman" w:cs="Times New Roman" w:hint="eastAsia"/>
-        </w:rPr>
-        <w:t>提供私訊機制</w:t>
-      </w:r>
-      <w:proofErr w:type="gramEnd"/>
-      <w:r>
-        <w:rPr>
-          <w:rFonts w:ascii="Times New Roman" w:eastAsia="標楷體" w:hAnsi="Times New Roman" w:cs="Times New Roman" w:hint="eastAsia"/>
-        </w:rPr>
-        <w:t>，讓雙方協商最終價格與交付方式，確保知識的傳遞過程既順暢高效，也保有人與人之間的溫度。</w:t>
+        <w:t>類。為體現對書本價值的尊重，賣家可設定期望售價，並上傳書況照片或分享使用心得。潛在買家則可透過搜尋與篩選功能，快速找到所需書籍。平台同時提供私訊機制，讓雙方協商最終價格與交付方式，確保知識的傳遞過程既順暢高效，也保有人與人之間的溫度。</w:t>
       </w:r>
     </w:p>
     <w:p>
@@ -991,14 +931,12 @@
                 <w:rFonts w:ascii="Times New Roman" w:eastAsia="標楷體" w:hAnsi="Times New Roman" w:cs="Times New Roman"/>
               </w:rPr>
             </w:pPr>
-            <w:proofErr w:type="gramStart"/>
             <w:r>
               <w:rPr>
                 <w:rFonts w:ascii="Times New Roman" w:eastAsia="標楷體" w:hAnsi="Times New Roman" w:cs="Times New Roman" w:hint="eastAsia"/>
               </w:rPr>
               <w:t>發送私訊</w:t>
             </w:r>
-            <w:proofErr w:type="gramEnd"/>
           </w:p>
         </w:tc>
       </w:tr>
@@ -1268,7 +1206,6 @@
               </w:rPr>
             </w:pPr>
             <w:proofErr w:type="spellStart"/>
-            <w:proofErr w:type="gramStart"/>
             <w:r>
               <w:rPr>
                 <w:rFonts w:ascii="Times New Roman" w:eastAsia="標楷體" w:hAnsi="Times New Roman" w:cs="Times New Roman" w:hint="eastAsia"/>
@@ -1276,7 +1213,6 @@
               <w:t>Re:Book</w:t>
             </w:r>
             <w:proofErr w:type="spellEnd"/>
-            <w:proofErr w:type="gramEnd"/>
           </w:p>
         </w:tc>
       </w:tr>
@@ -1652,21 +1588,7 @@
               <w:rPr>
                 <w:rFonts w:ascii="Times New Roman" w:eastAsia="標楷體" w:hAnsi="Times New Roman" w:cs="Times New Roman" w:hint="eastAsia"/>
               </w:rPr>
-              <w:t>、書名、價格、書</w:t>
-            </w:r>
-            <w:proofErr w:type="gramStart"/>
-            <w:r>
-              <w:rPr>
-                <w:rFonts w:ascii="Times New Roman" w:eastAsia="標楷體" w:hAnsi="Times New Roman" w:cs="Times New Roman" w:hint="eastAsia"/>
-              </w:rPr>
-              <w:t>況</w:t>
-            </w:r>
-            <w:proofErr w:type="gramEnd"/>
-            <w:r>
-              <w:rPr>
-                <w:rFonts w:ascii="Times New Roman" w:eastAsia="標楷體" w:hAnsi="Times New Roman" w:cs="Times New Roman" w:hint="eastAsia"/>
-              </w:rPr>
-              <w:t>及</w:t>
+              <w:t>、書名、價格、書況及</w:t>
             </w:r>
             <w:r>
               <w:rPr>
@@ -1723,14 +1645,12 @@
               </w:rPr>
               <w:t>格式</w:t>
             </w:r>
-            <w:proofErr w:type="gramStart"/>
             <w:r>
               <w:rPr>
                 <w:rFonts w:ascii="Times New Roman" w:eastAsia="標楷體" w:hAnsi="Times New Roman" w:cs="Times New Roman" w:hint="eastAsia"/>
               </w:rPr>
               <w:t>與必填欄位</w:t>
             </w:r>
-            <w:proofErr w:type="gramEnd"/>
             <w:r>
               <w:rPr>
                 <w:rFonts w:ascii="Times New Roman" w:eastAsia="標楷體" w:hAnsi="Times New Roman" w:cs="Times New Roman" w:hint="eastAsia"/>
@@ -1854,13 +1774,7 @@
               <w:rPr>
                 <w:rFonts w:ascii="Times New Roman" w:eastAsia="標楷體" w:hAnsi="Times New Roman" w:cs="Times New Roman" w:hint="eastAsia"/>
               </w:rPr>
-              <w:t>賣家修改</w:t>
-            </w:r>
-            <w:r>
-              <w:rPr>
-                <w:rFonts w:ascii="Times New Roman" w:eastAsia="標楷體" w:hAnsi="Times New Roman" w:cs="Times New Roman" w:hint="eastAsia"/>
-              </w:rPr>
-              <w:t>書籍資料</w:t>
+              <w:t>賣家修改書籍資料</w:t>
             </w:r>
             <w:r>
               <w:rPr>
@@ -2426,7 +2340,6 @@
               </w:rPr>
             </w:pPr>
             <w:proofErr w:type="spellStart"/>
-            <w:proofErr w:type="gramStart"/>
             <w:r>
               <w:rPr>
                 <w:rFonts w:ascii="Times New Roman" w:eastAsia="標楷體" w:hAnsi="Times New Roman" w:cs="Times New Roman" w:hint="eastAsia"/>
@@ -2434,7 +2347,6 @@
               <w:t>Re:Book</w:t>
             </w:r>
             <w:proofErr w:type="spellEnd"/>
-            <w:proofErr w:type="gramEnd"/>
           </w:p>
         </w:tc>
       </w:tr>
@@ -2759,21 +2671,7 @@
               <w:rPr>
                 <w:rFonts w:ascii="Times New Roman" w:eastAsia="標楷體" w:hAnsi="Times New Roman" w:cs="Times New Roman" w:hint="eastAsia"/>
               </w:rPr>
-              <w:t>買家選擇篩選條件</w:t>
-            </w:r>
-            <w:proofErr w:type="gramStart"/>
-            <w:r>
-              <w:rPr>
-                <w:rFonts w:ascii="Times New Roman" w:eastAsia="標楷體" w:hAnsi="Times New Roman" w:cs="Times New Roman" w:hint="eastAsia"/>
-              </w:rPr>
-              <w:t>（</w:t>
-            </w:r>
-            <w:proofErr w:type="gramEnd"/>
-            <w:r>
-              <w:rPr>
-                <w:rFonts w:ascii="Times New Roman" w:eastAsia="標楷體" w:hAnsi="Times New Roman" w:cs="Times New Roman" w:hint="eastAsia"/>
-              </w:rPr>
-              <w:t>如：</w:t>
+              <w:t>買家選擇篩選條件（如：</w:t>
             </w:r>
             <w:r>
               <w:rPr>
@@ -2785,21 +2683,7 @@
               <w:rPr>
                 <w:rFonts w:ascii="Times New Roman" w:eastAsia="標楷體" w:hAnsi="Times New Roman" w:cs="Times New Roman" w:hint="eastAsia"/>
               </w:rPr>
-              <w:t>、價格範圍</w:t>
-            </w:r>
-            <w:proofErr w:type="gramStart"/>
-            <w:r>
-              <w:rPr>
-                <w:rFonts w:ascii="Times New Roman" w:eastAsia="標楷體" w:hAnsi="Times New Roman" w:cs="Times New Roman" w:hint="eastAsia"/>
-              </w:rPr>
-              <w:t>）</w:t>
-            </w:r>
-            <w:proofErr w:type="gramEnd"/>
-            <w:r>
-              <w:rPr>
-                <w:rFonts w:ascii="Times New Roman" w:eastAsia="標楷體" w:hAnsi="Times New Roman" w:cs="Times New Roman" w:hint="eastAsia"/>
-              </w:rPr>
-              <w:t>。</w:t>
+              <w:t>、價格範圍）。</w:t>
             </w:r>
           </w:p>
           <w:p>
@@ -2855,7 +2739,7 @@
           <w:p>
             <w:pPr>
               <w:rPr>
-                <w:rFonts w:ascii="Times New Roman" w:eastAsia="標楷體" w:hAnsi="Times New Roman" w:cs="Times New Roman" w:hint="eastAsia"/>
+                <w:rFonts w:ascii="Times New Roman" w:eastAsia="標楷體" w:hAnsi="Times New Roman" w:cs="Times New Roman"/>
               </w:rPr>
             </w:pPr>
             <w:r>
@@ -3227,7 +3111,6 @@
               </w:rPr>
             </w:pPr>
             <w:proofErr w:type="spellStart"/>
-            <w:proofErr w:type="gramStart"/>
             <w:r>
               <w:rPr>
                 <w:rFonts w:ascii="Times New Roman" w:eastAsia="標楷體" w:hAnsi="Times New Roman" w:cs="Times New Roman" w:hint="eastAsia"/>
@@ -3235,7 +3118,6 @@
               <w:t>Re:Book</w:t>
             </w:r>
             <w:proofErr w:type="spellEnd"/>
-            <w:proofErr w:type="gramEnd"/>
           </w:p>
         </w:tc>
       </w:tr>
@@ -3537,35 +3419,7 @@
               <w:rPr>
                 <w:rFonts w:ascii="Times New Roman" w:eastAsia="標楷體" w:hAnsi="Times New Roman" w:cs="Times New Roman" w:hint="eastAsia"/>
               </w:rPr>
-              <w:t>系統顯示訂單資訊與線下交易選項</w:t>
-            </w:r>
-            <w:proofErr w:type="gramStart"/>
-            <w:r>
-              <w:rPr>
-                <w:rFonts w:ascii="Times New Roman" w:eastAsia="標楷體" w:hAnsi="Times New Roman" w:cs="Times New Roman" w:hint="eastAsia"/>
-              </w:rPr>
-              <w:t>（</w:t>
-            </w:r>
-            <w:proofErr w:type="gramEnd"/>
-            <w:r>
-              <w:rPr>
-                <w:rFonts w:ascii="Times New Roman" w:eastAsia="標楷體" w:hAnsi="Times New Roman" w:cs="Times New Roman" w:hint="eastAsia"/>
-              </w:rPr>
-              <w:t>如：面交付現、自行匯款</w:t>
-            </w:r>
-            <w:proofErr w:type="gramStart"/>
-            <w:r>
-              <w:rPr>
-                <w:rFonts w:ascii="Times New Roman" w:eastAsia="標楷體" w:hAnsi="Times New Roman" w:cs="Times New Roman" w:hint="eastAsia"/>
-              </w:rPr>
-              <w:t>）</w:t>
-            </w:r>
-            <w:proofErr w:type="gramEnd"/>
-            <w:r>
-              <w:rPr>
-                <w:rFonts w:ascii="Times New Roman" w:eastAsia="標楷體" w:hAnsi="Times New Roman" w:cs="Times New Roman" w:hint="eastAsia"/>
-              </w:rPr>
-              <w:t>。</w:t>
+              <w:t>系統顯示訂單資訊與線下交易選項（如：面交付現、自行匯款）。</w:t>
             </w:r>
           </w:p>
           <w:p>
@@ -3954,21 +3808,7 @@
               <w:rPr>
                 <w:rFonts w:ascii="Times New Roman" w:eastAsia="標楷體" w:hAnsi="Times New Roman" w:cs="Times New Roman"/>
               </w:rPr>
-              <w:t>是否需要設定自動取消機制？</w:t>
-            </w:r>
-            <w:proofErr w:type="gramStart"/>
-            <w:r>
-              <w:rPr>
-                <w:rFonts w:ascii="Times New Roman" w:eastAsia="標楷體" w:hAnsi="Times New Roman" w:cs="Times New Roman"/>
-              </w:rPr>
-              <w:t>（</w:t>
-            </w:r>
-            <w:proofErr w:type="gramEnd"/>
-            <w:r>
-              <w:rPr>
-                <w:rFonts w:ascii="Times New Roman" w:eastAsia="標楷體" w:hAnsi="Times New Roman" w:cs="Times New Roman"/>
-              </w:rPr>
-              <w:t>例</w:t>
+              <w:t>是否需要設定自動取消機制？（例</w:t>
             </w:r>
             <w:r>
               <w:rPr>
@@ -3987,21 +3827,7 @@
               <w:rPr>
                 <w:rFonts w:ascii="Times New Roman" w:eastAsia="標楷體" w:hAnsi="Times New Roman" w:cs="Times New Roman"/>
               </w:rPr>
-              <w:t>天內未點擊完成，系統自動取消並恢復書籍狀態</w:t>
-            </w:r>
-            <w:proofErr w:type="gramStart"/>
-            <w:r>
-              <w:rPr>
-                <w:rFonts w:ascii="Times New Roman" w:eastAsia="標楷體" w:hAnsi="Times New Roman" w:cs="Times New Roman"/>
-              </w:rPr>
-              <w:t>）</w:t>
-            </w:r>
-            <w:proofErr w:type="gramEnd"/>
-            <w:r>
-              <w:rPr>
-                <w:rFonts w:ascii="Times New Roman" w:eastAsia="標楷體" w:hAnsi="Times New Roman" w:cs="Times New Roman"/>
-              </w:rPr>
-              <w:t>。</w:t>
+              <w:t>天內未點擊完成，系統自動取消並恢復書籍狀態）。</w:t>
             </w:r>
           </w:p>
         </w:tc>
@@ -4127,7 +3953,6 @@
               </w:rPr>
             </w:pPr>
             <w:proofErr w:type="spellStart"/>
-            <w:proofErr w:type="gramStart"/>
             <w:r>
               <w:rPr>
                 <w:rFonts w:ascii="Times New Roman" w:eastAsia="標楷體" w:hAnsi="Times New Roman" w:cs="Times New Roman" w:hint="eastAsia"/>
@@ -4135,7 +3960,6 @@
               <w:t>Re:Book</w:t>
             </w:r>
             <w:proofErr w:type="spellEnd"/>
-            <w:proofErr w:type="gramEnd"/>
           </w:p>
         </w:tc>
       </w:tr>
@@ -4254,21 +4078,7 @@
               <w:rPr>
                 <w:rFonts w:ascii="Times New Roman" w:eastAsia="標楷體" w:hAnsi="Times New Roman" w:cs="Times New Roman" w:hint="eastAsia"/>
               </w:rPr>
-              <w:t>買家：希望直接聯繫賣家以詢問書</w:t>
-            </w:r>
-            <w:proofErr w:type="gramStart"/>
-            <w:r>
-              <w:rPr>
-                <w:rFonts w:ascii="Times New Roman" w:eastAsia="標楷體" w:hAnsi="Times New Roman" w:cs="Times New Roman" w:hint="eastAsia"/>
-              </w:rPr>
-              <w:t>況</w:t>
-            </w:r>
-            <w:proofErr w:type="gramEnd"/>
-            <w:r>
-              <w:rPr>
-                <w:rFonts w:ascii="Times New Roman" w:eastAsia="標楷體" w:hAnsi="Times New Roman" w:cs="Times New Roman" w:hint="eastAsia"/>
-              </w:rPr>
-              <w:t>細節或協商最終價格</w:t>
+              <w:t>買家：希望直接聯繫賣家以詢問書況細節或協商最終價格</w:t>
             </w:r>
           </w:p>
           <w:p>
@@ -4487,14 +4297,12 @@
               </w:rPr>
               <w:t>賣家</w:t>
             </w:r>
-            <w:proofErr w:type="gramStart"/>
             <w:r>
               <w:rPr>
                 <w:rFonts w:ascii="Times New Roman" w:eastAsia="標楷體" w:hAnsi="Times New Roman" w:cs="Times New Roman" w:hint="eastAsia"/>
               </w:rPr>
               <w:t>的私訊</w:t>
             </w:r>
-            <w:proofErr w:type="gramEnd"/>
             <w:r>
               <w:rPr>
                 <w:rFonts w:ascii="Times New Roman" w:eastAsia="標楷體" w:hAnsi="Times New Roman" w:cs="Times New Roman" w:hint="eastAsia"/>
@@ -4524,21 +4332,7 @@
               <w:rPr>
                 <w:rFonts w:ascii="Times New Roman" w:eastAsia="標楷體" w:hAnsi="Times New Roman" w:cs="Times New Roman" w:hint="eastAsia"/>
               </w:rPr>
-              <w:t>買家輸入諮詢內容</w:t>
-            </w:r>
-            <w:proofErr w:type="gramStart"/>
-            <w:r>
-              <w:rPr>
-                <w:rFonts w:ascii="Times New Roman" w:eastAsia="標楷體" w:hAnsi="Times New Roman" w:cs="Times New Roman" w:hint="eastAsia"/>
-              </w:rPr>
-              <w:t>（</w:t>
-            </w:r>
-            <w:proofErr w:type="gramEnd"/>
-            <w:r>
-              <w:rPr>
-                <w:rFonts w:ascii="Times New Roman" w:eastAsia="標楷體" w:hAnsi="Times New Roman" w:cs="Times New Roman" w:hint="eastAsia"/>
-              </w:rPr>
-              <w:t>如：詢問</w:t>
+              <w:t>買家輸入諮詢內容（如：詢問</w:t>
             </w:r>
             <w:r>
               <w:rPr>
@@ -4546,33 +4340,11 @@
               </w:rPr>
               <w:t>書</w:t>
             </w:r>
-            <w:proofErr w:type="gramStart"/>
-            <w:r>
-              <w:rPr>
-                <w:rFonts w:ascii="Times New Roman" w:eastAsia="標楷體" w:hAnsi="Times New Roman" w:cs="Times New Roman" w:hint="eastAsia"/>
-              </w:rPr>
-              <w:t>況</w:t>
-            </w:r>
-            <w:proofErr w:type="gramEnd"/>
-            <w:r>
-              <w:rPr>
-                <w:rFonts w:ascii="Times New Roman" w:eastAsia="標楷體" w:hAnsi="Times New Roman" w:cs="Times New Roman" w:hint="eastAsia"/>
-              </w:rPr>
-              <w:t>、議價或約定地點</w:t>
-            </w:r>
-            <w:proofErr w:type="gramStart"/>
-            <w:r>
-              <w:rPr>
-                <w:rFonts w:ascii="Times New Roman" w:eastAsia="標楷體" w:hAnsi="Times New Roman" w:cs="Times New Roman" w:hint="eastAsia"/>
-              </w:rPr>
-              <w:t>）</w:t>
-            </w:r>
-            <w:proofErr w:type="gramEnd"/>
-            <w:r>
-              <w:rPr>
-                <w:rFonts w:ascii="Times New Roman" w:eastAsia="標楷體" w:hAnsi="Times New Roman" w:cs="Times New Roman" w:hint="eastAsia"/>
-              </w:rPr>
-              <w:t>。</w:t>
+            <w:r>
+              <w:rPr>
+                <w:rFonts w:ascii="Times New Roman" w:eastAsia="標楷體" w:hAnsi="Times New Roman" w:cs="Times New Roman" w:hint="eastAsia"/>
+              </w:rPr>
+              <w:t>況、議價或約定地點）。</w:t>
             </w:r>
           </w:p>
           <w:p>
@@ -4797,21 +4569,7 @@
               <w:rPr>
                 <w:rFonts w:ascii="Times New Roman" w:eastAsia="標楷體" w:hAnsi="Times New Roman" w:cs="Times New Roman" w:hint="eastAsia"/>
               </w:rPr>
-              <w:t>支援文字訊息；未來可擴充支援圖片傳送（用於拍攝更詳細的書</w:t>
-            </w:r>
-            <w:proofErr w:type="gramStart"/>
-            <w:r>
-              <w:rPr>
-                <w:rFonts w:ascii="Times New Roman" w:eastAsia="標楷體" w:hAnsi="Times New Roman" w:cs="Times New Roman" w:hint="eastAsia"/>
-              </w:rPr>
-              <w:t>況</w:t>
-            </w:r>
-            <w:proofErr w:type="gramEnd"/>
-            <w:r>
-              <w:rPr>
-                <w:rFonts w:ascii="Times New Roman" w:eastAsia="標楷體" w:hAnsi="Times New Roman" w:cs="Times New Roman" w:hint="eastAsia"/>
-              </w:rPr>
-              <w:t>）。</w:t>
+              <w:t>支援文字訊息；未來可擴充支援圖片傳送（用於拍攝更詳細的書況）。</w:t>
             </w:r>
           </w:p>
         </w:tc>
@@ -5020,7 +4778,6 @@
               </w:rPr>
             </w:pPr>
             <w:proofErr w:type="spellStart"/>
-            <w:proofErr w:type="gramStart"/>
             <w:r>
               <w:rPr>
                 <w:rFonts w:ascii="Times New Roman" w:eastAsia="標楷體" w:hAnsi="Times New Roman" w:cs="Times New Roman" w:hint="eastAsia"/>
@@ -5028,7 +4785,6 @@
               <w:t>Re:Book</w:t>
             </w:r>
             <w:proofErr w:type="spellEnd"/>
-            <w:proofErr w:type="gramEnd"/>
           </w:p>
         </w:tc>
       </w:tr>
@@ -5320,14 +5076,7 @@
               <w:rPr>
                 <w:rFonts w:ascii="Times New Roman" w:eastAsia="標楷體" w:hAnsi="Times New Roman" w:cs="Times New Roman" w:hint="eastAsia"/>
               </w:rPr>
-              <w:t>被正確</w:t>
-            </w:r>
-            <w:proofErr w:type="gramStart"/>
-            <w:r>
-              <w:rPr>
-                <w:rFonts w:ascii="Times New Roman" w:eastAsia="標楷體" w:hAnsi="Times New Roman" w:cs="Times New Roman" w:hint="eastAsia"/>
-              </w:rPr>
-              <w:t>歸類至</w:t>
+              <w:t>被正確歸類至</w:t>
             </w:r>
             <w:r>
               <w:rPr>
@@ -5335,7 +5084,6 @@
               </w:rPr>
               <w:t>賣家</w:t>
             </w:r>
-            <w:proofErr w:type="gramEnd"/>
             <w:r>
               <w:rPr>
                 <w:rFonts w:ascii="Times New Roman" w:eastAsia="標楷體" w:hAnsi="Times New Roman" w:cs="Times New Roman" w:hint="eastAsia"/>
@@ -5352,21 +5100,7 @@
               <w:rPr>
                 <w:rFonts w:ascii="Times New Roman" w:eastAsia="標楷體" w:hAnsi="Times New Roman" w:cs="Times New Roman" w:hint="eastAsia"/>
               </w:rPr>
-              <w:t>分類中，且買家在賣家個人頁面能看到</w:t>
-            </w:r>
-            <w:proofErr w:type="gramStart"/>
-            <w:r>
-              <w:rPr>
-                <w:rFonts w:ascii="Times New Roman" w:eastAsia="標楷體" w:hAnsi="Times New Roman" w:cs="Times New Roman" w:hint="eastAsia"/>
-              </w:rPr>
-              <w:t>清楚的</w:t>
-            </w:r>
-            <w:proofErr w:type="gramEnd"/>
-            <w:r>
-              <w:rPr>
-                <w:rFonts w:ascii="Times New Roman" w:eastAsia="標楷體" w:hAnsi="Times New Roman" w:cs="Times New Roman" w:hint="eastAsia"/>
-              </w:rPr>
-              <w:t>分類結構。</w:t>
+              <w:t>分類中，且買家在賣家個人頁面能看到清楚的分類結構。</w:t>
             </w:r>
           </w:p>
         </w:tc>
@@ -6182,7 +5916,6 @@
               </w:rPr>
             </w:pPr>
             <w:proofErr w:type="spellStart"/>
-            <w:proofErr w:type="gramStart"/>
             <w:r>
               <w:rPr>
                 <w:rFonts w:ascii="Times New Roman" w:eastAsia="標楷體" w:hAnsi="Times New Roman" w:cs="Times New Roman"/>
@@ -6190,7 +5923,6 @@
               <w:t>Re:Book</w:t>
             </w:r>
             <w:proofErr w:type="spellEnd"/>
-            <w:proofErr w:type="gramEnd"/>
           </w:p>
         </w:tc>
       </w:tr>
@@ -6479,19 +6211,11 @@
               </w:rPr>
               <w:t>的</w:t>
             </w:r>
-            <w:proofErr w:type="gramStart"/>
-            <w:r>
-              <w:rPr>
-                <w:rFonts w:ascii="Times New Roman" w:eastAsia="標楷體" w:hAnsi="Times New Roman" w:cs="Times New Roman" w:hint="eastAsia"/>
-              </w:rPr>
-              <w:t>詳情頁點擊</w:t>
-            </w:r>
-            <w:proofErr w:type="gramEnd"/>
-            <w:r>
-              <w:rPr>
-                <w:rFonts w:ascii="Times New Roman" w:eastAsia="標楷體" w:hAnsi="Times New Roman" w:cs="Times New Roman" w:hint="eastAsia"/>
-              </w:rPr>
-              <w:t>「加入</w:t>
+            <w:r>
+              <w:rPr>
+                <w:rFonts w:ascii="Times New Roman" w:eastAsia="標楷體" w:hAnsi="Times New Roman" w:cs="Times New Roman" w:hint="eastAsia"/>
+              </w:rPr>
+              <w:t>詳情頁點擊「加入</w:t>
             </w:r>
             <w:r>
               <w:rPr>
@@ -6579,7 +6303,6 @@
               </w:rPr>
               <w:t>買家進入</w:t>
             </w:r>
-            <w:proofErr w:type="gramStart"/>
             <w:r>
               <w:rPr>
                 <w:rFonts w:ascii="Times New Roman" w:eastAsia="標楷體" w:hAnsi="Times New Roman" w:cs="Times New Roman" w:hint="eastAsia"/>
@@ -6590,14 +6313,7 @@
               <w:rPr>
                 <w:rFonts w:ascii="Times New Roman" w:eastAsia="標楷體" w:hAnsi="Times New Roman" w:cs="Times New Roman" w:hint="eastAsia"/>
               </w:rPr>
-              <w:t>頁面</w:t>
-            </w:r>
-            <w:proofErr w:type="gramEnd"/>
-            <w:r>
-              <w:rPr>
-                <w:rFonts w:ascii="Times New Roman" w:eastAsia="標楷體" w:hAnsi="Times New Roman" w:cs="Times New Roman" w:hint="eastAsia"/>
-              </w:rPr>
-              <w:t>，查看所有已</w:t>
+              <w:t>頁面，查看所有已</w:t>
             </w:r>
             <w:r>
               <w:rPr>
@@ -6642,14 +6358,12 @@
               </w:rPr>
               <w:t>買家可從</w:t>
             </w:r>
-            <w:proofErr w:type="gramStart"/>
             <w:r>
               <w:rPr>
                 <w:rFonts w:ascii="Times New Roman" w:eastAsia="標楷體" w:hAnsi="Times New Roman" w:cs="Times New Roman" w:hint="eastAsia"/>
               </w:rPr>
               <w:t>購物車頁面</w:t>
             </w:r>
-            <w:proofErr w:type="gramEnd"/>
             <w:r>
               <w:rPr>
                 <w:rFonts w:ascii="Times New Roman" w:eastAsia="標楷體" w:hAnsi="Times New Roman" w:cs="Times New Roman" w:hint="eastAsia"/>
@@ -7358,19 +7072,11 @@
                 <w:rFonts w:ascii="Times New Roman" w:eastAsia="標楷體" w:hAnsi="Times New Roman" w:cs="Times New Roman"/>
               </w:rPr>
             </w:pPr>
-            <w:proofErr w:type="gramStart"/>
-            <w:r>
-              <w:rPr>
-                <w:rFonts w:ascii="Times New Roman" w:eastAsia="標楷體" w:hAnsi="Times New Roman" w:cs="Times New Roman" w:hint="eastAsia"/>
-              </w:rPr>
-              <w:t>私訊傳遞</w:t>
-            </w:r>
-            <w:proofErr w:type="gramEnd"/>
-            <w:r>
-              <w:rPr>
-                <w:rFonts w:ascii="Times New Roman" w:eastAsia="標楷體" w:hAnsi="Times New Roman" w:cs="Times New Roman" w:hint="eastAsia"/>
-              </w:rPr>
-              <w:t>的延遲時間應小於</w:t>
+            <w:r>
+              <w:rPr>
+                <w:rFonts w:ascii="Times New Roman" w:eastAsia="標楷體" w:hAnsi="Times New Roman" w:cs="Times New Roman" w:hint="eastAsia"/>
+              </w:rPr>
+              <w:t>私訊傳遞的延遲時間應小於</w:t>
             </w:r>
             <w:r>
               <w:rPr>
@@ -7890,21 +7596,7 @@
               <w:rPr>
                 <w:rFonts w:ascii="Times New Roman" w:eastAsia="標楷體" w:hAnsi="Times New Roman" w:cs="Times New Roman"/>
               </w:rPr>
-              <w:t>，包含該書籍的價格、書</w:t>
-            </w:r>
-            <w:proofErr w:type="gramStart"/>
-            <w:r>
-              <w:rPr>
-                <w:rFonts w:ascii="Times New Roman" w:eastAsia="標楷體" w:hAnsi="Times New Roman" w:cs="Times New Roman"/>
-              </w:rPr>
-              <w:t>況</w:t>
-            </w:r>
-            <w:proofErr w:type="gramEnd"/>
-            <w:r>
-              <w:rPr>
-                <w:rFonts w:ascii="Times New Roman" w:eastAsia="標楷體" w:hAnsi="Times New Roman" w:cs="Times New Roman"/>
-              </w:rPr>
-              <w:t>、照片與所在地點等資訊。</w:t>
+              <w:t>，包含該書籍的價格、書況、照片與所在地點等資訊。</w:t>
             </w:r>
           </w:p>
         </w:tc>
@@ -8008,14 +7700,12 @@
                 <w:rFonts w:ascii="Times New Roman" w:eastAsia="標楷體" w:hAnsi="Times New Roman" w:cs="Times New Roman"/>
               </w:rPr>
             </w:pPr>
-            <w:proofErr w:type="gramStart"/>
             <w:r>
               <w:rPr>
                 <w:rFonts w:ascii="Times New Roman" w:eastAsia="標楷體" w:hAnsi="Times New Roman" w:cs="Times New Roman" w:hint="eastAsia"/>
               </w:rPr>
               <w:t>私訊</w:t>
             </w:r>
-            <w:proofErr w:type="gramEnd"/>
           </w:p>
         </w:tc>
         <w:tc>
@@ -8082,21 +7772,7 @@
               <w:rPr>
                 <w:rFonts w:ascii="Times New Roman" w:eastAsia="標楷體" w:hAnsi="Times New Roman" w:cs="Times New Roman" w:hint="eastAsia"/>
               </w:rPr>
-              <w:t>。讓買家在後續可以進行比價或</w:t>
-            </w:r>
-            <w:proofErr w:type="gramStart"/>
-            <w:r>
-              <w:rPr>
-                <w:rFonts w:ascii="Times New Roman" w:eastAsia="標楷體" w:hAnsi="Times New Roman" w:cs="Times New Roman" w:hint="eastAsia"/>
-              </w:rPr>
-              <w:t>發起私訊以</w:t>
-            </w:r>
-            <w:proofErr w:type="gramEnd"/>
-            <w:r>
-              <w:rPr>
-                <w:rFonts w:ascii="Times New Roman" w:eastAsia="標楷體" w:hAnsi="Times New Roman" w:cs="Times New Roman" w:hint="eastAsia"/>
-              </w:rPr>
-              <w:t>進行協商。</w:t>
+              <w:t>。讓買家在後續可以進行比價或發起私訊以進行協商。</w:t>
             </w:r>
           </w:p>
         </w:tc>
@@ -8354,7 +8030,6 @@
             <w:r>
               <w:rPr>
                 <w:rFonts w:ascii="Times New Roman" w:eastAsia="標楷體" w:hAnsi="Times New Roman" w:cs="Times New Roman" w:hint="eastAsia"/>
-                <w:highlight w:val="yellow"/>
               </w:rPr>
               <w:t>賣家</w:t>
             </w:r>
@@ -8373,7 +8048,6 @@
             <w:r>
               <w:rPr>
                 <w:rFonts w:ascii="Times New Roman" w:eastAsia="標楷體" w:hAnsi="Times New Roman" w:cs="Times New Roman" w:hint="eastAsia"/>
-                <w:highlight w:val="yellow"/>
               </w:rPr>
               <w:t>買家</w:t>
             </w:r>
@@ -8392,7 +8066,6 @@
             <w:r>
               <w:rPr>
                 <w:rFonts w:ascii="Times New Roman" w:eastAsia="標楷體" w:hAnsi="Times New Roman" w:cs="Times New Roman" w:hint="eastAsia"/>
-                <w:highlight w:val="yellow"/>
               </w:rPr>
               <w:t>書籍頁面</w:t>
             </w:r>
@@ -8406,13 +8079,11 @@
             <w:pPr>
               <w:rPr>
                 <w:rFonts w:ascii="Times New Roman" w:eastAsia="標楷體" w:hAnsi="Times New Roman" w:cs="Times New Roman"/>
-                <w:highlight w:val="yellow"/>
-              </w:rPr>
-            </w:pPr>
-            <w:r>
-              <w:rPr>
-                <w:rFonts w:ascii="Times New Roman" w:eastAsia="標楷體" w:hAnsi="Times New Roman" w:cs="Times New Roman" w:hint="eastAsia"/>
-                <w:highlight w:val="yellow"/>
+              </w:rPr>
+            </w:pPr>
+            <w:r>
+              <w:rPr>
+                <w:rFonts w:ascii="Times New Roman" w:eastAsia="標楷體" w:hAnsi="Times New Roman" w:cs="Times New Roman" w:hint="eastAsia"/>
               </w:rPr>
               <w:t>書籍</w:t>
             </w:r>
@@ -8431,7 +8102,6 @@
             <w:r>
               <w:rPr>
                 <w:rFonts w:ascii="Times New Roman" w:eastAsia="標楷體" w:hAnsi="Times New Roman" w:cs="Times New Roman" w:hint="eastAsia"/>
-                <w:highlight w:val="yellow"/>
               </w:rPr>
               <w:t>書籍狀態</w:t>
             </w:r>
@@ -8452,7 +8122,6 @@
             <w:r>
               <w:rPr>
                 <w:rFonts w:ascii="Times New Roman" w:eastAsia="標楷體" w:hAnsi="Times New Roman" w:cs="Times New Roman" w:hint="eastAsia"/>
-                <w:highlight w:val="yellow"/>
               </w:rPr>
               <w:t>系統</w:t>
             </w:r>
@@ -8471,7 +8140,6 @@
             <w:r>
               <w:rPr>
                 <w:rFonts w:ascii="Times New Roman" w:eastAsia="標楷體" w:hAnsi="Times New Roman" w:cs="Times New Roman" w:hint="eastAsia"/>
-                <w:highlight w:val="yellow"/>
               </w:rPr>
               <w:t>訂單狀態</w:t>
             </w:r>
@@ -8490,7 +8158,6 @@
             <w:r>
               <w:rPr>
                 <w:rFonts w:ascii="Times New Roman" w:eastAsia="標楷體" w:hAnsi="Times New Roman" w:cs="Times New Roman" w:hint="eastAsia"/>
-                <w:highlight w:val="yellow"/>
               </w:rPr>
               <w:t>資料庫</w:t>
             </w:r>
@@ -8509,14 +8176,12 @@
             <w:r>
               <w:rPr>
                 <w:rFonts w:ascii="Times New Roman" w:eastAsia="標楷體" w:hAnsi="Times New Roman" w:cs="Times New Roman" w:hint="eastAsia"/>
-                <w:highlight w:val="yellow"/>
               </w:rPr>
               <w:t>ISBN</w:t>
             </w:r>
             <w:r>
               <w:rPr>
                 <w:rFonts w:ascii="Times New Roman" w:eastAsia="標楷體" w:hAnsi="Times New Roman" w:cs="Times New Roman" w:hint="eastAsia"/>
-                <w:highlight w:val="yellow"/>
               </w:rPr>
               <w:t>格式</w:t>
             </w:r>
@@ -8532,15 +8197,12 @@
                 <w:rFonts w:ascii="Times New Roman" w:eastAsia="標楷體" w:hAnsi="Times New Roman" w:cs="Times New Roman"/>
               </w:rPr>
             </w:pPr>
-            <w:proofErr w:type="gramStart"/>
-            <w:r>
-              <w:rPr>
-                <w:rFonts w:ascii="Times New Roman" w:eastAsia="標楷體" w:hAnsi="Times New Roman" w:cs="Times New Roman" w:hint="eastAsia"/>
-                <w:highlight w:val="yellow"/>
+            <w:r>
+              <w:rPr>
+                <w:rFonts w:ascii="Times New Roman" w:eastAsia="標楷體" w:hAnsi="Times New Roman" w:cs="Times New Roman" w:hint="eastAsia"/>
               </w:rPr>
               <w:t>必填欄位</w:t>
             </w:r>
-            <w:proofErr w:type="gramEnd"/>
           </w:p>
         </w:tc>
       </w:tr>
@@ -8558,7 +8220,6 @@
             <w:r>
               <w:rPr>
                 <w:rFonts w:ascii="Times New Roman" w:eastAsia="標楷體" w:hAnsi="Times New Roman" w:cs="Times New Roman" w:hint="eastAsia"/>
-                <w:highlight w:val="yellow"/>
               </w:rPr>
               <w:t>所在地</w:t>
             </w:r>
@@ -8577,19 +8238,9 @@
             <w:r>
               <w:rPr>
                 <w:rFonts w:ascii="Times New Roman" w:eastAsia="標楷體" w:hAnsi="Times New Roman" w:cs="Times New Roman" w:hint="eastAsia"/>
-                <w:highlight w:val="yellow"/>
-              </w:rPr>
-              <w:t>書</w:t>
-            </w:r>
-            <w:proofErr w:type="gramStart"/>
-            <w:r>
-              <w:rPr>
-                <w:rFonts w:ascii="Times New Roman" w:eastAsia="標楷體" w:hAnsi="Times New Roman" w:cs="Times New Roman" w:hint="eastAsia"/>
-                <w:highlight w:val="yellow"/>
-              </w:rPr>
-              <w:t>況</w:t>
-            </w:r>
-            <w:proofErr w:type="gramEnd"/>
+              </w:rPr>
+              <w:t>書況</w:t>
+            </w:r>
           </w:p>
         </w:tc>
         <w:tc>
@@ -8605,7 +8256,6 @@
             <w:r>
               <w:rPr>
                 <w:rFonts w:ascii="Times New Roman" w:eastAsia="標楷體" w:hAnsi="Times New Roman" w:cs="Times New Roman" w:hint="eastAsia"/>
-                <w:highlight w:val="yellow"/>
               </w:rPr>
               <w:t>訂單通知</w:t>
             </w:r>
@@ -8639,15 +8289,12 @@
                 <w:rFonts w:ascii="Times New Roman" w:eastAsia="標楷體" w:hAnsi="Times New Roman" w:cs="Times New Roman"/>
               </w:rPr>
             </w:pPr>
-            <w:proofErr w:type="gramStart"/>
-            <w:r>
-              <w:rPr>
-                <w:rFonts w:ascii="Times New Roman" w:eastAsia="標楷體" w:hAnsi="Times New Roman" w:cs="Times New Roman" w:hint="eastAsia"/>
-                <w:highlight w:val="green"/>
+            <w:r>
+              <w:rPr>
+                <w:rFonts w:ascii="Times New Roman" w:eastAsia="標楷體" w:hAnsi="Times New Roman" w:cs="Times New Roman" w:hint="eastAsia"/>
               </w:rPr>
               <w:t>私訊</w:t>
             </w:r>
-            <w:proofErr w:type="gramEnd"/>
           </w:p>
         </w:tc>
       </w:tr>
@@ -8665,7 +8312,6 @@
             <w:r>
               <w:rPr>
                 <w:rFonts w:ascii="Times New Roman" w:eastAsia="標楷體" w:hAnsi="Times New Roman" w:cs="Times New Roman" w:hint="eastAsia"/>
-                <w:highlight w:val="yellow"/>
               </w:rPr>
               <w:t>價格範圍</w:t>
             </w:r>
@@ -8684,7 +8330,6 @@
             <w:r>
               <w:rPr>
                 <w:rFonts w:ascii="Times New Roman" w:eastAsia="標楷體" w:hAnsi="Times New Roman" w:cs="Times New Roman" w:hint="eastAsia"/>
-                <w:highlight w:val="yellow"/>
               </w:rPr>
               <w:t>搜尋條件</w:t>
             </w:r>
@@ -8703,7 +8348,6 @@
             <w:r>
               <w:rPr>
                 <w:rFonts w:ascii="Times New Roman" w:eastAsia="標楷體" w:hAnsi="Times New Roman" w:cs="Times New Roman" w:hint="eastAsia"/>
-                <w:highlight w:val="yellow"/>
               </w:rPr>
               <w:t>購物車</w:t>
             </w:r>
@@ -8760,7 +8404,6 @@
             <w:r>
               <w:rPr>
                 <w:rFonts w:ascii="Times New Roman" w:eastAsia="標楷體" w:hAnsi="Times New Roman" w:cs="Times New Roman" w:hint="eastAsia"/>
-                <w:highlight w:val="yellow"/>
               </w:rPr>
               <w:t>交易</w:t>
             </w:r>
@@ -8779,7 +8422,6 @@
             <w:r>
               <w:rPr>
                 <w:rFonts w:ascii="Times New Roman" w:eastAsia="標楷體" w:hAnsi="Times New Roman" w:cs="Times New Roman" w:hint="eastAsia"/>
-                <w:highlight w:val="yellow"/>
               </w:rPr>
               <w:t>搜尋結果列表</w:t>
             </w:r>
@@ -8798,7 +8440,6 @@
             <w:r>
               <w:rPr>
                 <w:rFonts w:ascii="Times New Roman" w:eastAsia="標楷體" w:hAnsi="Times New Roman" w:cs="Times New Roman" w:hint="eastAsia"/>
-                <w:highlight w:val="yellow"/>
               </w:rPr>
               <w:t>訂單</w:t>
             </w:r>
@@ -8835,7 +8476,6 @@
             <w:r>
               <w:rPr>
                 <w:rFonts w:ascii="Times New Roman" w:eastAsia="標楷體" w:hAnsi="Times New Roman" w:cs="Times New Roman" w:hint="eastAsia"/>
-                <w:highlight w:val="yellow"/>
               </w:rPr>
               <w:t>訂單資訊</w:t>
             </w:r>
@@ -8856,7 +8496,6 @@
             <w:r>
               <w:rPr>
                 <w:rFonts w:ascii="Times New Roman" w:eastAsia="標楷體" w:hAnsi="Times New Roman" w:cs="Times New Roman" w:hint="eastAsia"/>
-                <w:highlight w:val="yellow"/>
               </w:rPr>
               <w:t>個人賣場管理頁面</w:t>
             </w:r>
@@ -8875,7 +8514,6 @@
             <w:r>
               <w:rPr>
                 <w:rFonts w:ascii="Times New Roman" w:eastAsia="標楷體" w:hAnsi="Times New Roman" w:cs="Times New Roman" w:hint="eastAsia"/>
-                <w:highlight w:val="yellow"/>
               </w:rPr>
               <w:t>書籍清單</w:t>
             </w:r>
@@ -8889,18 +8527,14 @@
             <w:pPr>
               <w:rPr>
                 <w:rFonts w:ascii="Times New Roman" w:eastAsia="標楷體" w:hAnsi="Times New Roman" w:cs="Times New Roman"/>
-                <w:highlight w:val="yellow"/>
-              </w:rPr>
-            </w:pPr>
-            <w:proofErr w:type="gramStart"/>
-            <w:r>
-              <w:rPr>
-                <w:rFonts w:ascii="Times New Roman" w:eastAsia="標楷體" w:hAnsi="Times New Roman" w:cs="Times New Roman" w:hint="eastAsia"/>
-                <w:highlight w:val="yellow"/>
+              </w:rPr>
+            </w:pPr>
+            <w:r>
+              <w:rPr>
+                <w:rFonts w:ascii="Times New Roman" w:eastAsia="標楷體" w:hAnsi="Times New Roman" w:cs="Times New Roman" w:hint="eastAsia"/>
               </w:rPr>
               <w:t>購物車頁面</w:t>
             </w:r>
-            <w:proofErr w:type="gramEnd"/>
           </w:p>
         </w:tc>
         <w:tc>
@@ -8916,7 +8550,6 @@
             <w:r>
               <w:rPr>
                 <w:rFonts w:ascii="Times New Roman" w:eastAsia="標楷體" w:hAnsi="Times New Roman" w:cs="Times New Roman" w:hint="eastAsia"/>
-                <w:highlight w:val="yellow"/>
               </w:rPr>
               <w:t>搜尋列</w:t>
             </w:r>
@@ -8935,7 +8568,6 @@
             <w:r>
               <w:rPr>
                 <w:rFonts w:ascii="Times New Roman" w:eastAsia="標楷體" w:hAnsi="Times New Roman" w:cs="Times New Roman" w:hint="eastAsia"/>
-                <w:highlight w:val="yellow"/>
               </w:rPr>
               <w:t>書名</w:t>
             </w:r>
@@ -9043,21 +8675,7 @@
         <w:rPr>
           <w:rFonts w:ascii="Times New Roman" w:eastAsia="標楷體" w:hAnsi="Times New Roman" w:cs="Times New Roman" w:hint="eastAsia"/>
         </w:rPr>
-        <w:t>書籍頁面、個人賣場管理頁面、</w:t>
-      </w:r>
-      <w:proofErr w:type="gramStart"/>
-      <w:r>
-        <w:rPr>
-          <w:rFonts w:ascii="Times New Roman" w:eastAsia="標楷體" w:hAnsi="Times New Roman" w:cs="Times New Roman" w:hint="eastAsia"/>
-        </w:rPr>
-        <w:t>購物車頁面</w:t>
-      </w:r>
-      <w:proofErr w:type="gramEnd"/>
-      <w:r>
-        <w:rPr>
-          <w:rFonts w:ascii="Times New Roman" w:eastAsia="標楷體" w:hAnsi="Times New Roman" w:cs="Times New Roman" w:hint="eastAsia"/>
-        </w:rPr>
-        <w:t>：皆為前端</w:t>
+        <w:t>書籍頁面、個人賣場管理頁面、購物車頁面：皆為前端</w:t>
       </w:r>
       <w:r>
         <w:rPr>
@@ -9149,19 +8767,11 @@
           <w:rFonts w:ascii="Times New Roman" w:eastAsia="標楷體" w:hAnsi="Times New Roman" w:cs="Times New Roman"/>
         </w:rPr>
       </w:pPr>
-      <w:proofErr w:type="gramStart"/>
       <w:r>
         <w:rPr>
           <w:rFonts w:ascii="Times New Roman" w:eastAsia="標楷體" w:hAnsi="Times New Roman" w:cs="Times New Roman" w:hint="eastAsia"/>
         </w:rPr>
-        <w:t>必填欄位</w:t>
-      </w:r>
-      <w:proofErr w:type="gramEnd"/>
-      <w:r>
-        <w:rPr>
-          <w:rFonts w:ascii="Times New Roman" w:eastAsia="標楷體" w:hAnsi="Times New Roman" w:cs="Times New Roman" w:hint="eastAsia"/>
-        </w:rPr>
-        <w:t>：表單驗證規則，非實體物件。</w:t>
+        <w:t>必填欄位：表單驗證規則，非實體物件。</w:t>
       </w:r>
     </w:p>
     <w:p>
@@ -9222,21 +8832,7 @@
         <w:rPr>
           <w:rFonts w:ascii="Times New Roman" w:eastAsia="標楷體" w:hAnsi="Times New Roman" w:cs="Times New Roman" w:hint="eastAsia"/>
         </w:rPr>
-        <w:t>書籍狀態、書</w:t>
-      </w:r>
-      <w:proofErr w:type="gramStart"/>
-      <w:r>
-        <w:rPr>
-          <w:rFonts w:ascii="Times New Roman" w:eastAsia="標楷體" w:hAnsi="Times New Roman" w:cs="Times New Roman" w:hint="eastAsia"/>
-        </w:rPr>
-        <w:t>況</w:t>
-      </w:r>
-      <w:proofErr w:type="gramEnd"/>
-      <w:r>
-        <w:rPr>
-          <w:rFonts w:ascii="Times New Roman" w:eastAsia="標楷體" w:hAnsi="Times New Roman" w:cs="Times New Roman" w:hint="eastAsia"/>
-        </w:rPr>
-        <w:t>：應作為</w:t>
+        <w:t>書籍狀態、書況：應作為</w:t>
       </w:r>
       <w:r>
         <w:rPr>
@@ -9599,6 +9195,9 @@
     <w:p>
       <w:pPr>
         <w:pStyle w:val="3"/>
+        <w:rPr>
+          <w:rFonts w:hint="eastAsia"/>
+        </w:rPr>
       </w:pPr>
       <w:r>
         <w:rPr>
@@ -9610,50 +9209,62 @@
     <w:p>
       <w:pPr>
         <w:rPr>
-          <w:rFonts w:ascii="Times New Roman" w:eastAsia="標楷體" w:hAnsi="Times New Roman" w:cs="Times New Roman"/>
-        </w:rPr>
-      </w:pPr>
-    </w:p>
-    <w:p>
-      <w:pPr>
-        <w:pStyle w:val="2"/>
-      </w:pPr>
-      <w:r>
-        <w:rPr>
-          <w:rFonts w:hint="eastAsia"/>
-        </w:rPr>
-        <w:t>2.2 Add associations</w:t>
-      </w:r>
-    </w:p>
-    <w:p>
-      <w:pPr>
-        <w:rPr>
-          <w:rFonts w:ascii="Times New Roman" w:eastAsia="標楷體" w:hAnsi="Times New Roman" w:cs="Times New Roman"/>
-        </w:rPr>
-      </w:pPr>
-    </w:p>
-    <w:p>
-      <w:pPr>
-        <w:pStyle w:val="2"/>
-      </w:pPr>
-      <w:r>
-        <w:rPr>
-          <w:rFonts w:hint="eastAsia"/>
-        </w:rPr>
-        <w:t>2.3 Add attributes</w:t>
-      </w:r>
-    </w:p>
-    <w:p/>
-    <w:p>
-      <w:pPr>
-        <w:pStyle w:val="1"/>
-        <w:numPr>
-          <w:ilvl w:val="0"/>
-          <w:numId w:val="11"/>
-        </w:numPr>
-      </w:pPr>
-      <w:r>
-        <w:t>Measurement</w:t>
+          <w:rFonts w:ascii="Times New Roman" w:eastAsia="標楷體" w:hAnsi="Times New Roman" w:cs="Times New Roman" w:hint="eastAsia"/>
+        </w:rPr>
+      </w:pPr>
+      <w:r>
+        <w:rPr>
+          <w:rFonts w:ascii="Times New Roman" w:eastAsia="標楷體" w:hAnsi="Times New Roman" w:cs="Times New Roman" w:hint="eastAsia"/>
+        </w:rPr>
+        <w:t>綜合</w:t>
+      </w:r>
+      <w:r>
+        <w:rPr>
+          <w:rFonts w:ascii="Times New Roman" w:eastAsia="標楷體" w:hAnsi="Times New Roman" w:cs="Times New Roman" w:hint="eastAsia"/>
+        </w:rPr>
+        <w:t>2.2.1</w:t>
+      </w:r>
+      <w:r>
+        <w:rPr>
+          <w:rFonts w:ascii="Times New Roman" w:eastAsia="標楷體" w:hAnsi="Times New Roman" w:cs="Times New Roman" w:hint="eastAsia"/>
+        </w:rPr>
+        <w:t>和</w:t>
+      </w:r>
+      <w:r>
+        <w:rPr>
+          <w:rFonts w:ascii="Times New Roman" w:eastAsia="標楷體" w:hAnsi="Times New Roman" w:cs="Times New Roman" w:hint="eastAsia"/>
+        </w:rPr>
+        <w:t>2.2.2</w:t>
+      </w:r>
+      <w:r>
+        <w:rPr>
+          <w:rFonts w:ascii="Times New Roman" w:eastAsia="標楷體" w:hAnsi="Times New Roman" w:cs="Times New Roman" w:hint="eastAsia"/>
+        </w:rPr>
+        <w:t>，</w:t>
+      </w:r>
+      <w:r>
+        <w:rPr>
+          <w:rFonts w:ascii="Times New Roman" w:eastAsia="標楷體" w:hAnsi="Times New Roman" w:cs="Times New Roman" w:hint="eastAsia"/>
+        </w:rPr>
+        <w:t>我們認為</w:t>
+      </w:r>
+      <w:r>
+        <w:rPr>
+          <w:rFonts w:ascii="Times New Roman" w:eastAsia="標楷體" w:hAnsi="Times New Roman" w:cs="Times New Roman" w:hint="eastAsia"/>
+        </w:rPr>
+        <w:t>適合當作此專案的</w:t>
+      </w:r>
+      <w:r>
+        <w:rPr>
+          <w:rFonts w:ascii="Times New Roman" w:eastAsia="標楷體" w:hAnsi="Times New Roman" w:cs="Times New Roman" w:hint="eastAsia"/>
+        </w:rPr>
+        <w:t>classes</w:t>
+      </w:r>
+      <w:r>
+        <w:rPr>
+          <w:rFonts w:ascii="Times New Roman" w:eastAsia="標楷體" w:hAnsi="Times New Roman" w:cs="Times New Roman" w:hint="eastAsia"/>
+        </w:rPr>
+        <w:t>如下：</w:t>
       </w:r>
     </w:p>
     <w:tbl>
@@ -9674,32 +9285,32 @@
           <w:p>
             <w:pPr>
               <w:rPr>
-                <w:rFonts w:ascii="Times New Roman" w:eastAsia="標楷體" w:hAnsi="Times New Roman" w:cs="Times New Roman"/>
-              </w:rPr>
-            </w:pPr>
-            <w:r>
-              <w:rPr>
-                <w:rFonts w:ascii="Times New Roman" w:eastAsia="標楷體" w:hAnsi="Times New Roman" w:cs="Times New Roman" w:hint="eastAsia"/>
-              </w:rPr>
-              <w:t>Homework</w:t>
-            </w:r>
-          </w:p>
-        </w:tc>
-        <w:tc>
-          <w:tcPr>
-            <w:tcW w:w="4148" w:type="dxa"/>
-          </w:tcPr>
-          <w:p>
-            <w:pPr>
-              <w:rPr>
-                <w:rFonts w:ascii="Times New Roman" w:eastAsia="標楷體" w:hAnsi="Times New Roman" w:cs="Times New Roman"/>
-              </w:rPr>
-            </w:pPr>
-            <w:r>
-              <w:rPr>
-                <w:rFonts w:ascii="Times New Roman" w:eastAsia="標楷體" w:hAnsi="Times New Roman" w:cs="Times New Roman" w:hint="eastAsia"/>
-              </w:rPr>
-              <w:t>Time</w:t>
+                <w:rFonts w:ascii="Times New Roman" w:eastAsia="標楷體" w:hAnsi="Times New Roman" w:cs="Times New Roman" w:hint="eastAsia"/>
+              </w:rPr>
+            </w:pPr>
+            <w:r>
+              <w:rPr>
+                <w:rFonts w:ascii="Times New Roman" w:eastAsia="標楷體" w:hAnsi="Times New Roman" w:cs="Times New Roman" w:hint="eastAsia"/>
+              </w:rPr>
+              <w:t>買家</w:t>
+            </w:r>
+          </w:p>
+        </w:tc>
+        <w:tc>
+          <w:tcPr>
+            <w:tcW w:w="4148" w:type="dxa"/>
+          </w:tcPr>
+          <w:p>
+            <w:pPr>
+              <w:rPr>
+                <w:rFonts w:ascii="Times New Roman" w:eastAsia="標楷體" w:hAnsi="Times New Roman" w:cs="Times New Roman" w:hint="eastAsia"/>
+              </w:rPr>
+            </w:pPr>
+            <w:r>
+              <w:rPr>
+                <w:rFonts w:ascii="Times New Roman" w:eastAsia="標楷體" w:hAnsi="Times New Roman" w:cs="Times New Roman" w:hint="eastAsia"/>
+              </w:rPr>
+              <w:t>賣家</w:t>
             </w:r>
           </w:p>
         </w:tc>
@@ -9708,37 +9319,36 @@
         <w:tc>
           <w:tcPr>
             <w:tcW w:w="4148" w:type="dxa"/>
-            <w:vMerge w:val="restart"/>
-          </w:tcPr>
-          <w:p>
-            <w:pPr>
-              <w:rPr>
-                <w:rFonts w:ascii="Times New Roman" w:eastAsia="標楷體" w:hAnsi="Times New Roman" w:cs="Times New Roman"/>
-              </w:rPr>
-            </w:pPr>
-            <w:r>
-              <w:rPr>
-                <w:rFonts w:ascii="Times New Roman" w:eastAsia="標楷體" w:hAnsi="Times New Roman" w:cs="Times New Roman" w:hint="eastAsia"/>
-              </w:rPr>
-              <w:t>HW #1</w:t>
-            </w:r>
-          </w:p>
-        </w:tc>
-        <w:tc>
-          <w:tcPr>
-            <w:tcW w:w="4148" w:type="dxa"/>
-          </w:tcPr>
-          <w:p>
-            <w:pPr>
-              <w:rPr>
-                <w:rFonts w:ascii="Times New Roman" w:eastAsia="標楷體" w:hAnsi="Times New Roman" w:cs="Times New Roman"/>
-              </w:rPr>
-            </w:pPr>
-            <w:r>
-              <w:rPr>
-                <w:rFonts w:ascii="Times New Roman" w:eastAsia="標楷體" w:hAnsi="Times New Roman" w:cs="Times New Roman" w:hint="eastAsia"/>
-              </w:rPr>
-              <w:t>26/02/28 20:17~22:07</w:t>
+          </w:tcPr>
+          <w:p>
+            <w:pPr>
+              <w:rPr>
+                <w:rFonts w:ascii="Times New Roman" w:eastAsia="標楷體" w:hAnsi="Times New Roman" w:cs="Times New Roman" w:hint="eastAsia"/>
+              </w:rPr>
+            </w:pPr>
+            <w:r>
+              <w:rPr>
+                <w:rFonts w:ascii="Times New Roman" w:eastAsia="標楷體" w:hAnsi="Times New Roman" w:cs="Times New Roman" w:hint="eastAsia"/>
+              </w:rPr>
+              <w:t>書籍</w:t>
+            </w:r>
+          </w:p>
+        </w:tc>
+        <w:tc>
+          <w:tcPr>
+            <w:tcW w:w="4148" w:type="dxa"/>
+          </w:tcPr>
+          <w:p>
+            <w:pPr>
+              <w:rPr>
+                <w:rFonts w:ascii="Times New Roman" w:eastAsia="標楷體" w:hAnsi="Times New Roman" w:cs="Times New Roman" w:hint="eastAsia"/>
+              </w:rPr>
+            </w:pPr>
+            <w:r>
+              <w:rPr>
+                <w:rFonts w:ascii="Times New Roman" w:eastAsia="標楷體" w:hAnsi="Times New Roman" w:cs="Times New Roman" w:hint="eastAsia"/>
+              </w:rPr>
+              <w:t>訂單</w:t>
             </w:r>
           </w:p>
         </w:tc>
@@ -9747,31 +9357,36 @@
         <w:tc>
           <w:tcPr>
             <w:tcW w:w="4148" w:type="dxa"/>
-            <w:vMerge/>
-          </w:tcPr>
-          <w:p>
-            <w:pPr>
-              <w:rPr>
-                <w:rFonts w:ascii="Times New Roman" w:eastAsia="標楷體" w:hAnsi="Times New Roman" w:cs="Times New Roman"/>
-              </w:rPr>
-            </w:pPr>
-          </w:p>
-        </w:tc>
-        <w:tc>
-          <w:tcPr>
-            <w:tcW w:w="4148" w:type="dxa"/>
-          </w:tcPr>
-          <w:p>
-            <w:pPr>
-              <w:rPr>
-                <w:rFonts w:ascii="Times New Roman" w:eastAsia="標楷體" w:hAnsi="Times New Roman" w:cs="Times New Roman"/>
-              </w:rPr>
-            </w:pPr>
-            <w:r>
-              <w:rPr>
-                <w:rFonts w:ascii="Times New Roman" w:eastAsia="標楷體" w:hAnsi="Times New Roman" w:cs="Times New Roman" w:hint="eastAsia"/>
-              </w:rPr>
-              <w:t>26/03/02 17:15~18:19</w:t>
+          </w:tcPr>
+          <w:p>
+            <w:pPr>
+              <w:rPr>
+                <w:rFonts w:ascii="Times New Roman" w:eastAsia="標楷體" w:hAnsi="Times New Roman" w:cs="Times New Roman" w:hint="eastAsia"/>
+              </w:rPr>
+            </w:pPr>
+            <w:r>
+              <w:rPr>
+                <w:rFonts w:ascii="Times New Roman" w:eastAsia="標楷體" w:hAnsi="Times New Roman" w:cs="Times New Roman" w:hint="eastAsia"/>
+              </w:rPr>
+              <w:t>私訊</w:t>
+            </w:r>
+          </w:p>
+        </w:tc>
+        <w:tc>
+          <w:tcPr>
+            <w:tcW w:w="4148" w:type="dxa"/>
+          </w:tcPr>
+          <w:p>
+            <w:pPr>
+              <w:rPr>
+                <w:rFonts w:ascii="Times New Roman" w:eastAsia="標楷體" w:hAnsi="Times New Roman" w:cs="Times New Roman" w:hint="eastAsia"/>
+              </w:rPr>
+            </w:pPr>
+            <w:r>
+              <w:rPr>
+                <w:rFonts w:ascii="Times New Roman" w:eastAsia="標楷體" w:hAnsi="Times New Roman" w:cs="Times New Roman" w:hint="eastAsia"/>
+              </w:rPr>
+              <w:t>類別</w:t>
             </w:r>
           </w:p>
         </w:tc>
@@ -9780,37 +9395,244 @@
         <w:tc>
           <w:tcPr>
             <w:tcW w:w="4148" w:type="dxa"/>
-            <w:vMerge w:val="restart"/>
-          </w:tcPr>
-          <w:p>
-            <w:pPr>
-              <w:rPr>
-                <w:rFonts w:ascii="Times New Roman" w:eastAsia="標楷體" w:hAnsi="Times New Roman" w:cs="Times New Roman" w:hint="eastAsia"/>
-              </w:rPr>
-            </w:pPr>
-            <w:r>
-              <w:rPr>
-                <w:rFonts w:ascii="Times New Roman" w:eastAsia="標楷體" w:hAnsi="Times New Roman" w:cs="Times New Roman" w:hint="eastAsia"/>
-              </w:rPr>
-              <w:t>HW#2</w:t>
-            </w:r>
-          </w:p>
-        </w:tc>
-        <w:tc>
-          <w:tcPr>
-            <w:tcW w:w="4148" w:type="dxa"/>
-          </w:tcPr>
-          <w:p>
-            <w:pPr>
-              <w:rPr>
-                <w:rFonts w:ascii="Times New Roman" w:eastAsia="標楷體" w:hAnsi="Times New Roman" w:cs="Times New Roman"/>
-              </w:rPr>
-            </w:pPr>
-            <w:r>
-              <w:rPr>
-                <w:rFonts w:ascii="Times New Roman" w:eastAsia="標楷體" w:hAnsi="Times New Roman" w:cs="Times New Roman" w:hint="eastAsia"/>
-              </w:rPr>
-              <w:t>26/03/09 14:30~16:00</w:t>
+          </w:tcPr>
+          <w:p>
+            <w:pPr>
+              <w:rPr>
+                <w:rFonts w:ascii="Times New Roman" w:eastAsia="標楷體" w:hAnsi="Times New Roman" w:cs="Times New Roman" w:hint="eastAsia"/>
+              </w:rPr>
+            </w:pPr>
+            <w:r>
+              <w:rPr>
+                <w:rFonts w:ascii="Times New Roman" w:eastAsia="標楷體" w:hAnsi="Times New Roman" w:cs="Times New Roman" w:hint="eastAsia"/>
+              </w:rPr>
+              <w:t>購物車</w:t>
+            </w:r>
+          </w:p>
+        </w:tc>
+        <w:tc>
+          <w:tcPr>
+            <w:tcW w:w="4148" w:type="dxa"/>
+          </w:tcPr>
+          <w:p>
+            <w:pPr>
+              <w:rPr>
+                <w:rFonts w:ascii="Times New Roman" w:eastAsia="標楷體" w:hAnsi="Times New Roman" w:cs="Times New Roman" w:hint="eastAsia"/>
+              </w:rPr>
+            </w:pPr>
+            <w:r>
+              <w:rPr>
+                <w:rFonts w:ascii="Times New Roman" w:eastAsia="標楷體" w:hAnsi="Times New Roman" w:cs="Times New Roman" w:hint="eastAsia"/>
+              </w:rPr>
+              <w:t>個人賣場管理頁面</w:t>
+            </w:r>
+          </w:p>
+        </w:tc>
+      </w:tr>
+    </w:tbl>
+    <w:p>
+      <w:pPr>
+        <w:rPr>
+          <w:rFonts w:ascii="Times New Roman" w:eastAsia="標楷體" w:hAnsi="Times New Roman" w:cs="Times New Roman"/>
+        </w:rPr>
+      </w:pPr>
+    </w:p>
+    <w:p>
+      <w:pPr>
+        <w:rPr>
+          <w:rFonts w:ascii="Times New Roman" w:eastAsia="標楷體" w:hAnsi="Times New Roman" w:cs="Times New Roman"/>
+        </w:rPr>
+      </w:pPr>
+      <w:r>
+        <w:rPr>
+          <w:rFonts w:ascii="Times New Roman" w:eastAsia="標楷體" w:hAnsi="Times New Roman" w:cs="Times New Roman" w:hint="eastAsia"/>
+        </w:rPr>
+        <w:t>我們將書籍的詳細資訊拉出來變成另一個</w:t>
+      </w:r>
+      <w:r>
+        <w:rPr>
+          <w:rFonts w:ascii="Times New Roman" w:eastAsia="標楷體" w:hAnsi="Times New Roman" w:cs="Times New Roman" w:hint="eastAsia"/>
+        </w:rPr>
+        <w:t>class</w:t>
+      </w:r>
+      <w:r>
+        <w:rPr>
+          <w:rFonts w:ascii="Times New Roman" w:eastAsia="標楷體" w:hAnsi="Times New Roman" w:cs="Times New Roman" w:hint="eastAsia"/>
+        </w:rPr>
+        <w:t>—</w:t>
+      </w:r>
+      <w:r>
+        <w:rPr>
+          <w:rFonts w:ascii="Times New Roman" w:eastAsia="標楷體" w:hAnsi="Times New Roman" w:cs="Times New Roman" w:hint="eastAsia"/>
+        </w:rPr>
+        <w:t>書籍資訊</w:t>
+      </w:r>
+      <w:r>
+        <w:rPr>
+          <w:rFonts w:ascii="Times New Roman" w:eastAsia="標楷體" w:hAnsi="Times New Roman" w:cs="Times New Roman" w:hint="eastAsia"/>
+        </w:rPr>
+        <w:t>，以</w:t>
+      </w:r>
+      <w:r>
+        <w:rPr>
+          <w:rFonts w:ascii="Times New Roman" w:eastAsia="標楷體" w:hAnsi="Times New Roman" w:cs="Times New Roman" w:hint="eastAsia"/>
+        </w:rPr>
+        <w:t>避免相同的程式碼重複出現</w:t>
+      </w:r>
+      <w:r>
+        <w:rPr>
+          <w:rFonts w:ascii="Times New Roman" w:eastAsia="標楷體" w:hAnsi="Times New Roman" w:cs="Times New Roman" w:hint="eastAsia"/>
+        </w:rPr>
+        <w:t>；</w:t>
+      </w:r>
+      <w:r>
+        <w:rPr>
+          <w:rFonts w:ascii="Times New Roman" w:eastAsia="標楷體" w:hAnsi="Times New Roman" w:cs="Times New Roman" w:hint="eastAsia"/>
+        </w:rPr>
+        <w:t>而為了表達簡潔，</w:t>
+      </w:r>
+      <w:r>
+        <w:rPr>
+          <w:rFonts w:ascii="Times New Roman" w:eastAsia="標楷體" w:hAnsi="Times New Roman" w:cs="Times New Roman" w:hint="eastAsia"/>
+        </w:rPr>
+        <w:t>又將</w:t>
+      </w:r>
+      <w:r>
+        <w:rPr>
+          <w:rFonts w:ascii="Times New Roman" w:eastAsia="標楷體" w:hAnsi="Times New Roman" w:cs="Times New Roman" w:hint="eastAsia"/>
+        </w:rPr>
+        <w:t>class</w:t>
+      </w:r>
+      <w:r>
+        <w:rPr>
+          <w:rFonts w:ascii="Times New Roman" w:eastAsia="標楷體" w:hAnsi="Times New Roman" w:cs="Times New Roman" w:hint="eastAsia"/>
+        </w:rPr>
+        <w:t>名稱從</w:t>
+      </w:r>
+      <w:r>
+        <w:rPr>
+          <w:rFonts w:ascii="Times New Roman" w:eastAsia="標楷體" w:hAnsi="Times New Roman" w:cs="Times New Roman" w:hint="eastAsia"/>
+        </w:rPr>
+        <w:t>「</w:t>
+      </w:r>
+      <w:r>
+        <w:rPr>
+          <w:rFonts w:ascii="Times New Roman" w:eastAsia="標楷體" w:hAnsi="Times New Roman" w:cs="Times New Roman" w:hint="eastAsia"/>
+        </w:rPr>
+        <w:t>個人賣場管理頁面</w:t>
+      </w:r>
+      <w:r>
+        <w:rPr>
+          <w:rFonts w:ascii="Times New Roman" w:eastAsia="標楷體" w:hAnsi="Times New Roman" w:cs="Times New Roman" w:hint="eastAsia"/>
+        </w:rPr>
+        <w:t>」</w:t>
+      </w:r>
+      <w:r>
+        <w:rPr>
+          <w:rFonts w:ascii="Times New Roman" w:eastAsia="標楷體" w:hAnsi="Times New Roman" w:cs="Times New Roman" w:hint="eastAsia"/>
+        </w:rPr>
+        <w:t>簡化為「賣場」。至此</w:t>
+      </w:r>
+      <w:r>
+        <w:rPr>
+          <w:rFonts w:ascii="Times New Roman" w:eastAsia="標楷體" w:hAnsi="Times New Roman" w:cs="Times New Roman" w:hint="eastAsia"/>
+        </w:rPr>
+        <w:t>，本專案共有</w:t>
+      </w:r>
+      <w:r>
+        <w:rPr>
+          <w:rFonts w:ascii="Times New Roman" w:eastAsia="標楷體" w:hAnsi="Times New Roman" w:cs="Times New Roman" w:hint="eastAsia"/>
+        </w:rPr>
+        <w:t>下列</w:t>
+      </w:r>
+      <w:r>
+        <w:rPr>
+          <w:rFonts w:ascii="Times New Roman" w:eastAsia="標楷體" w:hAnsi="Times New Roman" w:cs="Times New Roman" w:hint="eastAsia"/>
+        </w:rPr>
+        <w:t>9</w:t>
+      </w:r>
+      <w:r>
+        <w:rPr>
+          <w:rFonts w:ascii="Times New Roman" w:eastAsia="標楷體" w:hAnsi="Times New Roman" w:cs="Times New Roman" w:hint="eastAsia"/>
+        </w:rPr>
+        <w:t>個</w:t>
+      </w:r>
+      <w:r>
+        <w:rPr>
+          <w:rFonts w:ascii="Times New Roman" w:eastAsia="標楷體" w:hAnsi="Times New Roman" w:cs="Times New Roman" w:hint="eastAsia"/>
+        </w:rPr>
+        <w:t>classes</w:t>
+      </w:r>
+      <w:r>
+        <w:rPr>
+          <w:rFonts w:ascii="Times New Roman" w:eastAsia="標楷體" w:hAnsi="Times New Roman" w:cs="Times New Roman" w:hint="eastAsia"/>
+        </w:rPr>
+        <w:t>：</w:t>
+      </w:r>
+    </w:p>
+    <w:tbl>
+      <w:tblPr>
+        <w:tblStyle w:val="af2"/>
+        <w:tblW w:w="0" w:type="auto"/>
+        <w:tblLook w:val="04A0" w:firstRow="1" w:lastRow="0" w:firstColumn="1" w:lastColumn="0" w:noHBand="0" w:noVBand="1"/>
+      </w:tblPr>
+      <w:tblGrid>
+        <w:gridCol w:w="2765"/>
+        <w:gridCol w:w="2765"/>
+        <w:gridCol w:w="2766"/>
+      </w:tblGrid>
+      <w:tr>
+        <w:tc>
+          <w:tcPr>
+            <w:tcW w:w="2765" w:type="dxa"/>
+          </w:tcPr>
+          <w:p>
+            <w:pPr>
+              <w:rPr>
+                <w:rFonts w:ascii="Times New Roman" w:eastAsia="標楷體" w:hAnsi="Times New Roman" w:cs="Times New Roman" w:hint="eastAsia"/>
+              </w:rPr>
+            </w:pPr>
+            <w:r>
+              <w:rPr>
+                <w:rFonts w:ascii="Times New Roman" w:eastAsia="標楷體" w:hAnsi="Times New Roman" w:cs="Times New Roman" w:hint="eastAsia"/>
+              </w:rPr>
+              <w:t>買家</w:t>
+            </w:r>
+          </w:p>
+        </w:tc>
+        <w:tc>
+          <w:tcPr>
+            <w:tcW w:w="2765" w:type="dxa"/>
+          </w:tcPr>
+          <w:p>
+            <w:pPr>
+              <w:rPr>
+                <w:rFonts w:ascii="Times New Roman" w:eastAsia="標楷體" w:hAnsi="Times New Roman" w:cs="Times New Roman" w:hint="eastAsia"/>
+              </w:rPr>
+            </w:pPr>
+            <w:r>
+              <w:rPr>
+                <w:rFonts w:ascii="Times New Roman" w:eastAsia="標楷體" w:hAnsi="Times New Roman" w:cs="Times New Roman" w:hint="eastAsia"/>
+              </w:rPr>
+              <w:t>賣家</w:t>
+            </w:r>
+          </w:p>
+        </w:tc>
+        <w:tc>
+          <w:tcPr>
+            <w:tcW w:w="2766" w:type="dxa"/>
+          </w:tcPr>
+          <w:p>
+            <w:pPr>
+              <w:rPr>
+                <w:rFonts w:ascii="Times New Roman" w:eastAsia="標楷體" w:hAnsi="Times New Roman" w:cs="Times New Roman" w:hint="eastAsia"/>
+              </w:rPr>
+            </w:pPr>
+            <w:r>
+              <w:rPr>
+                <w:rFonts w:ascii="Times New Roman" w:eastAsia="標楷體" w:hAnsi="Times New Roman" w:cs="Times New Roman" w:hint="eastAsia"/>
+              </w:rPr>
+              <w:t>書籍</w:t>
             </w:r>
           </w:p>
         </w:tc>
@@ -9818,32 +9640,55 @@
       <w:tr>
         <w:tc>
           <w:tcPr>
-            <w:tcW w:w="4148" w:type="dxa"/>
-            <w:vMerge/>
-          </w:tcPr>
-          <w:p>
-            <w:pPr>
-              <w:rPr>
-                <w:rFonts w:ascii="Times New Roman" w:eastAsia="標楷體" w:hAnsi="Times New Roman" w:cs="Times New Roman"/>
-              </w:rPr>
-            </w:pPr>
-          </w:p>
-        </w:tc>
-        <w:tc>
-          <w:tcPr>
-            <w:tcW w:w="4148" w:type="dxa"/>
-          </w:tcPr>
-          <w:p>
-            <w:pPr>
-              <w:rPr>
-                <w:rFonts w:ascii="Times New Roman" w:eastAsia="標楷體" w:hAnsi="Times New Roman" w:cs="Times New Roman"/>
-              </w:rPr>
-            </w:pPr>
-            <w:r>
-              <w:rPr>
-                <w:rFonts w:ascii="Times New Roman" w:eastAsia="標楷體" w:hAnsi="Times New Roman" w:cs="Times New Roman" w:hint="eastAsia"/>
-              </w:rPr>
-              <w:t>26/03/13 13:00~16:00</w:t>
+            <w:tcW w:w="2765" w:type="dxa"/>
+          </w:tcPr>
+          <w:p>
+            <w:pPr>
+              <w:rPr>
+                <w:rFonts w:ascii="Times New Roman" w:eastAsia="標楷體" w:hAnsi="Times New Roman" w:cs="Times New Roman" w:hint="eastAsia"/>
+              </w:rPr>
+            </w:pPr>
+            <w:r>
+              <w:rPr>
+                <w:rFonts w:ascii="Times New Roman" w:eastAsia="標楷體" w:hAnsi="Times New Roman" w:cs="Times New Roman" w:hint="eastAsia"/>
+              </w:rPr>
+              <w:t>書籍資訊</w:t>
+            </w:r>
+          </w:p>
+        </w:tc>
+        <w:tc>
+          <w:tcPr>
+            <w:tcW w:w="2765" w:type="dxa"/>
+          </w:tcPr>
+          <w:p>
+            <w:pPr>
+              <w:rPr>
+                <w:rFonts w:ascii="Times New Roman" w:eastAsia="標楷體" w:hAnsi="Times New Roman" w:cs="Times New Roman" w:hint="eastAsia"/>
+              </w:rPr>
+            </w:pPr>
+            <w:r>
+              <w:rPr>
+                <w:rFonts w:ascii="Times New Roman" w:eastAsia="標楷體" w:hAnsi="Times New Roman" w:cs="Times New Roman" w:hint="eastAsia"/>
+              </w:rPr>
+              <w:t>訂單</w:t>
+            </w:r>
+          </w:p>
+        </w:tc>
+        <w:tc>
+          <w:tcPr>
+            <w:tcW w:w="2766" w:type="dxa"/>
+          </w:tcPr>
+          <w:p>
+            <w:pPr>
+              <w:rPr>
+                <w:rFonts w:ascii="Times New Roman" w:eastAsia="標楷體" w:hAnsi="Times New Roman" w:cs="Times New Roman" w:hint="eastAsia"/>
+              </w:rPr>
+            </w:pPr>
+            <w:r>
+              <w:rPr>
+                <w:rFonts w:ascii="Times New Roman" w:eastAsia="標楷體" w:hAnsi="Times New Roman" w:cs="Times New Roman" w:hint="eastAsia"/>
+              </w:rPr>
+              <w:t>私訊</w:t>
             </w:r>
           </w:p>
         </w:tc>
@@ -9851,31 +9696,238 @@
       <w:tr>
         <w:tc>
           <w:tcPr>
-            <w:tcW w:w="4148" w:type="dxa"/>
-          </w:tcPr>
-          <w:p>
-            <w:pPr>
-              <w:rPr>
-                <w:rFonts w:ascii="Times New Roman" w:eastAsia="標楷體" w:hAnsi="Times New Roman" w:cs="Times New Roman"/>
-              </w:rPr>
-            </w:pPr>
-          </w:p>
-        </w:tc>
-        <w:tc>
-          <w:tcPr>
-            <w:tcW w:w="4148" w:type="dxa"/>
-          </w:tcPr>
-          <w:p>
-            <w:pPr>
-              <w:rPr>
-                <w:rFonts w:ascii="Times New Roman" w:eastAsia="標楷體" w:hAnsi="Times New Roman" w:cs="Times New Roman" w:hint="eastAsia"/>
-              </w:rPr>
-            </w:pPr>
-            <w:r>
-              <w:rPr>
-                <w:rFonts w:ascii="Times New Roman" w:eastAsia="標楷體" w:hAnsi="Times New Roman" w:cs="Times New Roman" w:hint="eastAsia"/>
-              </w:rPr>
-              <w:t>26/03/30 10:00~12:00</w:t>
+            <w:tcW w:w="2765" w:type="dxa"/>
+          </w:tcPr>
+          <w:p>
+            <w:pPr>
+              <w:rPr>
+                <w:rFonts w:ascii="Times New Roman" w:eastAsia="標楷體" w:hAnsi="Times New Roman" w:cs="Times New Roman" w:hint="eastAsia"/>
+              </w:rPr>
+            </w:pPr>
+            <w:r>
+              <w:rPr>
+                <w:rFonts w:ascii="Times New Roman" w:eastAsia="標楷體" w:hAnsi="Times New Roman" w:cs="Times New Roman" w:hint="eastAsia"/>
+              </w:rPr>
+              <w:t>類別</w:t>
+            </w:r>
+          </w:p>
+        </w:tc>
+        <w:tc>
+          <w:tcPr>
+            <w:tcW w:w="2765" w:type="dxa"/>
+          </w:tcPr>
+          <w:p>
+            <w:pPr>
+              <w:rPr>
+                <w:rFonts w:ascii="Times New Roman" w:eastAsia="標楷體" w:hAnsi="Times New Roman" w:cs="Times New Roman" w:hint="eastAsia"/>
+              </w:rPr>
+            </w:pPr>
+            <w:r>
+              <w:rPr>
+                <w:rFonts w:ascii="Times New Roman" w:eastAsia="標楷體" w:hAnsi="Times New Roman" w:cs="Times New Roman" w:hint="eastAsia"/>
+              </w:rPr>
+              <w:t>購物車</w:t>
+            </w:r>
+          </w:p>
+        </w:tc>
+        <w:tc>
+          <w:tcPr>
+            <w:tcW w:w="2766" w:type="dxa"/>
+          </w:tcPr>
+          <w:p>
+            <w:pPr>
+              <w:rPr>
+                <w:rFonts w:ascii="Times New Roman" w:eastAsia="標楷體" w:hAnsi="Times New Roman" w:cs="Times New Roman" w:hint="eastAsia"/>
+              </w:rPr>
+            </w:pPr>
+            <w:r>
+              <w:rPr>
+                <w:rFonts w:ascii="Times New Roman" w:eastAsia="標楷體" w:hAnsi="Times New Roman" w:cs="Times New Roman" w:hint="eastAsia"/>
+              </w:rPr>
+              <w:t>賣場</w:t>
+            </w:r>
+          </w:p>
+        </w:tc>
+      </w:tr>
+    </w:tbl>
+    <w:p>
+      <w:pPr>
+        <w:rPr>
+          <w:rFonts w:ascii="Times New Roman" w:eastAsia="標楷體" w:hAnsi="Times New Roman" w:cs="Times New Roman" w:hint="eastAsia"/>
+        </w:rPr>
+      </w:pPr>
+    </w:p>
+    <w:p>
+      <w:pPr>
+        <w:pStyle w:val="2"/>
+      </w:pPr>
+      <w:r>
+        <w:rPr>
+          <w:rFonts w:hint="eastAsia"/>
+        </w:rPr>
+        <w:lastRenderedPageBreak/>
+        <w:t>2.2 Add associations</w:t>
+      </w:r>
+    </w:p>
+    <w:p>
+      <w:pPr>
+        <w:jc w:val="center"/>
+        <w:rPr>
+          <w:rFonts w:ascii="Times New Roman" w:eastAsia="標楷體" w:hAnsi="Times New Roman" w:cs="Times New Roman"/>
+        </w:rPr>
+      </w:pPr>
+      <w:r>
+        <w:rPr>
+          <w:rFonts w:ascii="Times New Roman" w:eastAsia="標楷體" w:hAnsi="Times New Roman" w:cs="Times New Roman"/>
+        </w:rPr>
+        <w:drawing>
+          <wp:inline distT="0" distB="0" distL="0" distR="0" wp14:anchorId="631A6759" wp14:editId="11639DC7">
+            <wp:extent cx="8194890" cy="3494619"/>
+            <wp:effectExtent l="0" t="0" r="3810" b="0"/>
+            <wp:docPr id="1" name="圖片 1"/>
+            <wp:cNvGraphicFramePr>
+              <a:graphicFrameLocks xmlns:a="http://schemas.openxmlformats.org/drawingml/2006/main" noChangeAspect="1"/>
+            </wp:cNvGraphicFramePr>
+            <a:graphic xmlns:a="http://schemas.openxmlformats.org/drawingml/2006/main">
+              <a:graphicData uri="http://schemas.openxmlformats.org/drawingml/2006/picture">
+                <pic:pic xmlns:pic="http://schemas.openxmlformats.org/drawingml/2006/picture">
+                  <pic:nvPicPr>
+                    <pic:cNvPr id="1" name=""/>
+                    <pic:cNvPicPr/>
+                  </pic:nvPicPr>
+                  <pic:blipFill>
+                    <a:blip r:embed="rId9"/>
+                    <a:stretch>
+                      <a:fillRect/>
+                    </a:stretch>
+                  </pic:blipFill>
+                  <pic:spPr>
+                    <a:xfrm rot="5400000">
+                      <a:off x="0" y="0"/>
+                      <a:ext cx="8238967" cy="3513415"/>
+                    </a:xfrm>
+                    <a:prstGeom prst="rect">
+                      <a:avLst/>
+                    </a:prstGeom>
+                  </pic:spPr>
+                </pic:pic>
+              </a:graphicData>
+            </a:graphic>
+          </wp:inline>
+        </w:drawing>
+      </w:r>
+    </w:p>
+    <w:p>
+      <w:pPr>
+        <w:pStyle w:val="2"/>
+      </w:pPr>
+      <w:r>
+        <w:rPr>
+          <w:rFonts w:hint="eastAsia"/>
+        </w:rPr>
+        <w:lastRenderedPageBreak/>
+        <w:t>2.3 Add attributes</w:t>
+      </w:r>
+    </w:p>
+    <w:p>
+      <w:pPr>
+        <w:jc w:val="center"/>
+      </w:pPr>
+      <w:r>
+        <w:drawing>
+          <wp:inline distT="0" distB="0" distL="0" distR="0" wp14:anchorId="5CF64CB4" wp14:editId="19382F8F">
+            <wp:extent cx="8174258" cy="3767284"/>
+            <wp:effectExtent l="0" t="0" r="0" b="0"/>
+            <wp:docPr id="2" name="圖片 2"/>
+            <wp:cNvGraphicFramePr>
+              <a:graphicFrameLocks xmlns:a="http://schemas.openxmlformats.org/drawingml/2006/main" noChangeAspect="1"/>
+            </wp:cNvGraphicFramePr>
+            <a:graphic xmlns:a="http://schemas.openxmlformats.org/drawingml/2006/main">
+              <a:graphicData uri="http://schemas.openxmlformats.org/drawingml/2006/picture">
+                <pic:pic xmlns:pic="http://schemas.openxmlformats.org/drawingml/2006/picture">
+                  <pic:nvPicPr>
+                    <pic:cNvPr id="1" name=""/>
+                    <pic:cNvPicPr/>
+                  </pic:nvPicPr>
+                  <pic:blipFill>
+                    <a:blip r:embed="rId10"/>
+                    <a:stretch>
+                      <a:fillRect/>
+                    </a:stretch>
+                  </pic:blipFill>
+                  <pic:spPr>
+                    <a:xfrm rot="5400000">
+                      <a:off x="0" y="0"/>
+                      <a:ext cx="8216689" cy="3786839"/>
+                    </a:xfrm>
+                    <a:prstGeom prst="rect">
+                      <a:avLst/>
+                    </a:prstGeom>
+                  </pic:spPr>
+                </pic:pic>
+              </a:graphicData>
+            </a:graphic>
+          </wp:inline>
+        </w:drawing>
+      </w:r>
+    </w:p>
+    <w:p>
+      <w:pPr>
+        <w:pStyle w:val="1"/>
+        <w:numPr>
+          <w:ilvl w:val="0"/>
+          <w:numId w:val="11"/>
+        </w:numPr>
+      </w:pPr>
+      <w:r>
+        <w:lastRenderedPageBreak/>
+        <w:t>Measurement</w:t>
+      </w:r>
+    </w:p>
+    <w:tbl>
+      <w:tblPr>
+        <w:tblStyle w:val="af2"/>
+        <w:tblW w:w="0" w:type="auto"/>
+        <w:tblLook w:val="04A0" w:firstRow="1" w:lastRow="0" w:firstColumn="1" w:lastColumn="0" w:noHBand="0" w:noVBand="1"/>
+      </w:tblPr>
+      <w:tblGrid>
+        <w:gridCol w:w="4148"/>
+        <w:gridCol w:w="4148"/>
+      </w:tblGrid>
+      <w:tr>
+        <w:tc>
+          <w:tcPr>
+            <w:tcW w:w="4148" w:type="dxa"/>
+          </w:tcPr>
+          <w:p>
+            <w:pPr>
+              <w:rPr>
+                <w:rFonts w:ascii="Times New Roman" w:eastAsia="標楷體" w:hAnsi="Times New Roman" w:cs="Times New Roman"/>
+              </w:rPr>
+            </w:pPr>
+            <w:r>
+              <w:rPr>
+                <w:rFonts w:ascii="Times New Roman" w:eastAsia="標楷體" w:hAnsi="Times New Roman" w:cs="Times New Roman" w:hint="eastAsia"/>
+              </w:rPr>
+              <w:t>Homework</w:t>
+            </w:r>
+          </w:p>
+        </w:tc>
+        <w:tc>
+          <w:tcPr>
+            <w:tcW w:w="4148" w:type="dxa"/>
+          </w:tcPr>
+          <w:p>
+            <w:pPr>
+              <w:rPr>
+                <w:rFonts w:ascii="Times New Roman" w:eastAsia="標楷體" w:hAnsi="Times New Roman" w:cs="Times New Roman"/>
+              </w:rPr>
+            </w:pPr>
+            <w:r>
+              <w:rPr>
+                <w:rFonts w:ascii="Times New Roman" w:eastAsia="標楷體" w:hAnsi="Times New Roman" w:cs="Times New Roman" w:hint="eastAsia"/>
+              </w:rPr>
+              <w:t>Time</w:t>
             </w:r>
           </w:p>
         </w:tc>
@@ -9884,6 +9936,182 @@
         <w:tc>
           <w:tcPr>
             <w:tcW w:w="4148" w:type="dxa"/>
+            <w:vMerge w:val="restart"/>
+          </w:tcPr>
+          <w:p>
+            <w:pPr>
+              <w:rPr>
+                <w:rFonts w:ascii="Times New Roman" w:eastAsia="標楷體" w:hAnsi="Times New Roman" w:cs="Times New Roman"/>
+              </w:rPr>
+            </w:pPr>
+            <w:r>
+              <w:rPr>
+                <w:rFonts w:ascii="Times New Roman" w:eastAsia="標楷體" w:hAnsi="Times New Roman" w:cs="Times New Roman" w:hint="eastAsia"/>
+              </w:rPr>
+              <w:t>HW #1</w:t>
+            </w:r>
+          </w:p>
+        </w:tc>
+        <w:tc>
+          <w:tcPr>
+            <w:tcW w:w="4148" w:type="dxa"/>
+          </w:tcPr>
+          <w:p>
+            <w:pPr>
+              <w:rPr>
+                <w:rFonts w:ascii="Times New Roman" w:eastAsia="標楷體" w:hAnsi="Times New Roman" w:cs="Times New Roman"/>
+              </w:rPr>
+            </w:pPr>
+            <w:r>
+              <w:rPr>
+                <w:rFonts w:ascii="Times New Roman" w:eastAsia="標楷體" w:hAnsi="Times New Roman" w:cs="Times New Roman" w:hint="eastAsia"/>
+              </w:rPr>
+              <w:t>26/02/28 20:17~22:07</w:t>
+            </w:r>
+          </w:p>
+        </w:tc>
+      </w:tr>
+      <w:tr>
+        <w:tc>
+          <w:tcPr>
+            <w:tcW w:w="4148" w:type="dxa"/>
+            <w:vMerge/>
+          </w:tcPr>
+          <w:p>
+            <w:pPr>
+              <w:rPr>
+                <w:rFonts w:ascii="Times New Roman" w:eastAsia="標楷體" w:hAnsi="Times New Roman" w:cs="Times New Roman"/>
+              </w:rPr>
+            </w:pPr>
+          </w:p>
+        </w:tc>
+        <w:tc>
+          <w:tcPr>
+            <w:tcW w:w="4148" w:type="dxa"/>
+          </w:tcPr>
+          <w:p>
+            <w:pPr>
+              <w:rPr>
+                <w:rFonts w:ascii="Times New Roman" w:eastAsia="標楷體" w:hAnsi="Times New Roman" w:cs="Times New Roman"/>
+              </w:rPr>
+            </w:pPr>
+            <w:r>
+              <w:rPr>
+                <w:rFonts w:ascii="Times New Roman" w:eastAsia="標楷體" w:hAnsi="Times New Roman" w:cs="Times New Roman" w:hint="eastAsia"/>
+              </w:rPr>
+              <w:t>26/03/02 17:15~18:19</w:t>
+            </w:r>
+          </w:p>
+        </w:tc>
+      </w:tr>
+      <w:tr>
+        <w:tc>
+          <w:tcPr>
+            <w:tcW w:w="4148" w:type="dxa"/>
+            <w:vMerge w:val="restart"/>
+          </w:tcPr>
+          <w:p>
+            <w:pPr>
+              <w:rPr>
+                <w:rFonts w:ascii="Times New Roman" w:eastAsia="標楷體" w:hAnsi="Times New Roman" w:cs="Times New Roman"/>
+              </w:rPr>
+            </w:pPr>
+            <w:r>
+              <w:rPr>
+                <w:rFonts w:ascii="Times New Roman" w:eastAsia="標楷體" w:hAnsi="Times New Roman" w:cs="Times New Roman" w:hint="eastAsia"/>
+              </w:rPr>
+              <w:t>HW#2</w:t>
+            </w:r>
+          </w:p>
+        </w:tc>
+        <w:tc>
+          <w:tcPr>
+            <w:tcW w:w="4148" w:type="dxa"/>
+          </w:tcPr>
+          <w:p>
+            <w:pPr>
+              <w:rPr>
+                <w:rFonts w:ascii="Times New Roman" w:eastAsia="標楷體" w:hAnsi="Times New Roman" w:cs="Times New Roman"/>
+              </w:rPr>
+            </w:pPr>
+            <w:r>
+              <w:rPr>
+                <w:rFonts w:ascii="Times New Roman" w:eastAsia="標楷體" w:hAnsi="Times New Roman" w:cs="Times New Roman" w:hint="eastAsia"/>
+              </w:rPr>
+              <w:t>26/03/09 14:30~16:00</w:t>
+            </w:r>
+          </w:p>
+        </w:tc>
+      </w:tr>
+      <w:tr>
+        <w:tc>
+          <w:tcPr>
+            <w:tcW w:w="4148" w:type="dxa"/>
+            <w:vMerge/>
+          </w:tcPr>
+          <w:p>
+            <w:pPr>
+              <w:rPr>
+                <w:rFonts w:ascii="Times New Roman" w:eastAsia="標楷體" w:hAnsi="Times New Roman" w:cs="Times New Roman"/>
+              </w:rPr>
+            </w:pPr>
+          </w:p>
+        </w:tc>
+        <w:tc>
+          <w:tcPr>
+            <w:tcW w:w="4148" w:type="dxa"/>
+          </w:tcPr>
+          <w:p>
+            <w:pPr>
+              <w:rPr>
+                <w:rFonts w:ascii="Times New Roman" w:eastAsia="標楷體" w:hAnsi="Times New Roman" w:cs="Times New Roman"/>
+              </w:rPr>
+            </w:pPr>
+            <w:r>
+              <w:rPr>
+                <w:rFonts w:ascii="Times New Roman" w:eastAsia="標楷體" w:hAnsi="Times New Roman" w:cs="Times New Roman" w:hint="eastAsia"/>
+              </w:rPr>
+              <w:t>26/03/13 13:00~16:00</w:t>
+            </w:r>
+          </w:p>
+        </w:tc>
+      </w:tr>
+      <w:tr>
+        <w:tc>
+          <w:tcPr>
+            <w:tcW w:w="4148" w:type="dxa"/>
+          </w:tcPr>
+          <w:p>
+            <w:pPr>
+              <w:rPr>
+                <w:rFonts w:ascii="Times New Roman" w:eastAsia="標楷體" w:hAnsi="Times New Roman" w:cs="Times New Roman"/>
+              </w:rPr>
+            </w:pPr>
+          </w:p>
+        </w:tc>
+        <w:tc>
+          <w:tcPr>
+            <w:tcW w:w="4148" w:type="dxa"/>
+          </w:tcPr>
+          <w:p>
+            <w:pPr>
+              <w:rPr>
+                <w:rFonts w:ascii="Times New Roman" w:eastAsia="標楷體" w:hAnsi="Times New Roman" w:cs="Times New Roman" w:hint="eastAsia"/>
+              </w:rPr>
+            </w:pPr>
+            <w:r>
+              <w:rPr>
+                <w:rFonts w:ascii="Times New Roman" w:eastAsia="標楷體" w:hAnsi="Times New Roman" w:cs="Times New Roman" w:hint="eastAsia"/>
+              </w:rPr>
+              <w:t>26/03/26 21:00~22:00</w:t>
+            </w:r>
+          </w:p>
+        </w:tc>
+      </w:tr>
+      <w:tr>
+        <w:tc>
+          <w:tcPr>
+            <w:tcW w:w="4148" w:type="dxa"/>
           </w:tcPr>
           <w:p>
             <w:pPr>
@@ -9908,6 +10136,76 @@
                 <w:rFonts w:ascii="Times New Roman" w:eastAsia="標楷體" w:hAnsi="Times New Roman" w:cs="Times New Roman" w:hint="eastAsia"/>
               </w:rPr>
               <w:t xml:space="preserve">26/03/27 </w:t>
+            </w:r>
+          </w:p>
+        </w:tc>
+      </w:tr>
+      <w:tr>
+        <w:tc>
+          <w:tcPr>
+            <w:tcW w:w="4148" w:type="dxa"/>
+          </w:tcPr>
+          <w:p>
+            <w:pPr>
+              <w:rPr>
+                <w:rFonts w:ascii="Times New Roman" w:eastAsia="標楷體" w:hAnsi="Times New Roman" w:cs="Times New Roman"/>
+              </w:rPr>
+            </w:pPr>
+          </w:p>
+        </w:tc>
+        <w:tc>
+          <w:tcPr>
+            <w:tcW w:w="4148" w:type="dxa"/>
+          </w:tcPr>
+          <w:p>
+            <w:pPr>
+              <w:rPr>
+                <w:rFonts w:ascii="Times New Roman" w:eastAsia="標楷體" w:hAnsi="Times New Roman" w:cs="Times New Roman" w:hint="eastAsia"/>
+              </w:rPr>
+            </w:pPr>
+            <w:r>
+              <w:rPr>
+                <w:rFonts w:ascii="Times New Roman" w:eastAsia="標楷體" w:hAnsi="Times New Roman" w:cs="Times New Roman" w:hint="eastAsia"/>
+              </w:rPr>
+              <w:t>26/03/30 10:00~12:00</w:t>
+            </w:r>
+          </w:p>
+        </w:tc>
+      </w:tr>
+      <w:tr>
+        <w:tc>
+          <w:tcPr>
+            <w:tcW w:w="4148" w:type="dxa"/>
+          </w:tcPr>
+          <w:p>
+            <w:pPr>
+              <w:rPr>
+                <w:rFonts w:ascii="Times New Roman" w:eastAsia="標楷體" w:hAnsi="Times New Roman" w:cs="Times New Roman"/>
+              </w:rPr>
+            </w:pPr>
+          </w:p>
+        </w:tc>
+        <w:tc>
+          <w:tcPr>
+            <w:tcW w:w="4148" w:type="dxa"/>
+          </w:tcPr>
+          <w:p>
+            <w:pPr>
+              <w:rPr>
+                <w:rFonts w:ascii="Times New Roman" w:eastAsia="標楷體" w:hAnsi="Times New Roman" w:cs="Times New Roman" w:hint="eastAsia"/>
+              </w:rPr>
+            </w:pPr>
+            <w:r>
+              <w:rPr>
+                <w:rFonts w:ascii="Times New Roman" w:eastAsia="標楷體" w:hAnsi="Times New Roman" w:cs="Times New Roman" w:hint="eastAsia"/>
+              </w:rPr>
+              <w:t>26/03/30 14:00~</w:t>
+            </w:r>
+            <w:r>
+              <w:rPr>
+                <w:rFonts w:ascii="Times New Roman" w:eastAsia="標楷體" w:hAnsi="Times New Roman" w:cs="Times New Roman" w:hint="eastAsia"/>
+              </w:rPr>
+              <w:t>18:40</w:t>
             </w:r>
           </w:p>
         </w:tc>
@@ -9938,7 +10236,7 @@
 </file>
 
 <file path=word/endnotes.xml><?xml version="1.0" encoding="utf-8"?>
-<w:endnotes xmlns:wpc="http://schemas.microsoft.com/office/word/2010/wordprocessingCanvas" xmlns:cx="http://schemas.microsoft.com/office/drawing/2014/chartex" xmlns:cx1="http://schemas.microsoft.com/office/drawing/2015/9/8/chartex" xmlns:cx2="http://schemas.microsoft.com/office/drawing/2015/10/21/chartex" xmlns:cx3="http://schemas.microsoft.com/office/drawing/2016/5/9/chartex" xmlns:cx4="http://schemas.microsoft.com/office/drawing/2016/5/10/chartex" xmlns:cx5="http://schemas.microsoft.com/office/drawing/2016/5/11/chartex" xmlns:cx6="http://schemas.microsoft.com/office/drawing/2016/5/12/chartex" xmlns:cx7="http://schemas.microsoft.com/office/drawing/2016/5/13/chartex" xmlns:cx8="http://schemas.microsoft.com/office/drawing/2016/5/14/chartex" xmlns:mc="http://schemas.openxmlformats.org/markup-compatibility/2006" xmlns:aink="http://schemas.microsoft.com/office/drawing/2016/ink" xmlns:am3d="http://schemas.microsoft.com/office/drawing/2017/model3d" xmlns:o="urn:schemas-microsoft-com:office:office" xmlns:oel="http://schemas.microsoft.com/office/2019/extlst" xmlns:r="http://schemas.openxmlformats.org/officeDocument/2006/relationships" xmlns:m="http://schemas.openxmlformats.org/officeDocument/2006/math" xmlns:v="urn:schemas-microsoft-com:vml" xmlns:wp14="http://schemas.microsoft.com/office/word/2010/wordprocessingDrawing" xmlns:wp="http://schemas.openxmlformats.org/drawingml/2006/wordprocessingDrawing" xmlns:w10="urn:schemas-microsoft-com:office:word" xmlns:w="http://schemas.openxmlformats.org/wordprocessingml/2006/main" xmlns:w14="http://schemas.microsoft.com/office/word/2010/wordml" xmlns:w15="http://schemas.microsoft.com/office/word/2012/wordml" xmlns:w16cex="http://schemas.microsoft.com/office/word/2018/wordml/cex" xmlns:w16cid="http://schemas.microsoft.com/office/word/2016/wordml/cid" xmlns:w16="http://schemas.microsoft.com/office/word/2018/wordml" xmlns:w16du="http://schemas.microsoft.com/office/word/2023/wordml/word16du" xmlns:w16sdtdh="http://schemas.microsoft.com/office/word/2020/wordml/sdtdatahash" xmlns:w16sdtfl="http://schemas.microsoft.com/office/word/2024/wordml/sdtformatlock" xmlns:w16se="http://schemas.microsoft.com/office/word/2015/wordml/symex" xmlns:wpg="http://schemas.microsoft.com/office/word/2010/wordprocessingGroup" xmlns:wpi="http://schemas.microsoft.com/office/word/2010/wordprocessingInk" xmlns:wne="http://schemas.microsoft.com/office/word/2006/wordml" xmlns:wps="http://schemas.microsoft.com/office/word/2010/wordprocessingShape" mc:Ignorable="w14 w15 w16se w16cid w16 w16cex w16sdtdh w16sdtfl w16du wp14">
+<w:endnotes xmlns:wpc="http://schemas.microsoft.com/office/word/2010/wordprocessingCanvas" xmlns:cx="http://schemas.microsoft.com/office/drawing/2014/chartex" xmlns:cx1="http://schemas.microsoft.com/office/drawing/2015/9/8/chartex" xmlns:cx2="http://schemas.microsoft.com/office/drawing/2015/10/21/chartex" xmlns:cx3="http://schemas.microsoft.com/office/drawing/2016/5/9/chartex" xmlns:cx4="http://schemas.microsoft.com/office/drawing/2016/5/10/chartex" xmlns:cx5="http://schemas.microsoft.com/office/drawing/2016/5/11/chartex" xmlns:cx6="http://schemas.microsoft.com/office/drawing/2016/5/12/chartex" xmlns:cx7="http://schemas.microsoft.com/office/drawing/2016/5/13/chartex" xmlns:cx8="http://schemas.microsoft.com/office/drawing/2016/5/14/chartex" xmlns:mc="http://schemas.openxmlformats.org/markup-compatibility/2006" xmlns:aink="http://schemas.microsoft.com/office/drawing/2016/ink" xmlns:am3d="http://schemas.microsoft.com/office/drawing/2017/model3d" xmlns:o="urn:schemas-microsoft-com:office:office" xmlns:oel="http://schemas.microsoft.com/office/2019/extlst" xmlns:r="http://schemas.openxmlformats.org/officeDocument/2006/relationships" xmlns:m="http://schemas.openxmlformats.org/officeDocument/2006/math" xmlns:v="urn:schemas-microsoft-com:vml" xmlns:wp14="http://schemas.microsoft.com/office/word/2010/wordprocessingDrawing" xmlns:wp="http://schemas.openxmlformats.org/drawingml/2006/wordprocessingDrawing" xmlns:w10="urn:schemas-microsoft-com:office:word" xmlns:w="http://schemas.openxmlformats.org/wordprocessingml/2006/main" xmlns:w14="http://schemas.microsoft.com/office/word/2010/wordml" xmlns:w15="http://schemas.microsoft.com/office/word/2012/wordml" xmlns:w16cex="http://schemas.microsoft.com/office/word/2018/wordml/cex" xmlns:w16cid="http://schemas.microsoft.com/office/word/2016/wordml/cid" xmlns:w16="http://schemas.microsoft.com/office/word/2018/wordml" xmlns:w16sdtdh="http://schemas.microsoft.com/office/word/2020/wordml/sdtdatahash" xmlns:w16se="http://schemas.microsoft.com/office/word/2015/wordml/symex" xmlns:wpg="http://schemas.microsoft.com/office/word/2010/wordprocessingGroup" xmlns:wpi="http://schemas.microsoft.com/office/word/2010/wordprocessingInk" xmlns:wne="http://schemas.microsoft.com/office/word/2006/wordml" xmlns:wps="http://schemas.microsoft.com/office/word/2010/wordprocessingShape" mc:Ignorable="w14 w15 w16se w16cid w16 w16cex w16sdtdh wp14">
   <w:endnote w:type="separator" w:id="-1">
     <w:p>
       <w:pPr>
@@ -9963,7 +10261,7 @@
 </file>
 
 <file path=word/footnotes.xml><?xml version="1.0" encoding="utf-8"?>
-<w:footnotes xmlns:wpc="http://schemas.microsoft.com/office/word/2010/wordprocessingCanvas" xmlns:cx="http://schemas.microsoft.com/office/drawing/2014/chartex" xmlns:cx1="http://schemas.microsoft.com/office/drawing/2015/9/8/chartex" xmlns:cx2="http://schemas.microsoft.com/office/drawing/2015/10/21/chartex" xmlns:cx3="http://schemas.microsoft.com/office/drawing/2016/5/9/chartex" xmlns:cx4="http://schemas.microsoft.com/office/drawing/2016/5/10/chartex" xmlns:cx5="http://schemas.microsoft.com/office/drawing/2016/5/11/chartex" xmlns:cx6="http://schemas.microsoft.com/office/drawing/2016/5/12/chartex" xmlns:cx7="http://schemas.microsoft.com/office/drawing/2016/5/13/chartex" xmlns:cx8="http://schemas.microsoft.com/office/drawing/2016/5/14/chartex" xmlns:mc="http://schemas.openxmlformats.org/markup-compatibility/2006" xmlns:aink="http://schemas.microsoft.com/office/drawing/2016/ink" xmlns:am3d="http://schemas.microsoft.com/office/drawing/2017/model3d" xmlns:o="urn:schemas-microsoft-com:office:office" xmlns:oel="http://schemas.microsoft.com/office/2019/extlst" xmlns:r="http://schemas.openxmlformats.org/officeDocument/2006/relationships" xmlns:m="http://schemas.openxmlformats.org/officeDocument/2006/math" xmlns:v="urn:schemas-microsoft-com:vml" xmlns:wp14="http://schemas.microsoft.com/office/word/2010/wordprocessingDrawing" xmlns:wp="http://schemas.openxmlformats.org/drawingml/2006/wordprocessingDrawing" xmlns:w10="urn:schemas-microsoft-com:office:word" xmlns:w="http://schemas.openxmlformats.org/wordprocessingml/2006/main" xmlns:w14="http://schemas.microsoft.com/office/word/2010/wordml" xmlns:w15="http://schemas.microsoft.com/office/word/2012/wordml" xmlns:w16cex="http://schemas.microsoft.com/office/word/2018/wordml/cex" xmlns:w16cid="http://schemas.microsoft.com/office/word/2016/wordml/cid" xmlns:w16="http://schemas.microsoft.com/office/word/2018/wordml" xmlns:w16du="http://schemas.microsoft.com/office/word/2023/wordml/word16du" xmlns:w16sdtdh="http://schemas.microsoft.com/office/word/2020/wordml/sdtdatahash" xmlns:w16sdtfl="http://schemas.microsoft.com/office/word/2024/wordml/sdtformatlock" xmlns:w16se="http://schemas.microsoft.com/office/word/2015/wordml/symex" xmlns:wpg="http://schemas.microsoft.com/office/word/2010/wordprocessingGroup" xmlns:wpi="http://schemas.microsoft.com/office/word/2010/wordprocessingInk" xmlns:wne="http://schemas.microsoft.com/office/word/2006/wordml" xmlns:wps="http://schemas.microsoft.com/office/word/2010/wordprocessingShape" mc:Ignorable="w14 w15 w16se w16cid w16 w16cex w16sdtdh w16sdtfl w16du wp14">
+<w:footnotes xmlns:wpc="http://schemas.microsoft.com/office/word/2010/wordprocessingCanvas" xmlns:cx="http://schemas.microsoft.com/office/drawing/2014/chartex" xmlns:cx1="http://schemas.microsoft.com/office/drawing/2015/9/8/chartex" xmlns:cx2="http://schemas.microsoft.com/office/drawing/2015/10/21/chartex" xmlns:cx3="http://schemas.microsoft.com/office/drawing/2016/5/9/chartex" xmlns:cx4="http://schemas.microsoft.com/office/drawing/2016/5/10/chartex" xmlns:cx5="http://schemas.microsoft.com/office/drawing/2016/5/11/chartex" xmlns:cx6="http://schemas.microsoft.com/office/drawing/2016/5/12/chartex" xmlns:cx7="http://schemas.microsoft.com/office/drawing/2016/5/13/chartex" xmlns:cx8="http://schemas.microsoft.com/office/drawing/2016/5/14/chartex" xmlns:mc="http://schemas.openxmlformats.org/markup-compatibility/2006" xmlns:aink="http://schemas.microsoft.com/office/drawing/2016/ink" xmlns:am3d="http://schemas.microsoft.com/office/drawing/2017/model3d" xmlns:o="urn:schemas-microsoft-com:office:office" xmlns:oel="http://schemas.microsoft.com/office/2019/extlst" xmlns:r="http://schemas.openxmlformats.org/officeDocument/2006/relationships" xmlns:m="http://schemas.openxmlformats.org/officeDocument/2006/math" xmlns:v="urn:schemas-microsoft-com:vml" xmlns:wp14="http://schemas.microsoft.com/office/word/2010/wordprocessingDrawing" xmlns:wp="http://schemas.openxmlformats.org/drawingml/2006/wordprocessingDrawing" xmlns:w10="urn:schemas-microsoft-com:office:word" xmlns:w="http://schemas.openxmlformats.org/wordprocessingml/2006/main" xmlns:w14="http://schemas.microsoft.com/office/word/2010/wordml" xmlns:w15="http://schemas.microsoft.com/office/word/2012/wordml" xmlns:w16cex="http://schemas.microsoft.com/office/word/2018/wordml/cex" xmlns:w16cid="http://schemas.microsoft.com/office/word/2016/wordml/cid" xmlns:w16="http://schemas.microsoft.com/office/word/2018/wordml" xmlns:w16sdtdh="http://schemas.microsoft.com/office/word/2020/wordml/sdtdatahash" xmlns:w16se="http://schemas.microsoft.com/office/word/2015/wordml/symex" xmlns:wpg="http://schemas.microsoft.com/office/word/2010/wordprocessingGroup" xmlns:wpi="http://schemas.microsoft.com/office/word/2010/wordprocessingInk" xmlns:wne="http://schemas.microsoft.com/office/word/2006/wordml" xmlns:wps="http://schemas.microsoft.com/office/word/2010/wordprocessingShape" mc:Ignorable="w14 w15 w16se w16cid w16 w16cex w16sdtdh wp14">
   <w:footnote w:type="separator" w:id="-1">
     <w:p>
       <w:pPr>
@@ -9988,7 +10286,7 @@
 </file>
 
 <file path=word/numbering.xml><?xml version="1.0" encoding="utf-8"?>
-<w:numbering xmlns:wpc="http://schemas.microsoft.com/office/word/2010/wordprocessingCanvas" xmlns:cx="http://schemas.microsoft.com/office/drawing/2014/chartex" xmlns:cx1="http://schemas.microsoft.com/office/drawing/2015/9/8/chartex" xmlns:cx2="http://schemas.microsoft.com/office/drawing/2015/10/21/chartex" xmlns:cx3="http://schemas.microsoft.com/office/drawing/2016/5/9/chartex" xmlns:cx4="http://schemas.microsoft.com/office/drawing/2016/5/10/chartex" xmlns:cx5="http://schemas.microsoft.com/office/drawing/2016/5/11/chartex" xmlns:cx6="http://schemas.microsoft.com/office/drawing/2016/5/12/chartex" xmlns:cx7="http://schemas.microsoft.com/office/drawing/2016/5/13/chartex" xmlns:cx8="http://schemas.microsoft.com/office/drawing/2016/5/14/chartex" xmlns:mc="http://schemas.openxmlformats.org/markup-compatibility/2006" xmlns:aink="http://schemas.microsoft.com/office/drawing/2016/ink" xmlns:am3d="http://schemas.microsoft.com/office/drawing/2017/model3d" xmlns:o="urn:schemas-microsoft-com:office:office" xmlns:oel="http://schemas.microsoft.com/office/2019/extlst" xmlns:r="http://schemas.openxmlformats.org/officeDocument/2006/relationships" xmlns:m="http://schemas.openxmlformats.org/officeDocument/2006/math" xmlns:v="urn:schemas-microsoft-com:vml" xmlns:wp14="http://schemas.microsoft.com/office/word/2010/wordprocessingDrawing" xmlns:wp="http://schemas.openxmlformats.org/drawingml/2006/wordprocessingDrawing" xmlns:w10="urn:schemas-microsoft-com:office:word" xmlns:w="http://schemas.openxmlformats.org/wordprocessingml/2006/main" xmlns:w14="http://schemas.microsoft.com/office/word/2010/wordml" xmlns:w15="http://schemas.microsoft.com/office/word/2012/wordml" xmlns:w16cex="http://schemas.microsoft.com/office/word/2018/wordml/cex" xmlns:w16cid="http://schemas.microsoft.com/office/word/2016/wordml/cid" xmlns:w16="http://schemas.microsoft.com/office/word/2018/wordml" xmlns:w16du="http://schemas.microsoft.com/office/word/2023/wordml/word16du" xmlns:w16sdtdh="http://schemas.microsoft.com/office/word/2020/wordml/sdtdatahash" xmlns:w16sdtfl="http://schemas.microsoft.com/office/word/2024/wordml/sdtformatlock" xmlns:w16se="http://schemas.microsoft.com/office/word/2015/wordml/symex" xmlns:wpg="http://schemas.microsoft.com/office/word/2010/wordprocessingGroup" xmlns:wpi="http://schemas.microsoft.com/office/word/2010/wordprocessingInk" xmlns:wne="http://schemas.microsoft.com/office/word/2006/wordml" xmlns:wps="http://schemas.microsoft.com/office/word/2010/wordprocessingShape" mc:Ignorable="w14 w15 w16se w16cid w16 w16cex w16sdtdh w16sdtfl w16du wp14">
+<w:numbering xmlns:wpc="http://schemas.microsoft.com/office/word/2010/wordprocessingCanvas" xmlns:cx="http://schemas.microsoft.com/office/drawing/2014/chartex" xmlns:cx1="http://schemas.microsoft.com/office/drawing/2015/9/8/chartex" xmlns:cx2="http://schemas.microsoft.com/office/drawing/2015/10/21/chartex" xmlns:cx3="http://schemas.microsoft.com/office/drawing/2016/5/9/chartex" xmlns:cx4="http://schemas.microsoft.com/office/drawing/2016/5/10/chartex" xmlns:cx5="http://schemas.microsoft.com/office/drawing/2016/5/11/chartex" xmlns:cx6="http://schemas.microsoft.com/office/drawing/2016/5/12/chartex" xmlns:cx7="http://schemas.microsoft.com/office/drawing/2016/5/13/chartex" xmlns:cx8="http://schemas.microsoft.com/office/drawing/2016/5/14/chartex" xmlns:mc="http://schemas.openxmlformats.org/markup-compatibility/2006" xmlns:aink="http://schemas.microsoft.com/office/drawing/2016/ink" xmlns:am3d="http://schemas.microsoft.com/office/drawing/2017/model3d" xmlns:o="urn:schemas-microsoft-com:office:office" xmlns:oel="http://schemas.microsoft.com/office/2019/extlst" xmlns:r="http://schemas.openxmlformats.org/officeDocument/2006/relationships" xmlns:m="http://schemas.openxmlformats.org/officeDocument/2006/math" xmlns:v="urn:schemas-microsoft-com:vml" xmlns:wp14="http://schemas.microsoft.com/office/word/2010/wordprocessingDrawing" xmlns:wp="http://schemas.openxmlformats.org/drawingml/2006/wordprocessingDrawing" xmlns:w10="urn:schemas-microsoft-com:office:word" xmlns:w="http://schemas.openxmlformats.org/wordprocessingml/2006/main" xmlns:w14="http://schemas.microsoft.com/office/word/2010/wordml" xmlns:w15="http://schemas.microsoft.com/office/word/2012/wordml" xmlns:w16cex="http://schemas.microsoft.com/office/word/2018/wordml/cex" xmlns:w16cid="http://schemas.microsoft.com/office/word/2016/wordml/cid" xmlns:w16="http://schemas.microsoft.com/office/word/2018/wordml" xmlns:w16sdtdh="http://schemas.microsoft.com/office/word/2020/wordml/sdtdatahash" xmlns:w16se="http://schemas.microsoft.com/office/word/2015/wordml/symex" xmlns:wpg="http://schemas.microsoft.com/office/word/2010/wordprocessingGroup" xmlns:wpi="http://schemas.microsoft.com/office/word/2010/wordprocessingInk" xmlns:wne="http://schemas.microsoft.com/office/word/2006/wordml" xmlns:wps="http://schemas.microsoft.com/office/word/2010/wordprocessingShape" mc:Ignorable="w14 w15 w16se w16cid w16 w16cex w16sdtdh wp14">
   <w:abstractNum w:abstractNumId="0" w15:restartNumberingAfterBreak="0">
     <w:nsid w:val="0BA862C0"/>
     <w:multiLevelType w:val="hybridMultilevel"/>
@@ -11443,7 +11741,7 @@
 </file>
 
 <file path=word/styles.xml><?xml version="1.0" encoding="utf-8"?>
-<w:styles xmlns:mc="http://schemas.openxmlformats.org/markup-compatibility/2006" xmlns:r="http://schemas.openxmlformats.org/officeDocument/2006/relationships" xmlns:w="http://schemas.openxmlformats.org/wordprocessingml/2006/main" xmlns:w14="http://schemas.microsoft.com/office/word/2010/wordml" xmlns:w15="http://schemas.microsoft.com/office/word/2012/wordml" xmlns:w16cex="http://schemas.microsoft.com/office/word/2018/wordml/cex" xmlns:w16cid="http://schemas.microsoft.com/office/word/2016/wordml/cid" xmlns:w16="http://schemas.microsoft.com/office/word/2018/wordml" xmlns:w16du="http://schemas.microsoft.com/office/word/2023/wordml/word16du" xmlns:w16sdtdh="http://schemas.microsoft.com/office/word/2020/wordml/sdtdatahash" xmlns:w16sdtfl="http://schemas.microsoft.com/office/word/2024/wordml/sdtformatlock" xmlns:w16se="http://schemas.microsoft.com/office/word/2015/wordml/symex" mc:Ignorable="w14 w15 w16se w16cid w16 w16cex w16sdtdh w16sdtfl w16du">
+<w:styles xmlns:mc="http://schemas.openxmlformats.org/markup-compatibility/2006" xmlns:r="http://schemas.openxmlformats.org/officeDocument/2006/relationships" xmlns:w="http://schemas.openxmlformats.org/wordprocessingml/2006/main" xmlns:w14="http://schemas.microsoft.com/office/word/2010/wordml" xmlns:w15="http://schemas.microsoft.com/office/word/2012/wordml" xmlns:w16cex="http://schemas.microsoft.com/office/word/2018/wordml/cex" xmlns:w16cid="http://schemas.microsoft.com/office/word/2016/wordml/cid" xmlns:w16="http://schemas.microsoft.com/office/word/2018/wordml" xmlns:w16sdtdh="http://schemas.microsoft.com/office/word/2020/wordml/sdtdatahash" xmlns:w16se="http://schemas.microsoft.com/office/word/2015/wordml/symex" mc:Ignorable="w14 w15 w16se w16cid w16 w16cex w16sdtdh">
   <w:docDefaults>
     <w:rPrDefault>
       <w:rPr>
@@ -11842,7 +12140,7 @@
   <w:style w:type="paragraph" w:default="1" w:styleId="a">
     <w:name w:val="Normal"/>
     <w:qFormat/>
-    <w:rsid w:val="008A4F2C"/>
+    <w:rsid w:val="00C1102D"/>
     <w:pPr>
       <w:widowControl w:val="0"/>
     </w:pPr>

</xml_diff>

<commit_message>
doc: revise `Change History` and `Measurement`
</commit_message>
<xml_diff>
--- a/document/hw3.docx
+++ b/document/hw3.docx
@@ -84,6 +84,7 @@
         </w:rPr>
       </w:pPr>
       <w:proofErr w:type="spellStart"/>
+      <w:proofErr w:type="gramStart"/>
       <w:r>
         <w:rPr>
           <w:rFonts w:ascii="Times New Roman" w:eastAsia="標楷體" w:hAnsi="Times New Roman" w:cs="Times New Roman" w:hint="eastAsia"/>
@@ -95,6 +96,7 @@
         <w:t>Re:Book</w:t>
       </w:r>
       <w:proofErr w:type="spellEnd"/>
+      <w:proofErr w:type="gramEnd"/>
     </w:p>
     <w:p>
       <w:pPr>
@@ -199,21 +201,23 @@
           <w:szCs w:val="40"/>
         </w:rPr>
       </w:pPr>
+      <w:proofErr w:type="gramStart"/>
       <w:r>
         <w:rPr>
           <w:rFonts w:ascii="Times New Roman" w:eastAsia="標楷體" w:hAnsi="Times New Roman" w:cs="Times New Roman"/>
           <w:sz w:val="40"/>
           <w:szCs w:val="40"/>
         </w:rPr>
-        <w:t>資工碩二</w:t>
-      </w:r>
+        <w:t>資工碩</w:t>
+      </w:r>
+      <w:proofErr w:type="gramEnd"/>
       <w:r>
         <w:rPr>
           <w:rFonts w:ascii="Times New Roman" w:eastAsia="標楷體" w:hAnsi="Times New Roman" w:cs="Times New Roman"/>
           <w:sz w:val="40"/>
           <w:szCs w:val="40"/>
         </w:rPr>
-        <w:t xml:space="preserve"> 113598037 </w:t>
+        <w:t>二</w:t>
       </w:r>
       <w:r>
         <w:rPr>
@@ -221,26 +225,54 @@
           <w:sz w:val="40"/>
           <w:szCs w:val="40"/>
         </w:rPr>
-        <w:t>陳宥錡</w:t>
-      </w:r>
-    </w:p>
-    <w:p>
-      <w:pPr>
-        <w:jc w:val="center"/>
+        <w:t xml:space="preserve"> 113598037 </w:t>
+      </w:r>
+      <w:r>
         <w:rPr>
           <w:rFonts w:ascii="Times New Roman" w:eastAsia="標楷體" w:hAnsi="Times New Roman" w:cs="Times New Roman"/>
           <w:sz w:val="40"/>
           <w:szCs w:val="40"/>
         </w:rPr>
-      </w:pPr>
+        <w:t>陳</w:t>
+      </w:r>
+      <w:proofErr w:type="gramStart"/>
       <w:r>
         <w:rPr>
           <w:rFonts w:ascii="Times New Roman" w:eastAsia="標楷體" w:hAnsi="Times New Roman" w:cs="Times New Roman"/>
           <w:sz w:val="40"/>
           <w:szCs w:val="40"/>
         </w:rPr>
-        <w:t>資工碩一</w:t>
-      </w:r>
+        <w:t>宥錡</w:t>
+      </w:r>
+      <w:proofErr w:type="gramEnd"/>
+    </w:p>
+    <w:p>
+      <w:pPr>
+        <w:jc w:val="center"/>
+        <w:rPr>
+          <w:rFonts w:ascii="Times New Roman" w:eastAsia="標楷體" w:hAnsi="Times New Roman" w:cs="Times New Roman"/>
+          <w:sz w:val="40"/>
+          <w:szCs w:val="40"/>
+        </w:rPr>
+      </w:pPr>
+      <w:r>
+        <w:rPr>
+          <w:rFonts w:ascii="Times New Roman" w:eastAsia="標楷體" w:hAnsi="Times New Roman" w:cs="Times New Roman"/>
+          <w:sz w:val="40"/>
+          <w:szCs w:val="40"/>
+        </w:rPr>
+        <w:t>資工碩</w:t>
+      </w:r>
+      <w:proofErr w:type="gramStart"/>
+      <w:r>
+        <w:rPr>
+          <w:rFonts w:ascii="Times New Roman" w:eastAsia="標楷體" w:hAnsi="Times New Roman" w:cs="Times New Roman"/>
+          <w:sz w:val="40"/>
+          <w:szCs w:val="40"/>
+        </w:rPr>
+        <w:t>一</w:t>
+      </w:r>
+      <w:proofErr w:type="gramEnd"/>
       <w:r>
         <w:rPr>
           <w:rFonts w:ascii="Times New Roman" w:eastAsia="標楷體" w:hAnsi="Times New Roman" w:cs="Times New Roman"/>
@@ -601,6 +633,62 @@
           </w:p>
         </w:tc>
       </w:tr>
+      <w:tr>
+        <w:tc>
+          <w:tcPr>
+            <w:tcW w:w="990" w:type="dxa"/>
+          </w:tcPr>
+          <w:p>
+            <w:pPr>
+              <w:rPr>
+                <w:rFonts w:ascii="Times New Roman" w:hAnsi="Times New Roman" w:cs="Times New Roman" w:hint="eastAsia"/>
+              </w:rPr>
+            </w:pPr>
+            <w:r>
+              <w:rPr>
+                <w:rFonts w:ascii="Times New Roman" w:hAnsi="Times New Roman" w:cs="Times New Roman" w:hint="eastAsia"/>
+              </w:rPr>
+              <w:t>4</w:t>
+            </w:r>
+          </w:p>
+        </w:tc>
+        <w:tc>
+          <w:tcPr>
+            <w:tcW w:w="5384" w:type="dxa"/>
+          </w:tcPr>
+          <w:p>
+            <w:pPr>
+              <w:rPr>
+                <w:rFonts w:ascii="Times New Roman" w:hAnsi="Times New Roman" w:cs="Times New Roman"/>
+              </w:rPr>
+            </w:pPr>
+            <w:r>
+              <w:rPr>
+                <w:rFonts w:ascii="Times New Roman" w:hAnsi="Times New Roman" w:cs="Times New Roman" w:hint="eastAsia"/>
+              </w:rPr>
+              <w:t>Domain model</w:t>
+            </w:r>
+          </w:p>
+        </w:tc>
+        <w:tc>
+          <w:tcPr>
+            <w:tcW w:w="1922" w:type="dxa"/>
+          </w:tcPr>
+          <w:p>
+            <w:pPr>
+              <w:rPr>
+                <w:rFonts w:ascii="Times New Roman" w:hAnsi="Times New Roman" w:cs="Times New Roman"/>
+              </w:rPr>
+            </w:pPr>
+            <w:r>
+              <w:rPr>
+                <w:rFonts w:ascii="Times New Roman" w:hAnsi="Times New Roman" w:cs="Times New Roman" w:hint="eastAsia"/>
+              </w:rPr>
+              <w:t>2026/3/30</w:t>
+            </w:r>
+          </w:p>
+        </w:tc>
+      </w:tr>
     </w:tbl>
     <w:p/>
     <w:p>
@@ -704,7 +792,35 @@
         <w:rPr>
           <w:rFonts w:ascii="Times New Roman" w:eastAsia="標楷體" w:hAnsi="Times New Roman" w:cs="Times New Roman" w:hint="eastAsia"/>
         </w:rPr>
-        <w:t>類。為體現對書本價值的尊重，賣家可設定期望售價，並上傳書況照片或分享使用心得。潛在買家則可透過搜尋與篩選功能，快速找到所需書籍。平台同時提供私訊機制，讓雙方協商最終價格與交付方式，確保知識的傳遞過程既順暢高效，也保有人與人之間的溫度。</w:t>
+        <w:t>類。為體現對書本價值的尊重，賣家可設定期望售價，並上傳書</w:t>
+      </w:r>
+      <w:proofErr w:type="gramStart"/>
+      <w:r>
+        <w:rPr>
+          <w:rFonts w:ascii="Times New Roman" w:eastAsia="標楷體" w:hAnsi="Times New Roman" w:cs="Times New Roman" w:hint="eastAsia"/>
+        </w:rPr>
+        <w:t>況</w:t>
+      </w:r>
+      <w:proofErr w:type="gramEnd"/>
+      <w:r>
+        <w:rPr>
+          <w:rFonts w:ascii="Times New Roman" w:eastAsia="標楷體" w:hAnsi="Times New Roman" w:cs="Times New Roman" w:hint="eastAsia"/>
+        </w:rPr>
+        <w:t>照片或分享使用心得。潛在買家則可透過搜尋與篩選功能，快速找到所需書籍。平台同時</w:t>
+      </w:r>
+      <w:proofErr w:type="gramStart"/>
+      <w:r>
+        <w:rPr>
+          <w:rFonts w:ascii="Times New Roman" w:eastAsia="標楷體" w:hAnsi="Times New Roman" w:cs="Times New Roman" w:hint="eastAsia"/>
+        </w:rPr>
+        <w:t>提供私訊機制</w:t>
+      </w:r>
+      <w:proofErr w:type="gramEnd"/>
+      <w:r>
+        <w:rPr>
+          <w:rFonts w:ascii="Times New Roman" w:eastAsia="標楷體" w:hAnsi="Times New Roman" w:cs="Times New Roman" w:hint="eastAsia"/>
+        </w:rPr>
+        <w:t>，讓雙方協商最終價格與交付方式，確保知識的傳遞過程既順暢高效，也保有人與人之間的溫度。</w:t>
       </w:r>
     </w:p>
     <w:p>
@@ -917,6 +1033,7 @@
               <w:rPr>
                 <w:rFonts w:ascii="Times New Roman" w:eastAsia="標楷體" w:hAnsi="Times New Roman" w:cs="Times New Roman" w:hint="eastAsia"/>
               </w:rPr>
+              <w:lastRenderedPageBreak/>
               <w:t>FEA-04</w:t>
             </w:r>
           </w:p>
@@ -931,12 +1048,14 @@
                 <w:rFonts w:ascii="Times New Roman" w:eastAsia="標楷體" w:hAnsi="Times New Roman" w:cs="Times New Roman"/>
               </w:rPr>
             </w:pPr>
+            <w:proofErr w:type="gramStart"/>
             <w:r>
               <w:rPr>
                 <w:rFonts w:ascii="Times New Roman" w:eastAsia="標楷體" w:hAnsi="Times New Roman" w:cs="Times New Roman" w:hint="eastAsia"/>
               </w:rPr>
               <w:t>發送私訊</w:t>
             </w:r>
+            <w:proofErr w:type="gramEnd"/>
           </w:p>
         </w:tc>
       </w:tr>
@@ -955,7 +1074,6 @@
               <w:rPr>
                 <w:rFonts w:ascii="Times New Roman" w:eastAsia="標楷體" w:hAnsi="Times New Roman" w:cs="Times New Roman" w:hint="eastAsia"/>
               </w:rPr>
-              <w:lastRenderedPageBreak/>
               <w:t>FEA-05</w:t>
             </w:r>
           </w:p>
@@ -1206,6 +1324,7 @@
               </w:rPr>
             </w:pPr>
             <w:proofErr w:type="spellStart"/>
+            <w:proofErr w:type="gramStart"/>
             <w:r>
               <w:rPr>
                 <w:rFonts w:ascii="Times New Roman" w:eastAsia="標楷體" w:hAnsi="Times New Roman" w:cs="Times New Roman" w:hint="eastAsia"/>
@@ -1213,6 +1332,7 @@
               <w:t>Re:Book</w:t>
             </w:r>
             <w:proofErr w:type="spellEnd"/>
+            <w:proofErr w:type="gramEnd"/>
           </w:p>
         </w:tc>
       </w:tr>
@@ -1374,6 +1494,7 @@
               <w:rPr>
                 <w:rFonts w:ascii="Times New Roman" w:eastAsia="標楷體" w:hAnsi="Times New Roman" w:cs="Times New Roman" w:hint="eastAsia"/>
               </w:rPr>
+              <w:lastRenderedPageBreak/>
               <w:t>買家：希望看到最準確、即時的</w:t>
             </w:r>
             <w:r>
@@ -1386,7 +1507,6 @@
               <w:rPr>
                 <w:rFonts w:ascii="Times New Roman" w:eastAsia="標楷體" w:hAnsi="Times New Roman" w:cs="Times New Roman" w:hint="eastAsia"/>
               </w:rPr>
-              <w:lastRenderedPageBreak/>
               <w:t>狀態與資訊。</w:t>
             </w:r>
           </w:p>
@@ -1588,7 +1708,21 @@
               <w:rPr>
                 <w:rFonts w:ascii="Times New Roman" w:eastAsia="標楷體" w:hAnsi="Times New Roman" w:cs="Times New Roman" w:hint="eastAsia"/>
               </w:rPr>
-              <w:t>、書名、價格、書況及</w:t>
+              <w:t>、書名、價格、書</w:t>
+            </w:r>
+            <w:proofErr w:type="gramStart"/>
+            <w:r>
+              <w:rPr>
+                <w:rFonts w:ascii="Times New Roman" w:eastAsia="標楷體" w:hAnsi="Times New Roman" w:cs="Times New Roman" w:hint="eastAsia"/>
+              </w:rPr>
+              <w:t>況</w:t>
+            </w:r>
+            <w:proofErr w:type="gramEnd"/>
+            <w:r>
+              <w:rPr>
+                <w:rFonts w:ascii="Times New Roman" w:eastAsia="標楷體" w:hAnsi="Times New Roman" w:cs="Times New Roman" w:hint="eastAsia"/>
+              </w:rPr>
+              <w:t>及</w:t>
             </w:r>
             <w:r>
               <w:rPr>
@@ -1645,12 +1779,14 @@
               </w:rPr>
               <w:t>格式</w:t>
             </w:r>
+            <w:proofErr w:type="gramStart"/>
             <w:r>
               <w:rPr>
                 <w:rFonts w:ascii="Times New Roman" w:eastAsia="標楷體" w:hAnsi="Times New Roman" w:cs="Times New Roman" w:hint="eastAsia"/>
               </w:rPr>
               <w:t>與必填欄位</w:t>
             </w:r>
+            <w:proofErr w:type="gramEnd"/>
             <w:r>
               <w:rPr>
                 <w:rFonts w:ascii="Times New Roman" w:eastAsia="標楷體" w:hAnsi="Times New Roman" w:cs="Times New Roman" w:hint="eastAsia"/>
@@ -2340,6 +2476,7 @@
               </w:rPr>
             </w:pPr>
             <w:proofErr w:type="spellStart"/>
+            <w:proofErr w:type="gramStart"/>
             <w:r>
               <w:rPr>
                 <w:rFonts w:ascii="Times New Roman" w:eastAsia="標楷體" w:hAnsi="Times New Roman" w:cs="Times New Roman" w:hint="eastAsia"/>
@@ -2347,6 +2484,7 @@
               <w:t>Re:Book</w:t>
             </w:r>
             <w:proofErr w:type="spellEnd"/>
+            <w:proofErr w:type="gramEnd"/>
           </w:p>
         </w:tc>
       </w:tr>
@@ -2671,7 +2809,21 @@
               <w:rPr>
                 <w:rFonts w:ascii="Times New Roman" w:eastAsia="標楷體" w:hAnsi="Times New Roman" w:cs="Times New Roman" w:hint="eastAsia"/>
               </w:rPr>
-              <w:t>買家選擇篩選條件（如：</w:t>
+              <w:t>買家選擇篩選條件</w:t>
+            </w:r>
+            <w:proofErr w:type="gramStart"/>
+            <w:r>
+              <w:rPr>
+                <w:rFonts w:ascii="Times New Roman" w:eastAsia="標楷體" w:hAnsi="Times New Roman" w:cs="Times New Roman" w:hint="eastAsia"/>
+              </w:rPr>
+              <w:t>（</w:t>
+            </w:r>
+            <w:proofErr w:type="gramEnd"/>
+            <w:r>
+              <w:rPr>
+                <w:rFonts w:ascii="Times New Roman" w:eastAsia="標楷體" w:hAnsi="Times New Roman" w:cs="Times New Roman" w:hint="eastAsia"/>
+              </w:rPr>
+              <w:t>如：</w:t>
             </w:r>
             <w:r>
               <w:rPr>
@@ -2683,7 +2835,21 @@
               <w:rPr>
                 <w:rFonts w:ascii="Times New Roman" w:eastAsia="標楷體" w:hAnsi="Times New Roman" w:cs="Times New Roman" w:hint="eastAsia"/>
               </w:rPr>
-              <w:t>、價格範圍）。</w:t>
+              <w:t>、價格範圍</w:t>
+            </w:r>
+            <w:proofErr w:type="gramStart"/>
+            <w:r>
+              <w:rPr>
+                <w:rFonts w:ascii="Times New Roman" w:eastAsia="標楷體" w:hAnsi="Times New Roman" w:cs="Times New Roman" w:hint="eastAsia"/>
+              </w:rPr>
+              <w:t>）</w:t>
+            </w:r>
+            <w:proofErr w:type="gramEnd"/>
+            <w:r>
+              <w:rPr>
+                <w:rFonts w:ascii="Times New Roman" w:eastAsia="標楷體" w:hAnsi="Times New Roman" w:cs="Times New Roman" w:hint="eastAsia"/>
+              </w:rPr>
+              <w:t>。</w:t>
             </w:r>
           </w:p>
           <w:p>
@@ -3111,6 +3277,7 @@
               </w:rPr>
             </w:pPr>
             <w:proofErr w:type="spellStart"/>
+            <w:proofErr w:type="gramStart"/>
             <w:r>
               <w:rPr>
                 <w:rFonts w:ascii="Times New Roman" w:eastAsia="標楷體" w:hAnsi="Times New Roman" w:cs="Times New Roman" w:hint="eastAsia"/>
@@ -3118,6 +3285,7 @@
               <w:t>Re:Book</w:t>
             </w:r>
             <w:proofErr w:type="spellEnd"/>
+            <w:proofErr w:type="gramEnd"/>
           </w:p>
         </w:tc>
       </w:tr>
@@ -3419,7 +3587,35 @@
               <w:rPr>
                 <w:rFonts w:ascii="Times New Roman" w:eastAsia="標楷體" w:hAnsi="Times New Roman" w:cs="Times New Roman" w:hint="eastAsia"/>
               </w:rPr>
-              <w:t>系統顯示訂單資訊與線下交易選項（如：面交付現、自行匯款）。</w:t>
+              <w:t>系統顯示訂單資訊與線下交易選項</w:t>
+            </w:r>
+            <w:proofErr w:type="gramStart"/>
+            <w:r>
+              <w:rPr>
+                <w:rFonts w:ascii="Times New Roman" w:eastAsia="標楷體" w:hAnsi="Times New Roman" w:cs="Times New Roman" w:hint="eastAsia"/>
+              </w:rPr>
+              <w:t>（</w:t>
+            </w:r>
+            <w:proofErr w:type="gramEnd"/>
+            <w:r>
+              <w:rPr>
+                <w:rFonts w:ascii="Times New Roman" w:eastAsia="標楷體" w:hAnsi="Times New Roman" w:cs="Times New Roman" w:hint="eastAsia"/>
+              </w:rPr>
+              <w:t>如：面交付現、自行匯款</w:t>
+            </w:r>
+            <w:proofErr w:type="gramStart"/>
+            <w:r>
+              <w:rPr>
+                <w:rFonts w:ascii="Times New Roman" w:eastAsia="標楷體" w:hAnsi="Times New Roman" w:cs="Times New Roman" w:hint="eastAsia"/>
+              </w:rPr>
+              <w:t>）</w:t>
+            </w:r>
+            <w:proofErr w:type="gramEnd"/>
+            <w:r>
+              <w:rPr>
+                <w:rFonts w:ascii="Times New Roman" w:eastAsia="標楷體" w:hAnsi="Times New Roman" w:cs="Times New Roman" w:hint="eastAsia"/>
+              </w:rPr>
+              <w:t>。</w:t>
             </w:r>
           </w:p>
           <w:p>
@@ -3808,7 +4004,21 @@
               <w:rPr>
                 <w:rFonts w:ascii="Times New Roman" w:eastAsia="標楷體" w:hAnsi="Times New Roman" w:cs="Times New Roman"/>
               </w:rPr>
-              <w:t>是否需要設定自動取消機制？（例</w:t>
+              <w:t>是否需要設定自動取消機制？</w:t>
+            </w:r>
+            <w:proofErr w:type="gramStart"/>
+            <w:r>
+              <w:rPr>
+                <w:rFonts w:ascii="Times New Roman" w:eastAsia="標楷體" w:hAnsi="Times New Roman" w:cs="Times New Roman"/>
+              </w:rPr>
+              <w:t>（</w:t>
+            </w:r>
+            <w:proofErr w:type="gramEnd"/>
+            <w:r>
+              <w:rPr>
+                <w:rFonts w:ascii="Times New Roman" w:eastAsia="標楷體" w:hAnsi="Times New Roman" w:cs="Times New Roman"/>
+              </w:rPr>
+              <w:t>例</w:t>
             </w:r>
             <w:r>
               <w:rPr>
@@ -3827,7 +4037,21 @@
               <w:rPr>
                 <w:rFonts w:ascii="Times New Roman" w:eastAsia="標楷體" w:hAnsi="Times New Roman" w:cs="Times New Roman"/>
               </w:rPr>
-              <w:t>天內未點擊完成，系統自動取消並恢復書籍狀態）。</w:t>
+              <w:t>天內未點擊完成，系統自動取消並恢復書籍狀態</w:t>
+            </w:r>
+            <w:proofErr w:type="gramStart"/>
+            <w:r>
+              <w:rPr>
+                <w:rFonts w:ascii="Times New Roman" w:eastAsia="標楷體" w:hAnsi="Times New Roman" w:cs="Times New Roman"/>
+              </w:rPr>
+              <w:t>）</w:t>
+            </w:r>
+            <w:proofErr w:type="gramEnd"/>
+            <w:r>
+              <w:rPr>
+                <w:rFonts w:ascii="Times New Roman" w:eastAsia="標楷體" w:hAnsi="Times New Roman" w:cs="Times New Roman"/>
+              </w:rPr>
+              <w:t>。</w:t>
             </w:r>
           </w:p>
         </w:tc>
@@ -3953,6 +4177,7 @@
               </w:rPr>
             </w:pPr>
             <w:proofErr w:type="spellStart"/>
+            <w:proofErr w:type="gramStart"/>
             <w:r>
               <w:rPr>
                 <w:rFonts w:ascii="Times New Roman" w:eastAsia="標楷體" w:hAnsi="Times New Roman" w:cs="Times New Roman" w:hint="eastAsia"/>
@@ -3960,6 +4185,7 @@
               <w:t>Re:Book</w:t>
             </w:r>
             <w:proofErr w:type="spellEnd"/>
+            <w:proofErr w:type="gramEnd"/>
           </w:p>
         </w:tc>
       </w:tr>
@@ -4078,7 +4304,21 @@
               <w:rPr>
                 <w:rFonts w:ascii="Times New Roman" w:eastAsia="標楷體" w:hAnsi="Times New Roman" w:cs="Times New Roman" w:hint="eastAsia"/>
               </w:rPr>
-              <w:t>買家：希望直接聯繫賣家以詢問書況細節或協商最終價格</w:t>
+              <w:t>買家：希望直接聯繫賣家以詢問書</w:t>
+            </w:r>
+            <w:proofErr w:type="gramStart"/>
+            <w:r>
+              <w:rPr>
+                <w:rFonts w:ascii="Times New Roman" w:eastAsia="標楷體" w:hAnsi="Times New Roman" w:cs="Times New Roman" w:hint="eastAsia"/>
+              </w:rPr>
+              <w:t>況</w:t>
+            </w:r>
+            <w:proofErr w:type="gramEnd"/>
+            <w:r>
+              <w:rPr>
+                <w:rFonts w:ascii="Times New Roman" w:eastAsia="標楷體" w:hAnsi="Times New Roman" w:cs="Times New Roman" w:hint="eastAsia"/>
+              </w:rPr>
+              <w:t>細節或協商最終價格</w:t>
             </w:r>
           </w:p>
           <w:p>
@@ -4297,12 +4537,14 @@
               </w:rPr>
               <w:t>賣家</w:t>
             </w:r>
+            <w:proofErr w:type="gramStart"/>
             <w:r>
               <w:rPr>
                 <w:rFonts w:ascii="Times New Roman" w:eastAsia="標楷體" w:hAnsi="Times New Roman" w:cs="Times New Roman" w:hint="eastAsia"/>
               </w:rPr>
               <w:t>的私訊</w:t>
             </w:r>
+            <w:proofErr w:type="gramEnd"/>
             <w:r>
               <w:rPr>
                 <w:rFonts w:ascii="Times New Roman" w:eastAsia="標楷體" w:hAnsi="Times New Roman" w:cs="Times New Roman" w:hint="eastAsia"/>
@@ -4332,7 +4574,21 @@
               <w:rPr>
                 <w:rFonts w:ascii="Times New Roman" w:eastAsia="標楷體" w:hAnsi="Times New Roman" w:cs="Times New Roman" w:hint="eastAsia"/>
               </w:rPr>
-              <w:t>買家輸入諮詢內容（如：詢問</w:t>
+              <w:t>買家輸入諮詢內容</w:t>
+            </w:r>
+            <w:proofErr w:type="gramStart"/>
+            <w:r>
+              <w:rPr>
+                <w:rFonts w:ascii="Times New Roman" w:eastAsia="標楷體" w:hAnsi="Times New Roman" w:cs="Times New Roman" w:hint="eastAsia"/>
+              </w:rPr>
+              <w:t>（</w:t>
+            </w:r>
+            <w:proofErr w:type="gramEnd"/>
+            <w:r>
+              <w:rPr>
+                <w:rFonts w:ascii="Times New Roman" w:eastAsia="標楷體" w:hAnsi="Times New Roman" w:cs="Times New Roman" w:hint="eastAsia"/>
+              </w:rPr>
+              <w:t>如：詢問</w:t>
             </w:r>
             <w:r>
               <w:rPr>
@@ -4340,11 +4596,33 @@
               </w:rPr>
               <w:t>書</w:t>
             </w:r>
-            <w:r>
-              <w:rPr>
-                <w:rFonts w:ascii="Times New Roman" w:eastAsia="標楷體" w:hAnsi="Times New Roman" w:cs="Times New Roman" w:hint="eastAsia"/>
-              </w:rPr>
-              <w:t>況、議價或約定地點）。</w:t>
+            <w:proofErr w:type="gramStart"/>
+            <w:r>
+              <w:rPr>
+                <w:rFonts w:ascii="Times New Roman" w:eastAsia="標楷體" w:hAnsi="Times New Roman" w:cs="Times New Roman" w:hint="eastAsia"/>
+              </w:rPr>
+              <w:t>況</w:t>
+            </w:r>
+            <w:proofErr w:type="gramEnd"/>
+            <w:r>
+              <w:rPr>
+                <w:rFonts w:ascii="Times New Roman" w:eastAsia="標楷體" w:hAnsi="Times New Roman" w:cs="Times New Roman" w:hint="eastAsia"/>
+              </w:rPr>
+              <w:t>、議價或約定地點</w:t>
+            </w:r>
+            <w:proofErr w:type="gramStart"/>
+            <w:r>
+              <w:rPr>
+                <w:rFonts w:ascii="Times New Roman" w:eastAsia="標楷體" w:hAnsi="Times New Roman" w:cs="Times New Roman" w:hint="eastAsia"/>
+              </w:rPr>
+              <w:t>）</w:t>
+            </w:r>
+            <w:proofErr w:type="gramEnd"/>
+            <w:r>
+              <w:rPr>
+                <w:rFonts w:ascii="Times New Roman" w:eastAsia="標楷體" w:hAnsi="Times New Roman" w:cs="Times New Roman" w:hint="eastAsia"/>
+              </w:rPr>
+              <w:t>。</w:t>
             </w:r>
           </w:p>
           <w:p>
@@ -4569,7 +4847,21 @@
               <w:rPr>
                 <w:rFonts w:ascii="Times New Roman" w:eastAsia="標楷體" w:hAnsi="Times New Roman" w:cs="Times New Roman" w:hint="eastAsia"/>
               </w:rPr>
-              <w:t>支援文字訊息；未來可擴充支援圖片傳送（用於拍攝更詳細的書況）。</w:t>
+              <w:t>支援文字訊息；未來可擴充支援圖片傳送（用於拍攝更詳細的書</w:t>
+            </w:r>
+            <w:proofErr w:type="gramStart"/>
+            <w:r>
+              <w:rPr>
+                <w:rFonts w:ascii="Times New Roman" w:eastAsia="標楷體" w:hAnsi="Times New Roman" w:cs="Times New Roman" w:hint="eastAsia"/>
+              </w:rPr>
+              <w:t>況</w:t>
+            </w:r>
+            <w:proofErr w:type="gramEnd"/>
+            <w:r>
+              <w:rPr>
+                <w:rFonts w:ascii="Times New Roman" w:eastAsia="標楷體" w:hAnsi="Times New Roman" w:cs="Times New Roman" w:hint="eastAsia"/>
+              </w:rPr>
+              <w:t>）。</w:t>
             </w:r>
           </w:p>
         </w:tc>
@@ -4778,6 +5070,7 @@
               </w:rPr>
             </w:pPr>
             <w:proofErr w:type="spellStart"/>
+            <w:proofErr w:type="gramStart"/>
             <w:r>
               <w:rPr>
                 <w:rFonts w:ascii="Times New Roman" w:eastAsia="標楷體" w:hAnsi="Times New Roman" w:cs="Times New Roman" w:hint="eastAsia"/>
@@ -4785,6 +5078,7 @@
               <w:t>Re:Book</w:t>
             </w:r>
             <w:proofErr w:type="spellEnd"/>
+            <w:proofErr w:type="gramEnd"/>
           </w:p>
         </w:tc>
       </w:tr>
@@ -5076,7 +5370,14 @@
               <w:rPr>
                 <w:rFonts w:ascii="Times New Roman" w:eastAsia="標楷體" w:hAnsi="Times New Roman" w:cs="Times New Roman" w:hint="eastAsia"/>
               </w:rPr>
-              <w:t>被正確歸類至</w:t>
+              <w:t>被正確</w:t>
+            </w:r>
+            <w:proofErr w:type="gramStart"/>
+            <w:r>
+              <w:rPr>
+                <w:rFonts w:ascii="Times New Roman" w:eastAsia="標楷體" w:hAnsi="Times New Roman" w:cs="Times New Roman" w:hint="eastAsia"/>
+              </w:rPr>
+              <w:t>歸類至</w:t>
             </w:r>
             <w:r>
               <w:rPr>
@@ -5084,6 +5385,7 @@
               </w:rPr>
               <w:t>賣家</w:t>
             </w:r>
+            <w:proofErr w:type="gramEnd"/>
             <w:r>
               <w:rPr>
                 <w:rFonts w:ascii="Times New Roman" w:eastAsia="標楷體" w:hAnsi="Times New Roman" w:cs="Times New Roman" w:hint="eastAsia"/>
@@ -5100,7 +5402,21 @@
               <w:rPr>
                 <w:rFonts w:ascii="Times New Roman" w:eastAsia="標楷體" w:hAnsi="Times New Roman" w:cs="Times New Roman" w:hint="eastAsia"/>
               </w:rPr>
-              <w:t>分類中，且買家在賣家個人頁面能看到清楚的分類結構。</w:t>
+              <w:t>分類中，且買家在賣家個人頁面能看到</w:t>
+            </w:r>
+            <w:proofErr w:type="gramStart"/>
+            <w:r>
+              <w:rPr>
+                <w:rFonts w:ascii="Times New Roman" w:eastAsia="標楷體" w:hAnsi="Times New Roman" w:cs="Times New Roman" w:hint="eastAsia"/>
+              </w:rPr>
+              <w:t>清楚的</w:t>
+            </w:r>
+            <w:proofErr w:type="gramEnd"/>
+            <w:r>
+              <w:rPr>
+                <w:rFonts w:ascii="Times New Roman" w:eastAsia="標楷體" w:hAnsi="Times New Roman" w:cs="Times New Roman" w:hint="eastAsia"/>
+              </w:rPr>
+              <w:t>分類結構。</w:t>
             </w:r>
           </w:p>
         </w:tc>
@@ -5916,6 +6232,7 @@
               </w:rPr>
             </w:pPr>
             <w:proofErr w:type="spellStart"/>
+            <w:proofErr w:type="gramStart"/>
             <w:r>
               <w:rPr>
                 <w:rFonts w:ascii="Times New Roman" w:eastAsia="標楷體" w:hAnsi="Times New Roman" w:cs="Times New Roman"/>
@@ -5923,6 +6240,7 @@
               <w:t>Re:Book</w:t>
             </w:r>
             <w:proofErr w:type="spellEnd"/>
+            <w:proofErr w:type="gramEnd"/>
           </w:p>
         </w:tc>
       </w:tr>
@@ -6211,11 +6529,19 @@
               </w:rPr>
               <w:t>的</w:t>
             </w:r>
-            <w:r>
-              <w:rPr>
-                <w:rFonts w:ascii="Times New Roman" w:eastAsia="標楷體" w:hAnsi="Times New Roman" w:cs="Times New Roman" w:hint="eastAsia"/>
-              </w:rPr>
-              <w:t>詳情頁點擊「加入</w:t>
+            <w:proofErr w:type="gramStart"/>
+            <w:r>
+              <w:rPr>
+                <w:rFonts w:ascii="Times New Roman" w:eastAsia="標楷體" w:hAnsi="Times New Roman" w:cs="Times New Roman" w:hint="eastAsia"/>
+              </w:rPr>
+              <w:t>詳情頁點擊</w:t>
+            </w:r>
+            <w:proofErr w:type="gramEnd"/>
+            <w:r>
+              <w:rPr>
+                <w:rFonts w:ascii="Times New Roman" w:eastAsia="標楷體" w:hAnsi="Times New Roman" w:cs="Times New Roman" w:hint="eastAsia"/>
+              </w:rPr>
+              <w:t>「加入</w:t>
             </w:r>
             <w:r>
               <w:rPr>
@@ -6303,6 +6629,7 @@
               </w:rPr>
               <w:t>買家進入</w:t>
             </w:r>
+            <w:proofErr w:type="gramStart"/>
             <w:r>
               <w:rPr>
                 <w:rFonts w:ascii="Times New Roman" w:eastAsia="標楷體" w:hAnsi="Times New Roman" w:cs="Times New Roman" w:hint="eastAsia"/>
@@ -6313,7 +6640,14 @@
               <w:rPr>
                 <w:rFonts w:ascii="Times New Roman" w:eastAsia="標楷體" w:hAnsi="Times New Roman" w:cs="Times New Roman" w:hint="eastAsia"/>
               </w:rPr>
-              <w:t>頁面，查看所有已</w:t>
+              <w:t>頁面</w:t>
+            </w:r>
+            <w:proofErr w:type="gramEnd"/>
+            <w:r>
+              <w:rPr>
+                <w:rFonts w:ascii="Times New Roman" w:eastAsia="標楷體" w:hAnsi="Times New Roman" w:cs="Times New Roman" w:hint="eastAsia"/>
+              </w:rPr>
+              <w:t>，查看所有已</w:t>
             </w:r>
             <w:r>
               <w:rPr>
@@ -6358,12 +6692,14 @@
               </w:rPr>
               <w:t>買家可從</w:t>
             </w:r>
+            <w:proofErr w:type="gramStart"/>
             <w:r>
               <w:rPr>
                 <w:rFonts w:ascii="Times New Roman" w:eastAsia="標楷體" w:hAnsi="Times New Roman" w:cs="Times New Roman" w:hint="eastAsia"/>
               </w:rPr>
               <w:t>購物車頁面</w:t>
             </w:r>
+            <w:proofErr w:type="gramEnd"/>
             <w:r>
               <w:rPr>
                 <w:rFonts w:ascii="Times New Roman" w:eastAsia="標楷體" w:hAnsi="Times New Roman" w:cs="Times New Roman" w:hint="eastAsia"/>
@@ -7072,11 +7408,19 @@
                 <w:rFonts w:ascii="Times New Roman" w:eastAsia="標楷體" w:hAnsi="Times New Roman" w:cs="Times New Roman"/>
               </w:rPr>
             </w:pPr>
-            <w:r>
-              <w:rPr>
-                <w:rFonts w:ascii="Times New Roman" w:eastAsia="標楷體" w:hAnsi="Times New Roman" w:cs="Times New Roman" w:hint="eastAsia"/>
-              </w:rPr>
-              <w:t>私訊傳遞的延遲時間應小於</w:t>
+            <w:proofErr w:type="gramStart"/>
+            <w:r>
+              <w:rPr>
+                <w:rFonts w:ascii="Times New Roman" w:eastAsia="標楷體" w:hAnsi="Times New Roman" w:cs="Times New Roman" w:hint="eastAsia"/>
+              </w:rPr>
+              <w:t>私訊傳遞</w:t>
+            </w:r>
+            <w:proofErr w:type="gramEnd"/>
+            <w:r>
+              <w:rPr>
+                <w:rFonts w:ascii="Times New Roman" w:eastAsia="標楷體" w:hAnsi="Times New Roman" w:cs="Times New Roman" w:hint="eastAsia"/>
+              </w:rPr>
+              <w:t>的延遲時間應小於</w:t>
             </w:r>
             <w:r>
               <w:rPr>
@@ -7596,7 +7940,21 @@
               <w:rPr>
                 <w:rFonts w:ascii="Times New Roman" w:eastAsia="標楷體" w:hAnsi="Times New Roman" w:cs="Times New Roman"/>
               </w:rPr>
-              <w:t>，包含該書籍的價格、書況、照片與所在地點等資訊。</w:t>
+              <w:t>，包含該書籍的價格、書</w:t>
+            </w:r>
+            <w:proofErr w:type="gramStart"/>
+            <w:r>
+              <w:rPr>
+                <w:rFonts w:ascii="Times New Roman" w:eastAsia="標楷體" w:hAnsi="Times New Roman" w:cs="Times New Roman"/>
+              </w:rPr>
+              <w:t>況</w:t>
+            </w:r>
+            <w:proofErr w:type="gramEnd"/>
+            <w:r>
+              <w:rPr>
+                <w:rFonts w:ascii="Times New Roman" w:eastAsia="標楷體" w:hAnsi="Times New Roman" w:cs="Times New Roman"/>
+              </w:rPr>
+              <w:t>、照片與所在地點等資訊。</w:t>
             </w:r>
           </w:p>
         </w:tc>
@@ -7700,12 +8058,14 @@
                 <w:rFonts w:ascii="Times New Roman" w:eastAsia="標楷體" w:hAnsi="Times New Roman" w:cs="Times New Roman"/>
               </w:rPr>
             </w:pPr>
+            <w:proofErr w:type="gramStart"/>
             <w:r>
               <w:rPr>
                 <w:rFonts w:ascii="Times New Roman" w:eastAsia="標楷體" w:hAnsi="Times New Roman" w:cs="Times New Roman" w:hint="eastAsia"/>
               </w:rPr>
               <w:t>私訊</w:t>
             </w:r>
+            <w:proofErr w:type="gramEnd"/>
           </w:p>
         </w:tc>
         <w:tc>
@@ -7772,7 +8132,21 @@
               <w:rPr>
                 <w:rFonts w:ascii="Times New Roman" w:eastAsia="標楷體" w:hAnsi="Times New Roman" w:cs="Times New Roman" w:hint="eastAsia"/>
               </w:rPr>
-              <w:t>。讓買家在後續可以進行比價或發起私訊以進行協商。</w:t>
+              <w:t>。讓買家在後續可以進行比價或</w:t>
+            </w:r>
+            <w:proofErr w:type="gramStart"/>
+            <w:r>
+              <w:rPr>
+                <w:rFonts w:ascii="Times New Roman" w:eastAsia="標楷體" w:hAnsi="Times New Roman" w:cs="Times New Roman" w:hint="eastAsia"/>
+              </w:rPr>
+              <w:t>發起私訊以</w:t>
+            </w:r>
+            <w:proofErr w:type="gramEnd"/>
+            <w:r>
+              <w:rPr>
+                <w:rFonts w:ascii="Times New Roman" w:eastAsia="標楷體" w:hAnsi="Times New Roman" w:cs="Times New Roman" w:hint="eastAsia"/>
+              </w:rPr>
+              <w:t>進行協商。</w:t>
             </w:r>
           </w:p>
         </w:tc>
@@ -8197,12 +8571,14 @@
                 <w:rFonts w:ascii="Times New Roman" w:eastAsia="標楷體" w:hAnsi="Times New Roman" w:cs="Times New Roman"/>
               </w:rPr>
             </w:pPr>
+            <w:proofErr w:type="gramStart"/>
             <w:r>
               <w:rPr>
                 <w:rFonts w:ascii="Times New Roman" w:eastAsia="標楷體" w:hAnsi="Times New Roman" w:cs="Times New Roman" w:hint="eastAsia"/>
               </w:rPr>
               <w:t>必填欄位</w:t>
             </w:r>
+            <w:proofErr w:type="gramEnd"/>
           </w:p>
         </w:tc>
       </w:tr>
@@ -8239,8 +8615,16 @@
               <w:rPr>
                 <w:rFonts w:ascii="Times New Roman" w:eastAsia="標楷體" w:hAnsi="Times New Roman" w:cs="Times New Roman" w:hint="eastAsia"/>
               </w:rPr>
-              <w:t>書況</w:t>
-            </w:r>
+              <w:t>書</w:t>
+            </w:r>
+            <w:proofErr w:type="gramStart"/>
+            <w:r>
+              <w:rPr>
+                <w:rFonts w:ascii="Times New Roman" w:eastAsia="標楷體" w:hAnsi="Times New Roman" w:cs="Times New Roman" w:hint="eastAsia"/>
+              </w:rPr>
+              <w:t>況</w:t>
+            </w:r>
+            <w:proofErr w:type="gramEnd"/>
           </w:p>
         </w:tc>
         <w:tc>
@@ -8289,12 +8673,14 @@
                 <w:rFonts w:ascii="Times New Roman" w:eastAsia="標楷體" w:hAnsi="Times New Roman" w:cs="Times New Roman"/>
               </w:rPr>
             </w:pPr>
+            <w:proofErr w:type="gramStart"/>
             <w:r>
               <w:rPr>
                 <w:rFonts w:ascii="Times New Roman" w:eastAsia="標楷體" w:hAnsi="Times New Roman" w:cs="Times New Roman" w:hint="eastAsia"/>
               </w:rPr>
               <w:t>私訊</w:t>
             </w:r>
+            <w:proofErr w:type="gramEnd"/>
           </w:p>
         </w:tc>
       </w:tr>
@@ -8529,12 +8915,14 @@
                 <w:rFonts w:ascii="Times New Roman" w:eastAsia="標楷體" w:hAnsi="Times New Roman" w:cs="Times New Roman"/>
               </w:rPr>
             </w:pPr>
+            <w:proofErr w:type="gramStart"/>
             <w:r>
               <w:rPr>
                 <w:rFonts w:ascii="Times New Roman" w:eastAsia="標楷體" w:hAnsi="Times New Roman" w:cs="Times New Roman" w:hint="eastAsia"/>
               </w:rPr>
               <w:t>購物車頁面</w:t>
             </w:r>
+            <w:proofErr w:type="gramEnd"/>
           </w:p>
         </w:tc>
         <w:tc>
@@ -8675,7 +9063,21 @@
         <w:rPr>
           <w:rFonts w:ascii="Times New Roman" w:eastAsia="標楷體" w:hAnsi="Times New Roman" w:cs="Times New Roman" w:hint="eastAsia"/>
         </w:rPr>
-        <w:t>書籍頁面、個人賣場管理頁面、購物車頁面：皆為前端</w:t>
+        <w:t>書籍頁面、個人賣場管理頁面、</w:t>
+      </w:r>
+      <w:proofErr w:type="gramStart"/>
+      <w:r>
+        <w:rPr>
+          <w:rFonts w:ascii="Times New Roman" w:eastAsia="標楷體" w:hAnsi="Times New Roman" w:cs="Times New Roman" w:hint="eastAsia"/>
+        </w:rPr>
+        <w:t>購物車頁面</w:t>
+      </w:r>
+      <w:proofErr w:type="gramEnd"/>
+      <w:r>
+        <w:rPr>
+          <w:rFonts w:ascii="Times New Roman" w:eastAsia="標楷體" w:hAnsi="Times New Roman" w:cs="Times New Roman" w:hint="eastAsia"/>
+        </w:rPr>
+        <w:t>：皆為前端</w:t>
       </w:r>
       <w:r>
         <w:rPr>
@@ -8767,11 +9169,19 @@
           <w:rFonts w:ascii="Times New Roman" w:eastAsia="標楷體" w:hAnsi="Times New Roman" w:cs="Times New Roman"/>
         </w:rPr>
       </w:pPr>
+      <w:proofErr w:type="gramStart"/>
       <w:r>
         <w:rPr>
           <w:rFonts w:ascii="Times New Roman" w:eastAsia="標楷體" w:hAnsi="Times New Roman" w:cs="Times New Roman" w:hint="eastAsia"/>
         </w:rPr>
-        <w:t>必填欄位：表單驗證規則，非實體物件。</w:t>
+        <w:t>必填欄位</w:t>
+      </w:r>
+      <w:proofErr w:type="gramEnd"/>
+      <w:r>
+        <w:rPr>
+          <w:rFonts w:ascii="Times New Roman" w:eastAsia="標楷體" w:hAnsi="Times New Roman" w:cs="Times New Roman" w:hint="eastAsia"/>
+        </w:rPr>
+        <w:t>：表單驗證規則，非實體物件。</w:t>
       </w:r>
     </w:p>
     <w:p>
@@ -8832,7 +9242,21 @@
         <w:rPr>
           <w:rFonts w:ascii="Times New Roman" w:eastAsia="標楷體" w:hAnsi="Times New Roman" w:cs="Times New Roman" w:hint="eastAsia"/>
         </w:rPr>
-        <w:t>書籍狀態、書況：應作為</w:t>
+        <w:t>書籍狀態、書</w:t>
+      </w:r>
+      <w:proofErr w:type="gramStart"/>
+      <w:r>
+        <w:rPr>
+          <w:rFonts w:ascii="Times New Roman" w:eastAsia="標楷體" w:hAnsi="Times New Roman" w:cs="Times New Roman" w:hint="eastAsia"/>
+        </w:rPr>
+        <w:t>況</w:t>
+      </w:r>
+      <w:proofErr w:type="gramEnd"/>
+      <w:r>
+        <w:rPr>
+          <w:rFonts w:ascii="Times New Roman" w:eastAsia="標楷體" w:hAnsi="Times New Roman" w:cs="Times New Roman" w:hint="eastAsia"/>
+        </w:rPr>
+        <w:t>：應作為</w:t>
       </w:r>
       <w:r>
         <w:rPr>
@@ -9195,9 +9619,6 @@
     <w:p>
       <w:pPr>
         <w:pStyle w:val="3"/>
-        <w:rPr>
-          <w:rFonts w:hint="eastAsia"/>
-        </w:rPr>
       </w:pPr>
       <w:r>
         <w:rPr>
@@ -9209,7 +9630,7 @@
     <w:p>
       <w:pPr>
         <w:rPr>
-          <w:rFonts w:ascii="Times New Roman" w:eastAsia="標楷體" w:hAnsi="Times New Roman" w:cs="Times New Roman" w:hint="eastAsia"/>
+          <w:rFonts w:ascii="Times New Roman" w:eastAsia="標楷體" w:hAnsi="Times New Roman" w:cs="Times New Roman"/>
         </w:rPr>
       </w:pPr>
       <w:r>
@@ -9285,7 +9706,7 @@
           <w:p>
             <w:pPr>
               <w:rPr>
-                <w:rFonts w:ascii="Times New Roman" w:eastAsia="標楷體" w:hAnsi="Times New Roman" w:cs="Times New Roman" w:hint="eastAsia"/>
+                <w:rFonts w:ascii="Times New Roman" w:eastAsia="標楷體" w:hAnsi="Times New Roman" w:cs="Times New Roman"/>
               </w:rPr>
             </w:pPr>
             <w:r>
@@ -9303,7 +9724,7 @@
           <w:p>
             <w:pPr>
               <w:rPr>
-                <w:rFonts w:ascii="Times New Roman" w:eastAsia="標楷體" w:hAnsi="Times New Roman" w:cs="Times New Roman" w:hint="eastAsia"/>
+                <w:rFonts w:ascii="Times New Roman" w:eastAsia="標楷體" w:hAnsi="Times New Roman" w:cs="Times New Roman"/>
               </w:rPr>
             </w:pPr>
             <w:r>
@@ -9323,7 +9744,7 @@
           <w:p>
             <w:pPr>
               <w:rPr>
-                <w:rFonts w:ascii="Times New Roman" w:eastAsia="標楷體" w:hAnsi="Times New Roman" w:cs="Times New Roman" w:hint="eastAsia"/>
+                <w:rFonts w:ascii="Times New Roman" w:eastAsia="標楷體" w:hAnsi="Times New Roman" w:cs="Times New Roman"/>
               </w:rPr>
             </w:pPr>
             <w:r>
@@ -9341,7 +9762,7 @@
           <w:p>
             <w:pPr>
               <w:rPr>
-                <w:rFonts w:ascii="Times New Roman" w:eastAsia="標楷體" w:hAnsi="Times New Roman" w:cs="Times New Roman" w:hint="eastAsia"/>
+                <w:rFonts w:ascii="Times New Roman" w:eastAsia="標楷體" w:hAnsi="Times New Roman" w:cs="Times New Roman"/>
               </w:rPr>
             </w:pPr>
             <w:r>
@@ -9361,25 +9782,27 @@
           <w:p>
             <w:pPr>
               <w:rPr>
-                <w:rFonts w:ascii="Times New Roman" w:eastAsia="標楷體" w:hAnsi="Times New Roman" w:cs="Times New Roman" w:hint="eastAsia"/>
-              </w:rPr>
-            </w:pPr>
+                <w:rFonts w:ascii="Times New Roman" w:eastAsia="標楷體" w:hAnsi="Times New Roman" w:cs="Times New Roman"/>
+              </w:rPr>
+            </w:pPr>
+            <w:proofErr w:type="gramStart"/>
             <w:r>
               <w:rPr>
                 <w:rFonts w:ascii="Times New Roman" w:eastAsia="標楷體" w:hAnsi="Times New Roman" w:cs="Times New Roman" w:hint="eastAsia"/>
               </w:rPr>
               <w:t>私訊</w:t>
             </w:r>
-          </w:p>
-        </w:tc>
-        <w:tc>
-          <w:tcPr>
-            <w:tcW w:w="4148" w:type="dxa"/>
-          </w:tcPr>
-          <w:p>
-            <w:pPr>
-              <w:rPr>
-                <w:rFonts w:ascii="Times New Roman" w:eastAsia="標楷體" w:hAnsi="Times New Roman" w:cs="Times New Roman" w:hint="eastAsia"/>
+            <w:proofErr w:type="gramEnd"/>
+          </w:p>
+        </w:tc>
+        <w:tc>
+          <w:tcPr>
+            <w:tcW w:w="4148" w:type="dxa"/>
+          </w:tcPr>
+          <w:p>
+            <w:pPr>
+              <w:rPr>
+                <w:rFonts w:ascii="Times New Roman" w:eastAsia="標楷體" w:hAnsi="Times New Roman" w:cs="Times New Roman"/>
               </w:rPr>
             </w:pPr>
             <w:r>
@@ -9399,7 +9822,7 @@
           <w:p>
             <w:pPr>
               <w:rPr>
-                <w:rFonts w:ascii="Times New Roman" w:eastAsia="標楷體" w:hAnsi="Times New Roman" w:cs="Times New Roman" w:hint="eastAsia"/>
+                <w:rFonts w:ascii="Times New Roman" w:eastAsia="標楷體" w:hAnsi="Times New Roman" w:cs="Times New Roman"/>
               </w:rPr>
             </w:pPr>
             <w:r>
@@ -9417,7 +9840,7 @@
           <w:p>
             <w:pPr>
               <w:rPr>
-                <w:rFonts w:ascii="Times New Roman" w:eastAsia="標楷體" w:hAnsi="Times New Roman" w:cs="Times New Roman" w:hint="eastAsia"/>
+                <w:rFonts w:ascii="Times New Roman" w:eastAsia="標楷體" w:hAnsi="Times New Roman" w:cs="Times New Roman"/>
               </w:rPr>
             </w:pPr>
             <w:r>
@@ -9455,12 +9878,14 @@
         </w:rPr>
         <w:t>class</w:t>
       </w:r>
+      <w:proofErr w:type="gramStart"/>
       <w:r>
         <w:rPr>
           <w:rFonts w:ascii="Times New Roman" w:eastAsia="標楷體" w:hAnsi="Times New Roman" w:cs="Times New Roman" w:hint="eastAsia"/>
         </w:rPr>
         <w:t>—</w:t>
       </w:r>
+      <w:proofErr w:type="gramEnd"/>
       <w:r>
         <w:rPr>
           <w:rFonts w:ascii="Times New Roman" w:eastAsia="標楷體" w:hAnsi="Times New Roman" w:cs="Times New Roman" w:hint="eastAsia"/>
@@ -9471,13 +9896,7 @@
         <w:rPr>
           <w:rFonts w:ascii="Times New Roman" w:eastAsia="標楷體" w:hAnsi="Times New Roman" w:cs="Times New Roman" w:hint="eastAsia"/>
         </w:rPr>
-        <w:t>，以</w:t>
-      </w:r>
-      <w:r>
-        <w:rPr>
-          <w:rFonts w:ascii="Times New Roman" w:eastAsia="標楷體" w:hAnsi="Times New Roman" w:cs="Times New Roman" w:hint="eastAsia"/>
-        </w:rPr>
-        <w:t>避免相同的程式碼重複出現</w:t>
+        <w:t>，以避免相同的程式碼重複出現</w:t>
       </w:r>
       <w:r>
         <w:rPr>
@@ -9589,7 +10008,7 @@
           <w:p>
             <w:pPr>
               <w:rPr>
-                <w:rFonts w:ascii="Times New Roman" w:eastAsia="標楷體" w:hAnsi="Times New Roman" w:cs="Times New Roman" w:hint="eastAsia"/>
+                <w:rFonts w:ascii="Times New Roman" w:eastAsia="標楷體" w:hAnsi="Times New Roman" w:cs="Times New Roman"/>
               </w:rPr>
             </w:pPr>
             <w:r>
@@ -9607,7 +10026,7 @@
           <w:p>
             <w:pPr>
               <w:rPr>
-                <w:rFonts w:ascii="Times New Roman" w:eastAsia="標楷體" w:hAnsi="Times New Roman" w:cs="Times New Roman" w:hint="eastAsia"/>
+                <w:rFonts w:ascii="Times New Roman" w:eastAsia="標楷體" w:hAnsi="Times New Roman" w:cs="Times New Roman"/>
               </w:rPr>
             </w:pPr>
             <w:r>
@@ -9625,7 +10044,7 @@
           <w:p>
             <w:pPr>
               <w:rPr>
-                <w:rFonts w:ascii="Times New Roman" w:eastAsia="標楷體" w:hAnsi="Times New Roman" w:cs="Times New Roman" w:hint="eastAsia"/>
+                <w:rFonts w:ascii="Times New Roman" w:eastAsia="標楷體" w:hAnsi="Times New Roman" w:cs="Times New Roman"/>
               </w:rPr>
             </w:pPr>
             <w:r>
@@ -9645,7 +10064,7 @@
           <w:p>
             <w:pPr>
               <w:rPr>
-                <w:rFonts w:ascii="Times New Roman" w:eastAsia="標楷體" w:hAnsi="Times New Roman" w:cs="Times New Roman" w:hint="eastAsia"/>
+                <w:rFonts w:ascii="Times New Roman" w:eastAsia="標楷體" w:hAnsi="Times New Roman" w:cs="Times New Roman"/>
               </w:rPr>
             </w:pPr>
             <w:r>
@@ -9663,7 +10082,7 @@
           <w:p>
             <w:pPr>
               <w:rPr>
-                <w:rFonts w:ascii="Times New Roman" w:eastAsia="標楷體" w:hAnsi="Times New Roman" w:cs="Times New Roman" w:hint="eastAsia"/>
+                <w:rFonts w:ascii="Times New Roman" w:eastAsia="標楷體" w:hAnsi="Times New Roman" w:cs="Times New Roman"/>
               </w:rPr>
             </w:pPr>
             <w:r>
@@ -9681,15 +10100,17 @@
           <w:p>
             <w:pPr>
               <w:rPr>
-                <w:rFonts w:ascii="Times New Roman" w:eastAsia="標楷體" w:hAnsi="Times New Roman" w:cs="Times New Roman" w:hint="eastAsia"/>
-              </w:rPr>
-            </w:pPr>
+                <w:rFonts w:ascii="Times New Roman" w:eastAsia="標楷體" w:hAnsi="Times New Roman" w:cs="Times New Roman"/>
+              </w:rPr>
+            </w:pPr>
+            <w:proofErr w:type="gramStart"/>
             <w:r>
               <w:rPr>
                 <w:rFonts w:ascii="Times New Roman" w:eastAsia="標楷體" w:hAnsi="Times New Roman" w:cs="Times New Roman" w:hint="eastAsia"/>
               </w:rPr>
               <w:t>私訊</w:t>
             </w:r>
+            <w:proofErr w:type="gramEnd"/>
           </w:p>
         </w:tc>
       </w:tr>
@@ -9701,7 +10122,7 @@
           <w:p>
             <w:pPr>
               <w:rPr>
-                <w:rFonts w:ascii="Times New Roman" w:eastAsia="標楷體" w:hAnsi="Times New Roman" w:cs="Times New Roman" w:hint="eastAsia"/>
+                <w:rFonts w:ascii="Times New Roman" w:eastAsia="標楷體" w:hAnsi="Times New Roman" w:cs="Times New Roman"/>
               </w:rPr>
             </w:pPr>
             <w:r>
@@ -9719,7 +10140,7 @@
           <w:p>
             <w:pPr>
               <w:rPr>
-                <w:rFonts w:ascii="Times New Roman" w:eastAsia="標楷體" w:hAnsi="Times New Roman" w:cs="Times New Roman" w:hint="eastAsia"/>
+                <w:rFonts w:ascii="Times New Roman" w:eastAsia="標楷體" w:hAnsi="Times New Roman" w:cs="Times New Roman"/>
               </w:rPr>
             </w:pPr>
             <w:r>
@@ -9737,7 +10158,7 @@
           <w:p>
             <w:pPr>
               <w:rPr>
-                <w:rFonts w:ascii="Times New Roman" w:eastAsia="標楷體" w:hAnsi="Times New Roman" w:cs="Times New Roman" w:hint="eastAsia"/>
+                <w:rFonts w:ascii="Times New Roman" w:eastAsia="標楷體" w:hAnsi="Times New Roman" w:cs="Times New Roman"/>
               </w:rPr>
             </w:pPr>
             <w:r>
@@ -9753,7 +10174,7 @@
     <w:p>
       <w:pPr>
         <w:rPr>
-          <w:rFonts w:ascii="Times New Roman" w:eastAsia="標楷體" w:hAnsi="Times New Roman" w:cs="Times New Roman" w:hint="eastAsia"/>
+          <w:rFonts w:ascii="Times New Roman" w:eastAsia="標楷體" w:hAnsi="Times New Roman" w:cs="Times New Roman"/>
         </w:rPr>
       </w:pPr>
     </w:p>
@@ -9779,6 +10200,7 @@
       <w:r>
         <w:rPr>
           <w:rFonts w:ascii="Times New Roman" w:eastAsia="標楷體" w:hAnsi="Times New Roman" w:cs="Times New Roman"/>
+          <w:noProof/>
         </w:rPr>
         <w:drawing>
           <wp:inline distT="0" distB="0" distL="0" distR="0" wp14:anchorId="631A6759" wp14:editId="11639DC7">
@@ -9834,6 +10256,9 @@
         <w:jc w:val="center"/>
       </w:pPr>
       <w:r>
+        <w:rPr>
+          <w:noProof/>
+        </w:rPr>
         <w:drawing>
           <wp:inline distT="0" distB="0" distL="0" distR="0" wp14:anchorId="5CF64CB4" wp14:editId="19382F8F">
             <wp:extent cx="8174258" cy="3767284"/>
@@ -10080,23 +10505,30 @@
         <w:tc>
           <w:tcPr>
             <w:tcW w:w="4148" w:type="dxa"/>
-          </w:tcPr>
-          <w:p>
-            <w:pPr>
-              <w:rPr>
-                <w:rFonts w:ascii="Times New Roman" w:eastAsia="標楷體" w:hAnsi="Times New Roman" w:cs="Times New Roman"/>
-              </w:rPr>
-            </w:pPr>
-          </w:p>
-        </w:tc>
-        <w:tc>
-          <w:tcPr>
-            <w:tcW w:w="4148" w:type="dxa"/>
-          </w:tcPr>
-          <w:p>
-            <w:pPr>
-              <w:rPr>
-                <w:rFonts w:ascii="Times New Roman" w:eastAsia="標楷體" w:hAnsi="Times New Roman" w:cs="Times New Roman" w:hint="eastAsia"/>
+            <w:vMerge w:val="restart"/>
+          </w:tcPr>
+          <w:p>
+            <w:pPr>
+              <w:rPr>
+                <w:rFonts w:ascii="Times New Roman" w:eastAsia="標楷體" w:hAnsi="Times New Roman" w:cs="Times New Roman" w:hint="eastAsia"/>
+              </w:rPr>
+            </w:pPr>
+            <w:r>
+              <w:rPr>
+                <w:rFonts w:ascii="Times New Roman" w:eastAsia="標楷體" w:hAnsi="Times New Roman" w:cs="Times New Roman" w:hint="eastAsia"/>
+              </w:rPr>
+              <w:t>HW#3</w:t>
+            </w:r>
+          </w:p>
+        </w:tc>
+        <w:tc>
+          <w:tcPr>
+            <w:tcW w:w="4148" w:type="dxa"/>
+          </w:tcPr>
+          <w:p>
+            <w:pPr>
+              <w:rPr>
+                <w:rFonts w:ascii="Times New Roman" w:eastAsia="標楷體" w:hAnsi="Times New Roman" w:cs="Times New Roman"/>
               </w:rPr>
             </w:pPr>
             <w:r>
@@ -10112,30 +10544,31 @@
         <w:tc>
           <w:tcPr>
             <w:tcW w:w="4148" w:type="dxa"/>
-          </w:tcPr>
-          <w:p>
-            <w:pPr>
-              <w:rPr>
-                <w:rFonts w:ascii="Times New Roman" w:eastAsia="標楷體" w:hAnsi="Times New Roman" w:cs="Times New Roman"/>
-              </w:rPr>
-            </w:pPr>
-          </w:p>
-        </w:tc>
-        <w:tc>
-          <w:tcPr>
-            <w:tcW w:w="4148" w:type="dxa"/>
-          </w:tcPr>
-          <w:p>
-            <w:pPr>
-              <w:rPr>
-                <w:rFonts w:ascii="Times New Roman" w:eastAsia="標楷體" w:hAnsi="Times New Roman" w:cs="Times New Roman"/>
-              </w:rPr>
-            </w:pPr>
-            <w:r>
-              <w:rPr>
-                <w:rFonts w:ascii="Times New Roman" w:eastAsia="標楷體" w:hAnsi="Times New Roman" w:cs="Times New Roman" w:hint="eastAsia"/>
-              </w:rPr>
-              <w:t xml:space="preserve">26/03/27 </w:t>
+            <w:vMerge/>
+          </w:tcPr>
+          <w:p>
+            <w:pPr>
+              <w:rPr>
+                <w:rFonts w:ascii="Times New Roman" w:eastAsia="標楷體" w:hAnsi="Times New Roman" w:cs="Times New Roman"/>
+              </w:rPr>
+            </w:pPr>
+          </w:p>
+        </w:tc>
+        <w:tc>
+          <w:tcPr>
+            <w:tcW w:w="4148" w:type="dxa"/>
+          </w:tcPr>
+          <w:p>
+            <w:pPr>
+              <w:rPr>
+                <w:rFonts w:ascii="Times New Roman" w:eastAsia="標楷體" w:hAnsi="Times New Roman" w:cs="Times New Roman" w:hint="eastAsia"/>
+              </w:rPr>
+            </w:pPr>
+            <w:r>
+              <w:rPr>
+                <w:rFonts w:ascii="Times New Roman" w:eastAsia="標楷體" w:hAnsi="Times New Roman" w:cs="Times New Roman" w:hint="eastAsia"/>
+              </w:rPr>
+              <w:t>26/03/27 14:00~16:00</w:t>
             </w:r>
           </w:p>
         </w:tc>
@@ -10144,23 +10577,24 @@
         <w:tc>
           <w:tcPr>
             <w:tcW w:w="4148" w:type="dxa"/>
-          </w:tcPr>
-          <w:p>
-            <w:pPr>
-              <w:rPr>
-                <w:rFonts w:ascii="Times New Roman" w:eastAsia="標楷體" w:hAnsi="Times New Roman" w:cs="Times New Roman"/>
-              </w:rPr>
-            </w:pPr>
-          </w:p>
-        </w:tc>
-        <w:tc>
-          <w:tcPr>
-            <w:tcW w:w="4148" w:type="dxa"/>
-          </w:tcPr>
-          <w:p>
-            <w:pPr>
-              <w:rPr>
-                <w:rFonts w:ascii="Times New Roman" w:eastAsia="標楷體" w:hAnsi="Times New Roman" w:cs="Times New Roman" w:hint="eastAsia"/>
+            <w:vMerge/>
+          </w:tcPr>
+          <w:p>
+            <w:pPr>
+              <w:rPr>
+                <w:rFonts w:ascii="Times New Roman" w:eastAsia="標楷體" w:hAnsi="Times New Roman" w:cs="Times New Roman"/>
+              </w:rPr>
+            </w:pPr>
+          </w:p>
+        </w:tc>
+        <w:tc>
+          <w:tcPr>
+            <w:tcW w:w="4148" w:type="dxa"/>
+          </w:tcPr>
+          <w:p>
+            <w:pPr>
+              <w:rPr>
+                <w:rFonts w:ascii="Times New Roman" w:eastAsia="標楷體" w:hAnsi="Times New Roman" w:cs="Times New Roman"/>
               </w:rPr>
             </w:pPr>
             <w:r>
@@ -10176,36 +10610,31 @@
         <w:tc>
           <w:tcPr>
             <w:tcW w:w="4148" w:type="dxa"/>
-          </w:tcPr>
-          <w:p>
-            <w:pPr>
-              <w:rPr>
-                <w:rFonts w:ascii="Times New Roman" w:eastAsia="標楷體" w:hAnsi="Times New Roman" w:cs="Times New Roman"/>
-              </w:rPr>
-            </w:pPr>
-          </w:p>
-        </w:tc>
-        <w:tc>
-          <w:tcPr>
-            <w:tcW w:w="4148" w:type="dxa"/>
-          </w:tcPr>
-          <w:p>
-            <w:pPr>
-              <w:rPr>
-                <w:rFonts w:ascii="Times New Roman" w:eastAsia="標楷體" w:hAnsi="Times New Roman" w:cs="Times New Roman" w:hint="eastAsia"/>
-              </w:rPr>
-            </w:pPr>
-            <w:r>
-              <w:rPr>
-                <w:rFonts w:ascii="Times New Roman" w:eastAsia="標楷體" w:hAnsi="Times New Roman" w:cs="Times New Roman" w:hint="eastAsia"/>
-              </w:rPr>
-              <w:t>26/03/30 14:00~</w:t>
-            </w:r>
-            <w:r>
-              <w:rPr>
-                <w:rFonts w:ascii="Times New Roman" w:eastAsia="標楷體" w:hAnsi="Times New Roman" w:cs="Times New Roman" w:hint="eastAsia"/>
-              </w:rPr>
-              <w:t>18:40</w:t>
+            <w:vMerge/>
+          </w:tcPr>
+          <w:p>
+            <w:pPr>
+              <w:rPr>
+                <w:rFonts w:ascii="Times New Roman" w:eastAsia="標楷體" w:hAnsi="Times New Roman" w:cs="Times New Roman"/>
+              </w:rPr>
+            </w:pPr>
+          </w:p>
+        </w:tc>
+        <w:tc>
+          <w:tcPr>
+            <w:tcW w:w="4148" w:type="dxa"/>
+          </w:tcPr>
+          <w:p>
+            <w:pPr>
+              <w:rPr>
+                <w:rFonts w:ascii="Times New Roman" w:eastAsia="標楷體" w:hAnsi="Times New Roman" w:cs="Times New Roman"/>
+              </w:rPr>
+            </w:pPr>
+            <w:r>
+              <w:rPr>
+                <w:rFonts w:ascii="Times New Roman" w:eastAsia="標楷體" w:hAnsi="Times New Roman" w:cs="Times New Roman" w:hint="eastAsia"/>
+              </w:rPr>
+              <w:t>26/03/30 14:00~18:40</w:t>
             </w:r>
           </w:p>
         </w:tc>
@@ -12754,6 +13183,61 @@
     <w:semiHidden/>
     <w:rsid w:val="007B0C51"/>
   </w:style>
+  <w:style w:type="character" w:styleId="af5">
+    <w:name w:val="annotation reference"/>
+    <w:basedOn w:val="a0"/>
+    <w:uiPriority w:val="99"/>
+    <w:semiHidden/>
+    <w:unhideWhenUsed/>
+    <w:rsid w:val="00792CD9"/>
+    <w:rPr>
+      <w:sz w:val="18"/>
+      <w:szCs w:val="18"/>
+    </w:rPr>
+  </w:style>
+  <w:style w:type="paragraph" w:styleId="af6">
+    <w:name w:val="annotation text"/>
+    <w:basedOn w:val="a"/>
+    <w:link w:val="af7"/>
+    <w:uiPriority w:val="99"/>
+    <w:semiHidden/>
+    <w:unhideWhenUsed/>
+    <w:rsid w:val="00792CD9"/>
+  </w:style>
+  <w:style w:type="character" w:customStyle="1" w:styleId="af7">
+    <w:name w:val="註解文字 字元"/>
+    <w:basedOn w:val="a0"/>
+    <w:link w:val="af6"/>
+    <w:uiPriority w:val="99"/>
+    <w:semiHidden/>
+    <w:rsid w:val="00792CD9"/>
+  </w:style>
+  <w:style w:type="paragraph" w:styleId="af8">
+    <w:name w:val="annotation subject"/>
+    <w:basedOn w:val="af6"/>
+    <w:next w:val="af6"/>
+    <w:link w:val="af9"/>
+    <w:uiPriority w:val="99"/>
+    <w:semiHidden/>
+    <w:unhideWhenUsed/>
+    <w:rsid w:val="00792CD9"/>
+    <w:rPr>
+      <w:b/>
+      <w:bCs/>
+    </w:rPr>
+  </w:style>
+  <w:style w:type="character" w:customStyle="1" w:styleId="af9">
+    <w:name w:val="註解主旨 字元"/>
+    <w:basedOn w:val="af7"/>
+    <w:link w:val="af8"/>
+    <w:uiPriority w:val="99"/>
+    <w:semiHidden/>
+    <w:rsid w:val="00792CD9"/>
+    <w:rPr>
+      <w:b/>
+      <w:bCs/>
+    </w:rPr>
+  </w:style>
 </w:styles>
 </file>
 

</xml_diff>